<commit_message>
Dia 33: Tipos de proyectos de IA mas comunes y test de viabilidad
</commit_message>
<xml_diff>
--- a/Diseño de proyectos de IA/Diseño de proyectos de IA.docx
+++ b/Diseño de proyectos de IA/Diseño de proyectos de IA.docx
@@ -909,6 +909,2010 @@
       </w:r>
     </w:p>
     <w:p/>
+    <w:p>
+      <w:pPr>
+        <w:rPr>
+          <w:rFonts w:cstheme="minorHAnsi"/>
+          <w:b/>
+          <w:bCs/>
+          <w:sz w:val="36"/>
+          <w:szCs w:val="36"/>
+          <w:u w:val="single"/>
+        </w:rPr>
+      </w:pPr>
+      <w:r>
+        <w:rPr>
+          <w:rFonts w:ascii="Segoe UI Emoji" w:hAnsi="Segoe UI Emoji" w:cs="Segoe UI Emoji"/>
+          <w:b/>
+          <w:bCs/>
+          <w:sz w:val="36"/>
+          <w:szCs w:val="36"/>
+          <w:u w:val="single"/>
+        </w:rPr>
+        <w:t>🧠</w:t>
+      </w:r>
+      <w:r>
+        <w:rPr>
+          <w:rFonts w:cstheme="minorHAnsi"/>
+          <w:b/>
+          <w:bCs/>
+          <w:sz w:val="36"/>
+          <w:szCs w:val="36"/>
+          <w:u w:val="single"/>
+        </w:rPr>
+        <w:t xml:space="preserve"> Los 10 tipos de proyectos de IA más comunes</w:t>
+      </w:r>
+    </w:p>
+    <w:p>
+      <w:r>
+        <w:t>No son modelos.</w:t>
+      </w:r>
+      <w:r>
+        <w:br/>
+        <w:t xml:space="preserve">Son </w:t>
+      </w:r>
+      <w:r>
+        <w:rPr>
+          <w:b/>
+          <w:bCs/>
+        </w:rPr>
+        <w:t>tipos de problema</w:t>
+      </w:r>
+      <w:r>
+        <w:t>.</w:t>
+      </w:r>
+    </w:p>
+    <w:p>
+      <w:r>
+        <w:pict w14:anchorId="2605548D">
+          <v:rect id="_x0000_i1030" style="width:0;height:1.5pt" o:hralign="center" o:hrstd="t" o:hr="t" fillcolor="#a0a0a0" stroked="f"/>
+        </w:pict>
+      </w:r>
+    </w:p>
+    <w:p>
+      <w:pPr>
+        <w:rPr>
+          <w:b/>
+          <w:bCs/>
+          <w:sz w:val="28"/>
+          <w:szCs w:val="28"/>
+          <w:u w:val="single"/>
+        </w:rPr>
+      </w:pPr>
+      <w:r>
+        <w:rPr>
+          <w:b/>
+          <w:bCs/>
+        </w:rPr>
+        <w:t>1️</w:t>
+      </w:r>
+      <w:r>
+        <w:rPr>
+          <w:rFonts w:ascii="Tahoma" w:hAnsi="Tahoma" w:cs="Tahoma"/>
+          <w:b/>
+          <w:bCs/>
+          <w:sz w:val="28"/>
+          <w:szCs w:val="28"/>
+          <w:u w:val="single"/>
+        </w:rPr>
+        <w:t xml:space="preserve">) </w:t>
+      </w:r>
+      <w:r>
+        <w:rPr>
+          <w:b/>
+          <w:bCs/>
+          <w:sz w:val="28"/>
+          <w:szCs w:val="28"/>
+          <w:u w:val="single"/>
+        </w:rPr>
+        <w:t>Clasificación automática</w:t>
+      </w:r>
+    </w:p>
+    <w:p>
+      <w:r>
+        <w:t>Ejemplo:</w:t>
+      </w:r>
+    </w:p>
+    <w:p>
+      <w:pPr>
+        <w:numPr>
+          <w:ilvl w:val="0"/>
+          <w:numId w:val="7"/>
+        </w:numPr>
+      </w:pPr>
+      <w:r>
+        <w:t>spam / no spam</w:t>
+      </w:r>
+    </w:p>
+    <w:p>
+      <w:pPr>
+        <w:numPr>
+          <w:ilvl w:val="0"/>
+          <w:numId w:val="7"/>
+        </w:numPr>
+      </w:pPr>
+      <w:r>
+        <w:t>fraude / no fraude</w:t>
+      </w:r>
+    </w:p>
+    <w:p>
+      <w:pPr>
+        <w:numPr>
+          <w:ilvl w:val="0"/>
+          <w:numId w:val="7"/>
+        </w:numPr>
+      </w:pPr>
+      <w:r>
+        <w:t>ticket soporte / ventas / técnico</w:t>
+      </w:r>
+    </w:p>
+    <w:p>
+      <w:r>
+        <w:lastRenderedPageBreak/>
+        <w:t>IA usada:</w:t>
+      </w:r>
+    </w:p>
+    <w:p>
+      <w:r>
+        <w:t>ML clásico</w:t>
+      </w:r>
+    </w:p>
+    <w:p>
+      <w:r>
+        <w:t>Ejemplo real:</w:t>
+      </w:r>
+    </w:p>
+    <w:p>
+      <w:r>
+        <w:t>Clasificar tickets de soporte</w:t>
+      </w:r>
+    </w:p>
+    <w:p>
+      <w:r>
+        <w:pict w14:anchorId="35896344">
+          <v:rect id="_x0000_i1031" style="width:0;height:1.5pt" o:hralign="center" o:hrstd="t" o:hr="t" fillcolor="#a0a0a0" stroked="f"/>
+        </w:pict>
+      </w:r>
+    </w:p>
+    <w:p>
+      <w:pPr>
+        <w:rPr>
+          <w:b/>
+          <w:bCs/>
+          <w:sz w:val="28"/>
+          <w:szCs w:val="28"/>
+          <w:u w:val="single"/>
+        </w:rPr>
+      </w:pPr>
+      <w:r>
+        <w:rPr>
+          <w:b/>
+          <w:bCs/>
+          <w:sz w:val="28"/>
+          <w:szCs w:val="28"/>
+          <w:u w:val="single"/>
+        </w:rPr>
+        <w:t>2️</w:t>
+      </w:r>
+      <w:r>
+        <w:rPr>
+          <w:rFonts w:ascii="Tahoma" w:hAnsi="Tahoma" w:cs="Tahoma"/>
+          <w:b/>
+          <w:bCs/>
+          <w:sz w:val="28"/>
+          <w:szCs w:val="28"/>
+          <w:u w:val="single"/>
+        </w:rPr>
+        <w:t xml:space="preserve">) </w:t>
+      </w:r>
+      <w:r>
+        <w:rPr>
+          <w:b/>
+          <w:bCs/>
+          <w:sz w:val="28"/>
+          <w:szCs w:val="28"/>
+          <w:u w:val="single"/>
+        </w:rPr>
+        <w:t>Predicción</w:t>
+      </w:r>
+    </w:p>
+    <w:p>
+      <w:r>
+        <w:t>Ejemplo:</w:t>
+      </w:r>
+    </w:p>
+    <w:p>
+      <w:pPr>
+        <w:numPr>
+          <w:ilvl w:val="0"/>
+          <w:numId w:val="8"/>
+        </w:numPr>
+      </w:pPr>
+      <w:r>
+        <w:t>abandono de cliente</w:t>
+      </w:r>
+    </w:p>
+    <w:p>
+      <w:pPr>
+        <w:numPr>
+          <w:ilvl w:val="0"/>
+          <w:numId w:val="8"/>
+        </w:numPr>
+      </w:pPr>
+      <w:r>
+        <w:t>demanda de producto</w:t>
+      </w:r>
+    </w:p>
+    <w:p>
+      <w:pPr>
+        <w:numPr>
+          <w:ilvl w:val="0"/>
+          <w:numId w:val="8"/>
+        </w:numPr>
+      </w:pPr>
+      <w:r>
+        <w:t>probabilidad de compra</w:t>
+      </w:r>
+    </w:p>
+    <w:p>
+      <w:r>
+        <w:t>IA usada:</w:t>
+      </w:r>
+    </w:p>
+    <w:p>
+      <w:r>
+        <w:t>ML clásico</w:t>
+      </w:r>
+    </w:p>
+    <w:p>
+      <w:r>
+        <w:pict w14:anchorId="72B1EA76">
+          <v:rect id="_x0000_i1032" style="width:0;height:1.5pt" o:hralign="center" o:hrstd="t" o:hr="t" fillcolor="#a0a0a0" stroked="f"/>
+        </w:pict>
+      </w:r>
+    </w:p>
+    <w:p>
+      <w:pPr>
+        <w:rPr>
+          <w:b/>
+          <w:bCs/>
+          <w:sz w:val="28"/>
+          <w:szCs w:val="28"/>
+          <w:u w:val="single"/>
+        </w:rPr>
+      </w:pPr>
+      <w:r>
+        <w:rPr>
+          <w:b/>
+          <w:bCs/>
+          <w:sz w:val="28"/>
+          <w:szCs w:val="28"/>
+          <w:u w:val="single"/>
+        </w:rPr>
+        <w:t>3️</w:t>
+      </w:r>
+      <w:r>
+        <w:rPr>
+          <w:rFonts w:ascii="Tahoma" w:hAnsi="Tahoma" w:cs="Tahoma"/>
+          <w:b/>
+          <w:bCs/>
+          <w:sz w:val="28"/>
+          <w:szCs w:val="28"/>
+          <w:u w:val="single"/>
+        </w:rPr>
+        <w:t xml:space="preserve">) </w:t>
+      </w:r>
+      <w:r>
+        <w:rPr>
+          <w:b/>
+          <w:bCs/>
+          <w:sz w:val="28"/>
+          <w:szCs w:val="28"/>
+          <w:u w:val="single"/>
+        </w:rPr>
+        <w:t>Ranking</w:t>
+      </w:r>
+    </w:p>
+    <w:p>
+      <w:r>
+        <w:t>Ejemplo:</w:t>
+      </w:r>
+    </w:p>
+    <w:p>
+      <w:pPr>
+        <w:numPr>
+          <w:ilvl w:val="0"/>
+          <w:numId w:val="9"/>
+        </w:numPr>
+      </w:pPr>
+      <w:r>
+        <w:t>ordenar candidatos</w:t>
+      </w:r>
+    </w:p>
+    <w:p>
+      <w:pPr>
+        <w:numPr>
+          <w:ilvl w:val="0"/>
+          <w:numId w:val="9"/>
+        </w:numPr>
+      </w:pPr>
+      <w:r>
+        <w:t>ordenar productos</w:t>
+      </w:r>
+    </w:p>
+    <w:p>
+      <w:pPr>
+        <w:numPr>
+          <w:ilvl w:val="0"/>
+          <w:numId w:val="9"/>
+        </w:numPr>
+      </w:pPr>
+      <w:r>
+        <w:t>priorizar leads de venta</w:t>
+      </w:r>
+    </w:p>
+    <w:p>
+      <w:r>
+        <w:t>IA usada:</w:t>
+      </w:r>
+    </w:p>
+    <w:p>
+      <w:r>
+        <w:t>ML clásico</w:t>
+      </w:r>
+    </w:p>
+    <w:p>
+      <w:r>
+        <w:pict w14:anchorId="2E7CAB00">
+          <v:rect id="_x0000_i1033" style="width:0;height:1.5pt" o:hralign="center" o:hrstd="t" o:hr="t" fillcolor="#a0a0a0" stroked="f"/>
+        </w:pict>
+      </w:r>
+    </w:p>
+    <w:p>
+      <w:pPr>
+        <w:rPr>
+          <w:b/>
+          <w:bCs/>
+          <w:u w:val="single"/>
+        </w:rPr>
+      </w:pPr>
+      <w:r>
+        <w:rPr>
+          <w:b/>
+          <w:bCs/>
+          <w:sz w:val="28"/>
+          <w:szCs w:val="28"/>
+          <w:u w:val="single"/>
+        </w:rPr>
+        <w:t>4) Recomendación</w:t>
+      </w:r>
+    </w:p>
+    <w:p>
+      <w:r>
+        <w:t>Ejemplo:</w:t>
+      </w:r>
+    </w:p>
+    <w:p>
+      <w:pPr>
+        <w:numPr>
+          <w:ilvl w:val="0"/>
+          <w:numId w:val="10"/>
+        </w:numPr>
+      </w:pPr>
+      <w:r>
+        <w:t>Netflix</w:t>
+      </w:r>
+    </w:p>
+    <w:p>
+      <w:pPr>
+        <w:numPr>
+          <w:ilvl w:val="0"/>
+          <w:numId w:val="10"/>
+        </w:numPr>
+      </w:pPr>
+      <w:r>
+        <w:t>Spotify</w:t>
+      </w:r>
+    </w:p>
+    <w:p>
+      <w:pPr>
+        <w:numPr>
+          <w:ilvl w:val="0"/>
+          <w:numId w:val="10"/>
+        </w:numPr>
+      </w:pPr>
+      <w:r>
+        <w:t>Amazon</w:t>
+      </w:r>
+    </w:p>
+    <w:p>
+      <w:r>
+        <w:t>IA usada:</w:t>
+      </w:r>
+    </w:p>
+    <w:p>
+      <w:r>
+        <w:t xml:space="preserve">ML clásico + </w:t>
+      </w:r>
+      <w:proofErr w:type="spellStart"/>
+      <w:r>
+        <w:t>embeddings</w:t>
+      </w:r>
+      <w:proofErr w:type="spellEnd"/>
+    </w:p>
+    <w:p>
+      <w:r>
+        <w:pict w14:anchorId="7FB8FBD5">
+          <v:rect id="_x0000_i1034" style="width:0;height:1.5pt" o:hralign="center" o:hrstd="t" o:hr="t" fillcolor="#a0a0a0" stroked="f"/>
+        </w:pict>
+      </w:r>
+    </w:p>
+    <w:p>
+      <w:pPr>
+        <w:rPr>
+          <w:b/>
+          <w:bCs/>
+        </w:rPr>
+      </w:pPr>
+    </w:p>
+    <w:p>
+      <w:pPr>
+        <w:rPr>
+          <w:b/>
+          <w:bCs/>
+          <w:sz w:val="28"/>
+          <w:szCs w:val="28"/>
+          <w:u w:val="single"/>
+        </w:rPr>
+      </w:pPr>
+      <w:r>
+        <w:rPr>
+          <w:b/>
+          <w:bCs/>
+          <w:sz w:val="28"/>
+          <w:szCs w:val="28"/>
+          <w:u w:val="single"/>
+        </w:rPr>
+        <w:lastRenderedPageBreak/>
+        <w:t>5️</w:t>
+      </w:r>
+      <w:r>
+        <w:rPr>
+          <w:rFonts w:ascii="Tahoma" w:hAnsi="Tahoma" w:cs="Tahoma"/>
+          <w:b/>
+          <w:bCs/>
+          <w:sz w:val="28"/>
+          <w:szCs w:val="28"/>
+          <w:u w:val="single"/>
+        </w:rPr>
+        <w:t xml:space="preserve">) </w:t>
+      </w:r>
+      <w:r>
+        <w:rPr>
+          <w:b/>
+          <w:bCs/>
+          <w:sz w:val="28"/>
+          <w:szCs w:val="28"/>
+          <w:u w:val="single"/>
+        </w:rPr>
+        <w:t>Búsqueda inteligente</w:t>
+      </w:r>
+    </w:p>
+    <w:p>
+      <w:r>
+        <w:t>Ejemplo:</w:t>
+      </w:r>
+    </w:p>
+    <w:p>
+      <w:pPr>
+        <w:numPr>
+          <w:ilvl w:val="0"/>
+          <w:numId w:val="11"/>
+        </w:numPr>
+      </w:pPr>
+      <w:r>
+        <w:t>buscar en documentos</w:t>
+      </w:r>
+    </w:p>
+    <w:p>
+      <w:pPr>
+        <w:numPr>
+          <w:ilvl w:val="0"/>
+          <w:numId w:val="11"/>
+        </w:numPr>
+      </w:pPr>
+      <w:r>
+        <w:t>buscar en manuales</w:t>
+      </w:r>
+    </w:p>
+    <w:p>
+      <w:pPr>
+        <w:numPr>
+          <w:ilvl w:val="0"/>
+          <w:numId w:val="11"/>
+        </w:numPr>
+      </w:pPr>
+      <w:r>
+        <w:t>buscar en base de conocimiento</w:t>
+      </w:r>
+    </w:p>
+    <w:p>
+      <w:r>
+        <w:t>IA usada:</w:t>
+      </w:r>
+    </w:p>
+    <w:p>
+      <w:r>
+        <w:t>RAG + LLM</w:t>
+      </w:r>
+    </w:p>
+    <w:p>
+      <w:r>
+        <w:pict w14:anchorId="76A21C9A">
+          <v:rect id="_x0000_i1035" style="width:0;height:1.5pt" o:hralign="center" o:hrstd="t" o:hr="t" fillcolor="#a0a0a0" stroked="f"/>
+        </w:pict>
+      </w:r>
+    </w:p>
+    <w:p>
+      <w:pPr>
+        <w:rPr>
+          <w:b/>
+          <w:bCs/>
+          <w:sz w:val="28"/>
+          <w:szCs w:val="28"/>
+          <w:u w:val="single"/>
+        </w:rPr>
+      </w:pPr>
+      <w:r>
+        <w:rPr>
+          <w:b/>
+          <w:bCs/>
+          <w:sz w:val="28"/>
+          <w:szCs w:val="28"/>
+          <w:u w:val="single"/>
+        </w:rPr>
+        <w:t>6️</w:t>
+      </w:r>
+      <w:r>
+        <w:rPr>
+          <w:rFonts w:ascii="Tahoma" w:hAnsi="Tahoma" w:cs="Tahoma"/>
+          <w:b/>
+          <w:bCs/>
+          <w:sz w:val="28"/>
+          <w:szCs w:val="28"/>
+          <w:u w:val="single"/>
+        </w:rPr>
+        <w:t xml:space="preserve">) </w:t>
+      </w:r>
+      <w:r>
+        <w:rPr>
+          <w:b/>
+          <w:bCs/>
+          <w:sz w:val="28"/>
+          <w:szCs w:val="28"/>
+          <w:u w:val="single"/>
+        </w:rPr>
+        <w:t>Asistente conversacional</w:t>
+      </w:r>
+    </w:p>
+    <w:p>
+      <w:r>
+        <w:t>Ejemplo:</w:t>
+      </w:r>
+    </w:p>
+    <w:p>
+      <w:pPr>
+        <w:numPr>
+          <w:ilvl w:val="0"/>
+          <w:numId w:val="12"/>
+        </w:numPr>
+      </w:pPr>
+      <w:r>
+        <w:t>soporte automático</w:t>
+      </w:r>
+    </w:p>
+    <w:p>
+      <w:pPr>
+        <w:numPr>
+          <w:ilvl w:val="0"/>
+          <w:numId w:val="12"/>
+        </w:numPr>
+      </w:pPr>
+      <w:r>
+        <w:t>copiloto interno</w:t>
+      </w:r>
+    </w:p>
+    <w:p>
+      <w:r>
+        <w:t>IA usada:</w:t>
+      </w:r>
+    </w:p>
+    <w:p>
+      <w:r>
+        <w:t>LLM + RAG</w:t>
+      </w:r>
+    </w:p>
+    <w:p>
+      <w:r>
+        <w:pict w14:anchorId="44303475">
+          <v:rect id="_x0000_i1036" style="width:0;height:1.5pt" o:hralign="center" o:hrstd="t" o:hr="t" fillcolor="#a0a0a0" stroked="f"/>
+        </w:pict>
+      </w:r>
+    </w:p>
+    <w:p>
+      <w:pPr>
+        <w:rPr>
+          <w:b/>
+          <w:bCs/>
+          <w:sz w:val="28"/>
+          <w:szCs w:val="28"/>
+          <w:u w:val="single"/>
+        </w:rPr>
+      </w:pPr>
+      <w:r>
+        <w:rPr>
+          <w:b/>
+          <w:bCs/>
+          <w:sz w:val="28"/>
+          <w:szCs w:val="28"/>
+          <w:u w:val="single"/>
+        </w:rPr>
+        <w:t>7️</w:t>
+      </w:r>
+      <w:r>
+        <w:rPr>
+          <w:rFonts w:ascii="Tahoma" w:hAnsi="Tahoma" w:cs="Tahoma"/>
+          <w:b/>
+          <w:bCs/>
+          <w:sz w:val="28"/>
+          <w:szCs w:val="28"/>
+          <w:u w:val="single"/>
+        </w:rPr>
+        <w:t xml:space="preserve">) </w:t>
+      </w:r>
+      <w:r>
+        <w:rPr>
+          <w:b/>
+          <w:bCs/>
+          <w:sz w:val="28"/>
+          <w:szCs w:val="28"/>
+          <w:u w:val="single"/>
+        </w:rPr>
+        <w:t>Extracción de información</w:t>
+      </w:r>
+    </w:p>
+    <w:p>
+      <w:r>
+        <w:t>Ejemplo:</w:t>
+      </w:r>
+    </w:p>
+    <w:p>
+      <w:pPr>
+        <w:numPr>
+          <w:ilvl w:val="0"/>
+          <w:numId w:val="13"/>
+        </w:numPr>
+      </w:pPr>
+      <w:r>
+        <w:t>leer contratos</w:t>
+      </w:r>
+    </w:p>
+    <w:p>
+      <w:pPr>
+        <w:numPr>
+          <w:ilvl w:val="0"/>
+          <w:numId w:val="13"/>
+        </w:numPr>
+      </w:pPr>
+      <w:r>
+        <w:t>leer CV</w:t>
+      </w:r>
+    </w:p>
+    <w:p>
+      <w:pPr>
+        <w:numPr>
+          <w:ilvl w:val="0"/>
+          <w:numId w:val="13"/>
+        </w:numPr>
+      </w:pPr>
+      <w:r>
+        <w:t>leer facturas</w:t>
+      </w:r>
+    </w:p>
+    <w:p>
+      <w:r>
+        <w:t>IA usada:</w:t>
+      </w:r>
+    </w:p>
+    <w:p>
+      <w:r>
+        <w:t>LLM</w:t>
+      </w:r>
+    </w:p>
+    <w:p>
+      <w:r>
+        <w:pict w14:anchorId="085957BB">
+          <v:rect id="_x0000_i1037" style="width:0;height:1.5pt" o:hralign="center" o:hrstd="t" o:hr="t" fillcolor="#a0a0a0" stroked="f"/>
+        </w:pict>
+      </w:r>
+    </w:p>
+    <w:p>
+      <w:pPr>
+        <w:rPr>
+          <w:b/>
+          <w:bCs/>
+          <w:sz w:val="28"/>
+          <w:szCs w:val="28"/>
+          <w:u w:val="single"/>
+        </w:rPr>
+      </w:pPr>
+      <w:r>
+        <w:rPr>
+          <w:b/>
+          <w:bCs/>
+          <w:sz w:val="28"/>
+          <w:szCs w:val="28"/>
+          <w:u w:val="single"/>
+        </w:rPr>
+        <w:t>8️</w:t>
+      </w:r>
+      <w:r>
+        <w:rPr>
+          <w:rFonts w:ascii="Tahoma" w:hAnsi="Tahoma" w:cs="Tahoma"/>
+          <w:b/>
+          <w:bCs/>
+          <w:sz w:val="28"/>
+          <w:szCs w:val="28"/>
+          <w:u w:val="single"/>
+        </w:rPr>
+        <w:t xml:space="preserve">) </w:t>
+      </w:r>
+      <w:r>
+        <w:rPr>
+          <w:b/>
+          <w:bCs/>
+          <w:sz w:val="28"/>
+          <w:szCs w:val="28"/>
+          <w:u w:val="single"/>
+        </w:rPr>
+        <w:t>Generación de contenido</w:t>
+      </w:r>
+    </w:p>
+    <w:p>
+      <w:r>
+        <w:t>Ejemplo:</w:t>
+      </w:r>
+    </w:p>
+    <w:p>
+      <w:pPr>
+        <w:numPr>
+          <w:ilvl w:val="0"/>
+          <w:numId w:val="14"/>
+        </w:numPr>
+      </w:pPr>
+      <w:r>
+        <w:t>marketing</w:t>
+      </w:r>
+    </w:p>
+    <w:p>
+      <w:pPr>
+        <w:numPr>
+          <w:ilvl w:val="0"/>
+          <w:numId w:val="14"/>
+        </w:numPr>
+      </w:pPr>
+      <w:r>
+        <w:t>resúmenes</w:t>
+      </w:r>
+    </w:p>
+    <w:p>
+      <w:pPr>
+        <w:numPr>
+          <w:ilvl w:val="0"/>
+          <w:numId w:val="14"/>
+        </w:numPr>
+      </w:pPr>
+      <w:r>
+        <w:t>documentación</w:t>
+      </w:r>
+    </w:p>
+    <w:p>
+      <w:r>
+        <w:t>IA usada:</w:t>
+      </w:r>
+    </w:p>
+    <w:p>
+      <w:r>
+        <w:t>LLM</w:t>
+      </w:r>
+    </w:p>
+    <w:p>
+      <w:r>
+        <w:lastRenderedPageBreak/>
+        <w:pict w14:anchorId="668751A3">
+          <v:rect id="_x0000_i1038" style="width:0;height:1.5pt" o:hralign="center" o:hrstd="t" o:hr="t" fillcolor="#a0a0a0" stroked="f"/>
+        </w:pict>
+      </w:r>
+    </w:p>
+    <w:p>
+      <w:pPr>
+        <w:rPr>
+          <w:b/>
+          <w:bCs/>
+          <w:sz w:val="28"/>
+          <w:szCs w:val="28"/>
+          <w:u w:val="single"/>
+        </w:rPr>
+      </w:pPr>
+      <w:r>
+        <w:rPr>
+          <w:b/>
+          <w:bCs/>
+          <w:sz w:val="28"/>
+          <w:szCs w:val="28"/>
+          <w:u w:val="single"/>
+        </w:rPr>
+        <w:t>9️</w:t>
+      </w:r>
+      <w:r>
+        <w:rPr>
+          <w:rFonts w:ascii="Tahoma" w:hAnsi="Tahoma" w:cs="Tahoma"/>
+          <w:b/>
+          <w:bCs/>
+          <w:sz w:val="28"/>
+          <w:szCs w:val="28"/>
+          <w:u w:val="single"/>
+        </w:rPr>
+        <w:t xml:space="preserve">) </w:t>
+      </w:r>
+      <w:r>
+        <w:rPr>
+          <w:b/>
+          <w:bCs/>
+          <w:sz w:val="28"/>
+          <w:szCs w:val="28"/>
+          <w:u w:val="single"/>
+        </w:rPr>
+        <w:t>Detección de anomalías</w:t>
+      </w:r>
+    </w:p>
+    <w:p>
+      <w:r>
+        <w:t>Ejemplo:</w:t>
+      </w:r>
+    </w:p>
+    <w:p>
+      <w:pPr>
+        <w:numPr>
+          <w:ilvl w:val="0"/>
+          <w:numId w:val="15"/>
+        </w:numPr>
+      </w:pPr>
+      <w:r>
+        <w:t>fraude</w:t>
+      </w:r>
+    </w:p>
+    <w:p>
+      <w:pPr>
+        <w:numPr>
+          <w:ilvl w:val="0"/>
+          <w:numId w:val="15"/>
+        </w:numPr>
+      </w:pPr>
+      <w:r>
+        <w:t>fallas en máquinas</w:t>
+      </w:r>
+    </w:p>
+    <w:p>
+      <w:pPr>
+        <w:numPr>
+          <w:ilvl w:val="0"/>
+          <w:numId w:val="15"/>
+        </w:numPr>
+      </w:pPr>
+      <w:r>
+        <w:t>comportamiento extraño</w:t>
+      </w:r>
+    </w:p>
+    <w:p>
+      <w:r>
+        <w:t>IA usada:</w:t>
+      </w:r>
+    </w:p>
+    <w:p>
+      <w:r>
+        <w:t>ML clásico</w:t>
+      </w:r>
+    </w:p>
+    <w:p>
+      <w:r>
+        <w:pict w14:anchorId="7053B699">
+          <v:rect id="_x0000_i1039" style="width:0;height:1.5pt" o:hralign="center" o:hrstd="t" o:hr="t" fillcolor="#a0a0a0" stroked="f"/>
+        </w:pict>
+      </w:r>
+    </w:p>
+    <w:p>
+      <w:pPr>
+        <w:rPr>
+          <w:b/>
+          <w:bCs/>
+          <w:sz w:val="28"/>
+          <w:szCs w:val="28"/>
+          <w:u w:val="single"/>
+        </w:rPr>
+      </w:pPr>
+      <w:r>
+        <w:rPr>
+          <w:rFonts w:ascii="Segoe UI Emoji" w:hAnsi="Segoe UI Emoji" w:cs="Segoe UI Emoji"/>
+          <w:b/>
+          <w:bCs/>
+          <w:sz w:val="28"/>
+          <w:szCs w:val="28"/>
+          <w:u w:val="single"/>
+        </w:rPr>
+        <w:t xml:space="preserve">10) </w:t>
+      </w:r>
+      <w:r>
+        <w:rPr>
+          <w:b/>
+          <w:bCs/>
+          <w:sz w:val="28"/>
+          <w:szCs w:val="28"/>
+          <w:u w:val="single"/>
+        </w:rPr>
+        <w:t>Sistemas híbridos</w:t>
+      </w:r>
+    </w:p>
+    <w:p>
+      <w:r>
+        <w:t>Ejemplo:</w:t>
+      </w:r>
+    </w:p>
+    <w:p>
+      <w:pPr>
+        <w:numPr>
+          <w:ilvl w:val="0"/>
+          <w:numId w:val="16"/>
+        </w:numPr>
+      </w:pPr>
+      <w:proofErr w:type="spellStart"/>
+      <w:r>
+        <w:t>scoring</w:t>
+      </w:r>
+      <w:proofErr w:type="spellEnd"/>
+      <w:r>
+        <w:t xml:space="preserve"> + explicación</w:t>
+      </w:r>
+    </w:p>
+    <w:p>
+      <w:pPr>
+        <w:numPr>
+          <w:ilvl w:val="0"/>
+          <w:numId w:val="16"/>
+        </w:numPr>
+      </w:pPr>
+      <w:r>
+        <w:t>recomendación + asistente</w:t>
+      </w:r>
+    </w:p>
+    <w:p>
+      <w:pPr>
+        <w:numPr>
+          <w:ilvl w:val="0"/>
+          <w:numId w:val="16"/>
+        </w:numPr>
+      </w:pPr>
+      <w:r>
+        <w:t>copilotos</w:t>
+      </w:r>
+    </w:p>
+    <w:p>
+      <w:r>
+        <w:t>IA usada:</w:t>
+      </w:r>
+    </w:p>
+    <w:p>
+      <w:r>
+        <w:t>ML + LLM + RAG</w:t>
+      </w:r>
+    </w:p>
+    <w:p>
+      <w:r>
+        <w:t>Esto es lo que más está creciendo.</w:t>
+      </w:r>
+    </w:p>
+    <w:p>
+      <w:r>
+        <w:pict w14:anchorId="56910A5C">
+          <v:rect id="_x0000_i1040" style="width:0;height:1.5pt" o:hralign="center" o:hrstd="t" o:hr="t" fillcolor="#a0a0a0" stroked="f"/>
+        </w:pict>
+      </w:r>
+    </w:p>
+    <w:p>
+      <w:pPr>
+        <w:rPr>
+          <w:b/>
+          <w:bCs/>
+          <w:sz w:val="28"/>
+          <w:szCs w:val="28"/>
+          <w:u w:val="single"/>
+        </w:rPr>
+      </w:pPr>
+      <w:r>
+        <w:rPr>
+          <w:rFonts w:ascii="Segoe UI Emoji" w:hAnsi="Segoe UI Emoji" w:cs="Segoe UI Emoji"/>
+          <w:b/>
+          <w:bCs/>
+          <w:sz w:val="28"/>
+          <w:szCs w:val="28"/>
+          <w:u w:val="single"/>
+        </w:rPr>
+        <w:t>📌</w:t>
+      </w:r>
+      <w:r>
+        <w:rPr>
+          <w:b/>
+          <w:bCs/>
+          <w:sz w:val="28"/>
+          <w:szCs w:val="28"/>
+          <w:u w:val="single"/>
+        </w:rPr>
+        <w:t xml:space="preserve"> Lo importante</w:t>
+      </w:r>
+    </w:p>
+    <w:p>
+      <w:r>
+        <w:t>Cuando alguien dice:</w:t>
+      </w:r>
+    </w:p>
+    <w:p>
+      <w:r>
+        <w:t>“quiero hacer algo con IA”</w:t>
+      </w:r>
+    </w:p>
+    <w:p>
+      <w:r>
+        <w:t xml:space="preserve">En </w:t>
+      </w:r>
+      <w:proofErr w:type="gramStart"/>
+      <w:r>
+        <w:t>realidad</w:t>
+      </w:r>
+      <w:proofErr w:type="gramEnd"/>
+      <w:r>
+        <w:t xml:space="preserve"> suele ser </w:t>
+      </w:r>
+      <w:r>
+        <w:rPr>
+          <w:b/>
+          <w:bCs/>
+        </w:rPr>
+        <w:t>uno de estos 10 tipos</w:t>
+      </w:r>
+      <w:r>
+        <w:t>.</w:t>
+      </w:r>
+    </w:p>
+    <w:p/>
+    <w:p>
+      <w:pPr>
+        <w:rPr>
+          <w:b/>
+          <w:bCs/>
+          <w:sz w:val="32"/>
+          <w:szCs w:val="32"/>
+          <w:u w:val="single"/>
+        </w:rPr>
+      </w:pPr>
+      <w:r>
+        <w:rPr>
+          <w:b/>
+          <w:bCs/>
+          <w:sz w:val="32"/>
+          <w:szCs w:val="32"/>
+          <w:u w:val="single"/>
+        </w:rPr>
+        <w:t>Mini ejercicio</w:t>
+      </w:r>
+    </w:p>
+    <w:p>
+      <w:r>
+        <w:t>Te doy tres ideas.</w:t>
+      </w:r>
+    </w:p>
+    <w:p>
+      <w:r>
+        <w:t xml:space="preserve">Decime </w:t>
+      </w:r>
+      <w:r>
+        <w:rPr>
+          <w:b/>
+          <w:bCs/>
+        </w:rPr>
+        <w:t>qué tipo de proyecto es</w:t>
+      </w:r>
+      <w:r>
+        <w:t>.</w:t>
+      </w:r>
+    </w:p>
+    <w:p>
+      <w:pPr>
+        <w:rPr>
+          <w:b/>
+          <w:bCs/>
+        </w:rPr>
+      </w:pPr>
+      <w:r>
+        <w:rPr>
+          <w:b/>
+          <w:bCs/>
+        </w:rPr>
+        <w:t>A</w:t>
+      </w:r>
+      <w:r>
+        <w:rPr>
+          <w:b/>
+          <w:bCs/>
+        </w:rPr>
+        <w:t xml:space="preserve">) </w:t>
+      </w:r>
+      <w:r>
+        <w:t>Sistema que lee facturas automáticamente.</w:t>
+      </w:r>
+    </w:p>
+    <w:p>
+      <w:pPr>
+        <w:rPr>
+          <w:b/>
+          <w:bCs/>
+        </w:rPr>
+      </w:pPr>
+      <w:r>
+        <w:rPr>
+          <w:b/>
+          <w:bCs/>
+        </w:rPr>
+        <w:t>B</w:t>
+      </w:r>
+      <w:r>
+        <w:rPr>
+          <w:b/>
+          <w:bCs/>
+        </w:rPr>
+        <w:t xml:space="preserve">) </w:t>
+      </w:r>
+      <w:r>
+        <w:t>Sistema que predice si un cliente cancelará su suscripción.</w:t>
+      </w:r>
+    </w:p>
+    <w:p>
+      <w:r>
+        <w:rPr>
+          <w:b/>
+          <w:bCs/>
+        </w:rPr>
+        <w:t>C</w:t>
+      </w:r>
+      <w:r>
+        <w:rPr>
+          <w:b/>
+          <w:bCs/>
+        </w:rPr>
+        <w:t xml:space="preserve">) </w:t>
+      </w:r>
+      <w:r>
+        <w:t>Sistema que responde preguntas sobre un manual técnico.</w:t>
+      </w:r>
+    </w:p>
+    <w:p/>
+    <w:p>
+      <w:pPr>
+        <w:rPr>
+          <w:b/>
+          <w:bCs/>
+          <w:u w:val="single"/>
+        </w:rPr>
+      </w:pPr>
+      <w:r>
+        <w:rPr>
+          <w:b/>
+          <w:bCs/>
+          <w:u w:val="single"/>
+        </w:rPr>
+        <w:lastRenderedPageBreak/>
+        <w:t>Respuesta:</w:t>
+      </w:r>
+    </w:p>
+    <w:p>
+      <w:r>
+        <w:t>A -&gt; extracción de información</w:t>
+      </w:r>
+    </w:p>
+    <w:p>
+      <w:r>
+        <w:t>B -&gt; Predicción</w:t>
+      </w:r>
+    </w:p>
+    <w:p>
+      <w:r>
+        <w:t xml:space="preserve">C -&gt; Búsqueda inteligente </w:t>
+      </w:r>
+    </w:p>
+    <w:p/>
+    <w:p>
+      <w:pPr>
+        <w:rPr>
+          <w:b/>
+          <w:bCs/>
+          <w:sz w:val="36"/>
+          <w:szCs w:val="36"/>
+          <w:u w:val="single"/>
+        </w:rPr>
+      </w:pPr>
+      <w:r>
+        <w:rPr>
+          <w:b/>
+          <w:bCs/>
+          <w:sz w:val="36"/>
+          <w:szCs w:val="36"/>
+          <w:u w:val="single"/>
+        </w:rPr>
+        <w:t>Cómo evaluar si una idea de IA vale la pena</w:t>
+      </w:r>
+    </w:p>
+    <w:p>
+      <w:pPr>
+        <w:rPr>
+          <w:b/>
+          <w:bCs/>
+          <w:sz w:val="32"/>
+          <w:szCs w:val="32"/>
+          <w:u w:val="single"/>
+        </w:rPr>
+      </w:pPr>
+      <w:r>
+        <w:rPr>
+          <w:rFonts w:ascii="Segoe UI Emoji" w:hAnsi="Segoe UI Emoji" w:cs="Segoe UI Emoji"/>
+          <w:b/>
+          <w:bCs/>
+          <w:sz w:val="32"/>
+          <w:szCs w:val="32"/>
+          <w:u w:val="single"/>
+        </w:rPr>
+        <w:t>🧠</w:t>
+      </w:r>
+      <w:r>
+        <w:rPr>
+          <w:b/>
+          <w:bCs/>
+          <w:sz w:val="32"/>
+          <w:szCs w:val="32"/>
+          <w:u w:val="single"/>
+        </w:rPr>
+        <w:t xml:space="preserve"> El test de las 5 preguntas</w:t>
+      </w:r>
+    </w:p>
+    <w:p>
+      <w:r>
+        <w:t xml:space="preserve">Cuando alguien propone un proyecto de IA, </w:t>
+      </w:r>
+      <w:proofErr w:type="spellStart"/>
+      <w:r>
+        <w:t>hacé</w:t>
+      </w:r>
+      <w:proofErr w:type="spellEnd"/>
+      <w:r>
+        <w:t xml:space="preserve"> estas preguntas.</w:t>
+      </w:r>
+    </w:p>
+    <w:p>
+      <w:r>
+        <w:pict w14:anchorId="3CF05402">
+          <v:rect id="_x0000_i1131" style="width:0;height:1.5pt" o:hralign="center" o:hrstd="t" o:hr="t" fillcolor="#a0a0a0" stroked="f"/>
+        </w:pict>
+      </w:r>
+    </w:p>
+    <w:p>
+      <w:pPr>
+        <w:rPr>
+          <w:b/>
+          <w:bCs/>
+          <w:sz w:val="28"/>
+          <w:szCs w:val="28"/>
+          <w:u w:val="single"/>
+        </w:rPr>
+      </w:pPr>
+      <w:r>
+        <w:rPr>
+          <w:b/>
+          <w:bCs/>
+          <w:sz w:val="28"/>
+          <w:szCs w:val="28"/>
+          <w:u w:val="single"/>
+        </w:rPr>
+        <w:t>1️</w:t>
+      </w:r>
+      <w:r>
+        <w:rPr>
+          <w:rFonts w:ascii="Tahoma" w:hAnsi="Tahoma" w:cs="Tahoma"/>
+          <w:b/>
+          <w:bCs/>
+          <w:sz w:val="28"/>
+          <w:szCs w:val="28"/>
+          <w:u w:val="single"/>
+        </w:rPr>
+        <w:t xml:space="preserve">) </w:t>
+      </w:r>
+      <w:r>
+        <w:rPr>
+          <w:b/>
+          <w:bCs/>
+          <w:sz w:val="28"/>
+          <w:szCs w:val="28"/>
+          <w:u w:val="single"/>
+        </w:rPr>
+        <w:t>¿Existe realmente un problema?</w:t>
+      </w:r>
+    </w:p>
+    <w:p>
+      <w:r>
+        <w:t>Mala idea:</w:t>
+      </w:r>
+    </w:p>
+    <w:p>
+      <w:r>
+        <w:t>“Hagamos algo con IA para marketing.”</w:t>
+      </w:r>
+    </w:p>
+    <w:p>
+      <w:r>
+        <w:t>Buena idea:</w:t>
+      </w:r>
+    </w:p>
+    <w:p>
+      <w:r>
+        <w:t>“Perdemos clientes porque no detectamos cancelaciones a tiempo.”</w:t>
+      </w:r>
+    </w:p>
+    <w:p>
+      <w:pPr>
+        <w:rPr>
+          <w:b/>
+          <w:bCs/>
+          <w:u w:val="single"/>
+        </w:rPr>
+      </w:pPr>
+      <w:r>
+        <w:rPr>
+          <w:rFonts w:ascii="Segoe UI Emoji" w:hAnsi="Segoe UI Emoji" w:cs="Segoe UI Emoji"/>
+          <w:b/>
+          <w:bCs/>
+          <w:u w:val="single"/>
+        </w:rPr>
+        <w:t>📌</w:t>
+      </w:r>
+      <w:r>
+        <w:rPr>
+          <w:b/>
+          <w:bCs/>
+          <w:u w:val="single"/>
+        </w:rPr>
+        <w:t xml:space="preserve"> Regla:</w:t>
+      </w:r>
+    </w:p>
+    <w:p>
+      <w:r>
+        <w:t>IA resuelve problemas, no crea valor por sí sola.</w:t>
+      </w:r>
+    </w:p>
+    <w:p>
+      <w:r>
+        <w:pict w14:anchorId="6AD3A6E4">
+          <v:rect id="_x0000_i1132" style="width:0;height:1.5pt" o:hralign="center" o:hrstd="t" o:hr="t" fillcolor="#a0a0a0" stroked="f"/>
+        </w:pict>
+      </w:r>
+    </w:p>
+    <w:p>
+      <w:pPr>
+        <w:rPr>
+          <w:rFonts w:cstheme="minorHAnsi"/>
+          <w:b/>
+          <w:bCs/>
+          <w:sz w:val="28"/>
+          <w:szCs w:val="28"/>
+          <w:u w:val="single"/>
+        </w:rPr>
+      </w:pPr>
+      <w:r>
+        <w:rPr>
+          <w:rFonts w:cstheme="minorHAnsi"/>
+          <w:b/>
+          <w:bCs/>
+          <w:sz w:val="28"/>
+          <w:szCs w:val="28"/>
+          <w:u w:val="single"/>
+        </w:rPr>
+        <w:t>2️</w:t>
+      </w:r>
+      <w:r>
+        <w:rPr>
+          <w:rFonts w:ascii="Tahoma" w:hAnsi="Tahoma" w:cs="Tahoma"/>
+          <w:b/>
+          <w:bCs/>
+          <w:sz w:val="28"/>
+          <w:szCs w:val="28"/>
+          <w:u w:val="single"/>
+        </w:rPr>
+        <w:t xml:space="preserve">) </w:t>
+      </w:r>
+      <w:r>
+        <w:rPr>
+          <w:rFonts w:cstheme="minorHAnsi"/>
+          <w:b/>
+          <w:bCs/>
+          <w:sz w:val="28"/>
+          <w:szCs w:val="28"/>
+          <w:u w:val="single"/>
+        </w:rPr>
+        <w:t>¿Hay datos suficientes?</w:t>
+      </w:r>
+    </w:p>
+    <w:p>
+      <w:r>
+        <w:t>Muchos proyectos fallan acá.</w:t>
+      </w:r>
+    </w:p>
+    <w:p>
+      <w:r>
+        <w:t>Ejemplo:</w:t>
+      </w:r>
+    </w:p>
+    <w:p>
+      <w:r>
+        <w:t>“Queremos predecir ventas”</w:t>
+      </w:r>
+    </w:p>
+    <w:p>
+      <w:r>
+        <w:t>Pero tienen:</w:t>
+      </w:r>
+    </w:p>
+    <w:p>
+      <w:pPr>
+        <w:numPr>
+          <w:ilvl w:val="0"/>
+          <w:numId w:val="17"/>
+        </w:numPr>
+      </w:pPr>
+      <w:r>
+        <w:t>20 registros</w:t>
+      </w:r>
+    </w:p>
+    <w:p>
+      <w:pPr>
+        <w:numPr>
+          <w:ilvl w:val="0"/>
+          <w:numId w:val="17"/>
+        </w:numPr>
+      </w:pPr>
+      <w:r>
+        <w:t>datos incompletos</w:t>
+      </w:r>
+    </w:p>
+    <w:p>
+      <w:r>
+        <w:t xml:space="preserve">IA necesita </w:t>
+      </w:r>
+      <w:r>
+        <w:rPr>
+          <w:b/>
+          <w:bCs/>
+        </w:rPr>
+        <w:t>datos suficientes y confiables</w:t>
+      </w:r>
+      <w:r>
+        <w:t>.</w:t>
+      </w:r>
+    </w:p>
+    <w:p>
+      <w:r>
+        <w:pict w14:anchorId="54B674AF">
+          <v:rect id="_x0000_i1133" style="width:0;height:1.5pt" o:hralign="center" o:hrstd="t" o:hr="t" fillcolor="#a0a0a0" stroked="f"/>
+        </w:pict>
+      </w:r>
+    </w:p>
+    <w:p>
+      <w:pPr>
+        <w:rPr>
+          <w:rFonts w:cstheme="minorHAnsi"/>
+          <w:b/>
+          <w:bCs/>
+          <w:sz w:val="28"/>
+          <w:szCs w:val="28"/>
+          <w:u w:val="single"/>
+        </w:rPr>
+      </w:pPr>
+      <w:r>
+        <w:rPr>
+          <w:rFonts w:cstheme="minorHAnsi"/>
+          <w:b/>
+          <w:bCs/>
+          <w:sz w:val="28"/>
+          <w:szCs w:val="28"/>
+          <w:u w:val="single"/>
+        </w:rPr>
+        <w:t>3️</w:t>
+      </w:r>
+      <w:r>
+        <w:rPr>
+          <w:rFonts w:cstheme="minorHAnsi"/>
+          <w:b/>
+          <w:bCs/>
+          <w:sz w:val="28"/>
+          <w:szCs w:val="28"/>
+          <w:u w:val="single"/>
+        </w:rPr>
+        <w:t>) ¿</w:t>
+      </w:r>
+      <w:r>
+        <w:rPr>
+          <w:rFonts w:cstheme="minorHAnsi"/>
+          <w:b/>
+          <w:bCs/>
+          <w:sz w:val="28"/>
+          <w:szCs w:val="28"/>
+          <w:u w:val="single"/>
+        </w:rPr>
+        <w:t>La tarea se repite muchas veces?</w:t>
+      </w:r>
+    </w:p>
+    <w:p>
+      <w:r>
+        <w:t xml:space="preserve">IA tiene sentido cuando algo se hace </w:t>
+      </w:r>
+      <w:r>
+        <w:rPr>
+          <w:b/>
+          <w:bCs/>
+        </w:rPr>
+        <w:t>muchísimas veces</w:t>
+      </w:r>
+      <w:r>
+        <w:t>.</w:t>
+      </w:r>
+    </w:p>
+    <w:p>
+      <w:r>
+        <w:t>Ejemplo bueno:</w:t>
+      </w:r>
+    </w:p>
+    <w:p>
+      <w:pPr>
+        <w:numPr>
+          <w:ilvl w:val="0"/>
+          <w:numId w:val="18"/>
+        </w:numPr>
+      </w:pPr>
+      <w:r>
+        <w:t>analizar miles de CV</w:t>
+      </w:r>
+    </w:p>
+    <w:p>
+      <w:pPr>
+        <w:numPr>
+          <w:ilvl w:val="0"/>
+          <w:numId w:val="18"/>
+        </w:numPr>
+      </w:pPr>
+      <w:r>
+        <w:lastRenderedPageBreak/>
+        <w:t>revisar miles de tickets</w:t>
+      </w:r>
+    </w:p>
+    <w:p>
+      <w:r>
+        <w:t>Ejemplo malo:</w:t>
+      </w:r>
+    </w:p>
+    <w:p>
+      <w:pPr>
+        <w:numPr>
+          <w:ilvl w:val="0"/>
+          <w:numId w:val="19"/>
+        </w:numPr>
+      </w:pPr>
+      <w:r>
+        <w:t>analizar 3 contratos por mes</w:t>
+      </w:r>
+    </w:p>
+    <w:p>
+      <w:r>
+        <w:pict w14:anchorId="76A74127">
+          <v:rect id="_x0000_i1134" style="width:0;height:1.5pt" o:hralign="center" o:hrstd="t" o:hr="t" fillcolor="#a0a0a0" stroked="f"/>
+        </w:pict>
+      </w:r>
+    </w:p>
+    <w:p>
+      <w:pPr>
+        <w:rPr>
+          <w:rFonts w:cstheme="minorHAnsi"/>
+          <w:b/>
+          <w:bCs/>
+          <w:sz w:val="28"/>
+          <w:szCs w:val="28"/>
+          <w:u w:val="single"/>
+        </w:rPr>
+      </w:pPr>
+      <w:r>
+        <w:rPr>
+          <w:rFonts w:cstheme="minorHAnsi"/>
+          <w:b/>
+          <w:bCs/>
+          <w:sz w:val="28"/>
+          <w:szCs w:val="28"/>
+          <w:u w:val="single"/>
+        </w:rPr>
+        <w:t>4️</w:t>
+      </w:r>
+      <w:r>
+        <w:rPr>
+          <w:rFonts w:cstheme="minorHAnsi"/>
+          <w:b/>
+          <w:bCs/>
+          <w:sz w:val="28"/>
+          <w:szCs w:val="28"/>
+          <w:u w:val="single"/>
+        </w:rPr>
+        <w:t xml:space="preserve">) </w:t>
+      </w:r>
+      <w:r>
+        <w:rPr>
+          <w:rFonts w:cstheme="minorHAnsi"/>
+          <w:b/>
+          <w:bCs/>
+          <w:sz w:val="28"/>
+          <w:szCs w:val="28"/>
+          <w:u w:val="single"/>
+        </w:rPr>
+        <w:t>¿Se puede evaluar el resultado?</w:t>
+      </w:r>
+    </w:p>
+    <w:p>
+      <w:r>
+        <w:t xml:space="preserve">Si no </w:t>
+      </w:r>
+      <w:proofErr w:type="spellStart"/>
+      <w:r>
+        <w:t>podés</w:t>
+      </w:r>
+      <w:proofErr w:type="spellEnd"/>
+      <w:r>
+        <w:t xml:space="preserve"> medir si funciona, el proyecto es peligroso.</w:t>
+      </w:r>
+    </w:p>
+    <w:p>
+      <w:r>
+        <w:t>Ejemplo bueno:</w:t>
+      </w:r>
+    </w:p>
+    <w:p>
+      <w:pPr>
+        <w:numPr>
+          <w:ilvl w:val="0"/>
+          <w:numId w:val="20"/>
+        </w:numPr>
+      </w:pPr>
+      <w:r>
+        <w:t>detectar fraude</w:t>
+      </w:r>
+    </w:p>
+    <w:p>
+      <w:pPr>
+        <w:numPr>
+          <w:ilvl w:val="0"/>
+          <w:numId w:val="20"/>
+        </w:numPr>
+      </w:pPr>
+      <w:r>
+        <w:t>predecir abandono</w:t>
+      </w:r>
+    </w:p>
+    <w:p>
+      <w:proofErr w:type="spellStart"/>
+      <w:r>
+        <w:t>Podés</w:t>
+      </w:r>
+      <w:proofErr w:type="spellEnd"/>
+      <w:r>
+        <w:t xml:space="preserve"> medir precisión.</w:t>
+      </w:r>
+    </w:p>
+    <w:p>
+      <w:r>
+        <w:t>Ejemplo difícil:</w:t>
+      </w:r>
+    </w:p>
+    <w:p>
+      <w:pPr>
+        <w:numPr>
+          <w:ilvl w:val="0"/>
+          <w:numId w:val="21"/>
+        </w:numPr>
+      </w:pPr>
+      <w:r>
+        <w:t>“ser creativo”</w:t>
+      </w:r>
+    </w:p>
+    <w:p>
+      <w:pPr>
+        <w:numPr>
+          <w:ilvl w:val="0"/>
+          <w:numId w:val="21"/>
+        </w:numPr>
+      </w:pPr>
+      <w:r>
+        <w:t>“dar buenas ideas”</w:t>
+      </w:r>
+    </w:p>
+    <w:p>
+      <w:r>
+        <w:pict w14:anchorId="097B5E5F">
+          <v:rect id="_x0000_i1135" style="width:0;height:1.5pt" o:hralign="center" o:hrstd="t" o:hr="t" fillcolor="#a0a0a0" stroked="f"/>
+        </w:pict>
+      </w:r>
+    </w:p>
+    <w:p>
+      <w:pPr>
+        <w:rPr>
+          <w:rFonts w:cstheme="minorHAnsi"/>
+          <w:b/>
+          <w:bCs/>
+          <w:sz w:val="28"/>
+          <w:szCs w:val="28"/>
+          <w:u w:val="single"/>
+        </w:rPr>
+      </w:pPr>
+      <w:r>
+        <w:rPr>
+          <w:rFonts w:cstheme="minorHAnsi"/>
+          <w:b/>
+          <w:bCs/>
+          <w:sz w:val="28"/>
+          <w:szCs w:val="28"/>
+          <w:u w:val="single"/>
+        </w:rPr>
+        <w:t>5️</w:t>
+      </w:r>
+      <w:r>
+        <w:rPr>
+          <w:rFonts w:cstheme="minorHAnsi"/>
+          <w:b/>
+          <w:bCs/>
+          <w:sz w:val="28"/>
+          <w:szCs w:val="28"/>
+          <w:u w:val="single"/>
+        </w:rPr>
+        <w:t xml:space="preserve">) </w:t>
+      </w:r>
+      <w:r>
+        <w:rPr>
+          <w:rFonts w:cstheme="minorHAnsi"/>
+          <w:b/>
+          <w:bCs/>
+          <w:sz w:val="28"/>
+          <w:szCs w:val="28"/>
+          <w:u w:val="single"/>
+        </w:rPr>
+        <w:t>¿IA es realmente necesaria?</w:t>
+      </w:r>
+    </w:p>
+    <w:p>
+      <w:r>
+        <w:t>Muchas veces una solución simple alcanza.</w:t>
+      </w:r>
+    </w:p>
+    <w:p>
+      <w:r>
+        <w:t>Ejemplo:</w:t>
+      </w:r>
+    </w:p>
+    <w:p>
+      <w:r>
+        <w:t>Problema:</w:t>
+      </w:r>
+      <w:r>
+        <w:br/>
+        <w:t>clasificar 10 tipos de ticket</w:t>
+      </w:r>
+    </w:p>
+    <w:p>
+      <w:r>
+        <w:t>Solución:</w:t>
+      </w:r>
+    </w:p>
+    <w:p>
+      <w:r>
+        <w:t>reglas simples</w:t>
+      </w:r>
+    </w:p>
+    <w:p>
+      <w:r>
+        <w:t xml:space="preserve">No </w:t>
+      </w:r>
+      <w:proofErr w:type="spellStart"/>
+      <w:r>
+        <w:t>necesitás</w:t>
+      </w:r>
+      <w:proofErr w:type="spellEnd"/>
+      <w:r>
+        <w:t xml:space="preserve"> IA.</w:t>
+      </w:r>
+    </w:p>
+    <w:p>
+      <w:r>
+        <w:pict w14:anchorId="5CE016E3">
+          <v:rect id="_x0000_i1136" style="width:0;height:1.5pt" o:hralign="center" o:hrstd="t" o:hr="t" fillcolor="#a0a0a0" stroked="f"/>
+        </w:pict>
+      </w:r>
+    </w:p>
+    <w:p>
+      <w:pPr>
+        <w:rPr>
+          <w:rFonts w:cstheme="minorHAnsi"/>
+          <w:b/>
+          <w:bCs/>
+          <w:sz w:val="28"/>
+          <w:szCs w:val="28"/>
+          <w:u w:val="single"/>
+        </w:rPr>
+      </w:pPr>
+      <w:r>
+        <w:rPr>
+          <w:rFonts w:ascii="Segoe UI Emoji" w:hAnsi="Segoe UI Emoji" w:cs="Segoe UI Emoji"/>
+          <w:b/>
+          <w:bCs/>
+          <w:sz w:val="28"/>
+          <w:szCs w:val="28"/>
+          <w:u w:val="single"/>
+        </w:rPr>
+        <w:t>📌</w:t>
+      </w:r>
+      <w:r>
+        <w:rPr>
+          <w:rFonts w:cstheme="minorHAnsi"/>
+          <w:b/>
+          <w:bCs/>
+          <w:sz w:val="28"/>
+          <w:szCs w:val="28"/>
+          <w:u w:val="single"/>
+        </w:rPr>
+        <w:t xml:space="preserve"> Regla final</w:t>
+      </w:r>
+    </w:p>
+    <w:p>
+      <w:r>
+        <w:t xml:space="preserve">La mejor IA es la que </w:t>
+      </w:r>
+      <w:r>
+        <w:rPr>
+          <w:b/>
+          <w:bCs/>
+        </w:rPr>
+        <w:t>realmente resuelve un problema real</w:t>
+      </w:r>
+      <w:r>
+        <w:t>.</w:t>
+      </w:r>
+    </w:p>
+    <w:p/>
+    <w:p>
+      <w:pPr>
+        <w:rPr>
+          <w:b/>
+          <w:bCs/>
+          <w:sz w:val="28"/>
+          <w:szCs w:val="28"/>
+          <w:u w:val="single"/>
+        </w:rPr>
+      </w:pPr>
+      <w:r>
+        <w:rPr>
+          <w:b/>
+          <w:bCs/>
+          <w:sz w:val="28"/>
+          <w:szCs w:val="28"/>
+          <w:u w:val="single"/>
+        </w:rPr>
+        <w:t>Mini ejercicio</w:t>
+      </w:r>
+    </w:p>
+    <w:p>
+      <w:r>
+        <w:t>Te doy una idea:</w:t>
+      </w:r>
+    </w:p>
+    <w:p>
+      <w:r>
+        <w:t>“Una app que usa IA para recomendar qué ropa usar cada día.”</w:t>
+      </w:r>
+    </w:p>
+    <w:p>
+      <w:proofErr w:type="spellStart"/>
+      <w:r>
+        <w:t>Evaluá</w:t>
+      </w:r>
+      <w:proofErr w:type="spellEnd"/>
+      <w:r>
+        <w:t xml:space="preserve"> la idea usando las 5 preguntas.</w:t>
+      </w:r>
+    </w:p>
+    <w:p/>
+    <w:p>
+      <w:pPr>
+        <w:rPr>
+          <w:b/>
+          <w:bCs/>
+          <w:sz w:val="28"/>
+          <w:szCs w:val="28"/>
+          <w:u w:val="single"/>
+        </w:rPr>
+      </w:pPr>
+      <w:r>
+        <w:rPr>
+          <w:b/>
+          <w:bCs/>
+          <w:sz w:val="28"/>
+          <w:szCs w:val="28"/>
+          <w:u w:val="single"/>
+        </w:rPr>
+        <w:lastRenderedPageBreak/>
+        <w:t>Respuesta:</w:t>
+      </w:r>
+    </w:p>
+    <w:p>
+      <w:r>
+        <w:t>Problema →</w:t>
+      </w:r>
+      <w:r>
+        <w:t xml:space="preserve"> La verdad es que no es un problema, es un agregado o un detalle, no es algo a solucionar.</w:t>
+      </w:r>
+    </w:p>
+    <w:p>
+      <w:r>
+        <w:t>Datos →</w:t>
+      </w:r>
+      <w:r>
+        <w:t xml:space="preserve"> Seria complicado porque depende de el gusto de cada persona y en cada momento, hoy le puede gustar un tipo de ropa y mañana otra.</w:t>
+      </w:r>
+    </w:p>
+    <w:p>
+      <w:r>
+        <w:t>Frecuencia →</w:t>
+      </w:r>
+      <w:r>
+        <w:t xml:space="preserve"> Se repite una vez al día y ese es el caso que todos los días el usuario quiera preguntar como vestir, así que se utilizaría muy poco.</w:t>
+      </w:r>
+    </w:p>
+    <w:p>
+      <w:r>
+        <w:t>Evaluación →</w:t>
+      </w:r>
+      <w:r>
+        <w:t xml:space="preserve"> Muy difícil de evaluar porque es un tema más subjetivo.</w:t>
+      </w:r>
+    </w:p>
+    <w:p>
+      <w:r>
+        <w:t>¿Vale la pena? →</w:t>
+      </w:r>
+      <w:r>
+        <w:t xml:space="preserve"> No vale la pena porque no es un problema a resolver y también es difícil de evaluar</w:t>
+      </w:r>
+    </w:p>
+    <w:p/>
+    <w:p/>
+    <w:p/>
+    <w:p/>
     <w:sectPr>
       <w:pgSz w:w="11906" w:h="16838"/>
       <w:pgMar w:top="1417" w:right="1701" w:bottom="1417" w:left="1701" w:header="708" w:footer="708" w:gutter="0"/>
@@ -1071,6 +3075,304 @@
     </w:lvl>
   </w:abstractNum>
   <w:abstractNum w:abstractNumId="1" w15:restartNumberingAfterBreak="0">
+    <w:nsid w:val="08501AFC"/>
+    <w:multiLevelType w:val="multilevel"/>
+    <w:tmpl w:val="B622E10E"/>
+    <w:lvl w:ilvl="0">
+      <w:start w:val="1"/>
+      <w:numFmt w:val="bullet"/>
+      <w:lvlText w:val=""/>
+      <w:lvlJc w:val="left"/>
+      <w:pPr>
+        <w:tabs>
+          <w:tab w:val="num" w:pos="720"/>
+        </w:tabs>
+        <w:ind w:left="720" w:hanging="360"/>
+      </w:pPr>
+      <w:rPr>
+        <w:rFonts w:ascii="Symbol" w:hAnsi="Symbol" w:hint="default"/>
+        <w:sz w:val="20"/>
+      </w:rPr>
+    </w:lvl>
+    <w:lvl w:ilvl="1" w:tentative="1">
+      <w:start w:val="1"/>
+      <w:numFmt w:val="bullet"/>
+      <w:lvlText w:val="o"/>
+      <w:lvlJc w:val="left"/>
+      <w:pPr>
+        <w:tabs>
+          <w:tab w:val="num" w:pos="1440"/>
+        </w:tabs>
+        <w:ind w:left="1440" w:hanging="360"/>
+      </w:pPr>
+      <w:rPr>
+        <w:rFonts w:ascii="Courier New" w:hAnsi="Courier New" w:hint="default"/>
+        <w:sz w:val="20"/>
+      </w:rPr>
+    </w:lvl>
+    <w:lvl w:ilvl="2" w:tentative="1">
+      <w:start w:val="1"/>
+      <w:numFmt w:val="bullet"/>
+      <w:lvlText w:val=""/>
+      <w:lvlJc w:val="left"/>
+      <w:pPr>
+        <w:tabs>
+          <w:tab w:val="num" w:pos="2160"/>
+        </w:tabs>
+        <w:ind w:left="2160" w:hanging="360"/>
+      </w:pPr>
+      <w:rPr>
+        <w:rFonts w:ascii="Wingdings" w:hAnsi="Wingdings" w:hint="default"/>
+        <w:sz w:val="20"/>
+      </w:rPr>
+    </w:lvl>
+    <w:lvl w:ilvl="3" w:tentative="1">
+      <w:start w:val="1"/>
+      <w:numFmt w:val="bullet"/>
+      <w:lvlText w:val=""/>
+      <w:lvlJc w:val="left"/>
+      <w:pPr>
+        <w:tabs>
+          <w:tab w:val="num" w:pos="2880"/>
+        </w:tabs>
+        <w:ind w:left="2880" w:hanging="360"/>
+      </w:pPr>
+      <w:rPr>
+        <w:rFonts w:ascii="Wingdings" w:hAnsi="Wingdings" w:hint="default"/>
+        <w:sz w:val="20"/>
+      </w:rPr>
+    </w:lvl>
+    <w:lvl w:ilvl="4" w:tentative="1">
+      <w:start w:val="1"/>
+      <w:numFmt w:val="bullet"/>
+      <w:lvlText w:val=""/>
+      <w:lvlJc w:val="left"/>
+      <w:pPr>
+        <w:tabs>
+          <w:tab w:val="num" w:pos="3600"/>
+        </w:tabs>
+        <w:ind w:left="3600" w:hanging="360"/>
+      </w:pPr>
+      <w:rPr>
+        <w:rFonts w:ascii="Wingdings" w:hAnsi="Wingdings" w:hint="default"/>
+        <w:sz w:val="20"/>
+      </w:rPr>
+    </w:lvl>
+    <w:lvl w:ilvl="5" w:tentative="1">
+      <w:start w:val="1"/>
+      <w:numFmt w:val="bullet"/>
+      <w:lvlText w:val=""/>
+      <w:lvlJc w:val="left"/>
+      <w:pPr>
+        <w:tabs>
+          <w:tab w:val="num" w:pos="4320"/>
+        </w:tabs>
+        <w:ind w:left="4320" w:hanging="360"/>
+      </w:pPr>
+      <w:rPr>
+        <w:rFonts w:ascii="Wingdings" w:hAnsi="Wingdings" w:hint="default"/>
+        <w:sz w:val="20"/>
+      </w:rPr>
+    </w:lvl>
+    <w:lvl w:ilvl="6" w:tentative="1">
+      <w:start w:val="1"/>
+      <w:numFmt w:val="bullet"/>
+      <w:lvlText w:val=""/>
+      <w:lvlJc w:val="left"/>
+      <w:pPr>
+        <w:tabs>
+          <w:tab w:val="num" w:pos="5040"/>
+        </w:tabs>
+        <w:ind w:left="5040" w:hanging="360"/>
+      </w:pPr>
+      <w:rPr>
+        <w:rFonts w:ascii="Wingdings" w:hAnsi="Wingdings" w:hint="default"/>
+        <w:sz w:val="20"/>
+      </w:rPr>
+    </w:lvl>
+    <w:lvl w:ilvl="7" w:tentative="1">
+      <w:start w:val="1"/>
+      <w:numFmt w:val="bullet"/>
+      <w:lvlText w:val=""/>
+      <w:lvlJc w:val="left"/>
+      <w:pPr>
+        <w:tabs>
+          <w:tab w:val="num" w:pos="5760"/>
+        </w:tabs>
+        <w:ind w:left="5760" w:hanging="360"/>
+      </w:pPr>
+      <w:rPr>
+        <w:rFonts w:ascii="Wingdings" w:hAnsi="Wingdings" w:hint="default"/>
+        <w:sz w:val="20"/>
+      </w:rPr>
+    </w:lvl>
+    <w:lvl w:ilvl="8" w:tentative="1">
+      <w:start w:val="1"/>
+      <w:numFmt w:val="bullet"/>
+      <w:lvlText w:val=""/>
+      <w:lvlJc w:val="left"/>
+      <w:pPr>
+        <w:tabs>
+          <w:tab w:val="num" w:pos="6480"/>
+        </w:tabs>
+        <w:ind w:left="6480" w:hanging="360"/>
+      </w:pPr>
+      <w:rPr>
+        <w:rFonts w:ascii="Wingdings" w:hAnsi="Wingdings" w:hint="default"/>
+        <w:sz w:val="20"/>
+      </w:rPr>
+    </w:lvl>
+  </w:abstractNum>
+  <w:abstractNum w:abstractNumId="2" w15:restartNumberingAfterBreak="0">
+    <w:nsid w:val="0E017DE4"/>
+    <w:multiLevelType w:val="multilevel"/>
+    <w:tmpl w:val="E7D8C8A6"/>
+    <w:lvl w:ilvl="0">
+      <w:start w:val="1"/>
+      <w:numFmt w:val="bullet"/>
+      <w:lvlText w:val=""/>
+      <w:lvlJc w:val="left"/>
+      <w:pPr>
+        <w:tabs>
+          <w:tab w:val="num" w:pos="720"/>
+        </w:tabs>
+        <w:ind w:left="720" w:hanging="360"/>
+      </w:pPr>
+      <w:rPr>
+        <w:rFonts w:ascii="Symbol" w:hAnsi="Symbol" w:hint="default"/>
+        <w:sz w:val="20"/>
+      </w:rPr>
+    </w:lvl>
+    <w:lvl w:ilvl="1" w:tentative="1">
+      <w:start w:val="1"/>
+      <w:numFmt w:val="bullet"/>
+      <w:lvlText w:val="o"/>
+      <w:lvlJc w:val="left"/>
+      <w:pPr>
+        <w:tabs>
+          <w:tab w:val="num" w:pos="1440"/>
+        </w:tabs>
+        <w:ind w:left="1440" w:hanging="360"/>
+      </w:pPr>
+      <w:rPr>
+        <w:rFonts w:ascii="Courier New" w:hAnsi="Courier New" w:hint="default"/>
+        <w:sz w:val="20"/>
+      </w:rPr>
+    </w:lvl>
+    <w:lvl w:ilvl="2" w:tentative="1">
+      <w:start w:val="1"/>
+      <w:numFmt w:val="bullet"/>
+      <w:lvlText w:val=""/>
+      <w:lvlJc w:val="left"/>
+      <w:pPr>
+        <w:tabs>
+          <w:tab w:val="num" w:pos="2160"/>
+        </w:tabs>
+        <w:ind w:left="2160" w:hanging="360"/>
+      </w:pPr>
+      <w:rPr>
+        <w:rFonts w:ascii="Wingdings" w:hAnsi="Wingdings" w:hint="default"/>
+        <w:sz w:val="20"/>
+      </w:rPr>
+    </w:lvl>
+    <w:lvl w:ilvl="3" w:tentative="1">
+      <w:start w:val="1"/>
+      <w:numFmt w:val="bullet"/>
+      <w:lvlText w:val=""/>
+      <w:lvlJc w:val="left"/>
+      <w:pPr>
+        <w:tabs>
+          <w:tab w:val="num" w:pos="2880"/>
+        </w:tabs>
+        <w:ind w:left="2880" w:hanging="360"/>
+      </w:pPr>
+      <w:rPr>
+        <w:rFonts w:ascii="Wingdings" w:hAnsi="Wingdings" w:hint="default"/>
+        <w:sz w:val="20"/>
+      </w:rPr>
+    </w:lvl>
+    <w:lvl w:ilvl="4" w:tentative="1">
+      <w:start w:val="1"/>
+      <w:numFmt w:val="bullet"/>
+      <w:lvlText w:val=""/>
+      <w:lvlJc w:val="left"/>
+      <w:pPr>
+        <w:tabs>
+          <w:tab w:val="num" w:pos="3600"/>
+        </w:tabs>
+        <w:ind w:left="3600" w:hanging="360"/>
+      </w:pPr>
+      <w:rPr>
+        <w:rFonts w:ascii="Wingdings" w:hAnsi="Wingdings" w:hint="default"/>
+        <w:sz w:val="20"/>
+      </w:rPr>
+    </w:lvl>
+    <w:lvl w:ilvl="5" w:tentative="1">
+      <w:start w:val="1"/>
+      <w:numFmt w:val="bullet"/>
+      <w:lvlText w:val=""/>
+      <w:lvlJc w:val="left"/>
+      <w:pPr>
+        <w:tabs>
+          <w:tab w:val="num" w:pos="4320"/>
+        </w:tabs>
+        <w:ind w:left="4320" w:hanging="360"/>
+      </w:pPr>
+      <w:rPr>
+        <w:rFonts w:ascii="Wingdings" w:hAnsi="Wingdings" w:hint="default"/>
+        <w:sz w:val="20"/>
+      </w:rPr>
+    </w:lvl>
+    <w:lvl w:ilvl="6" w:tentative="1">
+      <w:start w:val="1"/>
+      <w:numFmt w:val="bullet"/>
+      <w:lvlText w:val=""/>
+      <w:lvlJc w:val="left"/>
+      <w:pPr>
+        <w:tabs>
+          <w:tab w:val="num" w:pos="5040"/>
+        </w:tabs>
+        <w:ind w:left="5040" w:hanging="360"/>
+      </w:pPr>
+      <w:rPr>
+        <w:rFonts w:ascii="Wingdings" w:hAnsi="Wingdings" w:hint="default"/>
+        <w:sz w:val="20"/>
+      </w:rPr>
+    </w:lvl>
+    <w:lvl w:ilvl="7" w:tentative="1">
+      <w:start w:val="1"/>
+      <w:numFmt w:val="bullet"/>
+      <w:lvlText w:val=""/>
+      <w:lvlJc w:val="left"/>
+      <w:pPr>
+        <w:tabs>
+          <w:tab w:val="num" w:pos="5760"/>
+        </w:tabs>
+        <w:ind w:left="5760" w:hanging="360"/>
+      </w:pPr>
+      <w:rPr>
+        <w:rFonts w:ascii="Wingdings" w:hAnsi="Wingdings" w:hint="default"/>
+        <w:sz w:val="20"/>
+      </w:rPr>
+    </w:lvl>
+    <w:lvl w:ilvl="8" w:tentative="1">
+      <w:start w:val="1"/>
+      <w:numFmt w:val="bullet"/>
+      <w:lvlText w:val=""/>
+      <w:lvlJc w:val="left"/>
+      <w:pPr>
+        <w:tabs>
+          <w:tab w:val="num" w:pos="6480"/>
+        </w:tabs>
+        <w:ind w:left="6480" w:hanging="360"/>
+      </w:pPr>
+      <w:rPr>
+        <w:rFonts w:ascii="Wingdings" w:hAnsi="Wingdings" w:hint="default"/>
+        <w:sz w:val="20"/>
+      </w:rPr>
+    </w:lvl>
+  </w:abstractNum>
+  <w:abstractNum w:abstractNumId="3" w15:restartNumberingAfterBreak="0">
     <w:nsid w:val="14CD2F19"/>
     <w:multiLevelType w:val="multilevel"/>
     <w:tmpl w:val="035EAAB4"/>
@@ -1219,7 +3521,305 @@
       </w:rPr>
     </w:lvl>
   </w:abstractNum>
-  <w:abstractNum w:abstractNumId="2" w15:restartNumberingAfterBreak="0">
+  <w:abstractNum w:abstractNumId="4" w15:restartNumberingAfterBreak="0">
+    <w:nsid w:val="168C1C14"/>
+    <w:multiLevelType w:val="multilevel"/>
+    <w:tmpl w:val="DE145FA8"/>
+    <w:lvl w:ilvl="0">
+      <w:start w:val="1"/>
+      <w:numFmt w:val="bullet"/>
+      <w:lvlText w:val=""/>
+      <w:lvlJc w:val="left"/>
+      <w:pPr>
+        <w:tabs>
+          <w:tab w:val="num" w:pos="720"/>
+        </w:tabs>
+        <w:ind w:left="720" w:hanging="360"/>
+      </w:pPr>
+      <w:rPr>
+        <w:rFonts w:ascii="Symbol" w:hAnsi="Symbol" w:hint="default"/>
+        <w:sz w:val="20"/>
+      </w:rPr>
+    </w:lvl>
+    <w:lvl w:ilvl="1" w:tentative="1">
+      <w:start w:val="1"/>
+      <w:numFmt w:val="bullet"/>
+      <w:lvlText w:val="o"/>
+      <w:lvlJc w:val="left"/>
+      <w:pPr>
+        <w:tabs>
+          <w:tab w:val="num" w:pos="1440"/>
+        </w:tabs>
+        <w:ind w:left="1440" w:hanging="360"/>
+      </w:pPr>
+      <w:rPr>
+        <w:rFonts w:ascii="Courier New" w:hAnsi="Courier New" w:hint="default"/>
+        <w:sz w:val="20"/>
+      </w:rPr>
+    </w:lvl>
+    <w:lvl w:ilvl="2" w:tentative="1">
+      <w:start w:val="1"/>
+      <w:numFmt w:val="bullet"/>
+      <w:lvlText w:val=""/>
+      <w:lvlJc w:val="left"/>
+      <w:pPr>
+        <w:tabs>
+          <w:tab w:val="num" w:pos="2160"/>
+        </w:tabs>
+        <w:ind w:left="2160" w:hanging="360"/>
+      </w:pPr>
+      <w:rPr>
+        <w:rFonts w:ascii="Wingdings" w:hAnsi="Wingdings" w:hint="default"/>
+        <w:sz w:val="20"/>
+      </w:rPr>
+    </w:lvl>
+    <w:lvl w:ilvl="3" w:tentative="1">
+      <w:start w:val="1"/>
+      <w:numFmt w:val="bullet"/>
+      <w:lvlText w:val=""/>
+      <w:lvlJc w:val="left"/>
+      <w:pPr>
+        <w:tabs>
+          <w:tab w:val="num" w:pos="2880"/>
+        </w:tabs>
+        <w:ind w:left="2880" w:hanging="360"/>
+      </w:pPr>
+      <w:rPr>
+        <w:rFonts w:ascii="Wingdings" w:hAnsi="Wingdings" w:hint="default"/>
+        <w:sz w:val="20"/>
+      </w:rPr>
+    </w:lvl>
+    <w:lvl w:ilvl="4" w:tentative="1">
+      <w:start w:val="1"/>
+      <w:numFmt w:val="bullet"/>
+      <w:lvlText w:val=""/>
+      <w:lvlJc w:val="left"/>
+      <w:pPr>
+        <w:tabs>
+          <w:tab w:val="num" w:pos="3600"/>
+        </w:tabs>
+        <w:ind w:left="3600" w:hanging="360"/>
+      </w:pPr>
+      <w:rPr>
+        <w:rFonts w:ascii="Wingdings" w:hAnsi="Wingdings" w:hint="default"/>
+        <w:sz w:val="20"/>
+      </w:rPr>
+    </w:lvl>
+    <w:lvl w:ilvl="5" w:tentative="1">
+      <w:start w:val="1"/>
+      <w:numFmt w:val="bullet"/>
+      <w:lvlText w:val=""/>
+      <w:lvlJc w:val="left"/>
+      <w:pPr>
+        <w:tabs>
+          <w:tab w:val="num" w:pos="4320"/>
+        </w:tabs>
+        <w:ind w:left="4320" w:hanging="360"/>
+      </w:pPr>
+      <w:rPr>
+        <w:rFonts w:ascii="Wingdings" w:hAnsi="Wingdings" w:hint="default"/>
+        <w:sz w:val="20"/>
+      </w:rPr>
+    </w:lvl>
+    <w:lvl w:ilvl="6" w:tentative="1">
+      <w:start w:val="1"/>
+      <w:numFmt w:val="bullet"/>
+      <w:lvlText w:val=""/>
+      <w:lvlJc w:val="left"/>
+      <w:pPr>
+        <w:tabs>
+          <w:tab w:val="num" w:pos="5040"/>
+        </w:tabs>
+        <w:ind w:left="5040" w:hanging="360"/>
+      </w:pPr>
+      <w:rPr>
+        <w:rFonts w:ascii="Wingdings" w:hAnsi="Wingdings" w:hint="default"/>
+        <w:sz w:val="20"/>
+      </w:rPr>
+    </w:lvl>
+    <w:lvl w:ilvl="7" w:tentative="1">
+      <w:start w:val="1"/>
+      <w:numFmt w:val="bullet"/>
+      <w:lvlText w:val=""/>
+      <w:lvlJc w:val="left"/>
+      <w:pPr>
+        <w:tabs>
+          <w:tab w:val="num" w:pos="5760"/>
+        </w:tabs>
+        <w:ind w:left="5760" w:hanging="360"/>
+      </w:pPr>
+      <w:rPr>
+        <w:rFonts w:ascii="Wingdings" w:hAnsi="Wingdings" w:hint="default"/>
+        <w:sz w:val="20"/>
+      </w:rPr>
+    </w:lvl>
+    <w:lvl w:ilvl="8" w:tentative="1">
+      <w:start w:val="1"/>
+      <w:numFmt w:val="bullet"/>
+      <w:lvlText w:val=""/>
+      <w:lvlJc w:val="left"/>
+      <w:pPr>
+        <w:tabs>
+          <w:tab w:val="num" w:pos="6480"/>
+        </w:tabs>
+        <w:ind w:left="6480" w:hanging="360"/>
+      </w:pPr>
+      <w:rPr>
+        <w:rFonts w:ascii="Wingdings" w:hAnsi="Wingdings" w:hint="default"/>
+        <w:sz w:val="20"/>
+      </w:rPr>
+    </w:lvl>
+  </w:abstractNum>
+  <w:abstractNum w:abstractNumId="5" w15:restartNumberingAfterBreak="0">
+    <w:nsid w:val="1E62487A"/>
+    <w:multiLevelType w:val="multilevel"/>
+    <w:tmpl w:val="89003A2C"/>
+    <w:lvl w:ilvl="0">
+      <w:start w:val="1"/>
+      <w:numFmt w:val="bullet"/>
+      <w:lvlText w:val=""/>
+      <w:lvlJc w:val="left"/>
+      <w:pPr>
+        <w:tabs>
+          <w:tab w:val="num" w:pos="720"/>
+        </w:tabs>
+        <w:ind w:left="720" w:hanging="360"/>
+      </w:pPr>
+      <w:rPr>
+        <w:rFonts w:ascii="Symbol" w:hAnsi="Symbol" w:hint="default"/>
+        <w:sz w:val="20"/>
+      </w:rPr>
+    </w:lvl>
+    <w:lvl w:ilvl="1" w:tentative="1">
+      <w:start w:val="1"/>
+      <w:numFmt w:val="bullet"/>
+      <w:lvlText w:val="o"/>
+      <w:lvlJc w:val="left"/>
+      <w:pPr>
+        <w:tabs>
+          <w:tab w:val="num" w:pos="1440"/>
+        </w:tabs>
+        <w:ind w:left="1440" w:hanging="360"/>
+      </w:pPr>
+      <w:rPr>
+        <w:rFonts w:ascii="Courier New" w:hAnsi="Courier New" w:hint="default"/>
+        <w:sz w:val="20"/>
+      </w:rPr>
+    </w:lvl>
+    <w:lvl w:ilvl="2" w:tentative="1">
+      <w:start w:val="1"/>
+      <w:numFmt w:val="bullet"/>
+      <w:lvlText w:val=""/>
+      <w:lvlJc w:val="left"/>
+      <w:pPr>
+        <w:tabs>
+          <w:tab w:val="num" w:pos="2160"/>
+        </w:tabs>
+        <w:ind w:left="2160" w:hanging="360"/>
+      </w:pPr>
+      <w:rPr>
+        <w:rFonts w:ascii="Wingdings" w:hAnsi="Wingdings" w:hint="default"/>
+        <w:sz w:val="20"/>
+      </w:rPr>
+    </w:lvl>
+    <w:lvl w:ilvl="3" w:tentative="1">
+      <w:start w:val="1"/>
+      <w:numFmt w:val="bullet"/>
+      <w:lvlText w:val=""/>
+      <w:lvlJc w:val="left"/>
+      <w:pPr>
+        <w:tabs>
+          <w:tab w:val="num" w:pos="2880"/>
+        </w:tabs>
+        <w:ind w:left="2880" w:hanging="360"/>
+      </w:pPr>
+      <w:rPr>
+        <w:rFonts w:ascii="Wingdings" w:hAnsi="Wingdings" w:hint="default"/>
+        <w:sz w:val="20"/>
+      </w:rPr>
+    </w:lvl>
+    <w:lvl w:ilvl="4" w:tentative="1">
+      <w:start w:val="1"/>
+      <w:numFmt w:val="bullet"/>
+      <w:lvlText w:val=""/>
+      <w:lvlJc w:val="left"/>
+      <w:pPr>
+        <w:tabs>
+          <w:tab w:val="num" w:pos="3600"/>
+        </w:tabs>
+        <w:ind w:left="3600" w:hanging="360"/>
+      </w:pPr>
+      <w:rPr>
+        <w:rFonts w:ascii="Wingdings" w:hAnsi="Wingdings" w:hint="default"/>
+        <w:sz w:val="20"/>
+      </w:rPr>
+    </w:lvl>
+    <w:lvl w:ilvl="5" w:tentative="1">
+      <w:start w:val="1"/>
+      <w:numFmt w:val="bullet"/>
+      <w:lvlText w:val=""/>
+      <w:lvlJc w:val="left"/>
+      <w:pPr>
+        <w:tabs>
+          <w:tab w:val="num" w:pos="4320"/>
+        </w:tabs>
+        <w:ind w:left="4320" w:hanging="360"/>
+      </w:pPr>
+      <w:rPr>
+        <w:rFonts w:ascii="Wingdings" w:hAnsi="Wingdings" w:hint="default"/>
+        <w:sz w:val="20"/>
+      </w:rPr>
+    </w:lvl>
+    <w:lvl w:ilvl="6" w:tentative="1">
+      <w:start w:val="1"/>
+      <w:numFmt w:val="bullet"/>
+      <w:lvlText w:val=""/>
+      <w:lvlJc w:val="left"/>
+      <w:pPr>
+        <w:tabs>
+          <w:tab w:val="num" w:pos="5040"/>
+        </w:tabs>
+        <w:ind w:left="5040" w:hanging="360"/>
+      </w:pPr>
+      <w:rPr>
+        <w:rFonts w:ascii="Wingdings" w:hAnsi="Wingdings" w:hint="default"/>
+        <w:sz w:val="20"/>
+      </w:rPr>
+    </w:lvl>
+    <w:lvl w:ilvl="7" w:tentative="1">
+      <w:start w:val="1"/>
+      <w:numFmt w:val="bullet"/>
+      <w:lvlText w:val=""/>
+      <w:lvlJc w:val="left"/>
+      <w:pPr>
+        <w:tabs>
+          <w:tab w:val="num" w:pos="5760"/>
+        </w:tabs>
+        <w:ind w:left="5760" w:hanging="360"/>
+      </w:pPr>
+      <w:rPr>
+        <w:rFonts w:ascii="Wingdings" w:hAnsi="Wingdings" w:hint="default"/>
+        <w:sz w:val="20"/>
+      </w:rPr>
+    </w:lvl>
+    <w:lvl w:ilvl="8" w:tentative="1">
+      <w:start w:val="1"/>
+      <w:numFmt w:val="bullet"/>
+      <w:lvlText w:val=""/>
+      <w:lvlJc w:val="left"/>
+      <w:pPr>
+        <w:tabs>
+          <w:tab w:val="num" w:pos="6480"/>
+        </w:tabs>
+        <w:ind w:left="6480" w:hanging="360"/>
+      </w:pPr>
+      <w:rPr>
+        <w:rFonts w:ascii="Wingdings" w:hAnsi="Wingdings" w:hint="default"/>
+        <w:sz w:val="20"/>
+      </w:rPr>
+    </w:lvl>
+  </w:abstractNum>
+  <w:abstractNum w:abstractNumId="6" w15:restartNumberingAfterBreak="0">
     <w:nsid w:val="23B50855"/>
     <w:multiLevelType w:val="multilevel"/>
     <w:tmpl w:val="B6E64CE6"/>
@@ -1368,7 +3968,156 @@
       </w:rPr>
     </w:lvl>
   </w:abstractNum>
-  <w:abstractNum w:abstractNumId="3" w15:restartNumberingAfterBreak="0">
+  <w:abstractNum w:abstractNumId="7" w15:restartNumberingAfterBreak="0">
+    <w:nsid w:val="24DC500A"/>
+    <w:multiLevelType w:val="multilevel"/>
+    <w:tmpl w:val="A5D4323C"/>
+    <w:lvl w:ilvl="0">
+      <w:start w:val="1"/>
+      <w:numFmt w:val="bullet"/>
+      <w:lvlText w:val=""/>
+      <w:lvlJc w:val="left"/>
+      <w:pPr>
+        <w:tabs>
+          <w:tab w:val="num" w:pos="720"/>
+        </w:tabs>
+        <w:ind w:left="720" w:hanging="360"/>
+      </w:pPr>
+      <w:rPr>
+        <w:rFonts w:ascii="Symbol" w:hAnsi="Symbol" w:hint="default"/>
+        <w:sz w:val="20"/>
+      </w:rPr>
+    </w:lvl>
+    <w:lvl w:ilvl="1" w:tentative="1">
+      <w:start w:val="1"/>
+      <w:numFmt w:val="bullet"/>
+      <w:lvlText w:val="o"/>
+      <w:lvlJc w:val="left"/>
+      <w:pPr>
+        <w:tabs>
+          <w:tab w:val="num" w:pos="1440"/>
+        </w:tabs>
+        <w:ind w:left="1440" w:hanging="360"/>
+      </w:pPr>
+      <w:rPr>
+        <w:rFonts w:ascii="Courier New" w:hAnsi="Courier New" w:hint="default"/>
+        <w:sz w:val="20"/>
+      </w:rPr>
+    </w:lvl>
+    <w:lvl w:ilvl="2" w:tentative="1">
+      <w:start w:val="1"/>
+      <w:numFmt w:val="bullet"/>
+      <w:lvlText w:val=""/>
+      <w:lvlJc w:val="left"/>
+      <w:pPr>
+        <w:tabs>
+          <w:tab w:val="num" w:pos="2160"/>
+        </w:tabs>
+        <w:ind w:left="2160" w:hanging="360"/>
+      </w:pPr>
+      <w:rPr>
+        <w:rFonts w:ascii="Wingdings" w:hAnsi="Wingdings" w:hint="default"/>
+        <w:sz w:val="20"/>
+      </w:rPr>
+    </w:lvl>
+    <w:lvl w:ilvl="3" w:tentative="1">
+      <w:start w:val="1"/>
+      <w:numFmt w:val="bullet"/>
+      <w:lvlText w:val=""/>
+      <w:lvlJc w:val="left"/>
+      <w:pPr>
+        <w:tabs>
+          <w:tab w:val="num" w:pos="2880"/>
+        </w:tabs>
+        <w:ind w:left="2880" w:hanging="360"/>
+      </w:pPr>
+      <w:rPr>
+        <w:rFonts w:ascii="Wingdings" w:hAnsi="Wingdings" w:hint="default"/>
+        <w:sz w:val="20"/>
+      </w:rPr>
+    </w:lvl>
+    <w:lvl w:ilvl="4" w:tentative="1">
+      <w:start w:val="1"/>
+      <w:numFmt w:val="bullet"/>
+      <w:lvlText w:val=""/>
+      <w:lvlJc w:val="left"/>
+      <w:pPr>
+        <w:tabs>
+          <w:tab w:val="num" w:pos="3600"/>
+        </w:tabs>
+        <w:ind w:left="3600" w:hanging="360"/>
+      </w:pPr>
+      <w:rPr>
+        <w:rFonts w:ascii="Wingdings" w:hAnsi="Wingdings" w:hint="default"/>
+        <w:sz w:val="20"/>
+      </w:rPr>
+    </w:lvl>
+    <w:lvl w:ilvl="5" w:tentative="1">
+      <w:start w:val="1"/>
+      <w:numFmt w:val="bullet"/>
+      <w:lvlText w:val=""/>
+      <w:lvlJc w:val="left"/>
+      <w:pPr>
+        <w:tabs>
+          <w:tab w:val="num" w:pos="4320"/>
+        </w:tabs>
+        <w:ind w:left="4320" w:hanging="360"/>
+      </w:pPr>
+      <w:rPr>
+        <w:rFonts w:ascii="Wingdings" w:hAnsi="Wingdings" w:hint="default"/>
+        <w:sz w:val="20"/>
+      </w:rPr>
+    </w:lvl>
+    <w:lvl w:ilvl="6" w:tentative="1">
+      <w:start w:val="1"/>
+      <w:numFmt w:val="bullet"/>
+      <w:lvlText w:val=""/>
+      <w:lvlJc w:val="left"/>
+      <w:pPr>
+        <w:tabs>
+          <w:tab w:val="num" w:pos="5040"/>
+        </w:tabs>
+        <w:ind w:left="5040" w:hanging="360"/>
+      </w:pPr>
+      <w:rPr>
+        <w:rFonts w:ascii="Wingdings" w:hAnsi="Wingdings" w:hint="default"/>
+        <w:sz w:val="20"/>
+      </w:rPr>
+    </w:lvl>
+    <w:lvl w:ilvl="7" w:tentative="1">
+      <w:start w:val="1"/>
+      <w:numFmt w:val="bullet"/>
+      <w:lvlText w:val=""/>
+      <w:lvlJc w:val="left"/>
+      <w:pPr>
+        <w:tabs>
+          <w:tab w:val="num" w:pos="5760"/>
+        </w:tabs>
+        <w:ind w:left="5760" w:hanging="360"/>
+      </w:pPr>
+      <w:rPr>
+        <w:rFonts w:ascii="Wingdings" w:hAnsi="Wingdings" w:hint="default"/>
+        <w:sz w:val="20"/>
+      </w:rPr>
+    </w:lvl>
+    <w:lvl w:ilvl="8" w:tentative="1">
+      <w:start w:val="1"/>
+      <w:numFmt w:val="bullet"/>
+      <w:lvlText w:val=""/>
+      <w:lvlJc w:val="left"/>
+      <w:pPr>
+        <w:tabs>
+          <w:tab w:val="num" w:pos="6480"/>
+        </w:tabs>
+        <w:ind w:left="6480" w:hanging="360"/>
+      </w:pPr>
+      <w:rPr>
+        <w:rFonts w:ascii="Wingdings" w:hAnsi="Wingdings" w:hint="default"/>
+        <w:sz w:val="20"/>
+      </w:rPr>
+    </w:lvl>
+  </w:abstractNum>
+  <w:abstractNum w:abstractNumId="8" w15:restartNumberingAfterBreak="0">
     <w:nsid w:val="24F916FC"/>
     <w:multiLevelType w:val="multilevel"/>
     <w:tmpl w:val="DB32BF3E"/>
@@ -1517,7 +4266,603 @@
       </w:rPr>
     </w:lvl>
   </w:abstractNum>
-  <w:abstractNum w:abstractNumId="4" w15:restartNumberingAfterBreak="0">
+  <w:abstractNum w:abstractNumId="9" w15:restartNumberingAfterBreak="0">
+    <w:nsid w:val="2D357FD8"/>
+    <w:multiLevelType w:val="multilevel"/>
+    <w:tmpl w:val="92B840E6"/>
+    <w:lvl w:ilvl="0">
+      <w:start w:val="1"/>
+      <w:numFmt w:val="bullet"/>
+      <w:lvlText w:val=""/>
+      <w:lvlJc w:val="left"/>
+      <w:pPr>
+        <w:tabs>
+          <w:tab w:val="num" w:pos="720"/>
+        </w:tabs>
+        <w:ind w:left="720" w:hanging="360"/>
+      </w:pPr>
+      <w:rPr>
+        <w:rFonts w:ascii="Symbol" w:hAnsi="Symbol" w:hint="default"/>
+        <w:sz w:val="20"/>
+      </w:rPr>
+    </w:lvl>
+    <w:lvl w:ilvl="1" w:tentative="1">
+      <w:start w:val="1"/>
+      <w:numFmt w:val="bullet"/>
+      <w:lvlText w:val="o"/>
+      <w:lvlJc w:val="left"/>
+      <w:pPr>
+        <w:tabs>
+          <w:tab w:val="num" w:pos="1440"/>
+        </w:tabs>
+        <w:ind w:left="1440" w:hanging="360"/>
+      </w:pPr>
+      <w:rPr>
+        <w:rFonts w:ascii="Courier New" w:hAnsi="Courier New" w:hint="default"/>
+        <w:sz w:val="20"/>
+      </w:rPr>
+    </w:lvl>
+    <w:lvl w:ilvl="2" w:tentative="1">
+      <w:start w:val="1"/>
+      <w:numFmt w:val="bullet"/>
+      <w:lvlText w:val=""/>
+      <w:lvlJc w:val="left"/>
+      <w:pPr>
+        <w:tabs>
+          <w:tab w:val="num" w:pos="2160"/>
+        </w:tabs>
+        <w:ind w:left="2160" w:hanging="360"/>
+      </w:pPr>
+      <w:rPr>
+        <w:rFonts w:ascii="Wingdings" w:hAnsi="Wingdings" w:hint="default"/>
+        <w:sz w:val="20"/>
+      </w:rPr>
+    </w:lvl>
+    <w:lvl w:ilvl="3" w:tentative="1">
+      <w:start w:val="1"/>
+      <w:numFmt w:val="bullet"/>
+      <w:lvlText w:val=""/>
+      <w:lvlJc w:val="left"/>
+      <w:pPr>
+        <w:tabs>
+          <w:tab w:val="num" w:pos="2880"/>
+        </w:tabs>
+        <w:ind w:left="2880" w:hanging="360"/>
+      </w:pPr>
+      <w:rPr>
+        <w:rFonts w:ascii="Wingdings" w:hAnsi="Wingdings" w:hint="default"/>
+        <w:sz w:val="20"/>
+      </w:rPr>
+    </w:lvl>
+    <w:lvl w:ilvl="4" w:tentative="1">
+      <w:start w:val="1"/>
+      <w:numFmt w:val="bullet"/>
+      <w:lvlText w:val=""/>
+      <w:lvlJc w:val="left"/>
+      <w:pPr>
+        <w:tabs>
+          <w:tab w:val="num" w:pos="3600"/>
+        </w:tabs>
+        <w:ind w:left="3600" w:hanging="360"/>
+      </w:pPr>
+      <w:rPr>
+        <w:rFonts w:ascii="Wingdings" w:hAnsi="Wingdings" w:hint="default"/>
+        <w:sz w:val="20"/>
+      </w:rPr>
+    </w:lvl>
+    <w:lvl w:ilvl="5" w:tentative="1">
+      <w:start w:val="1"/>
+      <w:numFmt w:val="bullet"/>
+      <w:lvlText w:val=""/>
+      <w:lvlJc w:val="left"/>
+      <w:pPr>
+        <w:tabs>
+          <w:tab w:val="num" w:pos="4320"/>
+        </w:tabs>
+        <w:ind w:left="4320" w:hanging="360"/>
+      </w:pPr>
+      <w:rPr>
+        <w:rFonts w:ascii="Wingdings" w:hAnsi="Wingdings" w:hint="default"/>
+        <w:sz w:val="20"/>
+      </w:rPr>
+    </w:lvl>
+    <w:lvl w:ilvl="6" w:tentative="1">
+      <w:start w:val="1"/>
+      <w:numFmt w:val="bullet"/>
+      <w:lvlText w:val=""/>
+      <w:lvlJc w:val="left"/>
+      <w:pPr>
+        <w:tabs>
+          <w:tab w:val="num" w:pos="5040"/>
+        </w:tabs>
+        <w:ind w:left="5040" w:hanging="360"/>
+      </w:pPr>
+      <w:rPr>
+        <w:rFonts w:ascii="Wingdings" w:hAnsi="Wingdings" w:hint="default"/>
+        <w:sz w:val="20"/>
+      </w:rPr>
+    </w:lvl>
+    <w:lvl w:ilvl="7" w:tentative="1">
+      <w:start w:val="1"/>
+      <w:numFmt w:val="bullet"/>
+      <w:lvlText w:val=""/>
+      <w:lvlJc w:val="left"/>
+      <w:pPr>
+        <w:tabs>
+          <w:tab w:val="num" w:pos="5760"/>
+        </w:tabs>
+        <w:ind w:left="5760" w:hanging="360"/>
+      </w:pPr>
+      <w:rPr>
+        <w:rFonts w:ascii="Wingdings" w:hAnsi="Wingdings" w:hint="default"/>
+        <w:sz w:val="20"/>
+      </w:rPr>
+    </w:lvl>
+    <w:lvl w:ilvl="8" w:tentative="1">
+      <w:start w:val="1"/>
+      <w:numFmt w:val="bullet"/>
+      <w:lvlText w:val=""/>
+      <w:lvlJc w:val="left"/>
+      <w:pPr>
+        <w:tabs>
+          <w:tab w:val="num" w:pos="6480"/>
+        </w:tabs>
+        <w:ind w:left="6480" w:hanging="360"/>
+      </w:pPr>
+      <w:rPr>
+        <w:rFonts w:ascii="Wingdings" w:hAnsi="Wingdings" w:hint="default"/>
+        <w:sz w:val="20"/>
+      </w:rPr>
+    </w:lvl>
+  </w:abstractNum>
+  <w:abstractNum w:abstractNumId="10" w15:restartNumberingAfterBreak="0">
+    <w:nsid w:val="2F697D3D"/>
+    <w:multiLevelType w:val="multilevel"/>
+    <w:tmpl w:val="A0FC9258"/>
+    <w:lvl w:ilvl="0">
+      <w:start w:val="1"/>
+      <w:numFmt w:val="bullet"/>
+      <w:lvlText w:val=""/>
+      <w:lvlJc w:val="left"/>
+      <w:pPr>
+        <w:tabs>
+          <w:tab w:val="num" w:pos="720"/>
+        </w:tabs>
+        <w:ind w:left="720" w:hanging="360"/>
+      </w:pPr>
+      <w:rPr>
+        <w:rFonts w:ascii="Symbol" w:hAnsi="Symbol" w:hint="default"/>
+        <w:sz w:val="20"/>
+      </w:rPr>
+    </w:lvl>
+    <w:lvl w:ilvl="1" w:tentative="1">
+      <w:start w:val="1"/>
+      <w:numFmt w:val="bullet"/>
+      <w:lvlText w:val="o"/>
+      <w:lvlJc w:val="left"/>
+      <w:pPr>
+        <w:tabs>
+          <w:tab w:val="num" w:pos="1440"/>
+        </w:tabs>
+        <w:ind w:left="1440" w:hanging="360"/>
+      </w:pPr>
+      <w:rPr>
+        <w:rFonts w:ascii="Courier New" w:hAnsi="Courier New" w:hint="default"/>
+        <w:sz w:val="20"/>
+      </w:rPr>
+    </w:lvl>
+    <w:lvl w:ilvl="2" w:tentative="1">
+      <w:start w:val="1"/>
+      <w:numFmt w:val="bullet"/>
+      <w:lvlText w:val=""/>
+      <w:lvlJc w:val="left"/>
+      <w:pPr>
+        <w:tabs>
+          <w:tab w:val="num" w:pos="2160"/>
+        </w:tabs>
+        <w:ind w:left="2160" w:hanging="360"/>
+      </w:pPr>
+      <w:rPr>
+        <w:rFonts w:ascii="Wingdings" w:hAnsi="Wingdings" w:hint="default"/>
+        <w:sz w:val="20"/>
+      </w:rPr>
+    </w:lvl>
+    <w:lvl w:ilvl="3" w:tentative="1">
+      <w:start w:val="1"/>
+      <w:numFmt w:val="bullet"/>
+      <w:lvlText w:val=""/>
+      <w:lvlJc w:val="left"/>
+      <w:pPr>
+        <w:tabs>
+          <w:tab w:val="num" w:pos="2880"/>
+        </w:tabs>
+        <w:ind w:left="2880" w:hanging="360"/>
+      </w:pPr>
+      <w:rPr>
+        <w:rFonts w:ascii="Wingdings" w:hAnsi="Wingdings" w:hint="default"/>
+        <w:sz w:val="20"/>
+      </w:rPr>
+    </w:lvl>
+    <w:lvl w:ilvl="4" w:tentative="1">
+      <w:start w:val="1"/>
+      <w:numFmt w:val="bullet"/>
+      <w:lvlText w:val=""/>
+      <w:lvlJc w:val="left"/>
+      <w:pPr>
+        <w:tabs>
+          <w:tab w:val="num" w:pos="3600"/>
+        </w:tabs>
+        <w:ind w:left="3600" w:hanging="360"/>
+      </w:pPr>
+      <w:rPr>
+        <w:rFonts w:ascii="Wingdings" w:hAnsi="Wingdings" w:hint="default"/>
+        <w:sz w:val="20"/>
+      </w:rPr>
+    </w:lvl>
+    <w:lvl w:ilvl="5" w:tentative="1">
+      <w:start w:val="1"/>
+      <w:numFmt w:val="bullet"/>
+      <w:lvlText w:val=""/>
+      <w:lvlJc w:val="left"/>
+      <w:pPr>
+        <w:tabs>
+          <w:tab w:val="num" w:pos="4320"/>
+        </w:tabs>
+        <w:ind w:left="4320" w:hanging="360"/>
+      </w:pPr>
+      <w:rPr>
+        <w:rFonts w:ascii="Wingdings" w:hAnsi="Wingdings" w:hint="default"/>
+        <w:sz w:val="20"/>
+      </w:rPr>
+    </w:lvl>
+    <w:lvl w:ilvl="6" w:tentative="1">
+      <w:start w:val="1"/>
+      <w:numFmt w:val="bullet"/>
+      <w:lvlText w:val=""/>
+      <w:lvlJc w:val="left"/>
+      <w:pPr>
+        <w:tabs>
+          <w:tab w:val="num" w:pos="5040"/>
+        </w:tabs>
+        <w:ind w:left="5040" w:hanging="360"/>
+      </w:pPr>
+      <w:rPr>
+        <w:rFonts w:ascii="Wingdings" w:hAnsi="Wingdings" w:hint="default"/>
+        <w:sz w:val="20"/>
+      </w:rPr>
+    </w:lvl>
+    <w:lvl w:ilvl="7" w:tentative="1">
+      <w:start w:val="1"/>
+      <w:numFmt w:val="bullet"/>
+      <w:lvlText w:val=""/>
+      <w:lvlJc w:val="left"/>
+      <w:pPr>
+        <w:tabs>
+          <w:tab w:val="num" w:pos="5760"/>
+        </w:tabs>
+        <w:ind w:left="5760" w:hanging="360"/>
+      </w:pPr>
+      <w:rPr>
+        <w:rFonts w:ascii="Wingdings" w:hAnsi="Wingdings" w:hint="default"/>
+        <w:sz w:val="20"/>
+      </w:rPr>
+    </w:lvl>
+    <w:lvl w:ilvl="8" w:tentative="1">
+      <w:start w:val="1"/>
+      <w:numFmt w:val="bullet"/>
+      <w:lvlText w:val=""/>
+      <w:lvlJc w:val="left"/>
+      <w:pPr>
+        <w:tabs>
+          <w:tab w:val="num" w:pos="6480"/>
+        </w:tabs>
+        <w:ind w:left="6480" w:hanging="360"/>
+      </w:pPr>
+      <w:rPr>
+        <w:rFonts w:ascii="Wingdings" w:hAnsi="Wingdings" w:hint="default"/>
+        <w:sz w:val="20"/>
+      </w:rPr>
+    </w:lvl>
+  </w:abstractNum>
+  <w:abstractNum w:abstractNumId="11" w15:restartNumberingAfterBreak="0">
+    <w:nsid w:val="337C5212"/>
+    <w:multiLevelType w:val="multilevel"/>
+    <w:tmpl w:val="8B40A606"/>
+    <w:lvl w:ilvl="0">
+      <w:start w:val="1"/>
+      <w:numFmt w:val="bullet"/>
+      <w:lvlText w:val=""/>
+      <w:lvlJc w:val="left"/>
+      <w:pPr>
+        <w:tabs>
+          <w:tab w:val="num" w:pos="720"/>
+        </w:tabs>
+        <w:ind w:left="720" w:hanging="360"/>
+      </w:pPr>
+      <w:rPr>
+        <w:rFonts w:ascii="Symbol" w:hAnsi="Symbol" w:hint="default"/>
+        <w:sz w:val="20"/>
+      </w:rPr>
+    </w:lvl>
+    <w:lvl w:ilvl="1" w:tentative="1">
+      <w:start w:val="1"/>
+      <w:numFmt w:val="bullet"/>
+      <w:lvlText w:val="o"/>
+      <w:lvlJc w:val="left"/>
+      <w:pPr>
+        <w:tabs>
+          <w:tab w:val="num" w:pos="1440"/>
+        </w:tabs>
+        <w:ind w:left="1440" w:hanging="360"/>
+      </w:pPr>
+      <w:rPr>
+        <w:rFonts w:ascii="Courier New" w:hAnsi="Courier New" w:hint="default"/>
+        <w:sz w:val="20"/>
+      </w:rPr>
+    </w:lvl>
+    <w:lvl w:ilvl="2" w:tentative="1">
+      <w:start w:val="1"/>
+      <w:numFmt w:val="bullet"/>
+      <w:lvlText w:val=""/>
+      <w:lvlJc w:val="left"/>
+      <w:pPr>
+        <w:tabs>
+          <w:tab w:val="num" w:pos="2160"/>
+        </w:tabs>
+        <w:ind w:left="2160" w:hanging="360"/>
+      </w:pPr>
+      <w:rPr>
+        <w:rFonts w:ascii="Wingdings" w:hAnsi="Wingdings" w:hint="default"/>
+        <w:sz w:val="20"/>
+      </w:rPr>
+    </w:lvl>
+    <w:lvl w:ilvl="3" w:tentative="1">
+      <w:start w:val="1"/>
+      <w:numFmt w:val="bullet"/>
+      <w:lvlText w:val=""/>
+      <w:lvlJc w:val="left"/>
+      <w:pPr>
+        <w:tabs>
+          <w:tab w:val="num" w:pos="2880"/>
+        </w:tabs>
+        <w:ind w:left="2880" w:hanging="360"/>
+      </w:pPr>
+      <w:rPr>
+        <w:rFonts w:ascii="Wingdings" w:hAnsi="Wingdings" w:hint="default"/>
+        <w:sz w:val="20"/>
+      </w:rPr>
+    </w:lvl>
+    <w:lvl w:ilvl="4" w:tentative="1">
+      <w:start w:val="1"/>
+      <w:numFmt w:val="bullet"/>
+      <w:lvlText w:val=""/>
+      <w:lvlJc w:val="left"/>
+      <w:pPr>
+        <w:tabs>
+          <w:tab w:val="num" w:pos="3600"/>
+        </w:tabs>
+        <w:ind w:left="3600" w:hanging="360"/>
+      </w:pPr>
+      <w:rPr>
+        <w:rFonts w:ascii="Wingdings" w:hAnsi="Wingdings" w:hint="default"/>
+        <w:sz w:val="20"/>
+      </w:rPr>
+    </w:lvl>
+    <w:lvl w:ilvl="5" w:tentative="1">
+      <w:start w:val="1"/>
+      <w:numFmt w:val="bullet"/>
+      <w:lvlText w:val=""/>
+      <w:lvlJc w:val="left"/>
+      <w:pPr>
+        <w:tabs>
+          <w:tab w:val="num" w:pos="4320"/>
+        </w:tabs>
+        <w:ind w:left="4320" w:hanging="360"/>
+      </w:pPr>
+      <w:rPr>
+        <w:rFonts w:ascii="Wingdings" w:hAnsi="Wingdings" w:hint="default"/>
+        <w:sz w:val="20"/>
+      </w:rPr>
+    </w:lvl>
+    <w:lvl w:ilvl="6" w:tentative="1">
+      <w:start w:val="1"/>
+      <w:numFmt w:val="bullet"/>
+      <w:lvlText w:val=""/>
+      <w:lvlJc w:val="left"/>
+      <w:pPr>
+        <w:tabs>
+          <w:tab w:val="num" w:pos="5040"/>
+        </w:tabs>
+        <w:ind w:left="5040" w:hanging="360"/>
+      </w:pPr>
+      <w:rPr>
+        <w:rFonts w:ascii="Wingdings" w:hAnsi="Wingdings" w:hint="default"/>
+        <w:sz w:val="20"/>
+      </w:rPr>
+    </w:lvl>
+    <w:lvl w:ilvl="7" w:tentative="1">
+      <w:start w:val="1"/>
+      <w:numFmt w:val="bullet"/>
+      <w:lvlText w:val=""/>
+      <w:lvlJc w:val="left"/>
+      <w:pPr>
+        <w:tabs>
+          <w:tab w:val="num" w:pos="5760"/>
+        </w:tabs>
+        <w:ind w:left="5760" w:hanging="360"/>
+      </w:pPr>
+      <w:rPr>
+        <w:rFonts w:ascii="Wingdings" w:hAnsi="Wingdings" w:hint="default"/>
+        <w:sz w:val="20"/>
+      </w:rPr>
+    </w:lvl>
+    <w:lvl w:ilvl="8" w:tentative="1">
+      <w:start w:val="1"/>
+      <w:numFmt w:val="bullet"/>
+      <w:lvlText w:val=""/>
+      <w:lvlJc w:val="left"/>
+      <w:pPr>
+        <w:tabs>
+          <w:tab w:val="num" w:pos="6480"/>
+        </w:tabs>
+        <w:ind w:left="6480" w:hanging="360"/>
+      </w:pPr>
+      <w:rPr>
+        <w:rFonts w:ascii="Wingdings" w:hAnsi="Wingdings" w:hint="default"/>
+        <w:sz w:val="20"/>
+      </w:rPr>
+    </w:lvl>
+  </w:abstractNum>
+  <w:abstractNum w:abstractNumId="12" w15:restartNumberingAfterBreak="0">
+    <w:nsid w:val="391A538B"/>
+    <w:multiLevelType w:val="multilevel"/>
+    <w:tmpl w:val="7F30BA7A"/>
+    <w:lvl w:ilvl="0">
+      <w:start w:val="1"/>
+      <w:numFmt w:val="bullet"/>
+      <w:lvlText w:val=""/>
+      <w:lvlJc w:val="left"/>
+      <w:pPr>
+        <w:tabs>
+          <w:tab w:val="num" w:pos="720"/>
+        </w:tabs>
+        <w:ind w:left="720" w:hanging="360"/>
+      </w:pPr>
+      <w:rPr>
+        <w:rFonts w:ascii="Symbol" w:hAnsi="Symbol" w:hint="default"/>
+        <w:sz w:val="20"/>
+      </w:rPr>
+    </w:lvl>
+    <w:lvl w:ilvl="1" w:tentative="1">
+      <w:start w:val="1"/>
+      <w:numFmt w:val="bullet"/>
+      <w:lvlText w:val="o"/>
+      <w:lvlJc w:val="left"/>
+      <w:pPr>
+        <w:tabs>
+          <w:tab w:val="num" w:pos="1440"/>
+        </w:tabs>
+        <w:ind w:left="1440" w:hanging="360"/>
+      </w:pPr>
+      <w:rPr>
+        <w:rFonts w:ascii="Courier New" w:hAnsi="Courier New" w:hint="default"/>
+        <w:sz w:val="20"/>
+      </w:rPr>
+    </w:lvl>
+    <w:lvl w:ilvl="2" w:tentative="1">
+      <w:start w:val="1"/>
+      <w:numFmt w:val="bullet"/>
+      <w:lvlText w:val=""/>
+      <w:lvlJc w:val="left"/>
+      <w:pPr>
+        <w:tabs>
+          <w:tab w:val="num" w:pos="2160"/>
+        </w:tabs>
+        <w:ind w:left="2160" w:hanging="360"/>
+      </w:pPr>
+      <w:rPr>
+        <w:rFonts w:ascii="Wingdings" w:hAnsi="Wingdings" w:hint="default"/>
+        <w:sz w:val="20"/>
+      </w:rPr>
+    </w:lvl>
+    <w:lvl w:ilvl="3" w:tentative="1">
+      <w:start w:val="1"/>
+      <w:numFmt w:val="bullet"/>
+      <w:lvlText w:val=""/>
+      <w:lvlJc w:val="left"/>
+      <w:pPr>
+        <w:tabs>
+          <w:tab w:val="num" w:pos="2880"/>
+        </w:tabs>
+        <w:ind w:left="2880" w:hanging="360"/>
+      </w:pPr>
+      <w:rPr>
+        <w:rFonts w:ascii="Wingdings" w:hAnsi="Wingdings" w:hint="default"/>
+        <w:sz w:val="20"/>
+      </w:rPr>
+    </w:lvl>
+    <w:lvl w:ilvl="4" w:tentative="1">
+      <w:start w:val="1"/>
+      <w:numFmt w:val="bullet"/>
+      <w:lvlText w:val=""/>
+      <w:lvlJc w:val="left"/>
+      <w:pPr>
+        <w:tabs>
+          <w:tab w:val="num" w:pos="3600"/>
+        </w:tabs>
+        <w:ind w:left="3600" w:hanging="360"/>
+      </w:pPr>
+      <w:rPr>
+        <w:rFonts w:ascii="Wingdings" w:hAnsi="Wingdings" w:hint="default"/>
+        <w:sz w:val="20"/>
+      </w:rPr>
+    </w:lvl>
+    <w:lvl w:ilvl="5" w:tentative="1">
+      <w:start w:val="1"/>
+      <w:numFmt w:val="bullet"/>
+      <w:lvlText w:val=""/>
+      <w:lvlJc w:val="left"/>
+      <w:pPr>
+        <w:tabs>
+          <w:tab w:val="num" w:pos="4320"/>
+        </w:tabs>
+        <w:ind w:left="4320" w:hanging="360"/>
+      </w:pPr>
+      <w:rPr>
+        <w:rFonts w:ascii="Wingdings" w:hAnsi="Wingdings" w:hint="default"/>
+        <w:sz w:val="20"/>
+      </w:rPr>
+    </w:lvl>
+    <w:lvl w:ilvl="6" w:tentative="1">
+      <w:start w:val="1"/>
+      <w:numFmt w:val="bullet"/>
+      <w:lvlText w:val=""/>
+      <w:lvlJc w:val="left"/>
+      <w:pPr>
+        <w:tabs>
+          <w:tab w:val="num" w:pos="5040"/>
+        </w:tabs>
+        <w:ind w:left="5040" w:hanging="360"/>
+      </w:pPr>
+      <w:rPr>
+        <w:rFonts w:ascii="Wingdings" w:hAnsi="Wingdings" w:hint="default"/>
+        <w:sz w:val="20"/>
+      </w:rPr>
+    </w:lvl>
+    <w:lvl w:ilvl="7" w:tentative="1">
+      <w:start w:val="1"/>
+      <w:numFmt w:val="bullet"/>
+      <w:lvlText w:val=""/>
+      <w:lvlJc w:val="left"/>
+      <w:pPr>
+        <w:tabs>
+          <w:tab w:val="num" w:pos="5760"/>
+        </w:tabs>
+        <w:ind w:left="5760" w:hanging="360"/>
+      </w:pPr>
+      <w:rPr>
+        <w:rFonts w:ascii="Wingdings" w:hAnsi="Wingdings" w:hint="default"/>
+        <w:sz w:val="20"/>
+      </w:rPr>
+    </w:lvl>
+    <w:lvl w:ilvl="8" w:tentative="1">
+      <w:start w:val="1"/>
+      <w:numFmt w:val="bullet"/>
+      <w:lvlText w:val=""/>
+      <w:lvlJc w:val="left"/>
+      <w:pPr>
+        <w:tabs>
+          <w:tab w:val="num" w:pos="6480"/>
+        </w:tabs>
+        <w:ind w:left="6480" w:hanging="360"/>
+      </w:pPr>
+      <w:rPr>
+        <w:rFonts w:ascii="Wingdings" w:hAnsi="Wingdings" w:hint="default"/>
+        <w:sz w:val="20"/>
+      </w:rPr>
+    </w:lvl>
+  </w:abstractNum>
+  <w:abstractNum w:abstractNumId="13" w15:restartNumberingAfterBreak="0">
     <w:nsid w:val="40787588"/>
     <w:multiLevelType w:val="multilevel"/>
     <w:tmpl w:val="56E2A682"/>
@@ -1666,10 +5011,904 @@
       </w:rPr>
     </w:lvl>
   </w:abstractNum>
-  <w:abstractNum w:abstractNumId="5" w15:restartNumberingAfterBreak="0">
+  <w:abstractNum w:abstractNumId="14" w15:restartNumberingAfterBreak="0">
+    <w:nsid w:val="41EE0DF2"/>
+    <w:multiLevelType w:val="multilevel"/>
+    <w:tmpl w:val="53D8DF16"/>
+    <w:lvl w:ilvl="0">
+      <w:start w:val="1"/>
+      <w:numFmt w:val="bullet"/>
+      <w:lvlText w:val=""/>
+      <w:lvlJc w:val="left"/>
+      <w:pPr>
+        <w:tabs>
+          <w:tab w:val="num" w:pos="720"/>
+        </w:tabs>
+        <w:ind w:left="720" w:hanging="360"/>
+      </w:pPr>
+      <w:rPr>
+        <w:rFonts w:ascii="Symbol" w:hAnsi="Symbol" w:hint="default"/>
+        <w:sz w:val="20"/>
+      </w:rPr>
+    </w:lvl>
+    <w:lvl w:ilvl="1" w:tentative="1">
+      <w:start w:val="1"/>
+      <w:numFmt w:val="bullet"/>
+      <w:lvlText w:val="o"/>
+      <w:lvlJc w:val="left"/>
+      <w:pPr>
+        <w:tabs>
+          <w:tab w:val="num" w:pos="1440"/>
+        </w:tabs>
+        <w:ind w:left="1440" w:hanging="360"/>
+      </w:pPr>
+      <w:rPr>
+        <w:rFonts w:ascii="Courier New" w:hAnsi="Courier New" w:hint="default"/>
+        <w:sz w:val="20"/>
+      </w:rPr>
+    </w:lvl>
+    <w:lvl w:ilvl="2" w:tentative="1">
+      <w:start w:val="1"/>
+      <w:numFmt w:val="bullet"/>
+      <w:lvlText w:val=""/>
+      <w:lvlJc w:val="left"/>
+      <w:pPr>
+        <w:tabs>
+          <w:tab w:val="num" w:pos="2160"/>
+        </w:tabs>
+        <w:ind w:left="2160" w:hanging="360"/>
+      </w:pPr>
+      <w:rPr>
+        <w:rFonts w:ascii="Wingdings" w:hAnsi="Wingdings" w:hint="default"/>
+        <w:sz w:val="20"/>
+      </w:rPr>
+    </w:lvl>
+    <w:lvl w:ilvl="3" w:tentative="1">
+      <w:start w:val="1"/>
+      <w:numFmt w:val="bullet"/>
+      <w:lvlText w:val=""/>
+      <w:lvlJc w:val="left"/>
+      <w:pPr>
+        <w:tabs>
+          <w:tab w:val="num" w:pos="2880"/>
+        </w:tabs>
+        <w:ind w:left="2880" w:hanging="360"/>
+      </w:pPr>
+      <w:rPr>
+        <w:rFonts w:ascii="Wingdings" w:hAnsi="Wingdings" w:hint="default"/>
+        <w:sz w:val="20"/>
+      </w:rPr>
+    </w:lvl>
+    <w:lvl w:ilvl="4" w:tentative="1">
+      <w:start w:val="1"/>
+      <w:numFmt w:val="bullet"/>
+      <w:lvlText w:val=""/>
+      <w:lvlJc w:val="left"/>
+      <w:pPr>
+        <w:tabs>
+          <w:tab w:val="num" w:pos="3600"/>
+        </w:tabs>
+        <w:ind w:left="3600" w:hanging="360"/>
+      </w:pPr>
+      <w:rPr>
+        <w:rFonts w:ascii="Wingdings" w:hAnsi="Wingdings" w:hint="default"/>
+        <w:sz w:val="20"/>
+      </w:rPr>
+    </w:lvl>
+    <w:lvl w:ilvl="5" w:tentative="1">
+      <w:start w:val="1"/>
+      <w:numFmt w:val="bullet"/>
+      <w:lvlText w:val=""/>
+      <w:lvlJc w:val="left"/>
+      <w:pPr>
+        <w:tabs>
+          <w:tab w:val="num" w:pos="4320"/>
+        </w:tabs>
+        <w:ind w:left="4320" w:hanging="360"/>
+      </w:pPr>
+      <w:rPr>
+        <w:rFonts w:ascii="Wingdings" w:hAnsi="Wingdings" w:hint="default"/>
+        <w:sz w:val="20"/>
+      </w:rPr>
+    </w:lvl>
+    <w:lvl w:ilvl="6" w:tentative="1">
+      <w:start w:val="1"/>
+      <w:numFmt w:val="bullet"/>
+      <w:lvlText w:val=""/>
+      <w:lvlJc w:val="left"/>
+      <w:pPr>
+        <w:tabs>
+          <w:tab w:val="num" w:pos="5040"/>
+        </w:tabs>
+        <w:ind w:left="5040" w:hanging="360"/>
+      </w:pPr>
+      <w:rPr>
+        <w:rFonts w:ascii="Wingdings" w:hAnsi="Wingdings" w:hint="default"/>
+        <w:sz w:val="20"/>
+      </w:rPr>
+    </w:lvl>
+    <w:lvl w:ilvl="7" w:tentative="1">
+      <w:start w:val="1"/>
+      <w:numFmt w:val="bullet"/>
+      <w:lvlText w:val=""/>
+      <w:lvlJc w:val="left"/>
+      <w:pPr>
+        <w:tabs>
+          <w:tab w:val="num" w:pos="5760"/>
+        </w:tabs>
+        <w:ind w:left="5760" w:hanging="360"/>
+      </w:pPr>
+      <w:rPr>
+        <w:rFonts w:ascii="Wingdings" w:hAnsi="Wingdings" w:hint="default"/>
+        <w:sz w:val="20"/>
+      </w:rPr>
+    </w:lvl>
+    <w:lvl w:ilvl="8" w:tentative="1">
+      <w:start w:val="1"/>
+      <w:numFmt w:val="bullet"/>
+      <w:lvlText w:val=""/>
+      <w:lvlJc w:val="left"/>
+      <w:pPr>
+        <w:tabs>
+          <w:tab w:val="num" w:pos="6480"/>
+        </w:tabs>
+        <w:ind w:left="6480" w:hanging="360"/>
+      </w:pPr>
+      <w:rPr>
+        <w:rFonts w:ascii="Wingdings" w:hAnsi="Wingdings" w:hint="default"/>
+        <w:sz w:val="20"/>
+      </w:rPr>
+    </w:lvl>
+  </w:abstractNum>
+  <w:abstractNum w:abstractNumId="15" w15:restartNumberingAfterBreak="0">
+    <w:nsid w:val="49C552A7"/>
+    <w:multiLevelType w:val="multilevel"/>
+    <w:tmpl w:val="110A216A"/>
+    <w:lvl w:ilvl="0">
+      <w:start w:val="1"/>
+      <w:numFmt w:val="bullet"/>
+      <w:lvlText w:val=""/>
+      <w:lvlJc w:val="left"/>
+      <w:pPr>
+        <w:tabs>
+          <w:tab w:val="num" w:pos="720"/>
+        </w:tabs>
+        <w:ind w:left="720" w:hanging="360"/>
+      </w:pPr>
+      <w:rPr>
+        <w:rFonts w:ascii="Symbol" w:hAnsi="Symbol" w:hint="default"/>
+        <w:sz w:val="20"/>
+      </w:rPr>
+    </w:lvl>
+    <w:lvl w:ilvl="1" w:tentative="1">
+      <w:start w:val="1"/>
+      <w:numFmt w:val="bullet"/>
+      <w:lvlText w:val="o"/>
+      <w:lvlJc w:val="left"/>
+      <w:pPr>
+        <w:tabs>
+          <w:tab w:val="num" w:pos="1440"/>
+        </w:tabs>
+        <w:ind w:left="1440" w:hanging="360"/>
+      </w:pPr>
+      <w:rPr>
+        <w:rFonts w:ascii="Courier New" w:hAnsi="Courier New" w:hint="default"/>
+        <w:sz w:val="20"/>
+      </w:rPr>
+    </w:lvl>
+    <w:lvl w:ilvl="2" w:tentative="1">
+      <w:start w:val="1"/>
+      <w:numFmt w:val="bullet"/>
+      <w:lvlText w:val=""/>
+      <w:lvlJc w:val="left"/>
+      <w:pPr>
+        <w:tabs>
+          <w:tab w:val="num" w:pos="2160"/>
+        </w:tabs>
+        <w:ind w:left="2160" w:hanging="360"/>
+      </w:pPr>
+      <w:rPr>
+        <w:rFonts w:ascii="Wingdings" w:hAnsi="Wingdings" w:hint="default"/>
+        <w:sz w:val="20"/>
+      </w:rPr>
+    </w:lvl>
+    <w:lvl w:ilvl="3" w:tentative="1">
+      <w:start w:val="1"/>
+      <w:numFmt w:val="bullet"/>
+      <w:lvlText w:val=""/>
+      <w:lvlJc w:val="left"/>
+      <w:pPr>
+        <w:tabs>
+          <w:tab w:val="num" w:pos="2880"/>
+        </w:tabs>
+        <w:ind w:left="2880" w:hanging="360"/>
+      </w:pPr>
+      <w:rPr>
+        <w:rFonts w:ascii="Wingdings" w:hAnsi="Wingdings" w:hint="default"/>
+        <w:sz w:val="20"/>
+      </w:rPr>
+    </w:lvl>
+    <w:lvl w:ilvl="4" w:tentative="1">
+      <w:start w:val="1"/>
+      <w:numFmt w:val="bullet"/>
+      <w:lvlText w:val=""/>
+      <w:lvlJc w:val="left"/>
+      <w:pPr>
+        <w:tabs>
+          <w:tab w:val="num" w:pos="3600"/>
+        </w:tabs>
+        <w:ind w:left="3600" w:hanging="360"/>
+      </w:pPr>
+      <w:rPr>
+        <w:rFonts w:ascii="Wingdings" w:hAnsi="Wingdings" w:hint="default"/>
+        <w:sz w:val="20"/>
+      </w:rPr>
+    </w:lvl>
+    <w:lvl w:ilvl="5" w:tentative="1">
+      <w:start w:val="1"/>
+      <w:numFmt w:val="bullet"/>
+      <w:lvlText w:val=""/>
+      <w:lvlJc w:val="left"/>
+      <w:pPr>
+        <w:tabs>
+          <w:tab w:val="num" w:pos="4320"/>
+        </w:tabs>
+        <w:ind w:left="4320" w:hanging="360"/>
+      </w:pPr>
+      <w:rPr>
+        <w:rFonts w:ascii="Wingdings" w:hAnsi="Wingdings" w:hint="default"/>
+        <w:sz w:val="20"/>
+      </w:rPr>
+    </w:lvl>
+    <w:lvl w:ilvl="6" w:tentative="1">
+      <w:start w:val="1"/>
+      <w:numFmt w:val="bullet"/>
+      <w:lvlText w:val=""/>
+      <w:lvlJc w:val="left"/>
+      <w:pPr>
+        <w:tabs>
+          <w:tab w:val="num" w:pos="5040"/>
+        </w:tabs>
+        <w:ind w:left="5040" w:hanging="360"/>
+      </w:pPr>
+      <w:rPr>
+        <w:rFonts w:ascii="Wingdings" w:hAnsi="Wingdings" w:hint="default"/>
+        <w:sz w:val="20"/>
+      </w:rPr>
+    </w:lvl>
+    <w:lvl w:ilvl="7" w:tentative="1">
+      <w:start w:val="1"/>
+      <w:numFmt w:val="bullet"/>
+      <w:lvlText w:val=""/>
+      <w:lvlJc w:val="left"/>
+      <w:pPr>
+        <w:tabs>
+          <w:tab w:val="num" w:pos="5760"/>
+        </w:tabs>
+        <w:ind w:left="5760" w:hanging="360"/>
+      </w:pPr>
+      <w:rPr>
+        <w:rFonts w:ascii="Wingdings" w:hAnsi="Wingdings" w:hint="default"/>
+        <w:sz w:val="20"/>
+      </w:rPr>
+    </w:lvl>
+    <w:lvl w:ilvl="8" w:tentative="1">
+      <w:start w:val="1"/>
+      <w:numFmt w:val="bullet"/>
+      <w:lvlText w:val=""/>
+      <w:lvlJc w:val="left"/>
+      <w:pPr>
+        <w:tabs>
+          <w:tab w:val="num" w:pos="6480"/>
+        </w:tabs>
+        <w:ind w:left="6480" w:hanging="360"/>
+      </w:pPr>
+      <w:rPr>
+        <w:rFonts w:ascii="Wingdings" w:hAnsi="Wingdings" w:hint="default"/>
+        <w:sz w:val="20"/>
+      </w:rPr>
+    </w:lvl>
+  </w:abstractNum>
+  <w:abstractNum w:abstractNumId="16" w15:restartNumberingAfterBreak="0">
+    <w:nsid w:val="53F2243B"/>
+    <w:multiLevelType w:val="multilevel"/>
+    <w:tmpl w:val="6B203F50"/>
+    <w:lvl w:ilvl="0">
+      <w:start w:val="1"/>
+      <w:numFmt w:val="bullet"/>
+      <w:lvlText w:val=""/>
+      <w:lvlJc w:val="left"/>
+      <w:pPr>
+        <w:tabs>
+          <w:tab w:val="num" w:pos="720"/>
+        </w:tabs>
+        <w:ind w:left="720" w:hanging="360"/>
+      </w:pPr>
+      <w:rPr>
+        <w:rFonts w:ascii="Symbol" w:hAnsi="Symbol" w:hint="default"/>
+        <w:sz w:val="20"/>
+      </w:rPr>
+    </w:lvl>
+    <w:lvl w:ilvl="1" w:tentative="1">
+      <w:start w:val="1"/>
+      <w:numFmt w:val="bullet"/>
+      <w:lvlText w:val="o"/>
+      <w:lvlJc w:val="left"/>
+      <w:pPr>
+        <w:tabs>
+          <w:tab w:val="num" w:pos="1440"/>
+        </w:tabs>
+        <w:ind w:left="1440" w:hanging="360"/>
+      </w:pPr>
+      <w:rPr>
+        <w:rFonts w:ascii="Courier New" w:hAnsi="Courier New" w:hint="default"/>
+        <w:sz w:val="20"/>
+      </w:rPr>
+    </w:lvl>
+    <w:lvl w:ilvl="2" w:tentative="1">
+      <w:start w:val="1"/>
+      <w:numFmt w:val="bullet"/>
+      <w:lvlText w:val=""/>
+      <w:lvlJc w:val="left"/>
+      <w:pPr>
+        <w:tabs>
+          <w:tab w:val="num" w:pos="2160"/>
+        </w:tabs>
+        <w:ind w:left="2160" w:hanging="360"/>
+      </w:pPr>
+      <w:rPr>
+        <w:rFonts w:ascii="Wingdings" w:hAnsi="Wingdings" w:hint="default"/>
+        <w:sz w:val="20"/>
+      </w:rPr>
+    </w:lvl>
+    <w:lvl w:ilvl="3" w:tentative="1">
+      <w:start w:val="1"/>
+      <w:numFmt w:val="bullet"/>
+      <w:lvlText w:val=""/>
+      <w:lvlJc w:val="left"/>
+      <w:pPr>
+        <w:tabs>
+          <w:tab w:val="num" w:pos="2880"/>
+        </w:tabs>
+        <w:ind w:left="2880" w:hanging="360"/>
+      </w:pPr>
+      <w:rPr>
+        <w:rFonts w:ascii="Wingdings" w:hAnsi="Wingdings" w:hint="default"/>
+        <w:sz w:val="20"/>
+      </w:rPr>
+    </w:lvl>
+    <w:lvl w:ilvl="4" w:tentative="1">
+      <w:start w:val="1"/>
+      <w:numFmt w:val="bullet"/>
+      <w:lvlText w:val=""/>
+      <w:lvlJc w:val="left"/>
+      <w:pPr>
+        <w:tabs>
+          <w:tab w:val="num" w:pos="3600"/>
+        </w:tabs>
+        <w:ind w:left="3600" w:hanging="360"/>
+      </w:pPr>
+      <w:rPr>
+        <w:rFonts w:ascii="Wingdings" w:hAnsi="Wingdings" w:hint="default"/>
+        <w:sz w:val="20"/>
+      </w:rPr>
+    </w:lvl>
+    <w:lvl w:ilvl="5" w:tentative="1">
+      <w:start w:val="1"/>
+      <w:numFmt w:val="bullet"/>
+      <w:lvlText w:val=""/>
+      <w:lvlJc w:val="left"/>
+      <w:pPr>
+        <w:tabs>
+          <w:tab w:val="num" w:pos="4320"/>
+        </w:tabs>
+        <w:ind w:left="4320" w:hanging="360"/>
+      </w:pPr>
+      <w:rPr>
+        <w:rFonts w:ascii="Wingdings" w:hAnsi="Wingdings" w:hint="default"/>
+        <w:sz w:val="20"/>
+      </w:rPr>
+    </w:lvl>
+    <w:lvl w:ilvl="6" w:tentative="1">
+      <w:start w:val="1"/>
+      <w:numFmt w:val="bullet"/>
+      <w:lvlText w:val=""/>
+      <w:lvlJc w:val="left"/>
+      <w:pPr>
+        <w:tabs>
+          <w:tab w:val="num" w:pos="5040"/>
+        </w:tabs>
+        <w:ind w:left="5040" w:hanging="360"/>
+      </w:pPr>
+      <w:rPr>
+        <w:rFonts w:ascii="Wingdings" w:hAnsi="Wingdings" w:hint="default"/>
+        <w:sz w:val="20"/>
+      </w:rPr>
+    </w:lvl>
+    <w:lvl w:ilvl="7" w:tentative="1">
+      <w:start w:val="1"/>
+      <w:numFmt w:val="bullet"/>
+      <w:lvlText w:val=""/>
+      <w:lvlJc w:val="left"/>
+      <w:pPr>
+        <w:tabs>
+          <w:tab w:val="num" w:pos="5760"/>
+        </w:tabs>
+        <w:ind w:left="5760" w:hanging="360"/>
+      </w:pPr>
+      <w:rPr>
+        <w:rFonts w:ascii="Wingdings" w:hAnsi="Wingdings" w:hint="default"/>
+        <w:sz w:val="20"/>
+      </w:rPr>
+    </w:lvl>
+    <w:lvl w:ilvl="8" w:tentative="1">
+      <w:start w:val="1"/>
+      <w:numFmt w:val="bullet"/>
+      <w:lvlText w:val=""/>
+      <w:lvlJc w:val="left"/>
+      <w:pPr>
+        <w:tabs>
+          <w:tab w:val="num" w:pos="6480"/>
+        </w:tabs>
+        <w:ind w:left="6480" w:hanging="360"/>
+      </w:pPr>
+      <w:rPr>
+        <w:rFonts w:ascii="Wingdings" w:hAnsi="Wingdings" w:hint="default"/>
+        <w:sz w:val="20"/>
+      </w:rPr>
+    </w:lvl>
+  </w:abstractNum>
+  <w:abstractNum w:abstractNumId="17" w15:restartNumberingAfterBreak="0">
+    <w:nsid w:val="61C21F20"/>
+    <w:multiLevelType w:val="multilevel"/>
+    <w:tmpl w:val="9EC6B29A"/>
+    <w:lvl w:ilvl="0">
+      <w:start w:val="1"/>
+      <w:numFmt w:val="bullet"/>
+      <w:lvlText w:val=""/>
+      <w:lvlJc w:val="left"/>
+      <w:pPr>
+        <w:tabs>
+          <w:tab w:val="num" w:pos="720"/>
+        </w:tabs>
+        <w:ind w:left="720" w:hanging="360"/>
+      </w:pPr>
+      <w:rPr>
+        <w:rFonts w:ascii="Symbol" w:hAnsi="Symbol" w:hint="default"/>
+        <w:sz w:val="20"/>
+      </w:rPr>
+    </w:lvl>
+    <w:lvl w:ilvl="1" w:tentative="1">
+      <w:start w:val="1"/>
+      <w:numFmt w:val="bullet"/>
+      <w:lvlText w:val="o"/>
+      <w:lvlJc w:val="left"/>
+      <w:pPr>
+        <w:tabs>
+          <w:tab w:val="num" w:pos="1440"/>
+        </w:tabs>
+        <w:ind w:left="1440" w:hanging="360"/>
+      </w:pPr>
+      <w:rPr>
+        <w:rFonts w:ascii="Courier New" w:hAnsi="Courier New" w:hint="default"/>
+        <w:sz w:val="20"/>
+      </w:rPr>
+    </w:lvl>
+    <w:lvl w:ilvl="2" w:tentative="1">
+      <w:start w:val="1"/>
+      <w:numFmt w:val="bullet"/>
+      <w:lvlText w:val=""/>
+      <w:lvlJc w:val="left"/>
+      <w:pPr>
+        <w:tabs>
+          <w:tab w:val="num" w:pos="2160"/>
+        </w:tabs>
+        <w:ind w:left="2160" w:hanging="360"/>
+      </w:pPr>
+      <w:rPr>
+        <w:rFonts w:ascii="Wingdings" w:hAnsi="Wingdings" w:hint="default"/>
+        <w:sz w:val="20"/>
+      </w:rPr>
+    </w:lvl>
+    <w:lvl w:ilvl="3" w:tentative="1">
+      <w:start w:val="1"/>
+      <w:numFmt w:val="bullet"/>
+      <w:lvlText w:val=""/>
+      <w:lvlJc w:val="left"/>
+      <w:pPr>
+        <w:tabs>
+          <w:tab w:val="num" w:pos="2880"/>
+        </w:tabs>
+        <w:ind w:left="2880" w:hanging="360"/>
+      </w:pPr>
+      <w:rPr>
+        <w:rFonts w:ascii="Wingdings" w:hAnsi="Wingdings" w:hint="default"/>
+        <w:sz w:val="20"/>
+      </w:rPr>
+    </w:lvl>
+    <w:lvl w:ilvl="4" w:tentative="1">
+      <w:start w:val="1"/>
+      <w:numFmt w:val="bullet"/>
+      <w:lvlText w:val=""/>
+      <w:lvlJc w:val="left"/>
+      <w:pPr>
+        <w:tabs>
+          <w:tab w:val="num" w:pos="3600"/>
+        </w:tabs>
+        <w:ind w:left="3600" w:hanging="360"/>
+      </w:pPr>
+      <w:rPr>
+        <w:rFonts w:ascii="Wingdings" w:hAnsi="Wingdings" w:hint="default"/>
+        <w:sz w:val="20"/>
+      </w:rPr>
+    </w:lvl>
+    <w:lvl w:ilvl="5" w:tentative="1">
+      <w:start w:val="1"/>
+      <w:numFmt w:val="bullet"/>
+      <w:lvlText w:val=""/>
+      <w:lvlJc w:val="left"/>
+      <w:pPr>
+        <w:tabs>
+          <w:tab w:val="num" w:pos="4320"/>
+        </w:tabs>
+        <w:ind w:left="4320" w:hanging="360"/>
+      </w:pPr>
+      <w:rPr>
+        <w:rFonts w:ascii="Wingdings" w:hAnsi="Wingdings" w:hint="default"/>
+        <w:sz w:val="20"/>
+      </w:rPr>
+    </w:lvl>
+    <w:lvl w:ilvl="6" w:tentative="1">
+      <w:start w:val="1"/>
+      <w:numFmt w:val="bullet"/>
+      <w:lvlText w:val=""/>
+      <w:lvlJc w:val="left"/>
+      <w:pPr>
+        <w:tabs>
+          <w:tab w:val="num" w:pos="5040"/>
+        </w:tabs>
+        <w:ind w:left="5040" w:hanging="360"/>
+      </w:pPr>
+      <w:rPr>
+        <w:rFonts w:ascii="Wingdings" w:hAnsi="Wingdings" w:hint="default"/>
+        <w:sz w:val="20"/>
+      </w:rPr>
+    </w:lvl>
+    <w:lvl w:ilvl="7" w:tentative="1">
+      <w:start w:val="1"/>
+      <w:numFmt w:val="bullet"/>
+      <w:lvlText w:val=""/>
+      <w:lvlJc w:val="left"/>
+      <w:pPr>
+        <w:tabs>
+          <w:tab w:val="num" w:pos="5760"/>
+        </w:tabs>
+        <w:ind w:left="5760" w:hanging="360"/>
+      </w:pPr>
+      <w:rPr>
+        <w:rFonts w:ascii="Wingdings" w:hAnsi="Wingdings" w:hint="default"/>
+        <w:sz w:val="20"/>
+      </w:rPr>
+    </w:lvl>
+    <w:lvl w:ilvl="8" w:tentative="1">
+      <w:start w:val="1"/>
+      <w:numFmt w:val="bullet"/>
+      <w:lvlText w:val=""/>
+      <w:lvlJc w:val="left"/>
+      <w:pPr>
+        <w:tabs>
+          <w:tab w:val="num" w:pos="6480"/>
+        </w:tabs>
+        <w:ind w:left="6480" w:hanging="360"/>
+      </w:pPr>
+      <w:rPr>
+        <w:rFonts w:ascii="Wingdings" w:hAnsi="Wingdings" w:hint="default"/>
+        <w:sz w:val="20"/>
+      </w:rPr>
+    </w:lvl>
+  </w:abstractNum>
+  <w:abstractNum w:abstractNumId="18" w15:restartNumberingAfterBreak="0">
+    <w:nsid w:val="63CA0A21"/>
+    <w:multiLevelType w:val="multilevel"/>
+    <w:tmpl w:val="ABEAB454"/>
+    <w:lvl w:ilvl="0">
+      <w:start w:val="1"/>
+      <w:numFmt w:val="bullet"/>
+      <w:lvlText w:val=""/>
+      <w:lvlJc w:val="left"/>
+      <w:pPr>
+        <w:tabs>
+          <w:tab w:val="num" w:pos="720"/>
+        </w:tabs>
+        <w:ind w:left="720" w:hanging="360"/>
+      </w:pPr>
+      <w:rPr>
+        <w:rFonts w:ascii="Symbol" w:hAnsi="Symbol" w:hint="default"/>
+        <w:sz w:val="20"/>
+      </w:rPr>
+    </w:lvl>
+    <w:lvl w:ilvl="1" w:tentative="1">
+      <w:start w:val="1"/>
+      <w:numFmt w:val="bullet"/>
+      <w:lvlText w:val="o"/>
+      <w:lvlJc w:val="left"/>
+      <w:pPr>
+        <w:tabs>
+          <w:tab w:val="num" w:pos="1440"/>
+        </w:tabs>
+        <w:ind w:left="1440" w:hanging="360"/>
+      </w:pPr>
+      <w:rPr>
+        <w:rFonts w:ascii="Courier New" w:hAnsi="Courier New" w:hint="default"/>
+        <w:sz w:val="20"/>
+      </w:rPr>
+    </w:lvl>
+    <w:lvl w:ilvl="2" w:tentative="1">
+      <w:start w:val="1"/>
+      <w:numFmt w:val="bullet"/>
+      <w:lvlText w:val=""/>
+      <w:lvlJc w:val="left"/>
+      <w:pPr>
+        <w:tabs>
+          <w:tab w:val="num" w:pos="2160"/>
+        </w:tabs>
+        <w:ind w:left="2160" w:hanging="360"/>
+      </w:pPr>
+      <w:rPr>
+        <w:rFonts w:ascii="Wingdings" w:hAnsi="Wingdings" w:hint="default"/>
+        <w:sz w:val="20"/>
+      </w:rPr>
+    </w:lvl>
+    <w:lvl w:ilvl="3" w:tentative="1">
+      <w:start w:val="1"/>
+      <w:numFmt w:val="bullet"/>
+      <w:lvlText w:val=""/>
+      <w:lvlJc w:val="left"/>
+      <w:pPr>
+        <w:tabs>
+          <w:tab w:val="num" w:pos="2880"/>
+        </w:tabs>
+        <w:ind w:left="2880" w:hanging="360"/>
+      </w:pPr>
+      <w:rPr>
+        <w:rFonts w:ascii="Wingdings" w:hAnsi="Wingdings" w:hint="default"/>
+        <w:sz w:val="20"/>
+      </w:rPr>
+    </w:lvl>
+    <w:lvl w:ilvl="4" w:tentative="1">
+      <w:start w:val="1"/>
+      <w:numFmt w:val="bullet"/>
+      <w:lvlText w:val=""/>
+      <w:lvlJc w:val="left"/>
+      <w:pPr>
+        <w:tabs>
+          <w:tab w:val="num" w:pos="3600"/>
+        </w:tabs>
+        <w:ind w:left="3600" w:hanging="360"/>
+      </w:pPr>
+      <w:rPr>
+        <w:rFonts w:ascii="Wingdings" w:hAnsi="Wingdings" w:hint="default"/>
+        <w:sz w:val="20"/>
+      </w:rPr>
+    </w:lvl>
+    <w:lvl w:ilvl="5" w:tentative="1">
+      <w:start w:val="1"/>
+      <w:numFmt w:val="bullet"/>
+      <w:lvlText w:val=""/>
+      <w:lvlJc w:val="left"/>
+      <w:pPr>
+        <w:tabs>
+          <w:tab w:val="num" w:pos="4320"/>
+        </w:tabs>
+        <w:ind w:left="4320" w:hanging="360"/>
+      </w:pPr>
+      <w:rPr>
+        <w:rFonts w:ascii="Wingdings" w:hAnsi="Wingdings" w:hint="default"/>
+        <w:sz w:val="20"/>
+      </w:rPr>
+    </w:lvl>
+    <w:lvl w:ilvl="6" w:tentative="1">
+      <w:start w:val="1"/>
+      <w:numFmt w:val="bullet"/>
+      <w:lvlText w:val=""/>
+      <w:lvlJc w:val="left"/>
+      <w:pPr>
+        <w:tabs>
+          <w:tab w:val="num" w:pos="5040"/>
+        </w:tabs>
+        <w:ind w:left="5040" w:hanging="360"/>
+      </w:pPr>
+      <w:rPr>
+        <w:rFonts w:ascii="Wingdings" w:hAnsi="Wingdings" w:hint="default"/>
+        <w:sz w:val="20"/>
+      </w:rPr>
+    </w:lvl>
+    <w:lvl w:ilvl="7" w:tentative="1">
+      <w:start w:val="1"/>
+      <w:numFmt w:val="bullet"/>
+      <w:lvlText w:val=""/>
+      <w:lvlJc w:val="left"/>
+      <w:pPr>
+        <w:tabs>
+          <w:tab w:val="num" w:pos="5760"/>
+        </w:tabs>
+        <w:ind w:left="5760" w:hanging="360"/>
+      </w:pPr>
+      <w:rPr>
+        <w:rFonts w:ascii="Wingdings" w:hAnsi="Wingdings" w:hint="default"/>
+        <w:sz w:val="20"/>
+      </w:rPr>
+    </w:lvl>
+    <w:lvl w:ilvl="8" w:tentative="1">
+      <w:start w:val="1"/>
+      <w:numFmt w:val="bullet"/>
+      <w:lvlText w:val=""/>
+      <w:lvlJc w:val="left"/>
+      <w:pPr>
+        <w:tabs>
+          <w:tab w:val="num" w:pos="6480"/>
+        </w:tabs>
+        <w:ind w:left="6480" w:hanging="360"/>
+      </w:pPr>
+      <w:rPr>
+        <w:rFonts w:ascii="Wingdings" w:hAnsi="Wingdings" w:hint="default"/>
+        <w:sz w:val="20"/>
+      </w:rPr>
+    </w:lvl>
+  </w:abstractNum>
+  <w:abstractNum w:abstractNumId="19" w15:restartNumberingAfterBreak="0">
     <w:nsid w:val="6C427D99"/>
     <w:multiLevelType w:val="multilevel"/>
     <w:tmpl w:val="6C26539A"/>
+    <w:lvl w:ilvl="0">
+      <w:start w:val="1"/>
+      <w:numFmt w:val="bullet"/>
+      <w:lvlText w:val=""/>
+      <w:lvlJc w:val="left"/>
+      <w:pPr>
+        <w:tabs>
+          <w:tab w:val="num" w:pos="720"/>
+        </w:tabs>
+        <w:ind w:left="720" w:hanging="360"/>
+      </w:pPr>
+      <w:rPr>
+        <w:rFonts w:ascii="Symbol" w:hAnsi="Symbol" w:hint="default"/>
+        <w:sz w:val="20"/>
+      </w:rPr>
+    </w:lvl>
+    <w:lvl w:ilvl="1" w:tentative="1">
+      <w:start w:val="1"/>
+      <w:numFmt w:val="bullet"/>
+      <w:lvlText w:val="o"/>
+      <w:lvlJc w:val="left"/>
+      <w:pPr>
+        <w:tabs>
+          <w:tab w:val="num" w:pos="1440"/>
+        </w:tabs>
+        <w:ind w:left="1440" w:hanging="360"/>
+      </w:pPr>
+      <w:rPr>
+        <w:rFonts w:ascii="Courier New" w:hAnsi="Courier New" w:hint="default"/>
+        <w:sz w:val="20"/>
+      </w:rPr>
+    </w:lvl>
+    <w:lvl w:ilvl="2" w:tentative="1">
+      <w:start w:val="1"/>
+      <w:numFmt w:val="bullet"/>
+      <w:lvlText w:val=""/>
+      <w:lvlJc w:val="left"/>
+      <w:pPr>
+        <w:tabs>
+          <w:tab w:val="num" w:pos="2160"/>
+        </w:tabs>
+        <w:ind w:left="2160" w:hanging="360"/>
+      </w:pPr>
+      <w:rPr>
+        <w:rFonts w:ascii="Wingdings" w:hAnsi="Wingdings" w:hint="default"/>
+        <w:sz w:val="20"/>
+      </w:rPr>
+    </w:lvl>
+    <w:lvl w:ilvl="3" w:tentative="1">
+      <w:start w:val="1"/>
+      <w:numFmt w:val="bullet"/>
+      <w:lvlText w:val=""/>
+      <w:lvlJc w:val="left"/>
+      <w:pPr>
+        <w:tabs>
+          <w:tab w:val="num" w:pos="2880"/>
+        </w:tabs>
+        <w:ind w:left="2880" w:hanging="360"/>
+      </w:pPr>
+      <w:rPr>
+        <w:rFonts w:ascii="Wingdings" w:hAnsi="Wingdings" w:hint="default"/>
+        <w:sz w:val="20"/>
+      </w:rPr>
+    </w:lvl>
+    <w:lvl w:ilvl="4" w:tentative="1">
+      <w:start w:val="1"/>
+      <w:numFmt w:val="bullet"/>
+      <w:lvlText w:val=""/>
+      <w:lvlJc w:val="left"/>
+      <w:pPr>
+        <w:tabs>
+          <w:tab w:val="num" w:pos="3600"/>
+        </w:tabs>
+        <w:ind w:left="3600" w:hanging="360"/>
+      </w:pPr>
+      <w:rPr>
+        <w:rFonts w:ascii="Wingdings" w:hAnsi="Wingdings" w:hint="default"/>
+        <w:sz w:val="20"/>
+      </w:rPr>
+    </w:lvl>
+    <w:lvl w:ilvl="5" w:tentative="1">
+      <w:start w:val="1"/>
+      <w:numFmt w:val="bullet"/>
+      <w:lvlText w:val=""/>
+      <w:lvlJc w:val="left"/>
+      <w:pPr>
+        <w:tabs>
+          <w:tab w:val="num" w:pos="4320"/>
+        </w:tabs>
+        <w:ind w:left="4320" w:hanging="360"/>
+      </w:pPr>
+      <w:rPr>
+        <w:rFonts w:ascii="Wingdings" w:hAnsi="Wingdings" w:hint="default"/>
+        <w:sz w:val="20"/>
+      </w:rPr>
+    </w:lvl>
+    <w:lvl w:ilvl="6" w:tentative="1">
+      <w:start w:val="1"/>
+      <w:numFmt w:val="bullet"/>
+      <w:lvlText w:val=""/>
+      <w:lvlJc w:val="left"/>
+      <w:pPr>
+        <w:tabs>
+          <w:tab w:val="num" w:pos="5040"/>
+        </w:tabs>
+        <w:ind w:left="5040" w:hanging="360"/>
+      </w:pPr>
+      <w:rPr>
+        <w:rFonts w:ascii="Wingdings" w:hAnsi="Wingdings" w:hint="default"/>
+        <w:sz w:val="20"/>
+      </w:rPr>
+    </w:lvl>
+    <w:lvl w:ilvl="7" w:tentative="1">
+      <w:start w:val="1"/>
+      <w:numFmt w:val="bullet"/>
+      <w:lvlText w:val=""/>
+      <w:lvlJc w:val="left"/>
+      <w:pPr>
+        <w:tabs>
+          <w:tab w:val="num" w:pos="5760"/>
+        </w:tabs>
+        <w:ind w:left="5760" w:hanging="360"/>
+      </w:pPr>
+      <w:rPr>
+        <w:rFonts w:ascii="Wingdings" w:hAnsi="Wingdings" w:hint="default"/>
+        <w:sz w:val="20"/>
+      </w:rPr>
+    </w:lvl>
+    <w:lvl w:ilvl="8" w:tentative="1">
+      <w:start w:val="1"/>
+      <w:numFmt w:val="bullet"/>
+      <w:lvlText w:val=""/>
+      <w:lvlJc w:val="left"/>
+      <w:pPr>
+        <w:tabs>
+          <w:tab w:val="num" w:pos="6480"/>
+        </w:tabs>
+        <w:ind w:left="6480" w:hanging="360"/>
+      </w:pPr>
+      <w:rPr>
+        <w:rFonts w:ascii="Wingdings" w:hAnsi="Wingdings" w:hint="default"/>
+        <w:sz w:val="20"/>
+      </w:rPr>
+    </w:lvl>
+  </w:abstractNum>
+  <w:abstractNum w:abstractNumId="20" w15:restartNumberingAfterBreak="0">
+    <w:nsid w:val="6C76368B"/>
+    <w:multiLevelType w:val="multilevel"/>
+    <w:tmpl w:val="53D44A26"/>
     <w:lvl w:ilvl="0">
       <w:start w:val="1"/>
       <w:numFmt w:val="bullet"/>
@@ -1819,19 +6058,64 @@
     <w:abstractNumId w:val="0"/>
   </w:num>
   <w:num w:numId="2" w16cid:durableId="278145578">
+    <w:abstractNumId w:val="13"/>
+  </w:num>
+  <w:num w:numId="3" w16cid:durableId="1082869659">
+    <w:abstractNumId w:val="6"/>
+  </w:num>
+  <w:num w:numId="4" w16cid:durableId="1399087449">
+    <w:abstractNumId w:val="19"/>
+  </w:num>
+  <w:num w:numId="5" w16cid:durableId="1590115480">
+    <w:abstractNumId w:val="8"/>
+  </w:num>
+  <w:num w:numId="6" w16cid:durableId="1275599465">
+    <w:abstractNumId w:val="3"/>
+  </w:num>
+  <w:num w:numId="7" w16cid:durableId="949821662">
+    <w:abstractNumId w:val="5"/>
+  </w:num>
+  <w:num w:numId="8" w16cid:durableId="502160085">
+    <w:abstractNumId w:val="7"/>
+  </w:num>
+  <w:num w:numId="9" w16cid:durableId="1561751620">
+    <w:abstractNumId w:val="11"/>
+  </w:num>
+  <w:num w:numId="10" w16cid:durableId="642005705">
+    <w:abstractNumId w:val="15"/>
+  </w:num>
+  <w:num w:numId="11" w16cid:durableId="1916285314">
+    <w:abstractNumId w:val="17"/>
+  </w:num>
+  <w:num w:numId="12" w16cid:durableId="112209799">
     <w:abstractNumId w:val="4"/>
   </w:num>
-  <w:num w:numId="3" w16cid:durableId="1082869659">
+  <w:num w:numId="13" w16cid:durableId="2034110977">
     <w:abstractNumId w:val="2"/>
   </w:num>
-  <w:num w:numId="4" w16cid:durableId="1399087449">
-    <w:abstractNumId w:val="5"/>
+  <w:num w:numId="14" w16cid:durableId="1815020617">
+    <w:abstractNumId w:val="20"/>
   </w:num>
-  <w:num w:numId="5" w16cid:durableId="1590115480">
-    <w:abstractNumId w:val="3"/>
+  <w:num w:numId="15" w16cid:durableId="122311294">
+    <w:abstractNumId w:val="9"/>
   </w:num>
-  <w:num w:numId="6" w16cid:durableId="1275599465">
+  <w:num w:numId="16" w16cid:durableId="1880705022">
+    <w:abstractNumId w:val="18"/>
+  </w:num>
+  <w:num w:numId="17" w16cid:durableId="245304063">
+    <w:abstractNumId w:val="12"/>
+  </w:num>
+  <w:num w:numId="18" w16cid:durableId="130291419">
     <w:abstractNumId w:val="1"/>
+  </w:num>
+  <w:num w:numId="19" w16cid:durableId="175270223">
+    <w:abstractNumId w:val="16"/>
+  </w:num>
+  <w:num w:numId="20" w16cid:durableId="1088422739">
+    <w:abstractNumId w:val="10"/>
+  </w:num>
+  <w:num w:numId="21" w16cid:durableId="943269753">
+    <w:abstractNumId w:val="14"/>
   </w:num>
 </w:numbering>
 </file>
@@ -2239,7 +6523,6 @@
   <w:style w:type="character" w:default="1" w:styleId="DefaultParagraphFont">
     <w:name w:val="Default Paragraph Font"/>
     <w:uiPriority w:val="1"/>
-    <w:semiHidden/>
     <w:unhideWhenUsed/>
   </w:style>
   <w:style w:type="table" w:default="1" w:styleId="TableNormal">

</xml_diff>

<commit_message>
Dia 34: Ideas simples en sistemas de IA
</commit_message>
<xml_diff>
--- a/Diseño de proyectos de IA/Diseño de proyectos de IA.docx
+++ b/Diseño de proyectos de IA/Diseño de proyectos de IA.docx
@@ -2208,7 +2208,7 @@
     <w:p>
       <w:r>
         <w:pict w14:anchorId="3CF05402">
-          <v:rect id="_x0000_i1131" style="width:0;height:1.5pt" o:hralign="center" o:hrstd="t" o:hr="t" fillcolor="#a0a0a0" stroked="f"/>
+          <v:rect id="_x0000_i1041" style="width:0;height:1.5pt" o:hralign="center" o:hrstd="t" o:hr="t" fillcolor="#a0a0a0" stroked="f"/>
         </w:pict>
       </w:r>
     </w:p>
@@ -2308,7 +2308,7 @@
     <w:p>
       <w:r>
         <w:pict w14:anchorId="6AD3A6E4">
-          <v:rect id="_x0000_i1132" style="width:0;height:1.5pt" o:hralign="center" o:hrstd="t" o:hr="t" fillcolor="#a0a0a0" stroked="f"/>
+          <v:rect id="_x0000_i1042" style="width:0;height:1.5pt" o:hralign="center" o:hrstd="t" o:hr="t" fillcolor="#a0a0a0" stroked="f"/>
         </w:pict>
       </w:r>
     </w:p>
@@ -2417,7 +2417,7 @@
     <w:p>
       <w:r>
         <w:pict w14:anchorId="54B674AF">
-          <v:rect id="_x0000_i1133" style="width:0;height:1.5pt" o:hralign="center" o:hrstd="t" o:hr="t" fillcolor="#a0a0a0" stroked="f"/>
+          <v:rect id="_x0000_i1043" style="width:0;height:1.5pt" o:hralign="center" o:hrstd="t" o:hr="t" fillcolor="#a0a0a0" stroked="f"/>
         </w:pict>
       </w:r>
     </w:p>
@@ -2441,29 +2441,7 @@
           <w:szCs w:val="28"/>
           <w:u w:val="single"/>
         </w:rPr>
-        <w:t>3️</w:t>
-      </w:r>
-      <w:r>
-        <w:rPr>
-          <w:rFonts w:cstheme="minorHAnsi"/>
-          <w:b/>
-          <w:bCs/>
-          <w:sz w:val="28"/>
-          <w:szCs w:val="28"/>
-          <w:u w:val="single"/>
-        </w:rPr>
-        <w:t>) ¿</w:t>
-      </w:r>
-      <w:r>
-        <w:rPr>
-          <w:rFonts w:cstheme="minorHAnsi"/>
-          <w:b/>
-          <w:bCs/>
-          <w:sz w:val="28"/>
-          <w:szCs w:val="28"/>
-          <w:u w:val="single"/>
-        </w:rPr>
-        <w:t>La tarea se repite muchas veces?</w:t>
+        <w:t>3️) ¿La tarea se repite muchas veces?</w:t>
       </w:r>
     </w:p>
     <w:p>
@@ -2528,7 +2506,7 @@
     <w:p>
       <w:r>
         <w:pict w14:anchorId="76A74127">
-          <v:rect id="_x0000_i1134" style="width:0;height:1.5pt" o:hralign="center" o:hrstd="t" o:hr="t" fillcolor="#a0a0a0" stroked="f"/>
+          <v:rect id="_x0000_i1044" style="width:0;height:1.5pt" o:hralign="center" o:hrstd="t" o:hr="t" fillcolor="#a0a0a0" stroked="f"/>
         </w:pict>
       </w:r>
     </w:p>
@@ -2552,29 +2530,7 @@
           <w:szCs w:val="28"/>
           <w:u w:val="single"/>
         </w:rPr>
-        <w:t>4️</w:t>
-      </w:r>
-      <w:r>
-        <w:rPr>
-          <w:rFonts w:cstheme="minorHAnsi"/>
-          <w:b/>
-          <w:bCs/>
-          <w:sz w:val="28"/>
-          <w:szCs w:val="28"/>
-          <w:u w:val="single"/>
-        </w:rPr>
-        <w:t xml:space="preserve">) </w:t>
-      </w:r>
-      <w:r>
-        <w:rPr>
-          <w:rFonts w:cstheme="minorHAnsi"/>
-          <w:b/>
-          <w:bCs/>
-          <w:sz w:val="28"/>
-          <w:szCs w:val="28"/>
-          <w:u w:val="single"/>
-        </w:rPr>
-        <w:t>¿Se puede evaluar el resultado?</w:t>
+        <w:t>4️) ¿Se puede evaluar el resultado?</w:t>
       </w:r>
     </w:p>
     <w:p>
@@ -2657,7 +2613,7 @@
     <w:p>
       <w:r>
         <w:pict w14:anchorId="097B5E5F">
-          <v:rect id="_x0000_i1135" style="width:0;height:1.5pt" o:hralign="center" o:hrstd="t" o:hr="t" fillcolor="#a0a0a0" stroked="f"/>
+          <v:rect id="_x0000_i1045" style="width:0;height:1.5pt" o:hralign="center" o:hrstd="t" o:hr="t" fillcolor="#a0a0a0" stroked="f"/>
         </w:pict>
       </w:r>
     </w:p>
@@ -2681,29 +2637,7 @@
           <w:szCs w:val="28"/>
           <w:u w:val="single"/>
         </w:rPr>
-        <w:t>5️</w:t>
-      </w:r>
-      <w:r>
-        <w:rPr>
-          <w:rFonts w:cstheme="minorHAnsi"/>
-          <w:b/>
-          <w:bCs/>
-          <w:sz w:val="28"/>
-          <w:szCs w:val="28"/>
-          <w:u w:val="single"/>
-        </w:rPr>
-        <w:t xml:space="preserve">) </w:t>
-      </w:r>
-      <w:r>
-        <w:rPr>
-          <w:rFonts w:cstheme="minorHAnsi"/>
-          <w:b/>
-          <w:bCs/>
-          <w:sz w:val="28"/>
-          <w:szCs w:val="28"/>
-          <w:u w:val="single"/>
-        </w:rPr>
-        <w:t>¿IA es realmente necesaria?</w:t>
+        <w:t>5️) ¿IA es realmente necesaria?</w:t>
       </w:r>
     </w:p>
     <w:p>
@@ -2751,7 +2685,7 @@
     <w:p>
       <w:r>
         <w:pict w14:anchorId="5CE016E3">
-          <v:rect id="_x0000_i1136" style="width:0;height:1.5pt" o:hralign="center" o:hrstd="t" o:hr="t" fillcolor="#a0a0a0" stroked="f"/>
+          <v:rect id="_x0000_i1046" style="width:0;height:1.5pt" o:hralign="center" o:hrstd="t" o:hr="t" fillcolor="#a0a0a0" stroked="f"/>
         </w:pict>
       </w:r>
     </w:p>
@@ -2871,44 +2805,849 @@
     </w:p>
     <w:p>
       <w:r>
-        <w:t>Problema →</w:t>
-      </w:r>
-      <w:r>
-        <w:t xml:space="preserve"> La verdad es que no es un problema, es un agregado o un detalle, no es algo a solucionar.</w:t>
-      </w:r>
-    </w:p>
-    <w:p>
-      <w:r>
-        <w:t>Datos →</w:t>
-      </w:r>
-      <w:r>
-        <w:t xml:space="preserve"> Seria complicado porque depende de el gusto de cada persona y en cada momento, hoy le puede gustar un tipo de ropa y mañana otra.</w:t>
-      </w:r>
-    </w:p>
-    <w:p>
-      <w:r>
-        <w:t>Frecuencia →</w:t>
-      </w:r>
-      <w:r>
-        <w:t xml:space="preserve"> Se repite una vez al día y ese es el caso que todos los días el usuario quiera preguntar como vestir, así que se utilizaría muy poco.</w:t>
-      </w:r>
-    </w:p>
-    <w:p>
-      <w:r>
-        <w:t>Evaluación →</w:t>
-      </w:r>
-      <w:r>
-        <w:t xml:space="preserve"> Muy difícil de evaluar porque es un tema más subjetivo.</w:t>
-      </w:r>
-    </w:p>
-    <w:p>
-      <w:r>
-        <w:t>¿Vale la pena? →</w:t>
-      </w:r>
-      <w:r>
-        <w:t xml:space="preserve"> No vale la pena porque no es un problema a resolver y también es difícil de evaluar</w:t>
-      </w:r>
-    </w:p>
+        <w:t>Problema → La verdad es que no es un problema, es un agregado o un detalle, no es algo a solucionar.</w:t>
+      </w:r>
+    </w:p>
+    <w:p>
+      <w:r>
+        <w:t>Datos → Seria complicado porque depende de el gusto de cada persona y en cada momento, hoy le puede gustar un tipo de ropa y mañana otra.</w:t>
+      </w:r>
+    </w:p>
+    <w:p>
+      <w:r>
+        <w:t>Frecuencia → Se repite una vez al día y ese es el caso que todos los días el usuario quiera preguntar como vestir, así que se utilizaría muy poco.</w:t>
+      </w:r>
+    </w:p>
+    <w:p>
+      <w:r>
+        <w:t>Evaluación → Muy difícil de evaluar porque es un tema más subjetivo.</w:t>
+      </w:r>
+    </w:p>
+    <w:p>
+      <w:r>
+        <w:t>¿Vale la pena? → No vale la pena porque no es un problema a resolver y también es difícil de evaluar</w:t>
+      </w:r>
+    </w:p>
+    <w:p/>
+    <w:p>
+      <w:pPr>
+        <w:rPr>
+          <w:b/>
+          <w:bCs/>
+          <w:sz w:val="36"/>
+          <w:szCs w:val="36"/>
+          <w:u w:val="single"/>
+        </w:rPr>
+      </w:pPr>
+      <w:r>
+        <w:rPr>
+          <w:b/>
+          <w:bCs/>
+          <w:sz w:val="36"/>
+          <w:szCs w:val="36"/>
+          <w:u w:val="single"/>
+        </w:rPr>
+        <w:t>Cómo transformar una idea simple en un proyecto de IA potente</w:t>
+      </w:r>
+    </w:p>
+    <w:p>
+      <w:pPr>
+        <w:rPr>
+          <w:rFonts w:cstheme="minorHAnsi"/>
+          <w:b/>
+          <w:bCs/>
+          <w:sz w:val="28"/>
+          <w:szCs w:val="28"/>
+          <w:u w:val="single"/>
+        </w:rPr>
+      </w:pPr>
+      <w:r>
+        <w:rPr>
+          <w:rFonts w:cstheme="minorHAnsi"/>
+          <w:b/>
+          <w:bCs/>
+          <w:sz w:val="28"/>
+          <w:szCs w:val="28"/>
+          <w:u w:val="single"/>
+        </w:rPr>
+        <w:t>1️</w:t>
+      </w:r>
+      <w:r>
+        <w:rPr>
+          <w:rFonts w:cstheme="minorHAnsi"/>
+          <w:b/>
+          <w:bCs/>
+          <w:sz w:val="28"/>
+          <w:szCs w:val="28"/>
+          <w:u w:val="single"/>
+        </w:rPr>
+        <w:t xml:space="preserve">) </w:t>
+      </w:r>
+      <w:r>
+        <w:rPr>
+          <w:rFonts w:cstheme="minorHAnsi"/>
+          <w:b/>
+          <w:bCs/>
+          <w:sz w:val="28"/>
+          <w:szCs w:val="28"/>
+          <w:u w:val="single"/>
+        </w:rPr>
+        <w:t>Idea simple</w:t>
+      </w:r>
+    </w:p>
+    <w:p>
+      <w:r>
+        <w:t>Ejemplo:</w:t>
+      </w:r>
+    </w:p>
+    <w:p>
+      <w:r>
+        <w:t xml:space="preserve">“Analizar </w:t>
+      </w:r>
+      <w:proofErr w:type="spellStart"/>
+      <w:r>
+        <w:t>CVs</w:t>
+      </w:r>
+      <w:proofErr w:type="spellEnd"/>
+      <w:r>
+        <w:t xml:space="preserve"> automáticamente”</w:t>
+      </w:r>
+    </w:p>
+    <w:p>
+      <w:r>
+        <w:t>Esto es una idea común.</w:t>
+      </w:r>
+    </w:p>
+    <w:p>
+      <w:r>
+        <w:t xml:space="preserve">Pero </w:t>
+      </w:r>
+      <w:proofErr w:type="spellStart"/>
+      <w:r>
+        <w:t>así</w:t>
+      </w:r>
+      <w:proofErr w:type="spellEnd"/>
+      <w:r>
+        <w:t xml:space="preserve"> sola </w:t>
+      </w:r>
+      <w:r>
+        <w:rPr>
+          <w:b/>
+          <w:bCs/>
+        </w:rPr>
+        <w:t>no es un sistema potente</w:t>
+      </w:r>
+      <w:r>
+        <w:t>.</w:t>
+      </w:r>
+    </w:p>
+    <w:p>
+      <w:r>
+        <w:pict w14:anchorId="004E32EB">
+          <v:rect id="_x0000_i1137" style="width:0;height:1.5pt" o:hralign="center" o:hrstd="t" o:hr="t" fillcolor="#a0a0a0" stroked="f"/>
+        </w:pict>
+      </w:r>
+    </w:p>
+    <w:p>
+      <w:pPr>
+        <w:rPr>
+          <w:rFonts w:cstheme="minorHAnsi"/>
+          <w:b/>
+          <w:bCs/>
+          <w:sz w:val="28"/>
+          <w:szCs w:val="28"/>
+          <w:u w:val="single"/>
+        </w:rPr>
+      </w:pPr>
+      <w:r>
+        <w:rPr>
+          <w:rFonts w:cstheme="minorHAnsi"/>
+          <w:b/>
+          <w:bCs/>
+          <w:sz w:val="28"/>
+          <w:szCs w:val="28"/>
+          <w:u w:val="single"/>
+        </w:rPr>
+        <w:t>2️</w:t>
+      </w:r>
+      <w:r>
+        <w:rPr>
+          <w:rFonts w:cstheme="minorHAnsi"/>
+          <w:b/>
+          <w:bCs/>
+          <w:sz w:val="28"/>
+          <w:szCs w:val="28"/>
+          <w:u w:val="single"/>
+        </w:rPr>
+        <w:t xml:space="preserve">) </w:t>
+      </w:r>
+      <w:r>
+        <w:rPr>
+          <w:rFonts w:cstheme="minorHAnsi"/>
+          <w:b/>
+          <w:bCs/>
+          <w:sz w:val="28"/>
+          <w:szCs w:val="28"/>
+          <w:u w:val="single"/>
+        </w:rPr>
+        <w:t>Identificar las partes del problema</w:t>
+      </w:r>
+    </w:p>
+    <w:p>
+      <w:r>
+        <w:t>Un sistema de CV podría necesitar:</w:t>
+      </w:r>
+    </w:p>
+    <w:p>
+      <w:pPr>
+        <w:numPr>
+          <w:ilvl w:val="0"/>
+          <w:numId w:val="22"/>
+        </w:numPr>
+      </w:pPr>
+      <w:r>
+        <w:t xml:space="preserve">leer </w:t>
+      </w:r>
+      <w:proofErr w:type="spellStart"/>
+      <w:r>
+        <w:t>CVs</w:t>
+      </w:r>
+      <w:proofErr w:type="spellEnd"/>
+    </w:p>
+    <w:p>
+      <w:pPr>
+        <w:numPr>
+          <w:ilvl w:val="0"/>
+          <w:numId w:val="22"/>
+        </w:numPr>
+      </w:pPr>
+      <w:r>
+        <w:t>extraer información</w:t>
+      </w:r>
+    </w:p>
+    <w:p>
+      <w:pPr>
+        <w:numPr>
+          <w:ilvl w:val="0"/>
+          <w:numId w:val="22"/>
+        </w:numPr>
+      </w:pPr>
+      <w:r>
+        <w:t>evaluar candidatos</w:t>
+      </w:r>
+    </w:p>
+    <w:p>
+      <w:pPr>
+        <w:numPr>
+          <w:ilvl w:val="0"/>
+          <w:numId w:val="22"/>
+        </w:numPr>
+      </w:pPr>
+      <w:r>
+        <w:t>ordenar candidatos</w:t>
+      </w:r>
+    </w:p>
+    <w:p>
+      <w:pPr>
+        <w:numPr>
+          <w:ilvl w:val="0"/>
+          <w:numId w:val="22"/>
+        </w:numPr>
+      </w:pPr>
+      <w:r>
+        <w:t>explicar decisiones</w:t>
+      </w:r>
+    </w:p>
+    <w:p>
+      <w:r>
+        <w:t xml:space="preserve">Ahí ya aparecen </w:t>
+      </w:r>
+      <w:r>
+        <w:rPr>
+          <w:b/>
+          <w:bCs/>
+        </w:rPr>
+        <w:t>varios tipos de IA</w:t>
+      </w:r>
+      <w:r>
+        <w:t>.</w:t>
+      </w:r>
+    </w:p>
+    <w:p>
+      <w:r>
+        <w:pict w14:anchorId="53042388">
+          <v:rect id="_x0000_i1138" style="width:0;height:1.5pt" o:hralign="center" o:hrstd="t" o:hr="t" fillcolor="#a0a0a0" stroked="f"/>
+        </w:pict>
+      </w:r>
+    </w:p>
+    <w:p>
+      <w:pPr>
+        <w:rPr>
+          <w:rFonts w:cstheme="minorHAnsi"/>
+          <w:b/>
+          <w:bCs/>
+          <w:sz w:val="28"/>
+          <w:szCs w:val="28"/>
+          <w:u w:val="single"/>
+        </w:rPr>
+      </w:pPr>
+      <w:r>
+        <w:rPr>
+          <w:rFonts w:cstheme="minorHAnsi"/>
+          <w:b/>
+          <w:bCs/>
+          <w:sz w:val="28"/>
+          <w:szCs w:val="28"/>
+          <w:u w:val="single"/>
+        </w:rPr>
+        <w:t>3️</w:t>
+      </w:r>
+      <w:r>
+        <w:rPr>
+          <w:rFonts w:cstheme="minorHAnsi"/>
+          <w:b/>
+          <w:bCs/>
+          <w:sz w:val="28"/>
+          <w:szCs w:val="28"/>
+          <w:u w:val="single"/>
+        </w:rPr>
+        <w:t xml:space="preserve">) </w:t>
+      </w:r>
+      <w:r>
+        <w:rPr>
+          <w:rFonts w:cstheme="minorHAnsi"/>
+          <w:b/>
+          <w:bCs/>
+          <w:sz w:val="28"/>
+          <w:szCs w:val="28"/>
+          <w:u w:val="single"/>
+        </w:rPr>
+        <w:t>Convertirlo en sistema</w:t>
+      </w:r>
+    </w:p>
+    <w:p>
+      <w:r>
+        <w:t>Arquitectura posible:</w:t>
+      </w:r>
+    </w:p>
+    <w:p>
+      <w:r>
+        <w:t>Input → CV</w:t>
+      </w:r>
+      <w:r>
+        <w:br/>
+        <w:t>↓</w:t>
+      </w:r>
+      <w:r>
+        <w:br/>
+      </w:r>
+      <w:r>
+        <w:lastRenderedPageBreak/>
+        <w:t>LLM → extraer información</w:t>
+      </w:r>
+      <w:r>
+        <w:br/>
+        <w:t>↓</w:t>
+      </w:r>
+      <w:r>
+        <w:br/>
+        <w:t>ML → score del candidato</w:t>
+      </w:r>
+      <w:r>
+        <w:br/>
+        <w:t>↓</w:t>
+      </w:r>
+      <w:r>
+        <w:br/>
+        <w:t>Ranking → ordenar candidatos</w:t>
+      </w:r>
+      <w:r>
+        <w:br/>
+        <w:t>↓</w:t>
+      </w:r>
+      <w:r>
+        <w:br/>
+        <w:t>LLM → explicar el resultado</w:t>
+      </w:r>
+    </w:p>
+    <w:p>
+      <w:r>
+        <w:t xml:space="preserve">Esto ya es un </w:t>
+      </w:r>
+      <w:r>
+        <w:rPr>
+          <w:b/>
+          <w:bCs/>
+        </w:rPr>
+        <w:t>sistema híbrido</w:t>
+      </w:r>
+      <w:r>
+        <w:t>.</w:t>
+      </w:r>
+    </w:p>
+    <w:p>
+      <w:r>
+        <w:pict w14:anchorId="60D40128">
+          <v:rect id="_x0000_i1139" style="width:0;height:1.5pt" o:hralign="center" o:hrstd="t" o:hr="t" fillcolor="#a0a0a0" stroked="f"/>
+        </w:pict>
+      </w:r>
+    </w:p>
+    <w:p>
+      <w:pPr>
+        <w:rPr>
+          <w:rFonts w:cstheme="minorHAnsi"/>
+          <w:b/>
+          <w:bCs/>
+          <w:sz w:val="28"/>
+          <w:szCs w:val="28"/>
+          <w:u w:val="single"/>
+        </w:rPr>
+      </w:pPr>
+      <w:r>
+        <w:rPr>
+          <w:rFonts w:cstheme="minorHAnsi"/>
+          <w:b/>
+          <w:bCs/>
+          <w:sz w:val="28"/>
+          <w:szCs w:val="28"/>
+          <w:u w:val="single"/>
+        </w:rPr>
+        <w:t>4️</w:t>
+      </w:r>
+      <w:r>
+        <w:rPr>
+          <w:rFonts w:cstheme="minorHAnsi"/>
+          <w:b/>
+          <w:bCs/>
+          <w:sz w:val="28"/>
+          <w:szCs w:val="28"/>
+          <w:u w:val="single"/>
+        </w:rPr>
+        <w:t xml:space="preserve">) </w:t>
+      </w:r>
+      <w:r>
+        <w:rPr>
+          <w:rFonts w:cstheme="minorHAnsi"/>
+          <w:b/>
+          <w:bCs/>
+          <w:sz w:val="28"/>
+          <w:szCs w:val="28"/>
+          <w:u w:val="single"/>
+        </w:rPr>
+        <w:t>Agregar contexto (RAG)</w:t>
+      </w:r>
+    </w:p>
+    <w:p>
+      <w:r>
+        <w:t>Ahora agregamos conocimiento externo.</w:t>
+      </w:r>
+    </w:p>
+    <w:p>
+      <w:r>
+        <w:t>Por ejemplo:</w:t>
+      </w:r>
+    </w:p>
+    <w:p>
+      <w:pPr>
+        <w:numPr>
+          <w:ilvl w:val="0"/>
+          <w:numId w:val="23"/>
+        </w:numPr>
+      </w:pPr>
+      <w:r>
+        <w:t>descripción del puesto</w:t>
+      </w:r>
+    </w:p>
+    <w:p>
+      <w:pPr>
+        <w:numPr>
+          <w:ilvl w:val="0"/>
+          <w:numId w:val="23"/>
+        </w:numPr>
+      </w:pPr>
+      <w:r>
+        <w:t>requisitos del rol</w:t>
+      </w:r>
+    </w:p>
+    <w:p>
+      <w:pPr>
+        <w:numPr>
+          <w:ilvl w:val="0"/>
+          <w:numId w:val="23"/>
+        </w:numPr>
+      </w:pPr>
+      <w:r>
+        <w:t>cultura de la empresa</w:t>
+      </w:r>
+    </w:p>
+    <w:p>
+      <w:r>
+        <w:t>Entonces:</w:t>
+      </w:r>
+    </w:p>
+    <w:p>
+      <w:r>
+        <w:t>Input → CV</w:t>
+      </w:r>
+      <w:r>
+        <w:br/>
+        <w:t>↓</w:t>
+      </w:r>
+      <w:r>
+        <w:br/>
+        <w:t>RAG → descripción del puesto</w:t>
+      </w:r>
+      <w:r>
+        <w:br/>
+        <w:t>↓</w:t>
+      </w:r>
+      <w:r>
+        <w:br/>
+        <w:t>LLM → extracción de datos</w:t>
+      </w:r>
+      <w:r>
+        <w:br/>
+        <w:t>↓</w:t>
+      </w:r>
+      <w:r>
+        <w:br/>
+        <w:t xml:space="preserve">ML → </w:t>
+      </w:r>
+      <w:proofErr w:type="spellStart"/>
+      <w:r>
+        <w:t>scoring</w:t>
+      </w:r>
+      <w:proofErr w:type="spellEnd"/>
+      <w:r>
+        <w:br/>
+        <w:t>↓</w:t>
+      </w:r>
+      <w:r>
+        <w:br/>
+        <w:t>LLM → explicación</w:t>
+      </w:r>
+    </w:p>
+    <w:p>
+      <w:r>
+        <w:pict w14:anchorId="403D4136">
+          <v:rect id="_x0000_i1140" style="width:0;height:1.5pt" o:hralign="center" o:hrstd="t" o:hr="t" fillcolor="#a0a0a0" stroked="f"/>
+        </w:pict>
+      </w:r>
+    </w:p>
+    <w:p>
+      <w:pPr>
+        <w:rPr>
+          <w:rFonts w:cstheme="minorHAnsi"/>
+          <w:b/>
+          <w:bCs/>
+          <w:sz w:val="28"/>
+          <w:szCs w:val="28"/>
+          <w:u w:val="single"/>
+        </w:rPr>
+      </w:pPr>
+      <w:r>
+        <w:rPr>
+          <w:rFonts w:cstheme="minorHAnsi"/>
+          <w:b/>
+          <w:bCs/>
+          <w:sz w:val="28"/>
+          <w:szCs w:val="28"/>
+          <w:u w:val="single"/>
+        </w:rPr>
+        <w:t>5️</w:t>
+      </w:r>
+      <w:r>
+        <w:rPr>
+          <w:rFonts w:cstheme="minorHAnsi"/>
+          <w:b/>
+          <w:bCs/>
+          <w:sz w:val="28"/>
+          <w:szCs w:val="28"/>
+          <w:u w:val="single"/>
+        </w:rPr>
+        <w:t xml:space="preserve">) </w:t>
+      </w:r>
+      <w:r>
+        <w:rPr>
+          <w:rFonts w:cstheme="minorHAnsi"/>
+          <w:b/>
+          <w:bCs/>
+          <w:sz w:val="28"/>
+          <w:szCs w:val="28"/>
+          <w:u w:val="single"/>
+        </w:rPr>
+        <w:t>Agregar memoria</w:t>
+      </w:r>
+    </w:p>
+    <w:p>
+      <w:r>
+        <w:t>El sistema puede aprender:</w:t>
+      </w:r>
+    </w:p>
+    <w:p>
+      <w:pPr>
+        <w:numPr>
+          <w:ilvl w:val="0"/>
+          <w:numId w:val="24"/>
+        </w:numPr>
+      </w:pPr>
+      <w:r>
+        <w:t>qué candidatos fueron contratados</w:t>
+      </w:r>
+    </w:p>
+    <w:p>
+      <w:pPr>
+        <w:numPr>
+          <w:ilvl w:val="0"/>
+          <w:numId w:val="24"/>
+        </w:numPr>
+      </w:pPr>
+      <w:r>
+        <w:t>qué perfiles funcionaron mejor</w:t>
+      </w:r>
+    </w:p>
+    <w:p>
+      <w:r>
+        <w:t>Esto mejora el modelo.</w:t>
+      </w:r>
+    </w:p>
+    <w:p>
+      <w:r>
+        <w:pict w14:anchorId="08FB7AC1">
+          <v:rect id="_x0000_i1141" style="width:0;height:1.5pt" o:hralign="center" o:hrstd="t" o:hr="t" fillcolor="#a0a0a0" stroked="f"/>
+        </w:pict>
+      </w:r>
+    </w:p>
+    <w:p>
+      <w:pPr>
+        <w:rPr>
+          <w:rFonts w:cstheme="minorHAnsi"/>
+          <w:b/>
+          <w:bCs/>
+          <w:sz w:val="28"/>
+          <w:szCs w:val="28"/>
+          <w:u w:val="single"/>
+        </w:rPr>
+      </w:pPr>
+      <w:r>
+        <w:rPr>
+          <w:rFonts w:cstheme="minorHAnsi"/>
+          <w:b/>
+          <w:bCs/>
+          <w:sz w:val="28"/>
+          <w:szCs w:val="28"/>
+          <w:u w:val="single"/>
+        </w:rPr>
+        <w:t>Resultado final</w:t>
+      </w:r>
+    </w:p>
+    <w:p>
+      <w:r>
+        <w:t>Lo que empezó como:</w:t>
+      </w:r>
+    </w:p>
+    <w:p>
+      <w:r>
+        <w:t xml:space="preserve">“analizar </w:t>
+      </w:r>
+      <w:proofErr w:type="spellStart"/>
+      <w:r>
+        <w:t>CVs</w:t>
+      </w:r>
+      <w:proofErr w:type="spellEnd"/>
+      <w:r>
+        <w:t>”</w:t>
+      </w:r>
+    </w:p>
+    <w:p>
+      <w:r>
+        <w:lastRenderedPageBreak/>
+        <w:t>termina siendo:</w:t>
+      </w:r>
+    </w:p>
+    <w:p>
+      <w:r>
+        <w:rPr>
+          <w:b/>
+          <w:bCs/>
+        </w:rPr>
+        <w:t>un sistema de selección inteligente de candidatos</w:t>
+      </w:r>
+    </w:p>
+    <w:p>
+      <w:r>
+        <w:pict w14:anchorId="32A0F231">
+          <v:rect id="_x0000_i1142" style="width:0;height:1.5pt" o:hralign="center" o:hrstd="t" o:hr="t" fillcolor="#a0a0a0" stroked="f"/>
+        </w:pict>
+      </w:r>
+    </w:p>
+    <w:p>
+      <w:pPr>
+        <w:rPr>
+          <w:rFonts w:cstheme="minorHAnsi"/>
+          <w:b/>
+          <w:bCs/>
+          <w:sz w:val="28"/>
+          <w:szCs w:val="28"/>
+          <w:u w:val="single"/>
+        </w:rPr>
+      </w:pPr>
+      <w:r>
+        <w:rPr>
+          <w:rFonts w:ascii="Segoe UI Emoji" w:hAnsi="Segoe UI Emoji" w:cs="Segoe UI Emoji"/>
+          <w:b/>
+          <w:bCs/>
+          <w:sz w:val="28"/>
+          <w:szCs w:val="28"/>
+          <w:u w:val="single"/>
+        </w:rPr>
+        <w:t>📌</w:t>
+      </w:r>
+      <w:r>
+        <w:rPr>
+          <w:rFonts w:cstheme="minorHAnsi"/>
+          <w:b/>
+          <w:bCs/>
+          <w:sz w:val="28"/>
+          <w:szCs w:val="28"/>
+          <w:u w:val="single"/>
+        </w:rPr>
+        <w:t xml:space="preserve"> Patrón importante</w:t>
+      </w:r>
+    </w:p>
+    <w:p>
+      <w:r>
+        <w:t>Las ideas potentes siguen este patrón:</w:t>
+      </w:r>
+    </w:p>
+    <w:p>
+      <w:r>
+        <w:t>Idea simple</w:t>
+      </w:r>
+      <w:r>
+        <w:br/>
+        <w:t>↓</w:t>
+      </w:r>
+      <w:r>
+        <w:br/>
+        <w:t>Identificar subtareas</w:t>
+      </w:r>
+      <w:r>
+        <w:br/>
+        <w:t>↓</w:t>
+      </w:r>
+      <w:r>
+        <w:br/>
+        <w:t>Asignar IA correcta</w:t>
+      </w:r>
+      <w:r>
+        <w:br/>
+        <w:t>↓</w:t>
+      </w:r>
+      <w:r>
+        <w:br/>
+        <w:t>Construir arquitectura</w:t>
+      </w:r>
+    </w:p>
+    <w:p/>
+    <w:p>
+      <w:pPr>
+        <w:rPr>
+          <w:b/>
+          <w:bCs/>
+          <w:sz w:val="28"/>
+          <w:szCs w:val="28"/>
+          <w:u w:val="single"/>
+        </w:rPr>
+      </w:pPr>
+      <w:r>
+        <w:rPr>
+          <w:b/>
+          <w:bCs/>
+          <w:sz w:val="28"/>
+          <w:szCs w:val="28"/>
+          <w:u w:val="single"/>
+        </w:rPr>
+        <w:t>Mini ejercicio</w:t>
+      </w:r>
+    </w:p>
+    <w:p>
+      <w:r>
+        <w:t>Te doy otra idea simple:</w:t>
+      </w:r>
+    </w:p>
+    <w:p>
+      <w:r>
+        <w:t>“Leer contratos automáticamente”</w:t>
+      </w:r>
+    </w:p>
+    <w:p>
+      <w:proofErr w:type="spellStart"/>
+      <w:r>
+        <w:t>Transformala</w:t>
+      </w:r>
+      <w:proofErr w:type="spellEnd"/>
+      <w:r>
+        <w:t xml:space="preserve"> en un sistema de IA.</w:t>
+      </w:r>
+    </w:p>
+    <w:p>
+      <w:pPr>
+        <w:rPr>
+          <w:b/>
+          <w:bCs/>
+          <w:u w:val="single"/>
+        </w:rPr>
+      </w:pPr>
+      <w:r>
+        <w:rPr>
+          <w:b/>
+          <w:bCs/>
+          <w:u w:val="single"/>
+        </w:rPr>
+        <w:t>Respuesta:</w:t>
+      </w:r>
+    </w:p>
+    <w:p>
+      <w:r>
+        <w:t>Input →</w:t>
+      </w:r>
+      <w:r>
+        <w:t xml:space="preserve"> contratos</w:t>
+      </w:r>
+      <w:r>
+        <w:br/>
+        <w:t>LLM →</w:t>
+      </w:r>
+      <w:r>
+        <w:t xml:space="preserve"> extracción de datos y explicación </w:t>
+      </w:r>
+      <w:r>
+        <w:br/>
+        <w:t>ML →</w:t>
+      </w:r>
+      <w:r>
+        <w:t xml:space="preserve"> Evaluar importancia del contenido</w:t>
+      </w:r>
+      <w:r>
+        <w:br/>
+        <w:t>RAG →</w:t>
+      </w:r>
+      <w:r>
+        <w:t xml:space="preserve"> Leyes aplicadas</w:t>
+      </w:r>
+      <w:r>
+        <w:br/>
+        <w:t>Resultado →</w:t>
+      </w:r>
+      <w:r>
+        <w:t xml:space="preserve"> </w:t>
+      </w:r>
+      <w:r>
+        <w:t xml:space="preserve">Sistema en el que lee, resume y categoriza los contratos </w:t>
+      </w:r>
+    </w:p>
+    <w:p/>
     <w:p/>
     <w:p/>
     <w:p/>
@@ -3522,6 +4261,155 @@
     </w:lvl>
   </w:abstractNum>
   <w:abstractNum w:abstractNumId="4" w15:restartNumberingAfterBreak="0">
+    <w:nsid w:val="15EB15B1"/>
+    <w:multiLevelType w:val="multilevel"/>
+    <w:tmpl w:val="C91E09EE"/>
+    <w:lvl w:ilvl="0">
+      <w:start w:val="1"/>
+      <w:numFmt w:val="bullet"/>
+      <w:lvlText w:val=""/>
+      <w:lvlJc w:val="left"/>
+      <w:pPr>
+        <w:tabs>
+          <w:tab w:val="num" w:pos="720"/>
+        </w:tabs>
+        <w:ind w:left="720" w:hanging="360"/>
+      </w:pPr>
+      <w:rPr>
+        <w:rFonts w:ascii="Symbol" w:hAnsi="Symbol" w:hint="default"/>
+        <w:sz w:val="20"/>
+      </w:rPr>
+    </w:lvl>
+    <w:lvl w:ilvl="1" w:tentative="1">
+      <w:start w:val="1"/>
+      <w:numFmt w:val="bullet"/>
+      <w:lvlText w:val="o"/>
+      <w:lvlJc w:val="left"/>
+      <w:pPr>
+        <w:tabs>
+          <w:tab w:val="num" w:pos="1440"/>
+        </w:tabs>
+        <w:ind w:left="1440" w:hanging="360"/>
+      </w:pPr>
+      <w:rPr>
+        <w:rFonts w:ascii="Courier New" w:hAnsi="Courier New" w:hint="default"/>
+        <w:sz w:val="20"/>
+      </w:rPr>
+    </w:lvl>
+    <w:lvl w:ilvl="2" w:tentative="1">
+      <w:start w:val="1"/>
+      <w:numFmt w:val="bullet"/>
+      <w:lvlText w:val=""/>
+      <w:lvlJc w:val="left"/>
+      <w:pPr>
+        <w:tabs>
+          <w:tab w:val="num" w:pos="2160"/>
+        </w:tabs>
+        <w:ind w:left="2160" w:hanging="360"/>
+      </w:pPr>
+      <w:rPr>
+        <w:rFonts w:ascii="Wingdings" w:hAnsi="Wingdings" w:hint="default"/>
+        <w:sz w:val="20"/>
+      </w:rPr>
+    </w:lvl>
+    <w:lvl w:ilvl="3" w:tentative="1">
+      <w:start w:val="1"/>
+      <w:numFmt w:val="bullet"/>
+      <w:lvlText w:val=""/>
+      <w:lvlJc w:val="left"/>
+      <w:pPr>
+        <w:tabs>
+          <w:tab w:val="num" w:pos="2880"/>
+        </w:tabs>
+        <w:ind w:left="2880" w:hanging="360"/>
+      </w:pPr>
+      <w:rPr>
+        <w:rFonts w:ascii="Wingdings" w:hAnsi="Wingdings" w:hint="default"/>
+        <w:sz w:val="20"/>
+      </w:rPr>
+    </w:lvl>
+    <w:lvl w:ilvl="4" w:tentative="1">
+      <w:start w:val="1"/>
+      <w:numFmt w:val="bullet"/>
+      <w:lvlText w:val=""/>
+      <w:lvlJc w:val="left"/>
+      <w:pPr>
+        <w:tabs>
+          <w:tab w:val="num" w:pos="3600"/>
+        </w:tabs>
+        <w:ind w:left="3600" w:hanging="360"/>
+      </w:pPr>
+      <w:rPr>
+        <w:rFonts w:ascii="Wingdings" w:hAnsi="Wingdings" w:hint="default"/>
+        <w:sz w:val="20"/>
+      </w:rPr>
+    </w:lvl>
+    <w:lvl w:ilvl="5" w:tentative="1">
+      <w:start w:val="1"/>
+      <w:numFmt w:val="bullet"/>
+      <w:lvlText w:val=""/>
+      <w:lvlJc w:val="left"/>
+      <w:pPr>
+        <w:tabs>
+          <w:tab w:val="num" w:pos="4320"/>
+        </w:tabs>
+        <w:ind w:left="4320" w:hanging="360"/>
+      </w:pPr>
+      <w:rPr>
+        <w:rFonts w:ascii="Wingdings" w:hAnsi="Wingdings" w:hint="default"/>
+        <w:sz w:val="20"/>
+      </w:rPr>
+    </w:lvl>
+    <w:lvl w:ilvl="6" w:tentative="1">
+      <w:start w:val="1"/>
+      <w:numFmt w:val="bullet"/>
+      <w:lvlText w:val=""/>
+      <w:lvlJc w:val="left"/>
+      <w:pPr>
+        <w:tabs>
+          <w:tab w:val="num" w:pos="5040"/>
+        </w:tabs>
+        <w:ind w:left="5040" w:hanging="360"/>
+      </w:pPr>
+      <w:rPr>
+        <w:rFonts w:ascii="Wingdings" w:hAnsi="Wingdings" w:hint="default"/>
+        <w:sz w:val="20"/>
+      </w:rPr>
+    </w:lvl>
+    <w:lvl w:ilvl="7" w:tentative="1">
+      <w:start w:val="1"/>
+      <w:numFmt w:val="bullet"/>
+      <w:lvlText w:val=""/>
+      <w:lvlJc w:val="left"/>
+      <w:pPr>
+        <w:tabs>
+          <w:tab w:val="num" w:pos="5760"/>
+        </w:tabs>
+        <w:ind w:left="5760" w:hanging="360"/>
+      </w:pPr>
+      <w:rPr>
+        <w:rFonts w:ascii="Wingdings" w:hAnsi="Wingdings" w:hint="default"/>
+        <w:sz w:val="20"/>
+      </w:rPr>
+    </w:lvl>
+    <w:lvl w:ilvl="8" w:tentative="1">
+      <w:start w:val="1"/>
+      <w:numFmt w:val="bullet"/>
+      <w:lvlText w:val=""/>
+      <w:lvlJc w:val="left"/>
+      <w:pPr>
+        <w:tabs>
+          <w:tab w:val="num" w:pos="6480"/>
+        </w:tabs>
+        <w:ind w:left="6480" w:hanging="360"/>
+      </w:pPr>
+      <w:rPr>
+        <w:rFonts w:ascii="Wingdings" w:hAnsi="Wingdings" w:hint="default"/>
+        <w:sz w:val="20"/>
+      </w:rPr>
+    </w:lvl>
+  </w:abstractNum>
+  <w:abstractNum w:abstractNumId="5" w15:restartNumberingAfterBreak="0">
     <w:nsid w:val="168C1C14"/>
     <w:multiLevelType w:val="multilevel"/>
     <w:tmpl w:val="DE145FA8"/>
@@ -3670,7 +4558,7 @@
       </w:rPr>
     </w:lvl>
   </w:abstractNum>
-  <w:abstractNum w:abstractNumId="5" w15:restartNumberingAfterBreak="0">
+  <w:abstractNum w:abstractNumId="6" w15:restartNumberingAfterBreak="0">
     <w:nsid w:val="1E62487A"/>
     <w:multiLevelType w:val="multilevel"/>
     <w:tmpl w:val="89003A2C"/>
@@ -3819,7 +4707,7 @@
       </w:rPr>
     </w:lvl>
   </w:abstractNum>
-  <w:abstractNum w:abstractNumId="6" w15:restartNumberingAfterBreak="0">
+  <w:abstractNum w:abstractNumId="7" w15:restartNumberingAfterBreak="0">
     <w:nsid w:val="23B50855"/>
     <w:multiLevelType w:val="multilevel"/>
     <w:tmpl w:val="B6E64CE6"/>
@@ -3968,7 +4856,7 @@
       </w:rPr>
     </w:lvl>
   </w:abstractNum>
-  <w:abstractNum w:abstractNumId="7" w15:restartNumberingAfterBreak="0">
+  <w:abstractNum w:abstractNumId="8" w15:restartNumberingAfterBreak="0">
     <w:nsid w:val="24DC500A"/>
     <w:multiLevelType w:val="multilevel"/>
     <w:tmpl w:val="A5D4323C"/>
@@ -4117,7 +5005,7 @@
       </w:rPr>
     </w:lvl>
   </w:abstractNum>
-  <w:abstractNum w:abstractNumId="8" w15:restartNumberingAfterBreak="0">
+  <w:abstractNum w:abstractNumId="9" w15:restartNumberingAfterBreak="0">
     <w:nsid w:val="24F916FC"/>
     <w:multiLevelType w:val="multilevel"/>
     <w:tmpl w:val="DB32BF3E"/>
@@ -4266,7 +5154,7 @@
       </w:rPr>
     </w:lvl>
   </w:abstractNum>
-  <w:abstractNum w:abstractNumId="9" w15:restartNumberingAfterBreak="0">
+  <w:abstractNum w:abstractNumId="10" w15:restartNumberingAfterBreak="0">
     <w:nsid w:val="2D357FD8"/>
     <w:multiLevelType w:val="multilevel"/>
     <w:tmpl w:val="92B840E6"/>
@@ -4415,7 +5303,7 @@
       </w:rPr>
     </w:lvl>
   </w:abstractNum>
-  <w:abstractNum w:abstractNumId="10" w15:restartNumberingAfterBreak="0">
+  <w:abstractNum w:abstractNumId="11" w15:restartNumberingAfterBreak="0">
     <w:nsid w:val="2F697D3D"/>
     <w:multiLevelType w:val="multilevel"/>
     <w:tmpl w:val="A0FC9258"/>
@@ -4564,7 +5452,7 @@
       </w:rPr>
     </w:lvl>
   </w:abstractNum>
-  <w:abstractNum w:abstractNumId="11" w15:restartNumberingAfterBreak="0">
+  <w:abstractNum w:abstractNumId="12" w15:restartNumberingAfterBreak="0">
     <w:nsid w:val="337C5212"/>
     <w:multiLevelType w:val="multilevel"/>
     <w:tmpl w:val="8B40A606"/>
@@ -4713,7 +5601,7 @@
       </w:rPr>
     </w:lvl>
   </w:abstractNum>
-  <w:abstractNum w:abstractNumId="12" w15:restartNumberingAfterBreak="0">
+  <w:abstractNum w:abstractNumId="13" w15:restartNumberingAfterBreak="0">
     <w:nsid w:val="391A538B"/>
     <w:multiLevelType w:val="multilevel"/>
     <w:tmpl w:val="7F30BA7A"/>
@@ -4862,7 +5750,305 @@
       </w:rPr>
     </w:lvl>
   </w:abstractNum>
-  <w:abstractNum w:abstractNumId="13" w15:restartNumberingAfterBreak="0">
+  <w:abstractNum w:abstractNumId="14" w15:restartNumberingAfterBreak="0">
+    <w:nsid w:val="39430A20"/>
+    <w:multiLevelType w:val="multilevel"/>
+    <w:tmpl w:val="5FE2FB92"/>
+    <w:lvl w:ilvl="0">
+      <w:start w:val="1"/>
+      <w:numFmt w:val="bullet"/>
+      <w:lvlText w:val=""/>
+      <w:lvlJc w:val="left"/>
+      <w:pPr>
+        <w:tabs>
+          <w:tab w:val="num" w:pos="720"/>
+        </w:tabs>
+        <w:ind w:left="720" w:hanging="360"/>
+      </w:pPr>
+      <w:rPr>
+        <w:rFonts w:ascii="Symbol" w:hAnsi="Symbol" w:hint="default"/>
+        <w:sz w:val="20"/>
+      </w:rPr>
+    </w:lvl>
+    <w:lvl w:ilvl="1" w:tentative="1">
+      <w:start w:val="1"/>
+      <w:numFmt w:val="bullet"/>
+      <w:lvlText w:val="o"/>
+      <w:lvlJc w:val="left"/>
+      <w:pPr>
+        <w:tabs>
+          <w:tab w:val="num" w:pos="1440"/>
+        </w:tabs>
+        <w:ind w:left="1440" w:hanging="360"/>
+      </w:pPr>
+      <w:rPr>
+        <w:rFonts w:ascii="Courier New" w:hAnsi="Courier New" w:hint="default"/>
+        <w:sz w:val="20"/>
+      </w:rPr>
+    </w:lvl>
+    <w:lvl w:ilvl="2" w:tentative="1">
+      <w:start w:val="1"/>
+      <w:numFmt w:val="bullet"/>
+      <w:lvlText w:val=""/>
+      <w:lvlJc w:val="left"/>
+      <w:pPr>
+        <w:tabs>
+          <w:tab w:val="num" w:pos="2160"/>
+        </w:tabs>
+        <w:ind w:left="2160" w:hanging="360"/>
+      </w:pPr>
+      <w:rPr>
+        <w:rFonts w:ascii="Wingdings" w:hAnsi="Wingdings" w:hint="default"/>
+        <w:sz w:val="20"/>
+      </w:rPr>
+    </w:lvl>
+    <w:lvl w:ilvl="3" w:tentative="1">
+      <w:start w:val="1"/>
+      <w:numFmt w:val="bullet"/>
+      <w:lvlText w:val=""/>
+      <w:lvlJc w:val="left"/>
+      <w:pPr>
+        <w:tabs>
+          <w:tab w:val="num" w:pos="2880"/>
+        </w:tabs>
+        <w:ind w:left="2880" w:hanging="360"/>
+      </w:pPr>
+      <w:rPr>
+        <w:rFonts w:ascii="Wingdings" w:hAnsi="Wingdings" w:hint="default"/>
+        <w:sz w:val="20"/>
+      </w:rPr>
+    </w:lvl>
+    <w:lvl w:ilvl="4" w:tentative="1">
+      <w:start w:val="1"/>
+      <w:numFmt w:val="bullet"/>
+      <w:lvlText w:val=""/>
+      <w:lvlJc w:val="left"/>
+      <w:pPr>
+        <w:tabs>
+          <w:tab w:val="num" w:pos="3600"/>
+        </w:tabs>
+        <w:ind w:left="3600" w:hanging="360"/>
+      </w:pPr>
+      <w:rPr>
+        <w:rFonts w:ascii="Wingdings" w:hAnsi="Wingdings" w:hint="default"/>
+        <w:sz w:val="20"/>
+      </w:rPr>
+    </w:lvl>
+    <w:lvl w:ilvl="5" w:tentative="1">
+      <w:start w:val="1"/>
+      <w:numFmt w:val="bullet"/>
+      <w:lvlText w:val=""/>
+      <w:lvlJc w:val="left"/>
+      <w:pPr>
+        <w:tabs>
+          <w:tab w:val="num" w:pos="4320"/>
+        </w:tabs>
+        <w:ind w:left="4320" w:hanging="360"/>
+      </w:pPr>
+      <w:rPr>
+        <w:rFonts w:ascii="Wingdings" w:hAnsi="Wingdings" w:hint="default"/>
+        <w:sz w:val="20"/>
+      </w:rPr>
+    </w:lvl>
+    <w:lvl w:ilvl="6" w:tentative="1">
+      <w:start w:val="1"/>
+      <w:numFmt w:val="bullet"/>
+      <w:lvlText w:val=""/>
+      <w:lvlJc w:val="left"/>
+      <w:pPr>
+        <w:tabs>
+          <w:tab w:val="num" w:pos="5040"/>
+        </w:tabs>
+        <w:ind w:left="5040" w:hanging="360"/>
+      </w:pPr>
+      <w:rPr>
+        <w:rFonts w:ascii="Wingdings" w:hAnsi="Wingdings" w:hint="default"/>
+        <w:sz w:val="20"/>
+      </w:rPr>
+    </w:lvl>
+    <w:lvl w:ilvl="7" w:tentative="1">
+      <w:start w:val="1"/>
+      <w:numFmt w:val="bullet"/>
+      <w:lvlText w:val=""/>
+      <w:lvlJc w:val="left"/>
+      <w:pPr>
+        <w:tabs>
+          <w:tab w:val="num" w:pos="5760"/>
+        </w:tabs>
+        <w:ind w:left="5760" w:hanging="360"/>
+      </w:pPr>
+      <w:rPr>
+        <w:rFonts w:ascii="Wingdings" w:hAnsi="Wingdings" w:hint="default"/>
+        <w:sz w:val="20"/>
+      </w:rPr>
+    </w:lvl>
+    <w:lvl w:ilvl="8" w:tentative="1">
+      <w:start w:val="1"/>
+      <w:numFmt w:val="bullet"/>
+      <w:lvlText w:val=""/>
+      <w:lvlJc w:val="left"/>
+      <w:pPr>
+        <w:tabs>
+          <w:tab w:val="num" w:pos="6480"/>
+        </w:tabs>
+        <w:ind w:left="6480" w:hanging="360"/>
+      </w:pPr>
+      <w:rPr>
+        <w:rFonts w:ascii="Wingdings" w:hAnsi="Wingdings" w:hint="default"/>
+        <w:sz w:val="20"/>
+      </w:rPr>
+    </w:lvl>
+  </w:abstractNum>
+  <w:abstractNum w:abstractNumId="15" w15:restartNumberingAfterBreak="0">
+    <w:nsid w:val="3F0440EC"/>
+    <w:multiLevelType w:val="multilevel"/>
+    <w:tmpl w:val="D68E910E"/>
+    <w:lvl w:ilvl="0">
+      <w:start w:val="1"/>
+      <w:numFmt w:val="bullet"/>
+      <w:lvlText w:val=""/>
+      <w:lvlJc w:val="left"/>
+      <w:pPr>
+        <w:tabs>
+          <w:tab w:val="num" w:pos="720"/>
+        </w:tabs>
+        <w:ind w:left="720" w:hanging="360"/>
+      </w:pPr>
+      <w:rPr>
+        <w:rFonts w:ascii="Symbol" w:hAnsi="Symbol" w:hint="default"/>
+        <w:sz w:val="20"/>
+      </w:rPr>
+    </w:lvl>
+    <w:lvl w:ilvl="1" w:tentative="1">
+      <w:start w:val="1"/>
+      <w:numFmt w:val="bullet"/>
+      <w:lvlText w:val="o"/>
+      <w:lvlJc w:val="left"/>
+      <w:pPr>
+        <w:tabs>
+          <w:tab w:val="num" w:pos="1440"/>
+        </w:tabs>
+        <w:ind w:left="1440" w:hanging="360"/>
+      </w:pPr>
+      <w:rPr>
+        <w:rFonts w:ascii="Courier New" w:hAnsi="Courier New" w:hint="default"/>
+        <w:sz w:val="20"/>
+      </w:rPr>
+    </w:lvl>
+    <w:lvl w:ilvl="2" w:tentative="1">
+      <w:start w:val="1"/>
+      <w:numFmt w:val="bullet"/>
+      <w:lvlText w:val=""/>
+      <w:lvlJc w:val="left"/>
+      <w:pPr>
+        <w:tabs>
+          <w:tab w:val="num" w:pos="2160"/>
+        </w:tabs>
+        <w:ind w:left="2160" w:hanging="360"/>
+      </w:pPr>
+      <w:rPr>
+        <w:rFonts w:ascii="Wingdings" w:hAnsi="Wingdings" w:hint="default"/>
+        <w:sz w:val="20"/>
+      </w:rPr>
+    </w:lvl>
+    <w:lvl w:ilvl="3" w:tentative="1">
+      <w:start w:val="1"/>
+      <w:numFmt w:val="bullet"/>
+      <w:lvlText w:val=""/>
+      <w:lvlJc w:val="left"/>
+      <w:pPr>
+        <w:tabs>
+          <w:tab w:val="num" w:pos="2880"/>
+        </w:tabs>
+        <w:ind w:left="2880" w:hanging="360"/>
+      </w:pPr>
+      <w:rPr>
+        <w:rFonts w:ascii="Wingdings" w:hAnsi="Wingdings" w:hint="default"/>
+        <w:sz w:val="20"/>
+      </w:rPr>
+    </w:lvl>
+    <w:lvl w:ilvl="4" w:tentative="1">
+      <w:start w:val="1"/>
+      <w:numFmt w:val="bullet"/>
+      <w:lvlText w:val=""/>
+      <w:lvlJc w:val="left"/>
+      <w:pPr>
+        <w:tabs>
+          <w:tab w:val="num" w:pos="3600"/>
+        </w:tabs>
+        <w:ind w:left="3600" w:hanging="360"/>
+      </w:pPr>
+      <w:rPr>
+        <w:rFonts w:ascii="Wingdings" w:hAnsi="Wingdings" w:hint="default"/>
+        <w:sz w:val="20"/>
+      </w:rPr>
+    </w:lvl>
+    <w:lvl w:ilvl="5" w:tentative="1">
+      <w:start w:val="1"/>
+      <w:numFmt w:val="bullet"/>
+      <w:lvlText w:val=""/>
+      <w:lvlJc w:val="left"/>
+      <w:pPr>
+        <w:tabs>
+          <w:tab w:val="num" w:pos="4320"/>
+        </w:tabs>
+        <w:ind w:left="4320" w:hanging="360"/>
+      </w:pPr>
+      <w:rPr>
+        <w:rFonts w:ascii="Wingdings" w:hAnsi="Wingdings" w:hint="default"/>
+        <w:sz w:val="20"/>
+      </w:rPr>
+    </w:lvl>
+    <w:lvl w:ilvl="6" w:tentative="1">
+      <w:start w:val="1"/>
+      <w:numFmt w:val="bullet"/>
+      <w:lvlText w:val=""/>
+      <w:lvlJc w:val="left"/>
+      <w:pPr>
+        <w:tabs>
+          <w:tab w:val="num" w:pos="5040"/>
+        </w:tabs>
+        <w:ind w:left="5040" w:hanging="360"/>
+      </w:pPr>
+      <w:rPr>
+        <w:rFonts w:ascii="Wingdings" w:hAnsi="Wingdings" w:hint="default"/>
+        <w:sz w:val="20"/>
+      </w:rPr>
+    </w:lvl>
+    <w:lvl w:ilvl="7" w:tentative="1">
+      <w:start w:val="1"/>
+      <w:numFmt w:val="bullet"/>
+      <w:lvlText w:val=""/>
+      <w:lvlJc w:val="left"/>
+      <w:pPr>
+        <w:tabs>
+          <w:tab w:val="num" w:pos="5760"/>
+        </w:tabs>
+        <w:ind w:left="5760" w:hanging="360"/>
+      </w:pPr>
+      <w:rPr>
+        <w:rFonts w:ascii="Wingdings" w:hAnsi="Wingdings" w:hint="default"/>
+        <w:sz w:val="20"/>
+      </w:rPr>
+    </w:lvl>
+    <w:lvl w:ilvl="8" w:tentative="1">
+      <w:start w:val="1"/>
+      <w:numFmt w:val="bullet"/>
+      <w:lvlText w:val=""/>
+      <w:lvlJc w:val="left"/>
+      <w:pPr>
+        <w:tabs>
+          <w:tab w:val="num" w:pos="6480"/>
+        </w:tabs>
+        <w:ind w:left="6480" w:hanging="360"/>
+      </w:pPr>
+      <w:rPr>
+        <w:rFonts w:ascii="Wingdings" w:hAnsi="Wingdings" w:hint="default"/>
+        <w:sz w:val="20"/>
+      </w:rPr>
+    </w:lvl>
+  </w:abstractNum>
+  <w:abstractNum w:abstractNumId="16" w15:restartNumberingAfterBreak="0">
     <w:nsid w:val="40787588"/>
     <w:multiLevelType w:val="multilevel"/>
     <w:tmpl w:val="56E2A682"/>
@@ -5011,7 +6197,7 @@
       </w:rPr>
     </w:lvl>
   </w:abstractNum>
-  <w:abstractNum w:abstractNumId="14" w15:restartNumberingAfterBreak="0">
+  <w:abstractNum w:abstractNumId="17" w15:restartNumberingAfterBreak="0">
     <w:nsid w:val="41EE0DF2"/>
     <w:multiLevelType w:val="multilevel"/>
     <w:tmpl w:val="53D8DF16"/>
@@ -5160,7 +6346,7 @@
       </w:rPr>
     </w:lvl>
   </w:abstractNum>
-  <w:abstractNum w:abstractNumId="15" w15:restartNumberingAfterBreak="0">
+  <w:abstractNum w:abstractNumId="18" w15:restartNumberingAfterBreak="0">
     <w:nsid w:val="49C552A7"/>
     <w:multiLevelType w:val="multilevel"/>
     <w:tmpl w:val="110A216A"/>
@@ -5309,7 +6495,7 @@
       </w:rPr>
     </w:lvl>
   </w:abstractNum>
-  <w:abstractNum w:abstractNumId="16" w15:restartNumberingAfterBreak="0">
+  <w:abstractNum w:abstractNumId="19" w15:restartNumberingAfterBreak="0">
     <w:nsid w:val="53F2243B"/>
     <w:multiLevelType w:val="multilevel"/>
     <w:tmpl w:val="6B203F50"/>
@@ -5458,7 +6644,7 @@
       </w:rPr>
     </w:lvl>
   </w:abstractNum>
-  <w:abstractNum w:abstractNumId="17" w15:restartNumberingAfterBreak="0">
+  <w:abstractNum w:abstractNumId="20" w15:restartNumberingAfterBreak="0">
     <w:nsid w:val="61C21F20"/>
     <w:multiLevelType w:val="multilevel"/>
     <w:tmpl w:val="9EC6B29A"/>
@@ -5607,7 +6793,7 @@
       </w:rPr>
     </w:lvl>
   </w:abstractNum>
-  <w:abstractNum w:abstractNumId="18" w15:restartNumberingAfterBreak="0">
+  <w:abstractNum w:abstractNumId="21" w15:restartNumberingAfterBreak="0">
     <w:nsid w:val="63CA0A21"/>
     <w:multiLevelType w:val="multilevel"/>
     <w:tmpl w:val="ABEAB454"/>
@@ -5756,7 +6942,7 @@
       </w:rPr>
     </w:lvl>
   </w:abstractNum>
-  <w:abstractNum w:abstractNumId="19" w15:restartNumberingAfterBreak="0">
+  <w:abstractNum w:abstractNumId="22" w15:restartNumberingAfterBreak="0">
     <w:nsid w:val="6C427D99"/>
     <w:multiLevelType w:val="multilevel"/>
     <w:tmpl w:val="6C26539A"/>
@@ -5905,7 +7091,7 @@
       </w:rPr>
     </w:lvl>
   </w:abstractNum>
-  <w:abstractNum w:abstractNumId="20" w15:restartNumberingAfterBreak="0">
+  <w:abstractNum w:abstractNumId="23" w15:restartNumberingAfterBreak="0">
     <w:nsid w:val="6C76368B"/>
     <w:multiLevelType w:val="multilevel"/>
     <w:tmpl w:val="53D44A26"/>
@@ -6058,64 +7244,73 @@
     <w:abstractNumId w:val="0"/>
   </w:num>
   <w:num w:numId="2" w16cid:durableId="278145578">
-    <w:abstractNumId w:val="13"/>
+    <w:abstractNumId w:val="16"/>
   </w:num>
   <w:num w:numId="3" w16cid:durableId="1082869659">
-    <w:abstractNumId w:val="6"/>
+    <w:abstractNumId w:val="7"/>
   </w:num>
   <w:num w:numId="4" w16cid:durableId="1399087449">
-    <w:abstractNumId w:val="19"/>
+    <w:abstractNumId w:val="22"/>
   </w:num>
   <w:num w:numId="5" w16cid:durableId="1590115480">
-    <w:abstractNumId w:val="8"/>
+    <w:abstractNumId w:val="9"/>
   </w:num>
   <w:num w:numId="6" w16cid:durableId="1275599465">
     <w:abstractNumId w:val="3"/>
   </w:num>
   <w:num w:numId="7" w16cid:durableId="949821662">
-    <w:abstractNumId w:val="5"/>
+    <w:abstractNumId w:val="6"/>
   </w:num>
   <w:num w:numId="8" w16cid:durableId="502160085">
-    <w:abstractNumId w:val="7"/>
+    <w:abstractNumId w:val="8"/>
   </w:num>
   <w:num w:numId="9" w16cid:durableId="1561751620">
-    <w:abstractNumId w:val="11"/>
+    <w:abstractNumId w:val="12"/>
   </w:num>
   <w:num w:numId="10" w16cid:durableId="642005705">
-    <w:abstractNumId w:val="15"/>
+    <w:abstractNumId w:val="18"/>
   </w:num>
   <w:num w:numId="11" w16cid:durableId="1916285314">
-    <w:abstractNumId w:val="17"/>
+    <w:abstractNumId w:val="20"/>
   </w:num>
   <w:num w:numId="12" w16cid:durableId="112209799">
-    <w:abstractNumId w:val="4"/>
+    <w:abstractNumId w:val="5"/>
   </w:num>
   <w:num w:numId="13" w16cid:durableId="2034110977">
     <w:abstractNumId w:val="2"/>
   </w:num>
   <w:num w:numId="14" w16cid:durableId="1815020617">
-    <w:abstractNumId w:val="20"/>
+    <w:abstractNumId w:val="23"/>
   </w:num>
   <w:num w:numId="15" w16cid:durableId="122311294">
-    <w:abstractNumId w:val="9"/>
+    <w:abstractNumId w:val="10"/>
   </w:num>
   <w:num w:numId="16" w16cid:durableId="1880705022">
-    <w:abstractNumId w:val="18"/>
+    <w:abstractNumId w:val="21"/>
   </w:num>
   <w:num w:numId="17" w16cid:durableId="245304063">
-    <w:abstractNumId w:val="12"/>
+    <w:abstractNumId w:val="13"/>
   </w:num>
   <w:num w:numId="18" w16cid:durableId="130291419">
     <w:abstractNumId w:val="1"/>
   </w:num>
   <w:num w:numId="19" w16cid:durableId="175270223">
-    <w:abstractNumId w:val="16"/>
+    <w:abstractNumId w:val="19"/>
   </w:num>
   <w:num w:numId="20" w16cid:durableId="1088422739">
-    <w:abstractNumId w:val="10"/>
+    <w:abstractNumId w:val="11"/>
   </w:num>
   <w:num w:numId="21" w16cid:durableId="943269753">
+    <w:abstractNumId w:val="17"/>
+  </w:num>
+  <w:num w:numId="22" w16cid:durableId="1132791763">
+    <w:abstractNumId w:val="15"/>
+  </w:num>
+  <w:num w:numId="23" w16cid:durableId="1311708505">
     <w:abstractNumId w:val="14"/>
+  </w:num>
+  <w:num w:numId="24" w16cid:durableId="863400549">
+    <w:abstractNumId w:val="4"/>
   </w:num>
 </w:numbering>
 </file>

</xml_diff>

<commit_message>
Dia 35: Deteccion de oportunidades de IA en problemas reales
</commit_message>
<xml_diff>
--- a/Diseño de proyectos de IA/Diseño de proyectos de IA.docx
+++ b/Diseño de proyectos de IA/Diseño de proyectos de IA.docx
@@ -1972,15 +1972,7 @@
     </w:p>
     <w:p>
       <w:r>
-        <w:t xml:space="preserve">En </w:t>
-      </w:r>
-      <w:proofErr w:type="gramStart"/>
-      <w:r>
-        <w:t>realidad</w:t>
-      </w:r>
-      <w:proofErr w:type="gramEnd"/>
-      <w:r>
-        <w:t xml:space="preserve"> suele ser </w:t>
+        <w:t xml:space="preserve">En realidad suele ser </w:t>
       </w:r>
       <w:r>
         <w:rPr>
@@ -2870,9 +2862,64 @@
           <w:szCs w:val="28"/>
           <w:u w:val="single"/>
         </w:rPr>
-        <w:t>1️</w:t>
-      </w:r>
-      <w:r>
+        <w:t>1️) Idea simple</w:t>
+      </w:r>
+    </w:p>
+    <w:p>
+      <w:r>
+        <w:t>Ejemplo:</w:t>
+      </w:r>
+    </w:p>
+    <w:p>
+      <w:r>
+        <w:t xml:space="preserve">“Analizar </w:t>
+      </w:r>
+      <w:proofErr w:type="spellStart"/>
+      <w:r>
+        <w:t>CVs</w:t>
+      </w:r>
+      <w:proofErr w:type="spellEnd"/>
+      <w:r>
+        <w:t xml:space="preserve"> automáticamente”</w:t>
+      </w:r>
+    </w:p>
+    <w:p>
+      <w:r>
+        <w:t>Esto es una idea común.</w:t>
+      </w:r>
+    </w:p>
+    <w:p>
+      <w:r>
+        <w:t xml:space="preserve">Pero </w:t>
+      </w:r>
+      <w:proofErr w:type="spellStart"/>
+      <w:r>
+        <w:t>así</w:t>
+      </w:r>
+      <w:proofErr w:type="spellEnd"/>
+      <w:r>
+        <w:t xml:space="preserve"> sola </w:t>
+      </w:r>
+      <w:r>
+        <w:rPr>
+          <w:b/>
+          <w:bCs/>
+        </w:rPr>
+        <w:t>no es un sistema potente</w:t>
+      </w:r>
+      <w:r>
+        <w:t>.</w:t>
+      </w:r>
+    </w:p>
+    <w:p>
+      <w:r>
+        <w:pict w14:anchorId="004E32EB">
+          <v:rect id="_x0000_i1047" style="width:0;height:1.5pt" o:hralign="center" o:hrstd="t" o:hr="t" fillcolor="#a0a0a0" stroked="f"/>
+        </w:pict>
+      </w:r>
+    </w:p>
+    <w:p>
+      <w:pPr>
         <w:rPr>
           <w:rFonts w:cstheme="minorHAnsi"/>
           <w:b/>
@@ -2881,8 +2928,7 @@
           <w:szCs w:val="28"/>
           <w:u w:val="single"/>
         </w:rPr>
-        <w:t xml:space="preserve">) </w:t>
-      </w:r>
+      </w:pPr>
       <w:r>
         <w:rPr>
           <w:rFonts w:cstheme="minorHAnsi"/>
@@ -2892,105 +2938,7 @@
           <w:szCs w:val="28"/>
           <w:u w:val="single"/>
         </w:rPr>
-        <w:t>Idea simple</w:t>
-      </w:r>
-    </w:p>
-    <w:p>
-      <w:r>
-        <w:t>Ejemplo:</w:t>
-      </w:r>
-    </w:p>
-    <w:p>
-      <w:r>
-        <w:t xml:space="preserve">“Analizar </w:t>
-      </w:r>
-      <w:proofErr w:type="spellStart"/>
-      <w:r>
-        <w:t>CVs</w:t>
-      </w:r>
-      <w:proofErr w:type="spellEnd"/>
-      <w:r>
-        <w:t xml:space="preserve"> automáticamente”</w:t>
-      </w:r>
-    </w:p>
-    <w:p>
-      <w:r>
-        <w:t>Esto es una idea común.</w:t>
-      </w:r>
-    </w:p>
-    <w:p>
-      <w:r>
-        <w:t xml:space="preserve">Pero </w:t>
-      </w:r>
-      <w:proofErr w:type="spellStart"/>
-      <w:r>
-        <w:t>así</w:t>
-      </w:r>
-      <w:proofErr w:type="spellEnd"/>
-      <w:r>
-        <w:t xml:space="preserve"> sola </w:t>
-      </w:r>
-      <w:r>
-        <w:rPr>
-          <w:b/>
-          <w:bCs/>
-        </w:rPr>
-        <w:t>no es un sistema potente</w:t>
-      </w:r>
-      <w:r>
-        <w:t>.</w:t>
-      </w:r>
-    </w:p>
-    <w:p>
-      <w:r>
-        <w:pict w14:anchorId="004E32EB">
-          <v:rect id="_x0000_i1137" style="width:0;height:1.5pt" o:hralign="center" o:hrstd="t" o:hr="t" fillcolor="#a0a0a0" stroked="f"/>
-        </w:pict>
-      </w:r>
-    </w:p>
-    <w:p>
-      <w:pPr>
-        <w:rPr>
-          <w:rFonts w:cstheme="minorHAnsi"/>
-          <w:b/>
-          <w:bCs/>
-          <w:sz w:val="28"/>
-          <w:szCs w:val="28"/>
-          <w:u w:val="single"/>
-        </w:rPr>
-      </w:pPr>
-      <w:r>
-        <w:rPr>
-          <w:rFonts w:cstheme="minorHAnsi"/>
-          <w:b/>
-          <w:bCs/>
-          <w:sz w:val="28"/>
-          <w:szCs w:val="28"/>
-          <w:u w:val="single"/>
-        </w:rPr>
-        <w:t>2️</w:t>
-      </w:r>
-      <w:r>
-        <w:rPr>
-          <w:rFonts w:cstheme="minorHAnsi"/>
-          <w:b/>
-          <w:bCs/>
-          <w:sz w:val="28"/>
-          <w:szCs w:val="28"/>
-          <w:u w:val="single"/>
-        </w:rPr>
-        <w:t xml:space="preserve">) </w:t>
-      </w:r>
-      <w:r>
-        <w:rPr>
-          <w:rFonts w:cstheme="minorHAnsi"/>
-          <w:b/>
-          <w:bCs/>
-          <w:sz w:val="28"/>
-          <w:szCs w:val="28"/>
-          <w:u w:val="single"/>
-        </w:rPr>
-        <w:t>Identificar las partes del problema</w:t>
+        <w:t>2️) Identificar las partes del problema</w:t>
       </w:r>
     </w:p>
     <w:p>
@@ -3076,7 +3024,7 @@
     <w:p>
       <w:r>
         <w:pict w14:anchorId="53042388">
-          <v:rect id="_x0000_i1138" style="width:0;height:1.5pt" o:hralign="center" o:hrstd="t" o:hr="t" fillcolor="#a0a0a0" stroked="f"/>
+          <v:rect id="_x0000_i1048" style="width:0;height:1.5pt" o:hralign="center" o:hrstd="t" o:hr="t" fillcolor="#a0a0a0" stroked="f"/>
         </w:pict>
       </w:r>
     </w:p>
@@ -3100,29 +3048,7 @@
           <w:szCs w:val="28"/>
           <w:u w:val="single"/>
         </w:rPr>
-        <w:t>3️</w:t>
-      </w:r>
-      <w:r>
-        <w:rPr>
-          <w:rFonts w:cstheme="minorHAnsi"/>
-          <w:b/>
-          <w:bCs/>
-          <w:sz w:val="28"/>
-          <w:szCs w:val="28"/>
-          <w:u w:val="single"/>
-        </w:rPr>
-        <w:t xml:space="preserve">) </w:t>
-      </w:r>
-      <w:r>
-        <w:rPr>
-          <w:rFonts w:cstheme="minorHAnsi"/>
-          <w:b/>
-          <w:bCs/>
-          <w:sz w:val="28"/>
-          <w:szCs w:val="28"/>
-          <w:u w:val="single"/>
-        </w:rPr>
-        <w:t>Convertirlo en sistema</w:t>
+        <w:t>3️) Convertirlo en sistema</w:t>
       </w:r>
     </w:p>
     <w:p>
@@ -3188,7 +3114,7 @@
     <w:p>
       <w:r>
         <w:pict w14:anchorId="60D40128">
-          <v:rect id="_x0000_i1139" style="width:0;height:1.5pt" o:hralign="center" o:hrstd="t" o:hr="t" fillcolor="#a0a0a0" stroked="f"/>
+          <v:rect id="_x0000_i1049" style="width:0;height:1.5pt" o:hralign="center" o:hrstd="t" o:hr="t" fillcolor="#a0a0a0" stroked="f"/>
         </w:pict>
       </w:r>
     </w:p>
@@ -3212,29 +3138,7 @@
           <w:szCs w:val="28"/>
           <w:u w:val="single"/>
         </w:rPr>
-        <w:t>4️</w:t>
-      </w:r>
-      <w:r>
-        <w:rPr>
-          <w:rFonts w:cstheme="minorHAnsi"/>
-          <w:b/>
-          <w:bCs/>
-          <w:sz w:val="28"/>
-          <w:szCs w:val="28"/>
-          <w:u w:val="single"/>
-        </w:rPr>
-        <w:t xml:space="preserve">) </w:t>
-      </w:r>
-      <w:r>
-        <w:rPr>
-          <w:rFonts w:cstheme="minorHAnsi"/>
-          <w:b/>
-          <w:bCs/>
-          <w:sz w:val="28"/>
-          <w:szCs w:val="28"/>
-          <w:u w:val="single"/>
-        </w:rPr>
-        <w:t>Agregar contexto (RAG)</w:t>
+        <w:t>4️) Agregar contexto (RAG)</w:t>
       </w:r>
     </w:p>
     <w:p>
@@ -3330,7 +3234,7 @@
     <w:p>
       <w:r>
         <w:pict w14:anchorId="403D4136">
-          <v:rect id="_x0000_i1140" style="width:0;height:1.5pt" o:hralign="center" o:hrstd="t" o:hr="t" fillcolor="#a0a0a0" stroked="f"/>
+          <v:rect id="_x0000_i1050" style="width:0;height:1.5pt" o:hralign="center" o:hrstd="t" o:hr="t" fillcolor="#a0a0a0" stroked="f"/>
         </w:pict>
       </w:r>
     </w:p>
@@ -3354,29 +3258,7 @@
           <w:szCs w:val="28"/>
           <w:u w:val="single"/>
         </w:rPr>
-        <w:t>5️</w:t>
-      </w:r>
-      <w:r>
-        <w:rPr>
-          <w:rFonts w:cstheme="minorHAnsi"/>
-          <w:b/>
-          <w:bCs/>
-          <w:sz w:val="28"/>
-          <w:szCs w:val="28"/>
-          <w:u w:val="single"/>
-        </w:rPr>
-        <w:t xml:space="preserve">) </w:t>
-      </w:r>
-      <w:r>
-        <w:rPr>
-          <w:rFonts w:cstheme="minorHAnsi"/>
-          <w:b/>
-          <w:bCs/>
-          <w:sz w:val="28"/>
-          <w:szCs w:val="28"/>
-          <w:u w:val="single"/>
-        </w:rPr>
-        <w:t>Agregar memoria</w:t>
+        <w:t>5️) Agregar memoria</w:t>
       </w:r>
     </w:p>
     <w:p>
@@ -3414,7 +3296,7 @@
     <w:p>
       <w:r>
         <w:pict w14:anchorId="08FB7AC1">
-          <v:rect id="_x0000_i1141" style="width:0;height:1.5pt" o:hralign="center" o:hrstd="t" o:hr="t" fillcolor="#a0a0a0" stroked="f"/>
+          <v:rect id="_x0000_i1051" style="width:0;height:1.5pt" o:hralign="center" o:hrstd="t" o:hr="t" fillcolor="#a0a0a0" stroked="f"/>
         </w:pict>
       </w:r>
     </w:p>
@@ -3477,7 +3359,7 @@
     <w:p>
       <w:r>
         <w:pict w14:anchorId="32A0F231">
-          <v:rect id="_x0000_i1142" style="width:0;height:1.5pt" o:hralign="center" o:hrstd="t" o:hr="t" fillcolor="#a0a0a0" stroked="f"/>
+          <v:rect id="_x0000_i1052" style="width:0;height:1.5pt" o:hralign="center" o:hrstd="t" o:hr="t" fillcolor="#a0a0a0" stroked="f"/>
         </w:pict>
       </w:r>
     </w:p>
@@ -3648,8 +3530,863 @@
       </w:r>
     </w:p>
     <w:p/>
+    <w:p>
+      <w:pPr>
+        <w:rPr>
+          <w:rFonts w:cstheme="minorHAnsi"/>
+          <w:b/>
+          <w:bCs/>
+          <w:sz w:val="36"/>
+          <w:szCs w:val="36"/>
+          <w:u w:val="single"/>
+        </w:rPr>
+      </w:pPr>
+      <w:r>
+        <w:rPr>
+          <w:rFonts w:ascii="Segoe UI Emoji" w:hAnsi="Segoe UI Emoji" w:cs="Segoe UI Emoji"/>
+          <w:b/>
+          <w:bCs/>
+          <w:sz w:val="36"/>
+          <w:szCs w:val="36"/>
+          <w:u w:val="single"/>
+        </w:rPr>
+        <w:t>🧠</w:t>
+      </w:r>
+      <w:r>
+        <w:rPr>
+          <w:rFonts w:cstheme="minorHAnsi"/>
+          <w:b/>
+          <w:bCs/>
+          <w:sz w:val="36"/>
+          <w:szCs w:val="36"/>
+          <w:u w:val="single"/>
+        </w:rPr>
+        <w:t xml:space="preserve"> Cómo encontrar ideas de proyectos de IA que valgan la pena</w:t>
+      </w:r>
+    </w:p>
+    <w:p>
+      <w:pPr>
+        <w:rPr>
+          <w:b/>
+          <w:bCs/>
+          <w:sz w:val="28"/>
+          <w:szCs w:val="28"/>
+          <w:u w:val="single"/>
+        </w:rPr>
+      </w:pPr>
+      <w:r>
+        <w:rPr>
+          <w:b/>
+          <w:bCs/>
+          <w:sz w:val="28"/>
+          <w:szCs w:val="28"/>
+          <w:u w:val="single"/>
+        </w:rPr>
+        <w:t>Dónde aparecen buenas ideas de IA</w:t>
+      </w:r>
+    </w:p>
+    <w:p>
+      <w:r>
+        <w:t>Las mejores ideas no salen de:</w:t>
+      </w:r>
+    </w:p>
+    <w:p>
+      <w:r>
+        <w:t>“quiero hacer algo con IA”</w:t>
+      </w:r>
+    </w:p>
+    <w:p>
+      <w:r>
+        <w:t xml:space="preserve">Salen de estos lugares </w:t>
+      </w:r>
+      <w:r>
+        <w:rPr>
+          <w:rFonts w:ascii="Segoe UI Emoji" w:hAnsi="Segoe UI Emoji" w:cs="Segoe UI Emoji"/>
+        </w:rPr>
+        <w:t>👇</w:t>
+      </w:r>
+    </w:p>
+    <w:p>
+      <w:r>
+        <w:pict w14:anchorId="060420FF">
+          <v:rect id="_x0000_i1143" style="width:0;height:1.5pt" o:hralign="center" o:hrstd="t" o:hr="t" fillcolor="#a0a0a0" stroked="f"/>
+        </w:pict>
+      </w:r>
+    </w:p>
+    <w:p>
+      <w:pPr>
+        <w:rPr>
+          <w:b/>
+          <w:bCs/>
+          <w:sz w:val="28"/>
+          <w:szCs w:val="28"/>
+          <w:u w:val="single"/>
+        </w:rPr>
+      </w:pPr>
+    </w:p>
+    <w:p>
+      <w:pPr>
+        <w:rPr>
+          <w:b/>
+          <w:bCs/>
+          <w:sz w:val="28"/>
+          <w:szCs w:val="28"/>
+          <w:u w:val="single"/>
+        </w:rPr>
+      </w:pPr>
+    </w:p>
+    <w:p>
+      <w:pPr>
+        <w:rPr>
+          <w:b/>
+          <w:bCs/>
+          <w:sz w:val="28"/>
+          <w:szCs w:val="28"/>
+          <w:u w:val="single"/>
+        </w:rPr>
+      </w:pPr>
+      <w:r>
+        <w:rPr>
+          <w:b/>
+          <w:bCs/>
+          <w:sz w:val="28"/>
+          <w:szCs w:val="28"/>
+          <w:u w:val="single"/>
+        </w:rPr>
+        <w:lastRenderedPageBreak/>
+        <w:t>1️</w:t>
+      </w:r>
+      <w:r>
+        <w:rPr>
+          <w:rFonts w:ascii="Tahoma" w:hAnsi="Tahoma" w:cs="Tahoma"/>
+          <w:b/>
+          <w:bCs/>
+          <w:sz w:val="28"/>
+          <w:szCs w:val="28"/>
+          <w:u w:val="single"/>
+        </w:rPr>
+        <w:t xml:space="preserve">) </w:t>
+      </w:r>
+      <w:r>
+        <w:rPr>
+          <w:b/>
+          <w:bCs/>
+          <w:sz w:val="28"/>
+          <w:szCs w:val="28"/>
+          <w:u w:val="single"/>
+        </w:rPr>
+        <w:t>Procesos manuales repetitivos</w:t>
+      </w:r>
+    </w:p>
+    <w:p>
+      <w:r>
+        <w:t>Ejemplos:</w:t>
+      </w:r>
+    </w:p>
+    <w:p>
+      <w:pPr>
+        <w:numPr>
+          <w:ilvl w:val="0"/>
+          <w:numId w:val="25"/>
+        </w:numPr>
+      </w:pPr>
+      <w:r>
+        <w:t xml:space="preserve">leer </w:t>
+      </w:r>
+      <w:proofErr w:type="spellStart"/>
+      <w:r>
+        <w:t>CVs</w:t>
+      </w:r>
+      <w:proofErr w:type="spellEnd"/>
+    </w:p>
+    <w:p>
+      <w:pPr>
+        <w:numPr>
+          <w:ilvl w:val="0"/>
+          <w:numId w:val="25"/>
+        </w:numPr>
+      </w:pPr>
+      <w:r>
+        <w:t>revisar contratos</w:t>
+      </w:r>
+    </w:p>
+    <w:p>
+      <w:pPr>
+        <w:numPr>
+          <w:ilvl w:val="0"/>
+          <w:numId w:val="25"/>
+        </w:numPr>
+      </w:pPr>
+      <w:r>
+        <w:t>responder tickets</w:t>
+      </w:r>
+    </w:p>
+    <w:p>
+      <w:pPr>
+        <w:numPr>
+          <w:ilvl w:val="0"/>
+          <w:numId w:val="25"/>
+        </w:numPr>
+      </w:pPr>
+      <w:r>
+        <w:t>cargar datos</w:t>
+      </w:r>
+    </w:p>
+    <w:p>
+      <w:r>
+        <w:rPr>
+          <w:rFonts w:ascii="Segoe UI Emoji" w:hAnsi="Segoe UI Emoji" w:cs="Segoe UI Emoji"/>
+        </w:rPr>
+        <w:t>📌</w:t>
+      </w:r>
+      <w:r>
+        <w:t xml:space="preserve"> Regla:</w:t>
+      </w:r>
+    </w:p>
+    <w:p>
+      <w:r>
+        <w:t>Si alguien hace lo mismo muchas veces → oportunidad de IA</w:t>
+      </w:r>
+    </w:p>
+    <w:p>
+      <w:r>
+        <w:pict w14:anchorId="67729234">
+          <v:rect id="_x0000_i1144" style="width:0;height:1.5pt" o:hralign="center" o:hrstd="t" o:hr="t" fillcolor="#a0a0a0" stroked="f"/>
+        </w:pict>
+      </w:r>
+    </w:p>
+    <w:p>
+      <w:pPr>
+        <w:rPr>
+          <w:b/>
+          <w:bCs/>
+          <w:sz w:val="28"/>
+          <w:szCs w:val="28"/>
+          <w:u w:val="single"/>
+        </w:rPr>
+      </w:pPr>
+      <w:r>
+        <w:rPr>
+          <w:b/>
+          <w:bCs/>
+          <w:sz w:val="28"/>
+          <w:szCs w:val="28"/>
+          <w:u w:val="single"/>
+        </w:rPr>
+        <w:t>2️</w:t>
+      </w:r>
+      <w:r>
+        <w:rPr>
+          <w:rFonts w:ascii="Tahoma" w:hAnsi="Tahoma" w:cs="Tahoma"/>
+          <w:b/>
+          <w:bCs/>
+          <w:sz w:val="28"/>
+          <w:szCs w:val="28"/>
+          <w:u w:val="single"/>
+        </w:rPr>
+        <w:t xml:space="preserve">) </w:t>
+      </w:r>
+      <w:r>
+        <w:rPr>
+          <w:b/>
+          <w:bCs/>
+          <w:sz w:val="28"/>
+          <w:szCs w:val="28"/>
+          <w:u w:val="single"/>
+        </w:rPr>
+        <w:t>Decisiones difíciles con muchos datos</w:t>
+      </w:r>
+    </w:p>
+    <w:p>
+      <w:r>
+        <w:t>Ejemplos:</w:t>
+      </w:r>
+    </w:p>
+    <w:p>
+      <w:pPr>
+        <w:numPr>
+          <w:ilvl w:val="0"/>
+          <w:numId w:val="26"/>
+        </w:numPr>
+      </w:pPr>
+      <w:r>
+        <w:t>a quién darle crédito</w:t>
+      </w:r>
+    </w:p>
+    <w:p>
+      <w:pPr>
+        <w:numPr>
+          <w:ilvl w:val="0"/>
+          <w:numId w:val="26"/>
+        </w:numPr>
+      </w:pPr>
+      <w:r>
+        <w:t>qué cliente va a cancelar</w:t>
+      </w:r>
+    </w:p>
+    <w:p>
+      <w:pPr>
+        <w:numPr>
+          <w:ilvl w:val="0"/>
+          <w:numId w:val="26"/>
+        </w:numPr>
+      </w:pPr>
+      <w:r>
+        <w:t>qué producto recomendar</w:t>
+      </w:r>
+    </w:p>
+    <w:p>
+      <w:r>
+        <w:rPr>
+          <w:rFonts w:ascii="Segoe UI Emoji" w:hAnsi="Segoe UI Emoji" w:cs="Segoe UI Emoji"/>
+        </w:rPr>
+        <w:t>📌</w:t>
+      </w:r>
+      <w:r>
+        <w:t xml:space="preserve"> Regla:</w:t>
+      </w:r>
+    </w:p>
+    <w:p>
+      <w:r>
+        <w:t>Si hay datos + decisión → ML clásico</w:t>
+      </w:r>
+    </w:p>
+    <w:p>
+      <w:r>
+        <w:pict w14:anchorId="315FBE3E">
+          <v:rect id="_x0000_i1145" style="width:0;height:1.5pt" o:hralign="center" o:hrstd="t" o:hr="t" fillcolor="#a0a0a0" stroked="f"/>
+        </w:pict>
+      </w:r>
+    </w:p>
+    <w:p>
+      <w:pPr>
+        <w:rPr>
+          <w:b/>
+          <w:bCs/>
+          <w:sz w:val="28"/>
+          <w:szCs w:val="28"/>
+          <w:u w:val="single"/>
+        </w:rPr>
+      </w:pPr>
+      <w:r>
+        <w:rPr>
+          <w:b/>
+          <w:bCs/>
+          <w:sz w:val="28"/>
+          <w:szCs w:val="28"/>
+          <w:u w:val="single"/>
+        </w:rPr>
+        <w:t>3️</w:t>
+      </w:r>
+      <w:r>
+        <w:rPr>
+          <w:rFonts w:ascii="Tahoma" w:hAnsi="Tahoma" w:cs="Tahoma"/>
+          <w:b/>
+          <w:bCs/>
+          <w:sz w:val="28"/>
+          <w:szCs w:val="28"/>
+          <w:u w:val="single"/>
+        </w:rPr>
+        <w:t xml:space="preserve">) </w:t>
+      </w:r>
+      <w:r>
+        <w:rPr>
+          <w:b/>
+          <w:bCs/>
+          <w:sz w:val="28"/>
+          <w:szCs w:val="28"/>
+          <w:u w:val="single"/>
+        </w:rPr>
+        <w:t>Mucho texto sin explotar</w:t>
+      </w:r>
+    </w:p>
+    <w:p>
+      <w:r>
+        <w:t>Ejemplos:</w:t>
+      </w:r>
+    </w:p>
+    <w:p>
+      <w:pPr>
+        <w:numPr>
+          <w:ilvl w:val="0"/>
+          <w:numId w:val="27"/>
+        </w:numPr>
+      </w:pPr>
+      <w:proofErr w:type="spellStart"/>
+      <w:r>
+        <w:t>PDFs</w:t>
+      </w:r>
+      <w:proofErr w:type="spellEnd"/>
+    </w:p>
+    <w:p>
+      <w:pPr>
+        <w:numPr>
+          <w:ilvl w:val="0"/>
+          <w:numId w:val="27"/>
+        </w:numPr>
+      </w:pPr>
+      <w:r>
+        <w:t>emails</w:t>
+      </w:r>
+    </w:p>
+    <w:p>
+      <w:pPr>
+        <w:numPr>
+          <w:ilvl w:val="0"/>
+          <w:numId w:val="27"/>
+        </w:numPr>
+      </w:pPr>
+      <w:r>
+        <w:t>chats</w:t>
+      </w:r>
+    </w:p>
+    <w:p>
+      <w:pPr>
+        <w:numPr>
+          <w:ilvl w:val="0"/>
+          <w:numId w:val="27"/>
+        </w:numPr>
+      </w:pPr>
+      <w:r>
+        <w:t>documentación</w:t>
+      </w:r>
+    </w:p>
+    <w:p>
+      <w:r>
+        <w:rPr>
+          <w:rFonts w:ascii="Segoe UI Emoji" w:hAnsi="Segoe UI Emoji" w:cs="Segoe UI Emoji"/>
+        </w:rPr>
+        <w:t>📌</w:t>
+      </w:r>
+      <w:r>
+        <w:t xml:space="preserve"> Regla:</w:t>
+      </w:r>
+    </w:p>
+    <w:p>
+      <w:r>
+        <w:t>Si hay texto sin usar → LLM / RAG</w:t>
+      </w:r>
+    </w:p>
+    <w:p>
+      <w:r>
+        <w:pict w14:anchorId="411212D6">
+          <v:rect id="_x0000_i1146" style="width:0;height:1.5pt" o:hralign="center" o:hrstd="t" o:hr="t" fillcolor="#a0a0a0" stroked="f"/>
+        </w:pict>
+      </w:r>
+    </w:p>
+    <w:p>
+      <w:pPr>
+        <w:rPr>
+          <w:b/>
+          <w:bCs/>
+          <w:sz w:val="28"/>
+          <w:szCs w:val="28"/>
+          <w:u w:val="single"/>
+        </w:rPr>
+      </w:pPr>
+      <w:r>
+        <w:rPr>
+          <w:b/>
+          <w:bCs/>
+          <w:sz w:val="28"/>
+          <w:szCs w:val="28"/>
+          <w:u w:val="single"/>
+        </w:rPr>
+        <w:t>4️</w:t>
+      </w:r>
+      <w:r>
+        <w:rPr>
+          <w:rFonts w:ascii="Tahoma" w:hAnsi="Tahoma" w:cs="Tahoma"/>
+          <w:b/>
+          <w:bCs/>
+          <w:sz w:val="28"/>
+          <w:szCs w:val="28"/>
+          <w:u w:val="single"/>
+        </w:rPr>
+        <w:t xml:space="preserve">) </w:t>
+      </w:r>
+      <w:r>
+        <w:rPr>
+          <w:b/>
+          <w:bCs/>
+          <w:sz w:val="28"/>
+          <w:szCs w:val="28"/>
+          <w:u w:val="single"/>
+        </w:rPr>
+        <w:t>Cuellos de botella humanos</w:t>
+      </w:r>
+    </w:p>
+    <w:p>
+      <w:r>
+        <w:t>Ejemplos:</w:t>
+      </w:r>
+    </w:p>
+    <w:p>
+      <w:pPr>
+        <w:numPr>
+          <w:ilvl w:val="0"/>
+          <w:numId w:val="28"/>
+        </w:numPr>
+      </w:pPr>
+      <w:r>
+        <w:t>un equipo legal que no da abasto</w:t>
+      </w:r>
+    </w:p>
+    <w:p>
+      <w:pPr>
+        <w:numPr>
+          <w:ilvl w:val="0"/>
+          <w:numId w:val="28"/>
+        </w:numPr>
+      </w:pPr>
+      <w:r>
+        <w:t>soporte saturado</w:t>
+      </w:r>
+    </w:p>
+    <w:p>
+      <w:pPr>
+        <w:numPr>
+          <w:ilvl w:val="0"/>
+          <w:numId w:val="28"/>
+        </w:numPr>
+      </w:pPr>
+      <w:proofErr w:type="spellStart"/>
+      <w:r>
+        <w:lastRenderedPageBreak/>
+        <w:t>recruiters</w:t>
+      </w:r>
+      <w:proofErr w:type="spellEnd"/>
+      <w:r>
+        <w:t xml:space="preserve"> desbordados</w:t>
+      </w:r>
+    </w:p>
+    <w:p>
+      <w:r>
+        <w:rPr>
+          <w:rFonts w:ascii="Segoe UI Emoji" w:hAnsi="Segoe UI Emoji" w:cs="Segoe UI Emoji"/>
+        </w:rPr>
+        <w:t>📌</w:t>
+      </w:r>
+      <w:r>
+        <w:t xml:space="preserve"> Regla:</w:t>
+      </w:r>
+    </w:p>
+    <w:p>
+      <w:r>
+        <w:t>Si una persona frena todo → automatización con IA</w:t>
+      </w:r>
+    </w:p>
+    <w:p>
+      <w:r>
+        <w:pict w14:anchorId="6D696C10">
+          <v:rect id="_x0000_i1147" style="width:0;height:1.5pt" o:hralign="center" o:hrstd="t" o:hr="t" fillcolor="#a0a0a0" stroked="f"/>
+        </w:pict>
+      </w:r>
+    </w:p>
+    <w:p>
+      <w:pPr>
+        <w:rPr>
+          <w:b/>
+          <w:bCs/>
+          <w:sz w:val="28"/>
+          <w:szCs w:val="28"/>
+          <w:u w:val="single"/>
+        </w:rPr>
+      </w:pPr>
+      <w:r>
+        <w:rPr>
+          <w:b/>
+          <w:bCs/>
+          <w:sz w:val="28"/>
+          <w:szCs w:val="28"/>
+          <w:u w:val="single"/>
+        </w:rPr>
+        <w:t>5️</w:t>
+      </w:r>
+      <w:r>
+        <w:rPr>
+          <w:rFonts w:ascii="Tahoma" w:hAnsi="Tahoma" w:cs="Tahoma"/>
+          <w:b/>
+          <w:bCs/>
+          <w:sz w:val="28"/>
+          <w:szCs w:val="28"/>
+          <w:u w:val="single"/>
+        </w:rPr>
+        <w:t xml:space="preserve">) </w:t>
+      </w:r>
+      <w:r>
+        <w:rPr>
+          <w:b/>
+          <w:bCs/>
+          <w:sz w:val="28"/>
+          <w:szCs w:val="28"/>
+          <w:u w:val="single"/>
+        </w:rPr>
+        <w:t>Sistemas que ya existen pero son malos</w:t>
+      </w:r>
+    </w:p>
+    <w:p>
+      <w:r>
+        <w:t>Ejemplos:</w:t>
+      </w:r>
+    </w:p>
+    <w:p>
+      <w:pPr>
+        <w:numPr>
+          <w:ilvl w:val="0"/>
+          <w:numId w:val="29"/>
+        </w:numPr>
+      </w:pPr>
+      <w:r>
+        <w:t>buscadores internos que no funcionan</w:t>
+      </w:r>
+    </w:p>
+    <w:p>
+      <w:pPr>
+        <w:numPr>
+          <w:ilvl w:val="0"/>
+          <w:numId w:val="29"/>
+        </w:numPr>
+      </w:pPr>
+      <w:proofErr w:type="spellStart"/>
+      <w:r>
+        <w:t>FAQs</w:t>
+      </w:r>
+      <w:proofErr w:type="spellEnd"/>
+      <w:r>
+        <w:t xml:space="preserve"> inútiles</w:t>
+      </w:r>
+    </w:p>
+    <w:p>
+      <w:pPr>
+        <w:numPr>
+          <w:ilvl w:val="0"/>
+          <w:numId w:val="29"/>
+        </w:numPr>
+      </w:pPr>
+      <w:r>
+        <w:t>sistemas rígidos</w:t>
+      </w:r>
+    </w:p>
+    <w:p>
+      <w:r>
+        <w:rPr>
+          <w:rFonts w:ascii="Segoe UI Emoji" w:hAnsi="Segoe UI Emoji" w:cs="Segoe UI Emoji"/>
+        </w:rPr>
+        <w:t>📌</w:t>
+      </w:r>
+      <w:r>
+        <w:t xml:space="preserve"> Regla:</w:t>
+      </w:r>
+    </w:p>
+    <w:p>
+      <w:r>
+        <w:t>Mejorar algo existente suele ser más fácil que crear algo nuevo</w:t>
+      </w:r>
+    </w:p>
+    <w:p>
+      <w:r>
+        <w:pict w14:anchorId="0063973B">
+          <v:rect id="_x0000_i1148" style="width:0;height:1.5pt" o:hralign="center" o:hrstd="t" o:hr="t" fillcolor="#a0a0a0" stroked="f"/>
+        </w:pict>
+      </w:r>
+    </w:p>
+    <w:p>
+      <w:pPr>
+        <w:rPr>
+          <w:b/>
+          <w:bCs/>
+          <w:sz w:val="28"/>
+          <w:szCs w:val="28"/>
+          <w:u w:val="single"/>
+        </w:rPr>
+      </w:pPr>
+      <w:r>
+        <w:rPr>
+          <w:rFonts w:ascii="Segoe UI Emoji" w:hAnsi="Segoe UI Emoji" w:cs="Segoe UI Emoji"/>
+          <w:b/>
+          <w:bCs/>
+          <w:sz w:val="28"/>
+          <w:szCs w:val="28"/>
+          <w:u w:val="single"/>
+        </w:rPr>
+        <w:t>📌</w:t>
+      </w:r>
+      <w:r>
+        <w:rPr>
+          <w:b/>
+          <w:bCs/>
+          <w:sz w:val="28"/>
+          <w:szCs w:val="28"/>
+          <w:u w:val="single"/>
+        </w:rPr>
+        <w:t xml:space="preserve"> Patrón mental</w:t>
+      </w:r>
+    </w:p>
+    <w:p>
+      <w:r>
+        <w:t xml:space="preserve">Cuando veas un problema, </w:t>
+      </w:r>
+      <w:proofErr w:type="spellStart"/>
+      <w:r>
+        <w:t>preguntate</w:t>
+      </w:r>
+      <w:proofErr w:type="spellEnd"/>
+      <w:r>
+        <w:t>:</w:t>
+      </w:r>
+    </w:p>
+    <w:p>
+      <w:r>
+        <w:t>¿Es repetitivo?</w:t>
+      </w:r>
+      <w:r>
+        <w:br/>
+        <w:t>¿Hay datos?</w:t>
+      </w:r>
+      <w:r>
+        <w:br/>
+        <w:t>¿Hay texto?</w:t>
+      </w:r>
+      <w:r>
+        <w:br/>
+        <w:t>¿Hay cuello de botella?</w:t>
+      </w:r>
+    </w:p>
+    <w:p>
+      <w:r>
+        <w:t>Si responde “sí” a varios → hay oportunidad.</w:t>
+      </w:r>
+    </w:p>
     <w:p/>
-    <w:p/>
+    <w:p>
+      <w:pPr>
+        <w:rPr>
+          <w:b/>
+          <w:bCs/>
+          <w:sz w:val="28"/>
+          <w:szCs w:val="28"/>
+          <w:u w:val="single"/>
+        </w:rPr>
+      </w:pPr>
+      <w:r>
+        <w:rPr>
+          <w:b/>
+          <w:bCs/>
+          <w:sz w:val="28"/>
+          <w:szCs w:val="28"/>
+          <w:u w:val="single"/>
+        </w:rPr>
+        <w:t xml:space="preserve">Mini ejercicio </w:t>
+      </w:r>
+    </w:p>
+    <w:p>
+      <w:r>
+        <w:t>Te doy un contexto real:</w:t>
+      </w:r>
+    </w:p>
+    <w:p>
+      <w:r>
+        <w:t>Una universidad tiene miles de consultas de alumnos todos los días (fechas, materias, correlativas, trámites).</w:t>
+      </w:r>
+    </w:p>
+    <w:p>
+      <w:proofErr w:type="spellStart"/>
+      <w:r>
+        <w:t>Detectá</w:t>
+      </w:r>
+      <w:proofErr w:type="spellEnd"/>
+      <w:r>
+        <w:t xml:space="preserve"> la oportunidad de IA.</w:t>
+      </w:r>
+    </w:p>
+    <w:p>
+      <w:pPr>
+        <w:rPr>
+          <w:b/>
+          <w:bCs/>
+          <w:u w:val="single"/>
+        </w:rPr>
+      </w:pPr>
+      <w:r>
+        <w:rPr>
+          <w:b/>
+          <w:bCs/>
+          <w:u w:val="single"/>
+        </w:rPr>
+        <w:t>Respuesta:</w:t>
+      </w:r>
+    </w:p>
+    <w:p>
+      <w:r>
+        <w:t>Problema →</w:t>
+      </w:r>
+      <w:r>
+        <w:t xml:space="preserve"> Saturación de consultas, no dan abasto para contestarlas</w:t>
+      </w:r>
+    </w:p>
+    <w:p>
+      <w:r>
+        <w:t>Tipo de IA →</w:t>
+      </w:r>
+      <w:r>
+        <w:t xml:space="preserve"> LLM y RAG</w:t>
+      </w:r>
+    </w:p>
+    <w:p>
+      <w:r>
+        <w:t>Arquitectura →</w:t>
+      </w:r>
+    </w:p>
+    <w:p>
+      <w:r>
+        <w:t>Input: Consulta</w:t>
+      </w:r>
+    </w:p>
+    <w:p>
+      <w:r>
+        <w:t xml:space="preserve">LLM: Interpreta la consulta </w:t>
+      </w:r>
+    </w:p>
+    <w:p>
+      <w:r>
+        <w:t xml:space="preserve">RAG → reglamentos, fechas, </w:t>
+      </w:r>
+      <w:proofErr w:type="spellStart"/>
+      <w:r>
+        <w:t>info</w:t>
+      </w:r>
+      <w:proofErr w:type="spellEnd"/>
+      <w:r>
+        <w:t xml:space="preserve"> académica</w:t>
+      </w:r>
+    </w:p>
+    <w:p>
+      <w:r>
+        <w:lastRenderedPageBreak/>
+        <w:br/>
+        <w:t>Sistema interno → datos del alumno (materias aprobadas, estado)</w:t>
+      </w:r>
+      <w:r>
+        <w:t>LLM: Contesta la pregunta</w:t>
+      </w:r>
+    </w:p>
+    <w:p>
+      <w:r>
+        <w:t>Resultado: Contesta las consultas de los alumnos en base a sus necesidades</w:t>
+      </w:r>
+    </w:p>
+    <w:p>
+      <w:r>
+        <w:t>Valor →</w:t>
+      </w:r>
+      <w:r>
+        <w:t xml:space="preserve"> Un sistema que agiliza </w:t>
+      </w:r>
+      <w:r>
+        <w:t>las dudas de los alumnos</w:t>
+      </w:r>
+    </w:p>
     <w:p/>
     <w:p/>
     <w:sectPr>
@@ -3814,6 +4551,155 @@
     </w:lvl>
   </w:abstractNum>
   <w:abstractNum w:abstractNumId="1" w15:restartNumberingAfterBreak="0">
+    <w:nsid w:val="060A65E4"/>
+    <w:multiLevelType w:val="multilevel"/>
+    <w:tmpl w:val="407A1D2A"/>
+    <w:lvl w:ilvl="0">
+      <w:start w:val="1"/>
+      <w:numFmt w:val="bullet"/>
+      <w:lvlText w:val=""/>
+      <w:lvlJc w:val="left"/>
+      <w:pPr>
+        <w:tabs>
+          <w:tab w:val="num" w:pos="720"/>
+        </w:tabs>
+        <w:ind w:left="720" w:hanging="360"/>
+      </w:pPr>
+      <w:rPr>
+        <w:rFonts w:ascii="Symbol" w:hAnsi="Symbol" w:hint="default"/>
+        <w:sz w:val="20"/>
+      </w:rPr>
+    </w:lvl>
+    <w:lvl w:ilvl="1" w:tentative="1">
+      <w:start w:val="1"/>
+      <w:numFmt w:val="bullet"/>
+      <w:lvlText w:val="o"/>
+      <w:lvlJc w:val="left"/>
+      <w:pPr>
+        <w:tabs>
+          <w:tab w:val="num" w:pos="1440"/>
+        </w:tabs>
+        <w:ind w:left="1440" w:hanging="360"/>
+      </w:pPr>
+      <w:rPr>
+        <w:rFonts w:ascii="Courier New" w:hAnsi="Courier New" w:hint="default"/>
+        <w:sz w:val="20"/>
+      </w:rPr>
+    </w:lvl>
+    <w:lvl w:ilvl="2" w:tentative="1">
+      <w:start w:val="1"/>
+      <w:numFmt w:val="bullet"/>
+      <w:lvlText w:val=""/>
+      <w:lvlJc w:val="left"/>
+      <w:pPr>
+        <w:tabs>
+          <w:tab w:val="num" w:pos="2160"/>
+        </w:tabs>
+        <w:ind w:left="2160" w:hanging="360"/>
+      </w:pPr>
+      <w:rPr>
+        <w:rFonts w:ascii="Wingdings" w:hAnsi="Wingdings" w:hint="default"/>
+        <w:sz w:val="20"/>
+      </w:rPr>
+    </w:lvl>
+    <w:lvl w:ilvl="3" w:tentative="1">
+      <w:start w:val="1"/>
+      <w:numFmt w:val="bullet"/>
+      <w:lvlText w:val=""/>
+      <w:lvlJc w:val="left"/>
+      <w:pPr>
+        <w:tabs>
+          <w:tab w:val="num" w:pos="2880"/>
+        </w:tabs>
+        <w:ind w:left="2880" w:hanging="360"/>
+      </w:pPr>
+      <w:rPr>
+        <w:rFonts w:ascii="Wingdings" w:hAnsi="Wingdings" w:hint="default"/>
+        <w:sz w:val="20"/>
+      </w:rPr>
+    </w:lvl>
+    <w:lvl w:ilvl="4" w:tentative="1">
+      <w:start w:val="1"/>
+      <w:numFmt w:val="bullet"/>
+      <w:lvlText w:val=""/>
+      <w:lvlJc w:val="left"/>
+      <w:pPr>
+        <w:tabs>
+          <w:tab w:val="num" w:pos="3600"/>
+        </w:tabs>
+        <w:ind w:left="3600" w:hanging="360"/>
+      </w:pPr>
+      <w:rPr>
+        <w:rFonts w:ascii="Wingdings" w:hAnsi="Wingdings" w:hint="default"/>
+        <w:sz w:val="20"/>
+      </w:rPr>
+    </w:lvl>
+    <w:lvl w:ilvl="5" w:tentative="1">
+      <w:start w:val="1"/>
+      <w:numFmt w:val="bullet"/>
+      <w:lvlText w:val=""/>
+      <w:lvlJc w:val="left"/>
+      <w:pPr>
+        <w:tabs>
+          <w:tab w:val="num" w:pos="4320"/>
+        </w:tabs>
+        <w:ind w:left="4320" w:hanging="360"/>
+      </w:pPr>
+      <w:rPr>
+        <w:rFonts w:ascii="Wingdings" w:hAnsi="Wingdings" w:hint="default"/>
+        <w:sz w:val="20"/>
+      </w:rPr>
+    </w:lvl>
+    <w:lvl w:ilvl="6" w:tentative="1">
+      <w:start w:val="1"/>
+      <w:numFmt w:val="bullet"/>
+      <w:lvlText w:val=""/>
+      <w:lvlJc w:val="left"/>
+      <w:pPr>
+        <w:tabs>
+          <w:tab w:val="num" w:pos="5040"/>
+        </w:tabs>
+        <w:ind w:left="5040" w:hanging="360"/>
+      </w:pPr>
+      <w:rPr>
+        <w:rFonts w:ascii="Wingdings" w:hAnsi="Wingdings" w:hint="default"/>
+        <w:sz w:val="20"/>
+      </w:rPr>
+    </w:lvl>
+    <w:lvl w:ilvl="7" w:tentative="1">
+      <w:start w:val="1"/>
+      <w:numFmt w:val="bullet"/>
+      <w:lvlText w:val=""/>
+      <w:lvlJc w:val="left"/>
+      <w:pPr>
+        <w:tabs>
+          <w:tab w:val="num" w:pos="5760"/>
+        </w:tabs>
+        <w:ind w:left="5760" w:hanging="360"/>
+      </w:pPr>
+      <w:rPr>
+        <w:rFonts w:ascii="Wingdings" w:hAnsi="Wingdings" w:hint="default"/>
+        <w:sz w:val="20"/>
+      </w:rPr>
+    </w:lvl>
+    <w:lvl w:ilvl="8" w:tentative="1">
+      <w:start w:val="1"/>
+      <w:numFmt w:val="bullet"/>
+      <w:lvlText w:val=""/>
+      <w:lvlJc w:val="left"/>
+      <w:pPr>
+        <w:tabs>
+          <w:tab w:val="num" w:pos="6480"/>
+        </w:tabs>
+        <w:ind w:left="6480" w:hanging="360"/>
+      </w:pPr>
+      <w:rPr>
+        <w:rFonts w:ascii="Wingdings" w:hAnsi="Wingdings" w:hint="default"/>
+        <w:sz w:val="20"/>
+      </w:rPr>
+    </w:lvl>
+  </w:abstractNum>
+  <w:abstractNum w:abstractNumId="2" w15:restartNumberingAfterBreak="0">
     <w:nsid w:val="08501AFC"/>
     <w:multiLevelType w:val="multilevel"/>
     <w:tmpl w:val="B622E10E"/>
@@ -3962,7 +4848,7 @@
       </w:rPr>
     </w:lvl>
   </w:abstractNum>
-  <w:abstractNum w:abstractNumId="2" w15:restartNumberingAfterBreak="0">
+  <w:abstractNum w:abstractNumId="3" w15:restartNumberingAfterBreak="0">
     <w:nsid w:val="0E017DE4"/>
     <w:multiLevelType w:val="multilevel"/>
     <w:tmpl w:val="E7D8C8A6"/>
@@ -4111,7 +4997,7 @@
       </w:rPr>
     </w:lvl>
   </w:abstractNum>
-  <w:abstractNum w:abstractNumId="3" w15:restartNumberingAfterBreak="0">
+  <w:abstractNum w:abstractNumId="4" w15:restartNumberingAfterBreak="0">
     <w:nsid w:val="14CD2F19"/>
     <w:multiLevelType w:val="multilevel"/>
     <w:tmpl w:val="035EAAB4"/>
@@ -4260,7 +5146,7 @@
       </w:rPr>
     </w:lvl>
   </w:abstractNum>
-  <w:abstractNum w:abstractNumId="4" w15:restartNumberingAfterBreak="0">
+  <w:abstractNum w:abstractNumId="5" w15:restartNumberingAfterBreak="0">
     <w:nsid w:val="15EB15B1"/>
     <w:multiLevelType w:val="multilevel"/>
     <w:tmpl w:val="C91E09EE"/>
@@ -4409,7 +5295,7 @@
       </w:rPr>
     </w:lvl>
   </w:abstractNum>
-  <w:abstractNum w:abstractNumId="5" w15:restartNumberingAfterBreak="0">
+  <w:abstractNum w:abstractNumId="6" w15:restartNumberingAfterBreak="0">
     <w:nsid w:val="168C1C14"/>
     <w:multiLevelType w:val="multilevel"/>
     <w:tmpl w:val="DE145FA8"/>
@@ -4558,7 +5444,7 @@
       </w:rPr>
     </w:lvl>
   </w:abstractNum>
-  <w:abstractNum w:abstractNumId="6" w15:restartNumberingAfterBreak="0">
+  <w:abstractNum w:abstractNumId="7" w15:restartNumberingAfterBreak="0">
     <w:nsid w:val="1E62487A"/>
     <w:multiLevelType w:val="multilevel"/>
     <w:tmpl w:val="89003A2C"/>
@@ -4707,7 +5593,7 @@
       </w:rPr>
     </w:lvl>
   </w:abstractNum>
-  <w:abstractNum w:abstractNumId="7" w15:restartNumberingAfterBreak="0">
+  <w:abstractNum w:abstractNumId="8" w15:restartNumberingAfterBreak="0">
     <w:nsid w:val="23B50855"/>
     <w:multiLevelType w:val="multilevel"/>
     <w:tmpl w:val="B6E64CE6"/>
@@ -4856,7 +5742,7 @@
       </w:rPr>
     </w:lvl>
   </w:abstractNum>
-  <w:abstractNum w:abstractNumId="8" w15:restartNumberingAfterBreak="0">
+  <w:abstractNum w:abstractNumId="9" w15:restartNumberingAfterBreak="0">
     <w:nsid w:val="24DC500A"/>
     <w:multiLevelType w:val="multilevel"/>
     <w:tmpl w:val="A5D4323C"/>
@@ -5005,7 +5891,7 @@
       </w:rPr>
     </w:lvl>
   </w:abstractNum>
-  <w:abstractNum w:abstractNumId="9" w15:restartNumberingAfterBreak="0">
+  <w:abstractNum w:abstractNumId="10" w15:restartNumberingAfterBreak="0">
     <w:nsid w:val="24F916FC"/>
     <w:multiLevelType w:val="multilevel"/>
     <w:tmpl w:val="DB32BF3E"/>
@@ -5154,7 +6040,305 @@
       </w:rPr>
     </w:lvl>
   </w:abstractNum>
-  <w:abstractNum w:abstractNumId="10" w15:restartNumberingAfterBreak="0">
+  <w:abstractNum w:abstractNumId="11" w15:restartNumberingAfterBreak="0">
+    <w:nsid w:val="25AC6489"/>
+    <w:multiLevelType w:val="multilevel"/>
+    <w:tmpl w:val="2D100BE8"/>
+    <w:lvl w:ilvl="0">
+      <w:start w:val="1"/>
+      <w:numFmt w:val="bullet"/>
+      <w:lvlText w:val=""/>
+      <w:lvlJc w:val="left"/>
+      <w:pPr>
+        <w:tabs>
+          <w:tab w:val="num" w:pos="720"/>
+        </w:tabs>
+        <w:ind w:left="720" w:hanging="360"/>
+      </w:pPr>
+      <w:rPr>
+        <w:rFonts w:ascii="Symbol" w:hAnsi="Symbol" w:hint="default"/>
+        <w:sz w:val="20"/>
+      </w:rPr>
+    </w:lvl>
+    <w:lvl w:ilvl="1" w:tentative="1">
+      <w:start w:val="1"/>
+      <w:numFmt w:val="bullet"/>
+      <w:lvlText w:val="o"/>
+      <w:lvlJc w:val="left"/>
+      <w:pPr>
+        <w:tabs>
+          <w:tab w:val="num" w:pos="1440"/>
+        </w:tabs>
+        <w:ind w:left="1440" w:hanging="360"/>
+      </w:pPr>
+      <w:rPr>
+        <w:rFonts w:ascii="Courier New" w:hAnsi="Courier New" w:hint="default"/>
+        <w:sz w:val="20"/>
+      </w:rPr>
+    </w:lvl>
+    <w:lvl w:ilvl="2" w:tentative="1">
+      <w:start w:val="1"/>
+      <w:numFmt w:val="bullet"/>
+      <w:lvlText w:val=""/>
+      <w:lvlJc w:val="left"/>
+      <w:pPr>
+        <w:tabs>
+          <w:tab w:val="num" w:pos="2160"/>
+        </w:tabs>
+        <w:ind w:left="2160" w:hanging="360"/>
+      </w:pPr>
+      <w:rPr>
+        <w:rFonts w:ascii="Wingdings" w:hAnsi="Wingdings" w:hint="default"/>
+        <w:sz w:val="20"/>
+      </w:rPr>
+    </w:lvl>
+    <w:lvl w:ilvl="3" w:tentative="1">
+      <w:start w:val="1"/>
+      <w:numFmt w:val="bullet"/>
+      <w:lvlText w:val=""/>
+      <w:lvlJc w:val="left"/>
+      <w:pPr>
+        <w:tabs>
+          <w:tab w:val="num" w:pos="2880"/>
+        </w:tabs>
+        <w:ind w:left="2880" w:hanging="360"/>
+      </w:pPr>
+      <w:rPr>
+        <w:rFonts w:ascii="Wingdings" w:hAnsi="Wingdings" w:hint="default"/>
+        <w:sz w:val="20"/>
+      </w:rPr>
+    </w:lvl>
+    <w:lvl w:ilvl="4" w:tentative="1">
+      <w:start w:val="1"/>
+      <w:numFmt w:val="bullet"/>
+      <w:lvlText w:val=""/>
+      <w:lvlJc w:val="left"/>
+      <w:pPr>
+        <w:tabs>
+          <w:tab w:val="num" w:pos="3600"/>
+        </w:tabs>
+        <w:ind w:left="3600" w:hanging="360"/>
+      </w:pPr>
+      <w:rPr>
+        <w:rFonts w:ascii="Wingdings" w:hAnsi="Wingdings" w:hint="default"/>
+        <w:sz w:val="20"/>
+      </w:rPr>
+    </w:lvl>
+    <w:lvl w:ilvl="5" w:tentative="1">
+      <w:start w:val="1"/>
+      <w:numFmt w:val="bullet"/>
+      <w:lvlText w:val=""/>
+      <w:lvlJc w:val="left"/>
+      <w:pPr>
+        <w:tabs>
+          <w:tab w:val="num" w:pos="4320"/>
+        </w:tabs>
+        <w:ind w:left="4320" w:hanging="360"/>
+      </w:pPr>
+      <w:rPr>
+        <w:rFonts w:ascii="Wingdings" w:hAnsi="Wingdings" w:hint="default"/>
+        <w:sz w:val="20"/>
+      </w:rPr>
+    </w:lvl>
+    <w:lvl w:ilvl="6" w:tentative="1">
+      <w:start w:val="1"/>
+      <w:numFmt w:val="bullet"/>
+      <w:lvlText w:val=""/>
+      <w:lvlJc w:val="left"/>
+      <w:pPr>
+        <w:tabs>
+          <w:tab w:val="num" w:pos="5040"/>
+        </w:tabs>
+        <w:ind w:left="5040" w:hanging="360"/>
+      </w:pPr>
+      <w:rPr>
+        <w:rFonts w:ascii="Wingdings" w:hAnsi="Wingdings" w:hint="default"/>
+        <w:sz w:val="20"/>
+      </w:rPr>
+    </w:lvl>
+    <w:lvl w:ilvl="7" w:tentative="1">
+      <w:start w:val="1"/>
+      <w:numFmt w:val="bullet"/>
+      <w:lvlText w:val=""/>
+      <w:lvlJc w:val="left"/>
+      <w:pPr>
+        <w:tabs>
+          <w:tab w:val="num" w:pos="5760"/>
+        </w:tabs>
+        <w:ind w:left="5760" w:hanging="360"/>
+      </w:pPr>
+      <w:rPr>
+        <w:rFonts w:ascii="Wingdings" w:hAnsi="Wingdings" w:hint="default"/>
+        <w:sz w:val="20"/>
+      </w:rPr>
+    </w:lvl>
+    <w:lvl w:ilvl="8" w:tentative="1">
+      <w:start w:val="1"/>
+      <w:numFmt w:val="bullet"/>
+      <w:lvlText w:val=""/>
+      <w:lvlJc w:val="left"/>
+      <w:pPr>
+        <w:tabs>
+          <w:tab w:val="num" w:pos="6480"/>
+        </w:tabs>
+        <w:ind w:left="6480" w:hanging="360"/>
+      </w:pPr>
+      <w:rPr>
+        <w:rFonts w:ascii="Wingdings" w:hAnsi="Wingdings" w:hint="default"/>
+        <w:sz w:val="20"/>
+      </w:rPr>
+    </w:lvl>
+  </w:abstractNum>
+  <w:abstractNum w:abstractNumId="12" w15:restartNumberingAfterBreak="0">
+    <w:nsid w:val="2C667E53"/>
+    <w:multiLevelType w:val="multilevel"/>
+    <w:tmpl w:val="2AC423AE"/>
+    <w:lvl w:ilvl="0">
+      <w:start w:val="1"/>
+      <w:numFmt w:val="bullet"/>
+      <w:lvlText w:val=""/>
+      <w:lvlJc w:val="left"/>
+      <w:pPr>
+        <w:tabs>
+          <w:tab w:val="num" w:pos="720"/>
+        </w:tabs>
+        <w:ind w:left="720" w:hanging="360"/>
+      </w:pPr>
+      <w:rPr>
+        <w:rFonts w:ascii="Symbol" w:hAnsi="Symbol" w:hint="default"/>
+        <w:sz w:val="20"/>
+      </w:rPr>
+    </w:lvl>
+    <w:lvl w:ilvl="1" w:tentative="1">
+      <w:start w:val="1"/>
+      <w:numFmt w:val="bullet"/>
+      <w:lvlText w:val="o"/>
+      <w:lvlJc w:val="left"/>
+      <w:pPr>
+        <w:tabs>
+          <w:tab w:val="num" w:pos="1440"/>
+        </w:tabs>
+        <w:ind w:left="1440" w:hanging="360"/>
+      </w:pPr>
+      <w:rPr>
+        <w:rFonts w:ascii="Courier New" w:hAnsi="Courier New" w:hint="default"/>
+        <w:sz w:val="20"/>
+      </w:rPr>
+    </w:lvl>
+    <w:lvl w:ilvl="2" w:tentative="1">
+      <w:start w:val="1"/>
+      <w:numFmt w:val="bullet"/>
+      <w:lvlText w:val=""/>
+      <w:lvlJc w:val="left"/>
+      <w:pPr>
+        <w:tabs>
+          <w:tab w:val="num" w:pos="2160"/>
+        </w:tabs>
+        <w:ind w:left="2160" w:hanging="360"/>
+      </w:pPr>
+      <w:rPr>
+        <w:rFonts w:ascii="Wingdings" w:hAnsi="Wingdings" w:hint="default"/>
+        <w:sz w:val="20"/>
+      </w:rPr>
+    </w:lvl>
+    <w:lvl w:ilvl="3" w:tentative="1">
+      <w:start w:val="1"/>
+      <w:numFmt w:val="bullet"/>
+      <w:lvlText w:val=""/>
+      <w:lvlJc w:val="left"/>
+      <w:pPr>
+        <w:tabs>
+          <w:tab w:val="num" w:pos="2880"/>
+        </w:tabs>
+        <w:ind w:left="2880" w:hanging="360"/>
+      </w:pPr>
+      <w:rPr>
+        <w:rFonts w:ascii="Wingdings" w:hAnsi="Wingdings" w:hint="default"/>
+        <w:sz w:val="20"/>
+      </w:rPr>
+    </w:lvl>
+    <w:lvl w:ilvl="4" w:tentative="1">
+      <w:start w:val="1"/>
+      <w:numFmt w:val="bullet"/>
+      <w:lvlText w:val=""/>
+      <w:lvlJc w:val="left"/>
+      <w:pPr>
+        <w:tabs>
+          <w:tab w:val="num" w:pos="3600"/>
+        </w:tabs>
+        <w:ind w:left="3600" w:hanging="360"/>
+      </w:pPr>
+      <w:rPr>
+        <w:rFonts w:ascii="Wingdings" w:hAnsi="Wingdings" w:hint="default"/>
+        <w:sz w:val="20"/>
+      </w:rPr>
+    </w:lvl>
+    <w:lvl w:ilvl="5" w:tentative="1">
+      <w:start w:val="1"/>
+      <w:numFmt w:val="bullet"/>
+      <w:lvlText w:val=""/>
+      <w:lvlJc w:val="left"/>
+      <w:pPr>
+        <w:tabs>
+          <w:tab w:val="num" w:pos="4320"/>
+        </w:tabs>
+        <w:ind w:left="4320" w:hanging="360"/>
+      </w:pPr>
+      <w:rPr>
+        <w:rFonts w:ascii="Wingdings" w:hAnsi="Wingdings" w:hint="default"/>
+        <w:sz w:val="20"/>
+      </w:rPr>
+    </w:lvl>
+    <w:lvl w:ilvl="6" w:tentative="1">
+      <w:start w:val="1"/>
+      <w:numFmt w:val="bullet"/>
+      <w:lvlText w:val=""/>
+      <w:lvlJc w:val="left"/>
+      <w:pPr>
+        <w:tabs>
+          <w:tab w:val="num" w:pos="5040"/>
+        </w:tabs>
+        <w:ind w:left="5040" w:hanging="360"/>
+      </w:pPr>
+      <w:rPr>
+        <w:rFonts w:ascii="Wingdings" w:hAnsi="Wingdings" w:hint="default"/>
+        <w:sz w:val="20"/>
+      </w:rPr>
+    </w:lvl>
+    <w:lvl w:ilvl="7" w:tentative="1">
+      <w:start w:val="1"/>
+      <w:numFmt w:val="bullet"/>
+      <w:lvlText w:val=""/>
+      <w:lvlJc w:val="left"/>
+      <w:pPr>
+        <w:tabs>
+          <w:tab w:val="num" w:pos="5760"/>
+        </w:tabs>
+        <w:ind w:left="5760" w:hanging="360"/>
+      </w:pPr>
+      <w:rPr>
+        <w:rFonts w:ascii="Wingdings" w:hAnsi="Wingdings" w:hint="default"/>
+        <w:sz w:val="20"/>
+      </w:rPr>
+    </w:lvl>
+    <w:lvl w:ilvl="8" w:tentative="1">
+      <w:start w:val="1"/>
+      <w:numFmt w:val="bullet"/>
+      <w:lvlText w:val=""/>
+      <w:lvlJc w:val="left"/>
+      <w:pPr>
+        <w:tabs>
+          <w:tab w:val="num" w:pos="6480"/>
+        </w:tabs>
+        <w:ind w:left="6480" w:hanging="360"/>
+      </w:pPr>
+      <w:rPr>
+        <w:rFonts w:ascii="Wingdings" w:hAnsi="Wingdings" w:hint="default"/>
+        <w:sz w:val="20"/>
+      </w:rPr>
+    </w:lvl>
+  </w:abstractNum>
+  <w:abstractNum w:abstractNumId="13" w15:restartNumberingAfterBreak="0">
     <w:nsid w:val="2D357FD8"/>
     <w:multiLevelType w:val="multilevel"/>
     <w:tmpl w:val="92B840E6"/>
@@ -5303,7 +6487,7 @@
       </w:rPr>
     </w:lvl>
   </w:abstractNum>
-  <w:abstractNum w:abstractNumId="11" w15:restartNumberingAfterBreak="0">
+  <w:abstractNum w:abstractNumId="14" w15:restartNumberingAfterBreak="0">
     <w:nsid w:val="2F697D3D"/>
     <w:multiLevelType w:val="multilevel"/>
     <w:tmpl w:val="A0FC9258"/>
@@ -5452,7 +6636,7 @@
       </w:rPr>
     </w:lvl>
   </w:abstractNum>
-  <w:abstractNum w:abstractNumId="12" w15:restartNumberingAfterBreak="0">
+  <w:abstractNum w:abstractNumId="15" w15:restartNumberingAfterBreak="0">
     <w:nsid w:val="337C5212"/>
     <w:multiLevelType w:val="multilevel"/>
     <w:tmpl w:val="8B40A606"/>
@@ -5601,7 +6785,7 @@
       </w:rPr>
     </w:lvl>
   </w:abstractNum>
-  <w:abstractNum w:abstractNumId="13" w15:restartNumberingAfterBreak="0">
+  <w:abstractNum w:abstractNumId="16" w15:restartNumberingAfterBreak="0">
     <w:nsid w:val="391A538B"/>
     <w:multiLevelType w:val="multilevel"/>
     <w:tmpl w:val="7F30BA7A"/>
@@ -5750,7 +6934,7 @@
       </w:rPr>
     </w:lvl>
   </w:abstractNum>
-  <w:abstractNum w:abstractNumId="14" w15:restartNumberingAfterBreak="0">
+  <w:abstractNum w:abstractNumId="17" w15:restartNumberingAfterBreak="0">
     <w:nsid w:val="39430A20"/>
     <w:multiLevelType w:val="multilevel"/>
     <w:tmpl w:val="5FE2FB92"/>
@@ -5899,7 +7083,7 @@
       </w:rPr>
     </w:lvl>
   </w:abstractNum>
-  <w:abstractNum w:abstractNumId="15" w15:restartNumberingAfterBreak="0">
+  <w:abstractNum w:abstractNumId="18" w15:restartNumberingAfterBreak="0">
     <w:nsid w:val="3F0440EC"/>
     <w:multiLevelType w:val="multilevel"/>
     <w:tmpl w:val="D68E910E"/>
@@ -6048,7 +7232,7 @@
       </w:rPr>
     </w:lvl>
   </w:abstractNum>
-  <w:abstractNum w:abstractNumId="16" w15:restartNumberingAfterBreak="0">
+  <w:abstractNum w:abstractNumId="19" w15:restartNumberingAfterBreak="0">
     <w:nsid w:val="40787588"/>
     <w:multiLevelType w:val="multilevel"/>
     <w:tmpl w:val="56E2A682"/>
@@ -6197,7 +7381,7 @@
       </w:rPr>
     </w:lvl>
   </w:abstractNum>
-  <w:abstractNum w:abstractNumId="17" w15:restartNumberingAfterBreak="0">
+  <w:abstractNum w:abstractNumId="20" w15:restartNumberingAfterBreak="0">
     <w:nsid w:val="41EE0DF2"/>
     <w:multiLevelType w:val="multilevel"/>
     <w:tmpl w:val="53D8DF16"/>
@@ -6346,7 +7530,7 @@
       </w:rPr>
     </w:lvl>
   </w:abstractNum>
-  <w:abstractNum w:abstractNumId="18" w15:restartNumberingAfterBreak="0">
+  <w:abstractNum w:abstractNumId="21" w15:restartNumberingAfterBreak="0">
     <w:nsid w:val="49C552A7"/>
     <w:multiLevelType w:val="multilevel"/>
     <w:tmpl w:val="110A216A"/>
@@ -6495,7 +7679,7 @@
       </w:rPr>
     </w:lvl>
   </w:abstractNum>
-  <w:abstractNum w:abstractNumId="19" w15:restartNumberingAfterBreak="0">
+  <w:abstractNum w:abstractNumId="22" w15:restartNumberingAfterBreak="0">
     <w:nsid w:val="53F2243B"/>
     <w:multiLevelType w:val="multilevel"/>
     <w:tmpl w:val="6B203F50"/>
@@ -6644,7 +7828,7 @@
       </w:rPr>
     </w:lvl>
   </w:abstractNum>
-  <w:abstractNum w:abstractNumId="20" w15:restartNumberingAfterBreak="0">
+  <w:abstractNum w:abstractNumId="23" w15:restartNumberingAfterBreak="0">
     <w:nsid w:val="61C21F20"/>
     <w:multiLevelType w:val="multilevel"/>
     <w:tmpl w:val="9EC6B29A"/>
@@ -6793,7 +7977,156 @@
       </w:rPr>
     </w:lvl>
   </w:abstractNum>
-  <w:abstractNum w:abstractNumId="21" w15:restartNumberingAfterBreak="0">
+  <w:abstractNum w:abstractNumId="24" w15:restartNumberingAfterBreak="0">
+    <w:nsid w:val="63730EA0"/>
+    <w:multiLevelType w:val="multilevel"/>
+    <w:tmpl w:val="A1F0EBA8"/>
+    <w:lvl w:ilvl="0">
+      <w:start w:val="1"/>
+      <w:numFmt w:val="bullet"/>
+      <w:lvlText w:val=""/>
+      <w:lvlJc w:val="left"/>
+      <w:pPr>
+        <w:tabs>
+          <w:tab w:val="num" w:pos="720"/>
+        </w:tabs>
+        <w:ind w:left="720" w:hanging="360"/>
+      </w:pPr>
+      <w:rPr>
+        <w:rFonts w:ascii="Symbol" w:hAnsi="Symbol" w:hint="default"/>
+        <w:sz w:val="20"/>
+      </w:rPr>
+    </w:lvl>
+    <w:lvl w:ilvl="1" w:tentative="1">
+      <w:start w:val="1"/>
+      <w:numFmt w:val="bullet"/>
+      <w:lvlText w:val="o"/>
+      <w:lvlJc w:val="left"/>
+      <w:pPr>
+        <w:tabs>
+          <w:tab w:val="num" w:pos="1440"/>
+        </w:tabs>
+        <w:ind w:left="1440" w:hanging="360"/>
+      </w:pPr>
+      <w:rPr>
+        <w:rFonts w:ascii="Courier New" w:hAnsi="Courier New" w:hint="default"/>
+        <w:sz w:val="20"/>
+      </w:rPr>
+    </w:lvl>
+    <w:lvl w:ilvl="2" w:tentative="1">
+      <w:start w:val="1"/>
+      <w:numFmt w:val="bullet"/>
+      <w:lvlText w:val=""/>
+      <w:lvlJc w:val="left"/>
+      <w:pPr>
+        <w:tabs>
+          <w:tab w:val="num" w:pos="2160"/>
+        </w:tabs>
+        <w:ind w:left="2160" w:hanging="360"/>
+      </w:pPr>
+      <w:rPr>
+        <w:rFonts w:ascii="Wingdings" w:hAnsi="Wingdings" w:hint="default"/>
+        <w:sz w:val="20"/>
+      </w:rPr>
+    </w:lvl>
+    <w:lvl w:ilvl="3" w:tentative="1">
+      <w:start w:val="1"/>
+      <w:numFmt w:val="bullet"/>
+      <w:lvlText w:val=""/>
+      <w:lvlJc w:val="left"/>
+      <w:pPr>
+        <w:tabs>
+          <w:tab w:val="num" w:pos="2880"/>
+        </w:tabs>
+        <w:ind w:left="2880" w:hanging="360"/>
+      </w:pPr>
+      <w:rPr>
+        <w:rFonts w:ascii="Wingdings" w:hAnsi="Wingdings" w:hint="default"/>
+        <w:sz w:val="20"/>
+      </w:rPr>
+    </w:lvl>
+    <w:lvl w:ilvl="4" w:tentative="1">
+      <w:start w:val="1"/>
+      <w:numFmt w:val="bullet"/>
+      <w:lvlText w:val=""/>
+      <w:lvlJc w:val="left"/>
+      <w:pPr>
+        <w:tabs>
+          <w:tab w:val="num" w:pos="3600"/>
+        </w:tabs>
+        <w:ind w:left="3600" w:hanging="360"/>
+      </w:pPr>
+      <w:rPr>
+        <w:rFonts w:ascii="Wingdings" w:hAnsi="Wingdings" w:hint="default"/>
+        <w:sz w:val="20"/>
+      </w:rPr>
+    </w:lvl>
+    <w:lvl w:ilvl="5" w:tentative="1">
+      <w:start w:val="1"/>
+      <w:numFmt w:val="bullet"/>
+      <w:lvlText w:val=""/>
+      <w:lvlJc w:val="left"/>
+      <w:pPr>
+        <w:tabs>
+          <w:tab w:val="num" w:pos="4320"/>
+        </w:tabs>
+        <w:ind w:left="4320" w:hanging="360"/>
+      </w:pPr>
+      <w:rPr>
+        <w:rFonts w:ascii="Wingdings" w:hAnsi="Wingdings" w:hint="default"/>
+        <w:sz w:val="20"/>
+      </w:rPr>
+    </w:lvl>
+    <w:lvl w:ilvl="6" w:tentative="1">
+      <w:start w:val="1"/>
+      <w:numFmt w:val="bullet"/>
+      <w:lvlText w:val=""/>
+      <w:lvlJc w:val="left"/>
+      <w:pPr>
+        <w:tabs>
+          <w:tab w:val="num" w:pos="5040"/>
+        </w:tabs>
+        <w:ind w:left="5040" w:hanging="360"/>
+      </w:pPr>
+      <w:rPr>
+        <w:rFonts w:ascii="Wingdings" w:hAnsi="Wingdings" w:hint="default"/>
+        <w:sz w:val="20"/>
+      </w:rPr>
+    </w:lvl>
+    <w:lvl w:ilvl="7" w:tentative="1">
+      <w:start w:val="1"/>
+      <w:numFmt w:val="bullet"/>
+      <w:lvlText w:val=""/>
+      <w:lvlJc w:val="left"/>
+      <w:pPr>
+        <w:tabs>
+          <w:tab w:val="num" w:pos="5760"/>
+        </w:tabs>
+        <w:ind w:left="5760" w:hanging="360"/>
+      </w:pPr>
+      <w:rPr>
+        <w:rFonts w:ascii="Wingdings" w:hAnsi="Wingdings" w:hint="default"/>
+        <w:sz w:val="20"/>
+      </w:rPr>
+    </w:lvl>
+    <w:lvl w:ilvl="8" w:tentative="1">
+      <w:start w:val="1"/>
+      <w:numFmt w:val="bullet"/>
+      <w:lvlText w:val=""/>
+      <w:lvlJc w:val="left"/>
+      <w:pPr>
+        <w:tabs>
+          <w:tab w:val="num" w:pos="6480"/>
+        </w:tabs>
+        <w:ind w:left="6480" w:hanging="360"/>
+      </w:pPr>
+      <w:rPr>
+        <w:rFonts w:ascii="Wingdings" w:hAnsi="Wingdings" w:hint="default"/>
+        <w:sz w:val="20"/>
+      </w:rPr>
+    </w:lvl>
+  </w:abstractNum>
+  <w:abstractNum w:abstractNumId="25" w15:restartNumberingAfterBreak="0">
     <w:nsid w:val="63CA0A21"/>
     <w:multiLevelType w:val="multilevel"/>
     <w:tmpl w:val="ABEAB454"/>
@@ -6942,7 +8275,7 @@
       </w:rPr>
     </w:lvl>
   </w:abstractNum>
-  <w:abstractNum w:abstractNumId="22" w15:restartNumberingAfterBreak="0">
+  <w:abstractNum w:abstractNumId="26" w15:restartNumberingAfterBreak="0">
     <w:nsid w:val="6C427D99"/>
     <w:multiLevelType w:val="multilevel"/>
     <w:tmpl w:val="6C26539A"/>
@@ -7091,10 +8424,159 @@
       </w:rPr>
     </w:lvl>
   </w:abstractNum>
-  <w:abstractNum w:abstractNumId="23" w15:restartNumberingAfterBreak="0">
+  <w:abstractNum w:abstractNumId="27" w15:restartNumberingAfterBreak="0">
     <w:nsid w:val="6C76368B"/>
     <w:multiLevelType w:val="multilevel"/>
     <w:tmpl w:val="53D44A26"/>
+    <w:lvl w:ilvl="0">
+      <w:start w:val="1"/>
+      <w:numFmt w:val="bullet"/>
+      <w:lvlText w:val=""/>
+      <w:lvlJc w:val="left"/>
+      <w:pPr>
+        <w:tabs>
+          <w:tab w:val="num" w:pos="720"/>
+        </w:tabs>
+        <w:ind w:left="720" w:hanging="360"/>
+      </w:pPr>
+      <w:rPr>
+        <w:rFonts w:ascii="Symbol" w:hAnsi="Symbol" w:hint="default"/>
+        <w:sz w:val="20"/>
+      </w:rPr>
+    </w:lvl>
+    <w:lvl w:ilvl="1" w:tentative="1">
+      <w:start w:val="1"/>
+      <w:numFmt w:val="bullet"/>
+      <w:lvlText w:val="o"/>
+      <w:lvlJc w:val="left"/>
+      <w:pPr>
+        <w:tabs>
+          <w:tab w:val="num" w:pos="1440"/>
+        </w:tabs>
+        <w:ind w:left="1440" w:hanging="360"/>
+      </w:pPr>
+      <w:rPr>
+        <w:rFonts w:ascii="Courier New" w:hAnsi="Courier New" w:hint="default"/>
+        <w:sz w:val="20"/>
+      </w:rPr>
+    </w:lvl>
+    <w:lvl w:ilvl="2" w:tentative="1">
+      <w:start w:val="1"/>
+      <w:numFmt w:val="bullet"/>
+      <w:lvlText w:val=""/>
+      <w:lvlJc w:val="left"/>
+      <w:pPr>
+        <w:tabs>
+          <w:tab w:val="num" w:pos="2160"/>
+        </w:tabs>
+        <w:ind w:left="2160" w:hanging="360"/>
+      </w:pPr>
+      <w:rPr>
+        <w:rFonts w:ascii="Wingdings" w:hAnsi="Wingdings" w:hint="default"/>
+        <w:sz w:val="20"/>
+      </w:rPr>
+    </w:lvl>
+    <w:lvl w:ilvl="3" w:tentative="1">
+      <w:start w:val="1"/>
+      <w:numFmt w:val="bullet"/>
+      <w:lvlText w:val=""/>
+      <w:lvlJc w:val="left"/>
+      <w:pPr>
+        <w:tabs>
+          <w:tab w:val="num" w:pos="2880"/>
+        </w:tabs>
+        <w:ind w:left="2880" w:hanging="360"/>
+      </w:pPr>
+      <w:rPr>
+        <w:rFonts w:ascii="Wingdings" w:hAnsi="Wingdings" w:hint="default"/>
+        <w:sz w:val="20"/>
+      </w:rPr>
+    </w:lvl>
+    <w:lvl w:ilvl="4" w:tentative="1">
+      <w:start w:val="1"/>
+      <w:numFmt w:val="bullet"/>
+      <w:lvlText w:val=""/>
+      <w:lvlJc w:val="left"/>
+      <w:pPr>
+        <w:tabs>
+          <w:tab w:val="num" w:pos="3600"/>
+        </w:tabs>
+        <w:ind w:left="3600" w:hanging="360"/>
+      </w:pPr>
+      <w:rPr>
+        <w:rFonts w:ascii="Wingdings" w:hAnsi="Wingdings" w:hint="default"/>
+        <w:sz w:val="20"/>
+      </w:rPr>
+    </w:lvl>
+    <w:lvl w:ilvl="5" w:tentative="1">
+      <w:start w:val="1"/>
+      <w:numFmt w:val="bullet"/>
+      <w:lvlText w:val=""/>
+      <w:lvlJc w:val="left"/>
+      <w:pPr>
+        <w:tabs>
+          <w:tab w:val="num" w:pos="4320"/>
+        </w:tabs>
+        <w:ind w:left="4320" w:hanging="360"/>
+      </w:pPr>
+      <w:rPr>
+        <w:rFonts w:ascii="Wingdings" w:hAnsi="Wingdings" w:hint="default"/>
+        <w:sz w:val="20"/>
+      </w:rPr>
+    </w:lvl>
+    <w:lvl w:ilvl="6" w:tentative="1">
+      <w:start w:val="1"/>
+      <w:numFmt w:val="bullet"/>
+      <w:lvlText w:val=""/>
+      <w:lvlJc w:val="left"/>
+      <w:pPr>
+        <w:tabs>
+          <w:tab w:val="num" w:pos="5040"/>
+        </w:tabs>
+        <w:ind w:left="5040" w:hanging="360"/>
+      </w:pPr>
+      <w:rPr>
+        <w:rFonts w:ascii="Wingdings" w:hAnsi="Wingdings" w:hint="default"/>
+        <w:sz w:val="20"/>
+      </w:rPr>
+    </w:lvl>
+    <w:lvl w:ilvl="7" w:tentative="1">
+      <w:start w:val="1"/>
+      <w:numFmt w:val="bullet"/>
+      <w:lvlText w:val=""/>
+      <w:lvlJc w:val="left"/>
+      <w:pPr>
+        <w:tabs>
+          <w:tab w:val="num" w:pos="5760"/>
+        </w:tabs>
+        <w:ind w:left="5760" w:hanging="360"/>
+      </w:pPr>
+      <w:rPr>
+        <w:rFonts w:ascii="Wingdings" w:hAnsi="Wingdings" w:hint="default"/>
+        <w:sz w:val="20"/>
+      </w:rPr>
+    </w:lvl>
+    <w:lvl w:ilvl="8" w:tentative="1">
+      <w:start w:val="1"/>
+      <w:numFmt w:val="bullet"/>
+      <w:lvlText w:val=""/>
+      <w:lvlJc w:val="left"/>
+      <w:pPr>
+        <w:tabs>
+          <w:tab w:val="num" w:pos="6480"/>
+        </w:tabs>
+        <w:ind w:left="6480" w:hanging="360"/>
+      </w:pPr>
+      <w:rPr>
+        <w:rFonts w:ascii="Wingdings" w:hAnsi="Wingdings" w:hint="default"/>
+        <w:sz w:val="20"/>
+      </w:rPr>
+    </w:lvl>
+  </w:abstractNum>
+  <w:abstractNum w:abstractNumId="28" w15:restartNumberingAfterBreak="0">
+    <w:nsid w:val="7B204074"/>
+    <w:multiLevelType w:val="multilevel"/>
+    <w:tmpl w:val="E6C803BC"/>
     <w:lvl w:ilvl="0">
       <w:start w:val="1"/>
       <w:numFmt w:val="bullet"/>
@@ -7244,73 +8726,88 @@
     <w:abstractNumId w:val="0"/>
   </w:num>
   <w:num w:numId="2" w16cid:durableId="278145578">
+    <w:abstractNumId w:val="19"/>
+  </w:num>
+  <w:num w:numId="3" w16cid:durableId="1082869659">
+    <w:abstractNumId w:val="8"/>
+  </w:num>
+  <w:num w:numId="4" w16cid:durableId="1399087449">
+    <w:abstractNumId w:val="26"/>
+  </w:num>
+  <w:num w:numId="5" w16cid:durableId="1590115480">
+    <w:abstractNumId w:val="10"/>
+  </w:num>
+  <w:num w:numId="6" w16cid:durableId="1275599465">
+    <w:abstractNumId w:val="4"/>
+  </w:num>
+  <w:num w:numId="7" w16cid:durableId="949821662">
+    <w:abstractNumId w:val="7"/>
+  </w:num>
+  <w:num w:numId="8" w16cid:durableId="502160085">
+    <w:abstractNumId w:val="9"/>
+  </w:num>
+  <w:num w:numId="9" w16cid:durableId="1561751620">
+    <w:abstractNumId w:val="15"/>
+  </w:num>
+  <w:num w:numId="10" w16cid:durableId="642005705">
+    <w:abstractNumId w:val="21"/>
+  </w:num>
+  <w:num w:numId="11" w16cid:durableId="1916285314">
+    <w:abstractNumId w:val="23"/>
+  </w:num>
+  <w:num w:numId="12" w16cid:durableId="112209799">
+    <w:abstractNumId w:val="6"/>
+  </w:num>
+  <w:num w:numId="13" w16cid:durableId="2034110977">
+    <w:abstractNumId w:val="3"/>
+  </w:num>
+  <w:num w:numId="14" w16cid:durableId="1815020617">
+    <w:abstractNumId w:val="27"/>
+  </w:num>
+  <w:num w:numId="15" w16cid:durableId="122311294">
+    <w:abstractNumId w:val="13"/>
+  </w:num>
+  <w:num w:numId="16" w16cid:durableId="1880705022">
+    <w:abstractNumId w:val="25"/>
+  </w:num>
+  <w:num w:numId="17" w16cid:durableId="245304063">
     <w:abstractNumId w:val="16"/>
   </w:num>
-  <w:num w:numId="3" w16cid:durableId="1082869659">
-    <w:abstractNumId w:val="7"/>
+  <w:num w:numId="18" w16cid:durableId="130291419">
+    <w:abstractNumId w:val="2"/>
   </w:num>
-  <w:num w:numId="4" w16cid:durableId="1399087449">
+  <w:num w:numId="19" w16cid:durableId="175270223">
     <w:abstractNumId w:val="22"/>
   </w:num>
-  <w:num w:numId="5" w16cid:durableId="1590115480">
-    <w:abstractNumId w:val="9"/>
+  <w:num w:numId="20" w16cid:durableId="1088422739">
+    <w:abstractNumId w:val="14"/>
   </w:num>
-  <w:num w:numId="6" w16cid:durableId="1275599465">
-    <w:abstractNumId w:val="3"/>
+  <w:num w:numId="21" w16cid:durableId="943269753">
+    <w:abstractNumId w:val="20"/>
   </w:num>
-  <w:num w:numId="7" w16cid:durableId="949821662">
-    <w:abstractNumId w:val="6"/>
+  <w:num w:numId="22" w16cid:durableId="1132791763">
+    <w:abstractNumId w:val="18"/>
   </w:num>
-  <w:num w:numId="8" w16cid:durableId="502160085">
-    <w:abstractNumId w:val="8"/>
+  <w:num w:numId="23" w16cid:durableId="1311708505">
+    <w:abstractNumId w:val="17"/>
   </w:num>
-  <w:num w:numId="9" w16cid:durableId="1561751620">
+  <w:num w:numId="24" w16cid:durableId="863400549">
+    <w:abstractNumId w:val="5"/>
+  </w:num>
+  <w:num w:numId="25" w16cid:durableId="790245534">
+    <w:abstractNumId w:val="28"/>
+  </w:num>
+  <w:num w:numId="26" w16cid:durableId="1656452626">
     <w:abstractNumId w:val="12"/>
   </w:num>
-  <w:num w:numId="10" w16cid:durableId="642005705">
-    <w:abstractNumId w:val="18"/>
-  </w:num>
-  <w:num w:numId="11" w16cid:durableId="1916285314">
-    <w:abstractNumId w:val="20"/>
-  </w:num>
-  <w:num w:numId="12" w16cid:durableId="112209799">
-    <w:abstractNumId w:val="5"/>
-  </w:num>
-  <w:num w:numId="13" w16cid:durableId="2034110977">
-    <w:abstractNumId w:val="2"/>
-  </w:num>
-  <w:num w:numId="14" w16cid:durableId="1815020617">
-    <w:abstractNumId w:val="23"/>
-  </w:num>
-  <w:num w:numId="15" w16cid:durableId="122311294">
-    <w:abstractNumId w:val="10"/>
-  </w:num>
-  <w:num w:numId="16" w16cid:durableId="1880705022">
-    <w:abstractNumId w:val="21"/>
-  </w:num>
-  <w:num w:numId="17" w16cid:durableId="245304063">
-    <w:abstractNumId w:val="13"/>
-  </w:num>
-  <w:num w:numId="18" w16cid:durableId="130291419">
+  <w:num w:numId="27" w16cid:durableId="1394891037">
     <w:abstractNumId w:val="1"/>
   </w:num>
-  <w:num w:numId="19" w16cid:durableId="175270223">
-    <w:abstractNumId w:val="19"/>
+  <w:num w:numId="28" w16cid:durableId="139657957">
+    <w:abstractNumId w:val="24"/>
   </w:num>
-  <w:num w:numId="20" w16cid:durableId="1088422739">
+  <w:num w:numId="29" w16cid:durableId="1263414231">
     <w:abstractNumId w:val="11"/>
-  </w:num>
-  <w:num w:numId="21" w16cid:durableId="943269753">
-    <w:abstractNumId w:val="17"/>
-  </w:num>
-  <w:num w:numId="22" w16cid:durableId="1132791763">
-    <w:abstractNumId w:val="15"/>
-  </w:num>
-  <w:num w:numId="23" w16cid:durableId="1311708505">
-    <w:abstractNumId w:val="14"/>
-  </w:num>
-  <w:num w:numId="24" w16cid:durableId="863400549">
-    <w:abstractNumId w:val="4"/>
   </w:num>
 </w:numbering>
 </file>

</xml_diff>

<commit_message>
Dia 36: Eleccion de proyectos
</commit_message>
<xml_diff>
--- a/Diseño de proyectos de IA/Diseño de proyectos de IA.docx
+++ b/Diseño de proyectos de IA/Diseño de proyectos de IA.docx
@@ -1972,7 +1972,15 @@
     </w:p>
     <w:p>
       <w:r>
-        <w:t xml:space="preserve">En realidad suele ser </w:t>
+        <w:t xml:space="preserve">En </w:t>
+      </w:r>
+      <w:proofErr w:type="gramStart"/>
+      <w:r>
+        <w:t>realidad</w:t>
+      </w:r>
+      <w:proofErr w:type="gramEnd"/>
+      <w:r>
+        <w:t xml:space="preserve"> suele ser </w:t>
       </w:r>
       <w:r>
         <w:rPr>
@@ -3609,7 +3617,7 @@
     <w:p>
       <w:r>
         <w:pict w14:anchorId="060420FF">
-          <v:rect id="_x0000_i1143" style="width:0;height:1.5pt" o:hralign="center" o:hrstd="t" o:hr="t" fillcolor="#a0a0a0" stroked="f"/>
+          <v:rect id="_x0000_i1053" style="width:0;height:1.5pt" o:hralign="center" o:hrstd="t" o:hr="t" fillcolor="#a0a0a0" stroked="f"/>
         </w:pict>
       </w:r>
     </w:p>
@@ -3751,7 +3759,7 @@
     <w:p>
       <w:r>
         <w:pict w14:anchorId="67729234">
-          <v:rect id="_x0000_i1144" style="width:0;height:1.5pt" o:hralign="center" o:hrstd="t" o:hr="t" fillcolor="#a0a0a0" stroked="f"/>
+          <v:rect id="_x0000_i1054" style="width:0;height:1.5pt" o:hralign="center" o:hrstd="t" o:hr="t" fillcolor="#a0a0a0" stroked="f"/>
         </w:pict>
       </w:r>
     </w:p>
@@ -3854,7 +3862,7 @@
     <w:p>
       <w:r>
         <w:pict w14:anchorId="315FBE3E">
-          <v:rect id="_x0000_i1145" style="width:0;height:1.5pt" o:hralign="center" o:hrstd="t" o:hr="t" fillcolor="#a0a0a0" stroked="f"/>
+          <v:rect id="_x0000_i1055" style="width:0;height:1.5pt" o:hralign="center" o:hrstd="t" o:hr="t" fillcolor="#a0a0a0" stroked="f"/>
         </w:pict>
       </w:r>
     </w:p>
@@ -3970,7 +3978,7 @@
     <w:p>
       <w:r>
         <w:pict w14:anchorId="411212D6">
-          <v:rect id="_x0000_i1146" style="width:0;height:1.5pt" o:hralign="center" o:hrstd="t" o:hr="t" fillcolor="#a0a0a0" stroked="f"/>
+          <v:rect id="_x0000_i1056" style="width:0;height:1.5pt" o:hralign="center" o:hrstd="t" o:hr="t" fillcolor="#a0a0a0" stroked="f"/>
         </w:pict>
       </w:r>
     </w:p>
@@ -4079,7 +4087,7 @@
     <w:p>
       <w:r>
         <w:pict w14:anchorId="6D696C10">
-          <v:rect id="_x0000_i1147" style="width:0;height:1.5pt" o:hralign="center" o:hrstd="t" o:hr="t" fillcolor="#a0a0a0" stroked="f"/>
+          <v:rect id="_x0000_i1057" style="width:0;height:1.5pt" o:hralign="center" o:hrstd="t" o:hr="t" fillcolor="#a0a0a0" stroked="f"/>
         </w:pict>
       </w:r>
     </w:p>
@@ -4122,7 +4130,29 @@
           <w:szCs w:val="28"/>
           <w:u w:val="single"/>
         </w:rPr>
-        <w:t>Sistemas que ya existen pero son malos</w:t>
+        <w:t xml:space="preserve">Sistemas que ya </w:t>
+      </w:r>
+      <w:proofErr w:type="gramStart"/>
+      <w:r>
+        <w:rPr>
+          <w:b/>
+          <w:bCs/>
+          <w:sz w:val="28"/>
+          <w:szCs w:val="28"/>
+          <w:u w:val="single"/>
+        </w:rPr>
+        <w:t>existen</w:t>
+      </w:r>
+      <w:proofErr w:type="gramEnd"/>
+      <w:r>
+        <w:rPr>
+          <w:b/>
+          <w:bCs/>
+          <w:sz w:val="28"/>
+          <w:szCs w:val="28"/>
+          <w:u w:val="single"/>
+        </w:rPr>
+        <w:t xml:space="preserve"> pero son malos</w:t>
       </w:r>
     </w:p>
     <w:p>
@@ -4187,7 +4217,7 @@
     <w:p>
       <w:r>
         <w:pict w14:anchorId="0063973B">
-          <v:rect id="_x0000_i1148" style="width:0;height:1.5pt" o:hralign="center" o:hrstd="t" o:hr="t" fillcolor="#a0a0a0" stroked="f"/>
+          <v:rect id="_x0000_i1058" style="width:0;height:1.5pt" o:hralign="center" o:hrstd="t" o:hr="t" fillcolor="#a0a0a0" stroked="f"/>
         </w:pict>
       </w:r>
     </w:p>
@@ -4350,7 +4380,13 @@
     </w:p>
     <w:p>
       <w:r>
-        <w:t xml:space="preserve">RAG → reglamentos, fechas, </w:t>
+        <w:t>RAG</w:t>
+      </w:r>
+      <w:r>
+        <w:t xml:space="preserve">: </w:t>
+      </w:r>
+      <w:r>
+        <w:t xml:space="preserve">reglamentos, fechas, </w:t>
       </w:r>
       <w:proofErr w:type="spellStart"/>
       <w:r>
@@ -4365,10 +4401,24 @@
       <w:r>
         <w:lastRenderedPageBreak/>
         <w:br/>
-        <w:t>Sistema interno → datos del alumno (materias aprobadas, estado)</w:t>
-      </w:r>
-      <w:r>
-        <w:t>LLM: Contesta la pregunta</w:t>
+        <w:t>Sistema interno</w:t>
+      </w:r>
+      <w:r>
+        <w:t>:</w:t>
+      </w:r>
+      <w:r>
+        <w:t xml:space="preserve"> datos del alumno (materias aprobadas, </w:t>
+      </w:r>
+      <w:proofErr w:type="gramStart"/>
+      <w:r>
+        <w:t>estado)</w:t>
+      </w:r>
+      <w:r>
+        <w:t>LLM</w:t>
+      </w:r>
+      <w:proofErr w:type="gramEnd"/>
+      <w:r>
+        <w:t>: Contesta la pregunta</w:t>
       </w:r>
     </w:p>
     <w:p>
@@ -4387,6 +4437,999 @@
         <w:t>las dudas de los alumnos</w:t>
       </w:r>
     </w:p>
+    <w:p>
+      <w:pPr>
+        <w:rPr>
+          <w:rFonts w:cstheme="minorHAnsi"/>
+          <w:b/>
+          <w:bCs/>
+          <w:sz w:val="36"/>
+          <w:szCs w:val="36"/>
+          <w:u w:val="single"/>
+        </w:rPr>
+      </w:pPr>
+      <w:r>
+        <w:rPr>
+          <w:rFonts w:ascii="Segoe UI Emoji" w:hAnsi="Segoe UI Emoji" w:cs="Segoe UI Emoji"/>
+          <w:b/>
+          <w:bCs/>
+          <w:sz w:val="36"/>
+          <w:szCs w:val="36"/>
+          <w:u w:val="single"/>
+        </w:rPr>
+        <w:t>🧠</w:t>
+      </w:r>
+      <w:r>
+        <w:rPr>
+          <w:rFonts w:cstheme="minorHAnsi"/>
+          <w:b/>
+          <w:bCs/>
+          <w:sz w:val="36"/>
+          <w:szCs w:val="36"/>
+          <w:u w:val="single"/>
+        </w:rPr>
+        <w:t xml:space="preserve"> Criterio para elegir un buen proyecto</w:t>
+      </w:r>
+    </w:p>
+    <w:p>
+      <w:r>
+        <w:t>Un buen proyecto cumple 4 cosas:</w:t>
+      </w:r>
+    </w:p>
+    <w:p>
+      <w:r>
+        <w:pict w14:anchorId="72BAD59E">
+          <v:rect id="_x0000_i1119" style="width:0;height:1.5pt" o:hralign="center" o:hrstd="t" o:hr="t" fillcolor="#a0a0a0" stroked="f"/>
+        </w:pict>
+      </w:r>
+    </w:p>
+    <w:p>
+      <w:pPr>
+        <w:rPr>
+          <w:rFonts w:cstheme="minorHAnsi"/>
+          <w:b/>
+          <w:bCs/>
+          <w:u w:val="single"/>
+        </w:rPr>
+      </w:pPr>
+      <w:r>
+        <w:rPr>
+          <w:rFonts w:cstheme="minorHAnsi"/>
+          <w:b/>
+          <w:bCs/>
+          <w:u w:val="single"/>
+        </w:rPr>
+        <w:t>1️</w:t>
+      </w:r>
+      <w:r>
+        <w:rPr>
+          <w:rFonts w:cstheme="minorHAnsi"/>
+          <w:b/>
+          <w:bCs/>
+          <w:u w:val="single"/>
+        </w:rPr>
+        <w:t xml:space="preserve">) </w:t>
+      </w:r>
+      <w:r>
+        <w:rPr>
+          <w:rFonts w:cstheme="minorHAnsi"/>
+          <w:b/>
+          <w:bCs/>
+          <w:u w:val="single"/>
+        </w:rPr>
+        <w:t xml:space="preserve">Problema real </w:t>
+      </w:r>
+      <w:r>
+        <w:rPr>
+          <w:rFonts w:ascii="Segoe UI Symbol" w:hAnsi="Segoe UI Symbol" w:cs="Segoe UI Symbol"/>
+          <w:b/>
+          <w:bCs/>
+          <w:u w:val="single"/>
+        </w:rPr>
+        <w:t>✔</w:t>
+      </w:r>
+    </w:p>
+    <w:p>
+      <w:r>
+        <w:t>Ejemplo bueno:</w:t>
+      </w:r>
+    </w:p>
+    <w:p>
+      <w:pPr>
+        <w:numPr>
+          <w:ilvl w:val="0"/>
+          <w:numId w:val="30"/>
+        </w:numPr>
+      </w:pPr>
+      <w:r>
+        <w:t xml:space="preserve">analizar </w:t>
+      </w:r>
+      <w:proofErr w:type="spellStart"/>
+      <w:r>
+        <w:t>CVs</w:t>
+      </w:r>
+      <w:proofErr w:type="spellEnd"/>
+      <w:r>
+        <w:t xml:space="preserve"> </w:t>
+      </w:r>
+    </w:p>
+    <w:p>
+      <w:pPr>
+        <w:numPr>
+          <w:ilvl w:val="0"/>
+          <w:numId w:val="30"/>
+        </w:numPr>
+      </w:pPr>
+      <w:r>
+        <w:t xml:space="preserve">responder consultas universitarias </w:t>
+      </w:r>
+    </w:p>
+    <w:p>
+      <w:pPr>
+        <w:numPr>
+          <w:ilvl w:val="0"/>
+          <w:numId w:val="30"/>
+        </w:numPr>
+      </w:pPr>
+      <w:r>
+        <w:t xml:space="preserve">clasificar tickets </w:t>
+      </w:r>
+    </w:p>
+    <w:p>
+      <w:r>
+        <w:t>Ejemplo malo:</w:t>
+      </w:r>
+    </w:p>
+    <w:p>
+      <w:pPr>
+        <w:numPr>
+          <w:ilvl w:val="0"/>
+          <w:numId w:val="31"/>
+        </w:numPr>
+      </w:pPr>
+      <w:r>
+        <w:t xml:space="preserve">“IA que recomienda frases motivacionales” </w:t>
+      </w:r>
+    </w:p>
+    <w:p>
+      <w:r>
+        <w:pict w14:anchorId="04A20311">
+          <v:rect id="_x0000_i1120" style="width:0;height:1.5pt" o:hralign="center" o:hrstd="t" o:hr="t" fillcolor="#a0a0a0" stroked="f"/>
+        </w:pict>
+      </w:r>
+    </w:p>
+    <w:p>
+      <w:pPr>
+        <w:rPr>
+          <w:rFonts w:cstheme="minorHAnsi"/>
+          <w:b/>
+          <w:bCs/>
+          <w:u w:val="single"/>
+        </w:rPr>
+      </w:pPr>
+      <w:r>
+        <w:rPr>
+          <w:rFonts w:cstheme="minorHAnsi"/>
+          <w:b/>
+          <w:bCs/>
+          <w:u w:val="single"/>
+        </w:rPr>
+        <w:t>2️</w:t>
+      </w:r>
+      <w:r>
+        <w:rPr>
+          <w:rFonts w:cstheme="minorHAnsi"/>
+          <w:b/>
+          <w:bCs/>
+          <w:u w:val="single"/>
+        </w:rPr>
+        <w:t xml:space="preserve">) </w:t>
+      </w:r>
+      <w:r>
+        <w:rPr>
+          <w:rFonts w:cstheme="minorHAnsi"/>
+          <w:b/>
+          <w:bCs/>
+          <w:u w:val="single"/>
+        </w:rPr>
+        <w:t xml:space="preserve">Alcance acotado </w:t>
+      </w:r>
+      <w:r>
+        <w:rPr>
+          <w:rFonts w:ascii="Segoe UI Symbol" w:hAnsi="Segoe UI Symbol" w:cs="Segoe UI Symbol"/>
+          <w:b/>
+          <w:bCs/>
+          <w:u w:val="single"/>
+        </w:rPr>
+        <w:t>✔</w:t>
+      </w:r>
+    </w:p>
+    <w:p>
+      <w:r>
+        <w:t>Debe poder hacerse en:</w:t>
+      </w:r>
+    </w:p>
+    <w:p>
+      <w:r>
+        <w:t>1–2 semanas (MVP)</w:t>
+      </w:r>
+    </w:p>
+    <w:p>
+      <w:r>
+        <w:t>No meses.</w:t>
+      </w:r>
+    </w:p>
+    <w:p>
+      <w:r>
+        <w:pict w14:anchorId="565C4F9B">
+          <v:rect id="_x0000_i1121" style="width:0;height:1.5pt" o:hralign="center" o:hrstd="t" o:hr="t" fillcolor="#a0a0a0" stroked="f"/>
+        </w:pict>
+      </w:r>
+    </w:p>
+    <w:p>
+      <w:pPr>
+        <w:rPr>
+          <w:rFonts w:cstheme="minorHAnsi"/>
+          <w:b/>
+          <w:bCs/>
+          <w:u w:val="single"/>
+        </w:rPr>
+      </w:pPr>
+      <w:r>
+        <w:rPr>
+          <w:rFonts w:cstheme="minorHAnsi"/>
+          <w:b/>
+          <w:bCs/>
+          <w:u w:val="single"/>
+        </w:rPr>
+        <w:t>3️</w:t>
+      </w:r>
+      <w:r>
+        <w:rPr>
+          <w:rFonts w:cstheme="minorHAnsi"/>
+          <w:b/>
+          <w:bCs/>
+          <w:u w:val="single"/>
+        </w:rPr>
+        <w:t xml:space="preserve">) </w:t>
+      </w:r>
+      <w:r>
+        <w:rPr>
+          <w:rFonts w:cstheme="minorHAnsi"/>
+          <w:b/>
+          <w:bCs/>
+          <w:u w:val="single"/>
+        </w:rPr>
+        <w:t xml:space="preserve">Usa lo que ya </w:t>
+      </w:r>
+      <w:proofErr w:type="spellStart"/>
+      <w:r>
+        <w:rPr>
+          <w:rFonts w:cstheme="minorHAnsi"/>
+          <w:b/>
+          <w:bCs/>
+          <w:u w:val="single"/>
+        </w:rPr>
+        <w:t>sabés</w:t>
+      </w:r>
+      <w:proofErr w:type="spellEnd"/>
+      <w:r>
+        <w:rPr>
+          <w:rFonts w:cstheme="minorHAnsi"/>
+          <w:b/>
+          <w:bCs/>
+          <w:u w:val="single"/>
+        </w:rPr>
+        <w:t xml:space="preserve"> </w:t>
+      </w:r>
+      <w:r>
+        <w:rPr>
+          <w:rFonts w:ascii="Segoe UI Symbol" w:hAnsi="Segoe UI Symbol" w:cs="Segoe UI Symbol"/>
+          <w:b/>
+          <w:bCs/>
+          <w:u w:val="single"/>
+        </w:rPr>
+        <w:t>✔</w:t>
+      </w:r>
+    </w:p>
+    <w:p>
+      <w:r>
+        <w:t xml:space="preserve">Vos ya </w:t>
+      </w:r>
+      <w:proofErr w:type="spellStart"/>
+      <w:r>
+        <w:t>sabés</w:t>
+      </w:r>
+      <w:proofErr w:type="spellEnd"/>
+      <w:r>
+        <w:t>:</w:t>
+      </w:r>
+    </w:p>
+    <w:p>
+      <w:pPr>
+        <w:numPr>
+          <w:ilvl w:val="0"/>
+          <w:numId w:val="32"/>
+        </w:numPr>
+      </w:pPr>
+      <w:r>
+        <w:t xml:space="preserve">ML clásico </w:t>
+      </w:r>
+    </w:p>
+    <w:p>
+      <w:pPr>
+        <w:numPr>
+          <w:ilvl w:val="0"/>
+          <w:numId w:val="32"/>
+        </w:numPr>
+      </w:pPr>
+      <w:r>
+        <w:t xml:space="preserve">LLM </w:t>
+      </w:r>
+    </w:p>
+    <w:p>
+      <w:pPr>
+        <w:numPr>
+          <w:ilvl w:val="0"/>
+          <w:numId w:val="32"/>
+        </w:numPr>
+      </w:pPr>
+      <w:r>
+        <w:t xml:space="preserve">RAG </w:t>
+      </w:r>
+    </w:p>
+    <w:p>
+      <w:pPr>
+        <w:numPr>
+          <w:ilvl w:val="0"/>
+          <w:numId w:val="32"/>
+        </w:numPr>
+      </w:pPr>
+      <w:r>
+        <w:t xml:space="preserve">sistemas híbridos </w:t>
+      </w:r>
+    </w:p>
+    <w:p>
+      <w:r>
+        <w:rPr>
+          <w:rFonts w:ascii="Segoe UI Emoji" w:hAnsi="Segoe UI Emoji" w:cs="Segoe UI Emoji"/>
+        </w:rPr>
+        <w:t>👉</w:t>
+      </w:r>
+      <w:r>
+        <w:t xml:space="preserve"> El proyecto debería usar eso.</w:t>
+      </w:r>
+    </w:p>
+    <w:p>
+      <w:r>
+        <w:pict w14:anchorId="2E66E27F">
+          <v:rect id="_x0000_i1122" style="width:0;height:1.5pt" o:hralign="center" o:hrstd="t" o:hr="t" fillcolor="#a0a0a0" stroked="f"/>
+        </w:pict>
+      </w:r>
+    </w:p>
+    <w:p>
+      <w:pPr>
+        <w:rPr>
+          <w:rFonts w:cstheme="minorHAnsi"/>
+          <w:b/>
+          <w:bCs/>
+          <w:u w:val="single"/>
+        </w:rPr>
+      </w:pPr>
+      <w:r>
+        <w:rPr>
+          <w:rFonts w:cstheme="minorHAnsi"/>
+          <w:b/>
+          <w:bCs/>
+          <w:u w:val="single"/>
+        </w:rPr>
+        <w:t>4️</w:t>
+      </w:r>
+      <w:r>
+        <w:rPr>
+          <w:rFonts w:cstheme="minorHAnsi"/>
+          <w:b/>
+          <w:bCs/>
+          <w:u w:val="single"/>
+        </w:rPr>
+        <w:t xml:space="preserve">) </w:t>
+      </w:r>
+      <w:r>
+        <w:rPr>
+          <w:rFonts w:cstheme="minorHAnsi"/>
+          <w:b/>
+          <w:bCs/>
+          <w:u w:val="single"/>
+        </w:rPr>
+        <w:t xml:space="preserve">Se puede mostrar </w:t>
+      </w:r>
+      <w:r>
+        <w:rPr>
+          <w:rFonts w:ascii="Segoe UI Symbol" w:hAnsi="Segoe UI Symbol" w:cs="Segoe UI Symbol"/>
+          <w:b/>
+          <w:bCs/>
+          <w:u w:val="single"/>
+        </w:rPr>
+        <w:t>✔</w:t>
+      </w:r>
+    </w:p>
+    <w:p>
+      <w:r>
+        <w:t>Debe poder decirse:</w:t>
+      </w:r>
+    </w:p>
+    <w:p>
+      <w:r>
+        <w:t>“Esto hace X y funciona así”</w:t>
+      </w:r>
+    </w:p>
+    <w:p>
+      <w:pPr>
+        <w:rPr>
+          <w:b/>
+          <w:bCs/>
+          <w:sz w:val="28"/>
+          <w:szCs w:val="28"/>
+          <w:u w:val="single"/>
+        </w:rPr>
+      </w:pPr>
+      <w:r>
+        <w:rPr>
+          <w:rFonts w:ascii="Segoe UI Emoji" w:hAnsi="Segoe UI Emoji" w:cs="Segoe UI Emoji"/>
+          <w:b/>
+          <w:bCs/>
+          <w:sz w:val="28"/>
+          <w:szCs w:val="28"/>
+          <w:u w:val="single"/>
+        </w:rPr>
+        <w:lastRenderedPageBreak/>
+        <w:t>🧠</w:t>
+      </w:r>
+      <w:r>
+        <w:rPr>
+          <w:b/>
+          <w:bCs/>
+          <w:sz w:val="28"/>
+          <w:szCs w:val="28"/>
+          <w:u w:val="single"/>
+        </w:rPr>
+        <w:t xml:space="preserve"> Ejemplos de buenos proyectos</w:t>
+      </w:r>
+    </w:p>
+    <w:p>
+      <w:r>
+        <w:pict w14:anchorId="516112F2">
+          <v:rect id="_x0000_i1247" style="width:0;height:1.5pt" o:hralign="center" o:hrstd="t" o:hr="t" fillcolor="#a0a0a0" stroked="f"/>
+        </w:pict>
+      </w:r>
+    </w:p>
+    <w:p>
+      <w:pPr>
+        <w:rPr>
+          <w:b/>
+          <w:bCs/>
+        </w:rPr>
+      </w:pPr>
+      <w:r>
+        <w:rPr>
+          <w:rFonts w:ascii="Segoe UI Emoji" w:hAnsi="Segoe UI Emoji" w:cs="Segoe UI Emoji"/>
+          <w:b/>
+          <w:bCs/>
+        </w:rPr>
+        <w:t>🔹</w:t>
+      </w:r>
+      <w:r>
+        <w:rPr>
+          <w:b/>
+          <w:bCs/>
+        </w:rPr>
+        <w:t xml:space="preserve"> Proyecto 1 — Analizador de </w:t>
+      </w:r>
+      <w:proofErr w:type="spellStart"/>
+      <w:r>
+        <w:rPr>
+          <w:b/>
+          <w:bCs/>
+        </w:rPr>
+        <w:t>CVs</w:t>
+      </w:r>
+      <w:proofErr w:type="spellEnd"/>
+    </w:p>
+    <w:p>
+      <w:pPr>
+        <w:numPr>
+          <w:ilvl w:val="0"/>
+          <w:numId w:val="33"/>
+        </w:numPr>
+      </w:pPr>
+      <w:r>
+        <w:t xml:space="preserve">LLM → extrae </w:t>
+      </w:r>
+      <w:proofErr w:type="spellStart"/>
+      <w:r>
+        <w:t>info</w:t>
+      </w:r>
+      <w:proofErr w:type="spellEnd"/>
+      <w:r>
+        <w:t xml:space="preserve"> </w:t>
+      </w:r>
+    </w:p>
+    <w:p>
+      <w:pPr>
+        <w:numPr>
+          <w:ilvl w:val="0"/>
+          <w:numId w:val="33"/>
+        </w:numPr>
+      </w:pPr>
+      <w:r>
+        <w:t xml:space="preserve">ML → score </w:t>
+      </w:r>
+    </w:p>
+    <w:p>
+      <w:pPr>
+        <w:numPr>
+          <w:ilvl w:val="0"/>
+          <w:numId w:val="33"/>
+        </w:numPr>
+      </w:pPr>
+      <w:r>
+        <w:t xml:space="preserve">ranking de candidatos </w:t>
+      </w:r>
+    </w:p>
+    <w:p>
+      <w:pPr>
+        <w:numPr>
+          <w:ilvl w:val="0"/>
+          <w:numId w:val="33"/>
+        </w:numPr>
+      </w:pPr>
+      <w:r>
+        <w:t xml:space="preserve">explicación </w:t>
+      </w:r>
+    </w:p>
+    <w:p>
+      <w:r>
+        <w:pict w14:anchorId="1420B1A6">
+          <v:rect id="_x0000_i1248" style="width:0;height:1.5pt" o:hralign="center" o:hrstd="t" o:hr="t" fillcolor="#a0a0a0" stroked="f"/>
+        </w:pict>
+      </w:r>
+    </w:p>
+    <w:p>
+      <w:pPr>
+        <w:rPr>
+          <w:b/>
+          <w:bCs/>
+        </w:rPr>
+      </w:pPr>
+      <w:r>
+        <w:rPr>
+          <w:rFonts w:ascii="Segoe UI Emoji" w:hAnsi="Segoe UI Emoji" w:cs="Segoe UI Emoji"/>
+          <w:b/>
+          <w:bCs/>
+        </w:rPr>
+        <w:t>🔹</w:t>
+      </w:r>
+      <w:r>
+        <w:rPr>
+          <w:b/>
+          <w:bCs/>
+        </w:rPr>
+        <w:t xml:space="preserve"> Proyecto 2 — Asistente universitario</w:t>
+      </w:r>
+    </w:p>
+    <w:p>
+      <w:pPr>
+        <w:numPr>
+          <w:ilvl w:val="0"/>
+          <w:numId w:val="34"/>
+        </w:numPr>
+      </w:pPr>
+      <w:r>
+        <w:t xml:space="preserve">RAG → reglamentos </w:t>
+      </w:r>
+    </w:p>
+    <w:p>
+      <w:pPr>
+        <w:numPr>
+          <w:ilvl w:val="0"/>
+          <w:numId w:val="34"/>
+        </w:numPr>
+      </w:pPr>
+      <w:r>
+        <w:t xml:space="preserve">LLM → responde </w:t>
+      </w:r>
+    </w:p>
+    <w:p>
+      <w:pPr>
+        <w:numPr>
+          <w:ilvl w:val="0"/>
+          <w:numId w:val="34"/>
+        </w:numPr>
+      </w:pPr>
+      <w:r>
+        <w:t xml:space="preserve">sistema interno → datos del alumno </w:t>
+      </w:r>
+    </w:p>
+    <w:p>
+      <w:r>
+        <w:pict w14:anchorId="454BD7B7">
+          <v:rect id="_x0000_i1249" style="width:0;height:1.5pt" o:hralign="center" o:hrstd="t" o:hr="t" fillcolor="#a0a0a0" stroked="f"/>
+        </w:pict>
+      </w:r>
+    </w:p>
+    <w:p>
+      <w:pPr>
+        <w:rPr>
+          <w:b/>
+          <w:bCs/>
+        </w:rPr>
+      </w:pPr>
+      <w:r>
+        <w:rPr>
+          <w:rFonts w:ascii="Segoe UI Emoji" w:hAnsi="Segoe UI Emoji" w:cs="Segoe UI Emoji"/>
+          <w:b/>
+          <w:bCs/>
+        </w:rPr>
+        <w:t>🔹</w:t>
+      </w:r>
+      <w:r>
+        <w:rPr>
+          <w:b/>
+          <w:bCs/>
+        </w:rPr>
+        <w:t xml:space="preserve"> Proyecto 3 — Clasificador de tickets + respuesta</w:t>
+      </w:r>
+    </w:p>
+    <w:p>
+      <w:pPr>
+        <w:numPr>
+          <w:ilvl w:val="0"/>
+          <w:numId w:val="35"/>
+        </w:numPr>
+      </w:pPr>
+      <w:r>
+        <w:t xml:space="preserve">ML → clasifica </w:t>
+      </w:r>
+    </w:p>
+    <w:p>
+      <w:pPr>
+        <w:numPr>
+          <w:ilvl w:val="0"/>
+          <w:numId w:val="35"/>
+        </w:numPr>
+      </w:pPr>
+      <w:r>
+        <w:t xml:space="preserve">LLM → responde </w:t>
+      </w:r>
+    </w:p>
+    <w:p>
+      <w:pPr>
+        <w:numPr>
+          <w:ilvl w:val="0"/>
+          <w:numId w:val="35"/>
+        </w:numPr>
+      </w:pPr>
+      <w:r>
+        <w:t xml:space="preserve">métricas → evaluación </w:t>
+      </w:r>
+    </w:p>
+    <w:p>
+      <w:r>
+        <w:pict w14:anchorId="099F59FB">
+          <v:rect id="_x0000_i1250" style="width:0;height:1.5pt" o:hralign="center" o:hrstd="t" o:hr="t" fillcolor="#a0a0a0" stroked="f"/>
+        </w:pict>
+      </w:r>
+    </w:p>
+    <w:p>
+      <w:pPr>
+        <w:rPr>
+          <w:b/>
+          <w:bCs/>
+          <w:sz w:val="24"/>
+          <w:szCs w:val="24"/>
+          <w:u w:val="single"/>
+        </w:rPr>
+      </w:pPr>
+      <w:r>
+        <w:rPr>
+          <w:rFonts w:ascii="Segoe UI Emoji" w:hAnsi="Segoe UI Emoji" w:cs="Segoe UI Emoji"/>
+          <w:b/>
+          <w:bCs/>
+          <w:sz w:val="24"/>
+          <w:szCs w:val="24"/>
+          <w:u w:val="single"/>
+        </w:rPr>
+        <w:t>📌</w:t>
+      </w:r>
+      <w:r>
+        <w:rPr>
+          <w:b/>
+          <w:bCs/>
+          <w:sz w:val="24"/>
+          <w:szCs w:val="24"/>
+          <w:u w:val="single"/>
+        </w:rPr>
+        <w:t xml:space="preserve"> Regla clave</w:t>
+      </w:r>
+    </w:p>
+    <w:p>
+      <w:r>
+        <w:t>Mejor un proyecto simple terminado</w:t>
+      </w:r>
+      <w:r>
+        <w:br/>
+        <w:t>que uno ambicioso incompleto</w:t>
+      </w:r>
+    </w:p>
+    <w:p>
+      <w:pPr>
+        <w:rPr>
+          <w:b/>
+          <w:bCs/>
+        </w:rPr>
+      </w:pPr>
+      <w:r>
+        <w:rPr>
+          <w:b/>
+          <w:bCs/>
+        </w:rPr>
+        <w:t xml:space="preserve">Mini ejercicio </w:t>
+      </w:r>
+    </w:p>
+    <w:p>
+      <w:r>
+        <w:t xml:space="preserve">Elegí </w:t>
+      </w:r>
+      <w:r>
+        <w:rPr>
+          <w:b/>
+          <w:bCs/>
+        </w:rPr>
+        <w:t>uno</w:t>
+      </w:r>
+      <w:r>
+        <w:t xml:space="preserve"> de estos tres:</w:t>
+      </w:r>
+    </w:p>
+    <w:p>
+      <w:pPr>
+        <w:numPr>
+          <w:ilvl w:val="0"/>
+          <w:numId w:val="36"/>
+        </w:numPr>
+      </w:pPr>
+      <w:proofErr w:type="spellStart"/>
+      <w:r>
+        <w:t>CVs</w:t>
+      </w:r>
+      <w:proofErr w:type="spellEnd"/>
+      <w:r>
+        <w:t xml:space="preserve"> </w:t>
+      </w:r>
+    </w:p>
+    <w:p>
+      <w:pPr>
+        <w:numPr>
+          <w:ilvl w:val="0"/>
+          <w:numId w:val="36"/>
+        </w:numPr>
+      </w:pPr>
+      <w:r>
+        <w:t xml:space="preserve">asistente universitario </w:t>
+      </w:r>
+    </w:p>
+    <w:p>
+      <w:pPr>
+        <w:numPr>
+          <w:ilvl w:val="0"/>
+          <w:numId w:val="36"/>
+        </w:numPr>
+      </w:pPr>
+      <w:r>
+        <w:t>tickets</w:t>
+      </w:r>
+    </w:p>
+    <w:p>
+      <w:pPr>
+        <w:rPr>
+          <w:b/>
+          <w:bCs/>
+          <w:u w:val="single"/>
+        </w:rPr>
+      </w:pPr>
+      <w:r>
+        <w:rPr>
+          <w:b/>
+          <w:bCs/>
+          <w:u w:val="single"/>
+        </w:rPr>
+        <w:t>Respuesta:</w:t>
+      </w:r>
+    </w:p>
+    <w:p>
+      <w:r>
+        <w:t>Proyecto elegido →</w:t>
+      </w:r>
+      <w:r>
+        <w:t xml:space="preserve"> </w:t>
+      </w:r>
+      <w:proofErr w:type="spellStart"/>
+      <w:r>
+        <w:t>CVs</w:t>
+      </w:r>
+      <w:proofErr w:type="spellEnd"/>
+      <w:r>
+        <w:t>.</w:t>
+      </w:r>
+    </w:p>
+    <w:p>
+      <w:r>
+        <w:t>Por qué →</w:t>
+      </w:r>
+      <w:r>
+        <w:t xml:space="preserve"> Buena cantidad de conceptos a aplicar de los aprendidos</w:t>
+      </w:r>
+      <w:r>
+        <w:t>,</w:t>
+      </w:r>
+      <w:r>
+        <w:t xml:space="preserve"> buena escalabilidad en caso de querer usarlo como un medio para conseguir dinero</w:t>
+      </w:r>
+      <w:r>
+        <w:t xml:space="preserve"> y es un proyecto que cualquiera puede entender rápido que hace</w:t>
+      </w:r>
+      <w:r>
+        <w:t>.</w:t>
+      </w:r>
+    </w:p>
+    <w:p>
+      <w:r>
+        <w:t>Arquitectura básica →</w:t>
+      </w:r>
+      <w:r>
+        <w:t xml:space="preserve"> </w:t>
+      </w:r>
+    </w:p>
+    <w:p>
+      <w:r>
+        <w:lastRenderedPageBreak/>
+        <w:t xml:space="preserve">Input: </w:t>
+      </w:r>
+      <w:proofErr w:type="spellStart"/>
+      <w:r>
+        <w:t>CVs</w:t>
+      </w:r>
+      <w:proofErr w:type="spellEnd"/>
+    </w:p>
+    <w:p>
+      <w:r>
+        <w:t xml:space="preserve">RAG: </w:t>
+      </w:r>
+      <w:r>
+        <w:t>descripción del puesto + requisitos</w:t>
+      </w:r>
+    </w:p>
+    <w:p>
+      <w:r>
+        <w:t xml:space="preserve">LLM: Extrae información </w:t>
+      </w:r>
+      <w:r>
+        <w:t>estructurada</w:t>
+      </w:r>
+    </w:p>
+    <w:p>
+      <w:r>
+        <w:t>ML: Clasifica la información</w:t>
+      </w:r>
+    </w:p>
+    <w:p>
+      <w:r>
+        <w:t xml:space="preserve">Ranking: Los mas aptos para el puesto </w:t>
+      </w:r>
+      <w:r>
+        <w:t>de trabajo</w:t>
+      </w:r>
+    </w:p>
+    <w:p>
+      <w:r>
+        <w:t>LLM: Explica por qué elegir a X persona</w:t>
+      </w:r>
+    </w:p>
+    <w:p>
+      <w:pPr>
+        <w:rPr>
+          <w:b/>
+          <w:bCs/>
+          <w:u w:val="single"/>
+        </w:rPr>
+      </w:pPr>
+      <w:r>
+        <w:rPr>
+          <w:b/>
+          <w:bCs/>
+          <w:u w:val="single"/>
+        </w:rPr>
+        <w:t>Ejemplo salida del sistema</w:t>
+      </w:r>
+    </w:p>
+    <w:p>
+      <w:r>
+        <w:t>Candidato: Juan Pérez</w:t>
+      </w:r>
+      <w:r>
+        <w:br/>
+        <w:t>Score: 0.82</w:t>
+      </w:r>
+      <w:r>
+        <w:br/>
+      </w:r>
+      <w:r>
+        <w:br/>
+        <w:t>Motivos:</w:t>
+      </w:r>
+      <w:r>
+        <w:br/>
+        <w:t xml:space="preserve">- 3 años de experiencia en Python </w:t>
+      </w:r>
+      <w:r>
+        <w:rPr>
+          <w:rFonts w:ascii="Segoe UI Symbol" w:hAnsi="Segoe UI Symbol" w:cs="Segoe UI Symbol"/>
+        </w:rPr>
+        <w:t>✔</w:t>
+      </w:r>
+      <w:r>
+        <w:br/>
+        <w:t xml:space="preserve">- experiencia en ML </w:t>
+      </w:r>
+      <w:r>
+        <w:rPr>
+          <w:rFonts w:ascii="Segoe UI Symbol" w:hAnsi="Segoe UI Symbol" w:cs="Segoe UI Symbol"/>
+        </w:rPr>
+        <w:t>✔</w:t>
+      </w:r>
+      <w:r>
+        <w:br/>
+        <w:t xml:space="preserve">- falta de experiencia en SQL </w:t>
+      </w:r>
+      <w:r>
+        <w:rPr>
+          <w:rFonts w:ascii="Segoe UI Symbol" w:hAnsi="Segoe UI Symbol" w:cs="Segoe UI Symbol"/>
+        </w:rPr>
+        <w:t>✖</w:t>
+      </w:r>
+      <w:r>
+        <w:br/>
+      </w:r>
+      <w:r>
+        <w:br/>
+        <w:t>Recomendaci</w:t>
+      </w:r>
+      <w:r>
+        <w:rPr>
+          <w:rFonts w:ascii="Calibri" w:hAnsi="Calibri" w:cs="Calibri"/>
+        </w:rPr>
+        <w:t>ó</w:t>
+      </w:r>
+      <w:r>
+        <w:t>n:</w:t>
+      </w:r>
+      <w:r>
+        <w:br/>
+        <w:t>Apto para entrevista t</w:t>
+      </w:r>
+      <w:r>
+        <w:rPr>
+          <w:rFonts w:ascii="Calibri" w:hAnsi="Calibri" w:cs="Calibri"/>
+        </w:rPr>
+        <w:t>é</w:t>
+      </w:r>
+      <w:r>
+        <w:t>cnica</w:t>
+      </w:r>
+    </w:p>
+    <w:p/>
+    <w:p/>
+    <w:p/>
     <w:p/>
     <w:p/>
     <w:sectPr>
@@ -4551,6 +5594,155 @@
     </w:lvl>
   </w:abstractNum>
   <w:abstractNum w:abstractNumId="1" w15:restartNumberingAfterBreak="0">
+    <w:nsid w:val="04845A9C"/>
+    <w:multiLevelType w:val="multilevel"/>
+    <w:tmpl w:val="BF9657FA"/>
+    <w:lvl w:ilvl="0">
+      <w:start w:val="1"/>
+      <w:numFmt w:val="bullet"/>
+      <w:lvlText w:val=""/>
+      <w:lvlJc w:val="left"/>
+      <w:pPr>
+        <w:tabs>
+          <w:tab w:val="num" w:pos="720"/>
+        </w:tabs>
+        <w:ind w:left="720" w:hanging="360"/>
+      </w:pPr>
+      <w:rPr>
+        <w:rFonts w:ascii="Symbol" w:hAnsi="Symbol" w:hint="default"/>
+        <w:sz w:val="20"/>
+      </w:rPr>
+    </w:lvl>
+    <w:lvl w:ilvl="1" w:tentative="1">
+      <w:start w:val="1"/>
+      <w:numFmt w:val="bullet"/>
+      <w:lvlText w:val="o"/>
+      <w:lvlJc w:val="left"/>
+      <w:pPr>
+        <w:tabs>
+          <w:tab w:val="num" w:pos="1440"/>
+        </w:tabs>
+        <w:ind w:left="1440" w:hanging="360"/>
+      </w:pPr>
+      <w:rPr>
+        <w:rFonts w:ascii="Courier New" w:hAnsi="Courier New" w:hint="default"/>
+        <w:sz w:val="20"/>
+      </w:rPr>
+    </w:lvl>
+    <w:lvl w:ilvl="2" w:tentative="1">
+      <w:start w:val="1"/>
+      <w:numFmt w:val="bullet"/>
+      <w:lvlText w:val=""/>
+      <w:lvlJc w:val="left"/>
+      <w:pPr>
+        <w:tabs>
+          <w:tab w:val="num" w:pos="2160"/>
+        </w:tabs>
+        <w:ind w:left="2160" w:hanging="360"/>
+      </w:pPr>
+      <w:rPr>
+        <w:rFonts w:ascii="Wingdings" w:hAnsi="Wingdings" w:hint="default"/>
+        <w:sz w:val="20"/>
+      </w:rPr>
+    </w:lvl>
+    <w:lvl w:ilvl="3" w:tentative="1">
+      <w:start w:val="1"/>
+      <w:numFmt w:val="bullet"/>
+      <w:lvlText w:val=""/>
+      <w:lvlJc w:val="left"/>
+      <w:pPr>
+        <w:tabs>
+          <w:tab w:val="num" w:pos="2880"/>
+        </w:tabs>
+        <w:ind w:left="2880" w:hanging="360"/>
+      </w:pPr>
+      <w:rPr>
+        <w:rFonts w:ascii="Wingdings" w:hAnsi="Wingdings" w:hint="default"/>
+        <w:sz w:val="20"/>
+      </w:rPr>
+    </w:lvl>
+    <w:lvl w:ilvl="4" w:tentative="1">
+      <w:start w:val="1"/>
+      <w:numFmt w:val="bullet"/>
+      <w:lvlText w:val=""/>
+      <w:lvlJc w:val="left"/>
+      <w:pPr>
+        <w:tabs>
+          <w:tab w:val="num" w:pos="3600"/>
+        </w:tabs>
+        <w:ind w:left="3600" w:hanging="360"/>
+      </w:pPr>
+      <w:rPr>
+        <w:rFonts w:ascii="Wingdings" w:hAnsi="Wingdings" w:hint="default"/>
+        <w:sz w:val="20"/>
+      </w:rPr>
+    </w:lvl>
+    <w:lvl w:ilvl="5" w:tentative="1">
+      <w:start w:val="1"/>
+      <w:numFmt w:val="bullet"/>
+      <w:lvlText w:val=""/>
+      <w:lvlJc w:val="left"/>
+      <w:pPr>
+        <w:tabs>
+          <w:tab w:val="num" w:pos="4320"/>
+        </w:tabs>
+        <w:ind w:left="4320" w:hanging="360"/>
+      </w:pPr>
+      <w:rPr>
+        <w:rFonts w:ascii="Wingdings" w:hAnsi="Wingdings" w:hint="default"/>
+        <w:sz w:val="20"/>
+      </w:rPr>
+    </w:lvl>
+    <w:lvl w:ilvl="6" w:tentative="1">
+      <w:start w:val="1"/>
+      <w:numFmt w:val="bullet"/>
+      <w:lvlText w:val=""/>
+      <w:lvlJc w:val="left"/>
+      <w:pPr>
+        <w:tabs>
+          <w:tab w:val="num" w:pos="5040"/>
+        </w:tabs>
+        <w:ind w:left="5040" w:hanging="360"/>
+      </w:pPr>
+      <w:rPr>
+        <w:rFonts w:ascii="Wingdings" w:hAnsi="Wingdings" w:hint="default"/>
+        <w:sz w:val="20"/>
+      </w:rPr>
+    </w:lvl>
+    <w:lvl w:ilvl="7" w:tentative="1">
+      <w:start w:val="1"/>
+      <w:numFmt w:val="bullet"/>
+      <w:lvlText w:val=""/>
+      <w:lvlJc w:val="left"/>
+      <w:pPr>
+        <w:tabs>
+          <w:tab w:val="num" w:pos="5760"/>
+        </w:tabs>
+        <w:ind w:left="5760" w:hanging="360"/>
+      </w:pPr>
+      <w:rPr>
+        <w:rFonts w:ascii="Wingdings" w:hAnsi="Wingdings" w:hint="default"/>
+        <w:sz w:val="20"/>
+      </w:rPr>
+    </w:lvl>
+    <w:lvl w:ilvl="8" w:tentative="1">
+      <w:start w:val="1"/>
+      <w:numFmt w:val="bullet"/>
+      <w:lvlText w:val=""/>
+      <w:lvlJc w:val="left"/>
+      <w:pPr>
+        <w:tabs>
+          <w:tab w:val="num" w:pos="6480"/>
+        </w:tabs>
+        <w:ind w:left="6480" w:hanging="360"/>
+      </w:pPr>
+      <w:rPr>
+        <w:rFonts w:ascii="Wingdings" w:hAnsi="Wingdings" w:hint="default"/>
+        <w:sz w:val="20"/>
+      </w:rPr>
+    </w:lvl>
+  </w:abstractNum>
+  <w:abstractNum w:abstractNumId="2" w15:restartNumberingAfterBreak="0">
     <w:nsid w:val="060A65E4"/>
     <w:multiLevelType w:val="multilevel"/>
     <w:tmpl w:val="407A1D2A"/>
@@ -4699,7 +5891,7 @@
       </w:rPr>
     </w:lvl>
   </w:abstractNum>
-  <w:abstractNum w:abstractNumId="2" w15:restartNumberingAfterBreak="0">
+  <w:abstractNum w:abstractNumId="3" w15:restartNumberingAfterBreak="0">
     <w:nsid w:val="08501AFC"/>
     <w:multiLevelType w:val="multilevel"/>
     <w:tmpl w:val="B622E10E"/>
@@ -4848,7 +6040,7 @@
       </w:rPr>
     </w:lvl>
   </w:abstractNum>
-  <w:abstractNum w:abstractNumId="3" w15:restartNumberingAfterBreak="0">
+  <w:abstractNum w:abstractNumId="4" w15:restartNumberingAfterBreak="0">
     <w:nsid w:val="0E017DE4"/>
     <w:multiLevelType w:val="multilevel"/>
     <w:tmpl w:val="E7D8C8A6"/>
@@ -4997,7 +6189,7 @@
       </w:rPr>
     </w:lvl>
   </w:abstractNum>
-  <w:abstractNum w:abstractNumId="4" w15:restartNumberingAfterBreak="0">
+  <w:abstractNum w:abstractNumId="5" w15:restartNumberingAfterBreak="0">
     <w:nsid w:val="14CD2F19"/>
     <w:multiLevelType w:val="multilevel"/>
     <w:tmpl w:val="035EAAB4"/>
@@ -5146,7 +6338,7 @@
       </w:rPr>
     </w:lvl>
   </w:abstractNum>
-  <w:abstractNum w:abstractNumId="5" w15:restartNumberingAfterBreak="0">
+  <w:abstractNum w:abstractNumId="6" w15:restartNumberingAfterBreak="0">
     <w:nsid w:val="15EB15B1"/>
     <w:multiLevelType w:val="multilevel"/>
     <w:tmpl w:val="C91E09EE"/>
@@ -5295,7 +6487,7 @@
       </w:rPr>
     </w:lvl>
   </w:abstractNum>
-  <w:abstractNum w:abstractNumId="6" w15:restartNumberingAfterBreak="0">
+  <w:abstractNum w:abstractNumId="7" w15:restartNumberingAfterBreak="0">
     <w:nsid w:val="168C1C14"/>
     <w:multiLevelType w:val="multilevel"/>
     <w:tmpl w:val="DE145FA8"/>
@@ -5444,7 +6636,7 @@
       </w:rPr>
     </w:lvl>
   </w:abstractNum>
-  <w:abstractNum w:abstractNumId="7" w15:restartNumberingAfterBreak="0">
+  <w:abstractNum w:abstractNumId="8" w15:restartNumberingAfterBreak="0">
     <w:nsid w:val="1E62487A"/>
     <w:multiLevelType w:val="multilevel"/>
     <w:tmpl w:val="89003A2C"/>
@@ -5593,7 +6785,7 @@
       </w:rPr>
     </w:lvl>
   </w:abstractNum>
-  <w:abstractNum w:abstractNumId="8" w15:restartNumberingAfterBreak="0">
+  <w:abstractNum w:abstractNumId="9" w15:restartNumberingAfterBreak="0">
     <w:nsid w:val="23B50855"/>
     <w:multiLevelType w:val="multilevel"/>
     <w:tmpl w:val="B6E64CE6"/>
@@ -5742,7 +6934,7 @@
       </w:rPr>
     </w:lvl>
   </w:abstractNum>
-  <w:abstractNum w:abstractNumId="9" w15:restartNumberingAfterBreak="0">
+  <w:abstractNum w:abstractNumId="10" w15:restartNumberingAfterBreak="0">
     <w:nsid w:val="24DC500A"/>
     <w:multiLevelType w:val="multilevel"/>
     <w:tmpl w:val="A5D4323C"/>
@@ -5891,7 +7083,7 @@
       </w:rPr>
     </w:lvl>
   </w:abstractNum>
-  <w:abstractNum w:abstractNumId="10" w15:restartNumberingAfterBreak="0">
+  <w:abstractNum w:abstractNumId="11" w15:restartNumberingAfterBreak="0">
     <w:nsid w:val="24F916FC"/>
     <w:multiLevelType w:val="multilevel"/>
     <w:tmpl w:val="DB32BF3E"/>
@@ -6040,7 +7232,7 @@
       </w:rPr>
     </w:lvl>
   </w:abstractNum>
-  <w:abstractNum w:abstractNumId="11" w15:restartNumberingAfterBreak="0">
+  <w:abstractNum w:abstractNumId="12" w15:restartNumberingAfterBreak="0">
     <w:nsid w:val="25AC6489"/>
     <w:multiLevelType w:val="multilevel"/>
     <w:tmpl w:val="2D100BE8"/>
@@ -6189,7 +7381,7 @@
       </w:rPr>
     </w:lvl>
   </w:abstractNum>
-  <w:abstractNum w:abstractNumId="12" w15:restartNumberingAfterBreak="0">
+  <w:abstractNum w:abstractNumId="13" w15:restartNumberingAfterBreak="0">
     <w:nsid w:val="2C667E53"/>
     <w:multiLevelType w:val="multilevel"/>
     <w:tmpl w:val="2AC423AE"/>
@@ -6338,7 +7530,7 @@
       </w:rPr>
     </w:lvl>
   </w:abstractNum>
-  <w:abstractNum w:abstractNumId="13" w15:restartNumberingAfterBreak="0">
+  <w:abstractNum w:abstractNumId="14" w15:restartNumberingAfterBreak="0">
     <w:nsid w:val="2D357FD8"/>
     <w:multiLevelType w:val="multilevel"/>
     <w:tmpl w:val="92B840E6"/>
@@ -6487,7 +7679,156 @@
       </w:rPr>
     </w:lvl>
   </w:abstractNum>
-  <w:abstractNum w:abstractNumId="14" w15:restartNumberingAfterBreak="0">
+  <w:abstractNum w:abstractNumId="15" w15:restartNumberingAfterBreak="0">
+    <w:nsid w:val="2EF359FC"/>
+    <w:multiLevelType w:val="multilevel"/>
+    <w:tmpl w:val="C14AAB2E"/>
+    <w:lvl w:ilvl="0">
+      <w:start w:val="1"/>
+      <w:numFmt w:val="bullet"/>
+      <w:lvlText w:val=""/>
+      <w:lvlJc w:val="left"/>
+      <w:pPr>
+        <w:tabs>
+          <w:tab w:val="num" w:pos="720"/>
+        </w:tabs>
+        <w:ind w:left="720" w:hanging="360"/>
+      </w:pPr>
+      <w:rPr>
+        <w:rFonts w:ascii="Symbol" w:hAnsi="Symbol" w:hint="default"/>
+        <w:sz w:val="20"/>
+      </w:rPr>
+    </w:lvl>
+    <w:lvl w:ilvl="1" w:tentative="1">
+      <w:start w:val="1"/>
+      <w:numFmt w:val="bullet"/>
+      <w:lvlText w:val="o"/>
+      <w:lvlJc w:val="left"/>
+      <w:pPr>
+        <w:tabs>
+          <w:tab w:val="num" w:pos="1440"/>
+        </w:tabs>
+        <w:ind w:left="1440" w:hanging="360"/>
+      </w:pPr>
+      <w:rPr>
+        <w:rFonts w:ascii="Courier New" w:hAnsi="Courier New" w:hint="default"/>
+        <w:sz w:val="20"/>
+      </w:rPr>
+    </w:lvl>
+    <w:lvl w:ilvl="2" w:tentative="1">
+      <w:start w:val="1"/>
+      <w:numFmt w:val="bullet"/>
+      <w:lvlText w:val=""/>
+      <w:lvlJc w:val="left"/>
+      <w:pPr>
+        <w:tabs>
+          <w:tab w:val="num" w:pos="2160"/>
+        </w:tabs>
+        <w:ind w:left="2160" w:hanging="360"/>
+      </w:pPr>
+      <w:rPr>
+        <w:rFonts w:ascii="Wingdings" w:hAnsi="Wingdings" w:hint="default"/>
+        <w:sz w:val="20"/>
+      </w:rPr>
+    </w:lvl>
+    <w:lvl w:ilvl="3" w:tentative="1">
+      <w:start w:val="1"/>
+      <w:numFmt w:val="bullet"/>
+      <w:lvlText w:val=""/>
+      <w:lvlJc w:val="left"/>
+      <w:pPr>
+        <w:tabs>
+          <w:tab w:val="num" w:pos="2880"/>
+        </w:tabs>
+        <w:ind w:left="2880" w:hanging="360"/>
+      </w:pPr>
+      <w:rPr>
+        <w:rFonts w:ascii="Wingdings" w:hAnsi="Wingdings" w:hint="default"/>
+        <w:sz w:val="20"/>
+      </w:rPr>
+    </w:lvl>
+    <w:lvl w:ilvl="4" w:tentative="1">
+      <w:start w:val="1"/>
+      <w:numFmt w:val="bullet"/>
+      <w:lvlText w:val=""/>
+      <w:lvlJc w:val="left"/>
+      <w:pPr>
+        <w:tabs>
+          <w:tab w:val="num" w:pos="3600"/>
+        </w:tabs>
+        <w:ind w:left="3600" w:hanging="360"/>
+      </w:pPr>
+      <w:rPr>
+        <w:rFonts w:ascii="Wingdings" w:hAnsi="Wingdings" w:hint="default"/>
+        <w:sz w:val="20"/>
+      </w:rPr>
+    </w:lvl>
+    <w:lvl w:ilvl="5" w:tentative="1">
+      <w:start w:val="1"/>
+      <w:numFmt w:val="bullet"/>
+      <w:lvlText w:val=""/>
+      <w:lvlJc w:val="left"/>
+      <w:pPr>
+        <w:tabs>
+          <w:tab w:val="num" w:pos="4320"/>
+        </w:tabs>
+        <w:ind w:left="4320" w:hanging="360"/>
+      </w:pPr>
+      <w:rPr>
+        <w:rFonts w:ascii="Wingdings" w:hAnsi="Wingdings" w:hint="default"/>
+        <w:sz w:val="20"/>
+      </w:rPr>
+    </w:lvl>
+    <w:lvl w:ilvl="6" w:tentative="1">
+      <w:start w:val="1"/>
+      <w:numFmt w:val="bullet"/>
+      <w:lvlText w:val=""/>
+      <w:lvlJc w:val="left"/>
+      <w:pPr>
+        <w:tabs>
+          <w:tab w:val="num" w:pos="5040"/>
+        </w:tabs>
+        <w:ind w:left="5040" w:hanging="360"/>
+      </w:pPr>
+      <w:rPr>
+        <w:rFonts w:ascii="Wingdings" w:hAnsi="Wingdings" w:hint="default"/>
+        <w:sz w:val="20"/>
+      </w:rPr>
+    </w:lvl>
+    <w:lvl w:ilvl="7" w:tentative="1">
+      <w:start w:val="1"/>
+      <w:numFmt w:val="bullet"/>
+      <w:lvlText w:val=""/>
+      <w:lvlJc w:val="left"/>
+      <w:pPr>
+        <w:tabs>
+          <w:tab w:val="num" w:pos="5760"/>
+        </w:tabs>
+        <w:ind w:left="5760" w:hanging="360"/>
+      </w:pPr>
+      <w:rPr>
+        <w:rFonts w:ascii="Wingdings" w:hAnsi="Wingdings" w:hint="default"/>
+        <w:sz w:val="20"/>
+      </w:rPr>
+    </w:lvl>
+    <w:lvl w:ilvl="8" w:tentative="1">
+      <w:start w:val="1"/>
+      <w:numFmt w:val="bullet"/>
+      <w:lvlText w:val=""/>
+      <w:lvlJc w:val="left"/>
+      <w:pPr>
+        <w:tabs>
+          <w:tab w:val="num" w:pos="6480"/>
+        </w:tabs>
+        <w:ind w:left="6480" w:hanging="360"/>
+      </w:pPr>
+      <w:rPr>
+        <w:rFonts w:ascii="Wingdings" w:hAnsi="Wingdings" w:hint="default"/>
+        <w:sz w:val="20"/>
+      </w:rPr>
+    </w:lvl>
+  </w:abstractNum>
+  <w:abstractNum w:abstractNumId="16" w15:restartNumberingAfterBreak="0">
     <w:nsid w:val="2F697D3D"/>
     <w:multiLevelType w:val="multilevel"/>
     <w:tmpl w:val="A0FC9258"/>
@@ -6636,7 +7977,156 @@
       </w:rPr>
     </w:lvl>
   </w:abstractNum>
-  <w:abstractNum w:abstractNumId="15" w15:restartNumberingAfterBreak="0">
+  <w:abstractNum w:abstractNumId="17" w15:restartNumberingAfterBreak="0">
+    <w:nsid w:val="312A5F99"/>
+    <w:multiLevelType w:val="multilevel"/>
+    <w:tmpl w:val="7D5E0A1A"/>
+    <w:lvl w:ilvl="0">
+      <w:start w:val="1"/>
+      <w:numFmt w:val="bullet"/>
+      <w:lvlText w:val=""/>
+      <w:lvlJc w:val="left"/>
+      <w:pPr>
+        <w:tabs>
+          <w:tab w:val="num" w:pos="720"/>
+        </w:tabs>
+        <w:ind w:left="720" w:hanging="360"/>
+      </w:pPr>
+      <w:rPr>
+        <w:rFonts w:ascii="Symbol" w:hAnsi="Symbol" w:hint="default"/>
+        <w:sz w:val="20"/>
+      </w:rPr>
+    </w:lvl>
+    <w:lvl w:ilvl="1" w:tentative="1">
+      <w:start w:val="1"/>
+      <w:numFmt w:val="bullet"/>
+      <w:lvlText w:val="o"/>
+      <w:lvlJc w:val="left"/>
+      <w:pPr>
+        <w:tabs>
+          <w:tab w:val="num" w:pos="1440"/>
+        </w:tabs>
+        <w:ind w:left="1440" w:hanging="360"/>
+      </w:pPr>
+      <w:rPr>
+        <w:rFonts w:ascii="Courier New" w:hAnsi="Courier New" w:hint="default"/>
+        <w:sz w:val="20"/>
+      </w:rPr>
+    </w:lvl>
+    <w:lvl w:ilvl="2" w:tentative="1">
+      <w:start w:val="1"/>
+      <w:numFmt w:val="bullet"/>
+      <w:lvlText w:val=""/>
+      <w:lvlJc w:val="left"/>
+      <w:pPr>
+        <w:tabs>
+          <w:tab w:val="num" w:pos="2160"/>
+        </w:tabs>
+        <w:ind w:left="2160" w:hanging="360"/>
+      </w:pPr>
+      <w:rPr>
+        <w:rFonts w:ascii="Wingdings" w:hAnsi="Wingdings" w:hint="default"/>
+        <w:sz w:val="20"/>
+      </w:rPr>
+    </w:lvl>
+    <w:lvl w:ilvl="3" w:tentative="1">
+      <w:start w:val="1"/>
+      <w:numFmt w:val="bullet"/>
+      <w:lvlText w:val=""/>
+      <w:lvlJc w:val="left"/>
+      <w:pPr>
+        <w:tabs>
+          <w:tab w:val="num" w:pos="2880"/>
+        </w:tabs>
+        <w:ind w:left="2880" w:hanging="360"/>
+      </w:pPr>
+      <w:rPr>
+        <w:rFonts w:ascii="Wingdings" w:hAnsi="Wingdings" w:hint="default"/>
+        <w:sz w:val="20"/>
+      </w:rPr>
+    </w:lvl>
+    <w:lvl w:ilvl="4" w:tentative="1">
+      <w:start w:val="1"/>
+      <w:numFmt w:val="bullet"/>
+      <w:lvlText w:val=""/>
+      <w:lvlJc w:val="left"/>
+      <w:pPr>
+        <w:tabs>
+          <w:tab w:val="num" w:pos="3600"/>
+        </w:tabs>
+        <w:ind w:left="3600" w:hanging="360"/>
+      </w:pPr>
+      <w:rPr>
+        <w:rFonts w:ascii="Wingdings" w:hAnsi="Wingdings" w:hint="default"/>
+        <w:sz w:val="20"/>
+      </w:rPr>
+    </w:lvl>
+    <w:lvl w:ilvl="5" w:tentative="1">
+      <w:start w:val="1"/>
+      <w:numFmt w:val="bullet"/>
+      <w:lvlText w:val=""/>
+      <w:lvlJc w:val="left"/>
+      <w:pPr>
+        <w:tabs>
+          <w:tab w:val="num" w:pos="4320"/>
+        </w:tabs>
+        <w:ind w:left="4320" w:hanging="360"/>
+      </w:pPr>
+      <w:rPr>
+        <w:rFonts w:ascii="Wingdings" w:hAnsi="Wingdings" w:hint="default"/>
+        <w:sz w:val="20"/>
+      </w:rPr>
+    </w:lvl>
+    <w:lvl w:ilvl="6" w:tentative="1">
+      <w:start w:val="1"/>
+      <w:numFmt w:val="bullet"/>
+      <w:lvlText w:val=""/>
+      <w:lvlJc w:val="left"/>
+      <w:pPr>
+        <w:tabs>
+          <w:tab w:val="num" w:pos="5040"/>
+        </w:tabs>
+        <w:ind w:left="5040" w:hanging="360"/>
+      </w:pPr>
+      <w:rPr>
+        <w:rFonts w:ascii="Wingdings" w:hAnsi="Wingdings" w:hint="default"/>
+        <w:sz w:val="20"/>
+      </w:rPr>
+    </w:lvl>
+    <w:lvl w:ilvl="7" w:tentative="1">
+      <w:start w:val="1"/>
+      <w:numFmt w:val="bullet"/>
+      <w:lvlText w:val=""/>
+      <w:lvlJc w:val="left"/>
+      <w:pPr>
+        <w:tabs>
+          <w:tab w:val="num" w:pos="5760"/>
+        </w:tabs>
+        <w:ind w:left="5760" w:hanging="360"/>
+      </w:pPr>
+      <w:rPr>
+        <w:rFonts w:ascii="Wingdings" w:hAnsi="Wingdings" w:hint="default"/>
+        <w:sz w:val="20"/>
+      </w:rPr>
+    </w:lvl>
+    <w:lvl w:ilvl="8" w:tentative="1">
+      <w:start w:val="1"/>
+      <w:numFmt w:val="bullet"/>
+      <w:lvlText w:val=""/>
+      <w:lvlJc w:val="left"/>
+      <w:pPr>
+        <w:tabs>
+          <w:tab w:val="num" w:pos="6480"/>
+        </w:tabs>
+        <w:ind w:left="6480" w:hanging="360"/>
+      </w:pPr>
+      <w:rPr>
+        <w:rFonts w:ascii="Wingdings" w:hAnsi="Wingdings" w:hint="default"/>
+        <w:sz w:val="20"/>
+      </w:rPr>
+    </w:lvl>
+  </w:abstractNum>
+  <w:abstractNum w:abstractNumId="18" w15:restartNumberingAfterBreak="0">
     <w:nsid w:val="337C5212"/>
     <w:multiLevelType w:val="multilevel"/>
     <w:tmpl w:val="8B40A606"/>
@@ -6785,7 +8275,7 @@
       </w:rPr>
     </w:lvl>
   </w:abstractNum>
-  <w:abstractNum w:abstractNumId="16" w15:restartNumberingAfterBreak="0">
+  <w:abstractNum w:abstractNumId="19" w15:restartNumberingAfterBreak="0">
     <w:nsid w:val="391A538B"/>
     <w:multiLevelType w:val="multilevel"/>
     <w:tmpl w:val="7F30BA7A"/>
@@ -6934,7 +8424,7 @@
       </w:rPr>
     </w:lvl>
   </w:abstractNum>
-  <w:abstractNum w:abstractNumId="17" w15:restartNumberingAfterBreak="0">
+  <w:abstractNum w:abstractNumId="20" w15:restartNumberingAfterBreak="0">
     <w:nsid w:val="39430A20"/>
     <w:multiLevelType w:val="multilevel"/>
     <w:tmpl w:val="5FE2FB92"/>
@@ -7083,7 +8573,7 @@
       </w:rPr>
     </w:lvl>
   </w:abstractNum>
-  <w:abstractNum w:abstractNumId="18" w15:restartNumberingAfterBreak="0">
+  <w:abstractNum w:abstractNumId="21" w15:restartNumberingAfterBreak="0">
     <w:nsid w:val="3F0440EC"/>
     <w:multiLevelType w:val="multilevel"/>
     <w:tmpl w:val="D68E910E"/>
@@ -7232,7 +8722,7 @@
       </w:rPr>
     </w:lvl>
   </w:abstractNum>
-  <w:abstractNum w:abstractNumId="19" w15:restartNumberingAfterBreak="0">
+  <w:abstractNum w:abstractNumId="22" w15:restartNumberingAfterBreak="0">
     <w:nsid w:val="40787588"/>
     <w:multiLevelType w:val="multilevel"/>
     <w:tmpl w:val="56E2A682"/>
@@ -7381,7 +8871,7 @@
       </w:rPr>
     </w:lvl>
   </w:abstractNum>
-  <w:abstractNum w:abstractNumId="20" w15:restartNumberingAfterBreak="0">
+  <w:abstractNum w:abstractNumId="23" w15:restartNumberingAfterBreak="0">
     <w:nsid w:val="41EE0DF2"/>
     <w:multiLevelType w:val="multilevel"/>
     <w:tmpl w:val="53D8DF16"/>
@@ -7530,7 +9020,156 @@
       </w:rPr>
     </w:lvl>
   </w:abstractNum>
-  <w:abstractNum w:abstractNumId="21" w15:restartNumberingAfterBreak="0">
+  <w:abstractNum w:abstractNumId="24" w15:restartNumberingAfterBreak="0">
+    <w:nsid w:val="42A74D23"/>
+    <w:multiLevelType w:val="multilevel"/>
+    <w:tmpl w:val="0C48949E"/>
+    <w:lvl w:ilvl="0">
+      <w:start w:val="1"/>
+      <w:numFmt w:val="bullet"/>
+      <w:lvlText w:val=""/>
+      <w:lvlJc w:val="left"/>
+      <w:pPr>
+        <w:tabs>
+          <w:tab w:val="num" w:pos="720"/>
+        </w:tabs>
+        <w:ind w:left="720" w:hanging="360"/>
+      </w:pPr>
+      <w:rPr>
+        <w:rFonts w:ascii="Symbol" w:hAnsi="Symbol" w:hint="default"/>
+        <w:sz w:val="20"/>
+      </w:rPr>
+    </w:lvl>
+    <w:lvl w:ilvl="1" w:tentative="1">
+      <w:start w:val="1"/>
+      <w:numFmt w:val="bullet"/>
+      <w:lvlText w:val="o"/>
+      <w:lvlJc w:val="left"/>
+      <w:pPr>
+        <w:tabs>
+          <w:tab w:val="num" w:pos="1440"/>
+        </w:tabs>
+        <w:ind w:left="1440" w:hanging="360"/>
+      </w:pPr>
+      <w:rPr>
+        <w:rFonts w:ascii="Courier New" w:hAnsi="Courier New" w:hint="default"/>
+        <w:sz w:val="20"/>
+      </w:rPr>
+    </w:lvl>
+    <w:lvl w:ilvl="2" w:tentative="1">
+      <w:start w:val="1"/>
+      <w:numFmt w:val="bullet"/>
+      <w:lvlText w:val=""/>
+      <w:lvlJc w:val="left"/>
+      <w:pPr>
+        <w:tabs>
+          <w:tab w:val="num" w:pos="2160"/>
+        </w:tabs>
+        <w:ind w:left="2160" w:hanging="360"/>
+      </w:pPr>
+      <w:rPr>
+        <w:rFonts w:ascii="Wingdings" w:hAnsi="Wingdings" w:hint="default"/>
+        <w:sz w:val="20"/>
+      </w:rPr>
+    </w:lvl>
+    <w:lvl w:ilvl="3" w:tentative="1">
+      <w:start w:val="1"/>
+      <w:numFmt w:val="bullet"/>
+      <w:lvlText w:val=""/>
+      <w:lvlJc w:val="left"/>
+      <w:pPr>
+        <w:tabs>
+          <w:tab w:val="num" w:pos="2880"/>
+        </w:tabs>
+        <w:ind w:left="2880" w:hanging="360"/>
+      </w:pPr>
+      <w:rPr>
+        <w:rFonts w:ascii="Wingdings" w:hAnsi="Wingdings" w:hint="default"/>
+        <w:sz w:val="20"/>
+      </w:rPr>
+    </w:lvl>
+    <w:lvl w:ilvl="4" w:tentative="1">
+      <w:start w:val="1"/>
+      <w:numFmt w:val="bullet"/>
+      <w:lvlText w:val=""/>
+      <w:lvlJc w:val="left"/>
+      <w:pPr>
+        <w:tabs>
+          <w:tab w:val="num" w:pos="3600"/>
+        </w:tabs>
+        <w:ind w:left="3600" w:hanging="360"/>
+      </w:pPr>
+      <w:rPr>
+        <w:rFonts w:ascii="Wingdings" w:hAnsi="Wingdings" w:hint="default"/>
+        <w:sz w:val="20"/>
+      </w:rPr>
+    </w:lvl>
+    <w:lvl w:ilvl="5" w:tentative="1">
+      <w:start w:val="1"/>
+      <w:numFmt w:val="bullet"/>
+      <w:lvlText w:val=""/>
+      <w:lvlJc w:val="left"/>
+      <w:pPr>
+        <w:tabs>
+          <w:tab w:val="num" w:pos="4320"/>
+        </w:tabs>
+        <w:ind w:left="4320" w:hanging="360"/>
+      </w:pPr>
+      <w:rPr>
+        <w:rFonts w:ascii="Wingdings" w:hAnsi="Wingdings" w:hint="default"/>
+        <w:sz w:val="20"/>
+      </w:rPr>
+    </w:lvl>
+    <w:lvl w:ilvl="6" w:tentative="1">
+      <w:start w:val="1"/>
+      <w:numFmt w:val="bullet"/>
+      <w:lvlText w:val=""/>
+      <w:lvlJc w:val="left"/>
+      <w:pPr>
+        <w:tabs>
+          <w:tab w:val="num" w:pos="5040"/>
+        </w:tabs>
+        <w:ind w:left="5040" w:hanging="360"/>
+      </w:pPr>
+      <w:rPr>
+        <w:rFonts w:ascii="Wingdings" w:hAnsi="Wingdings" w:hint="default"/>
+        <w:sz w:val="20"/>
+      </w:rPr>
+    </w:lvl>
+    <w:lvl w:ilvl="7" w:tentative="1">
+      <w:start w:val="1"/>
+      <w:numFmt w:val="bullet"/>
+      <w:lvlText w:val=""/>
+      <w:lvlJc w:val="left"/>
+      <w:pPr>
+        <w:tabs>
+          <w:tab w:val="num" w:pos="5760"/>
+        </w:tabs>
+        <w:ind w:left="5760" w:hanging="360"/>
+      </w:pPr>
+      <w:rPr>
+        <w:rFonts w:ascii="Wingdings" w:hAnsi="Wingdings" w:hint="default"/>
+        <w:sz w:val="20"/>
+      </w:rPr>
+    </w:lvl>
+    <w:lvl w:ilvl="8" w:tentative="1">
+      <w:start w:val="1"/>
+      <w:numFmt w:val="bullet"/>
+      <w:lvlText w:val=""/>
+      <w:lvlJc w:val="left"/>
+      <w:pPr>
+        <w:tabs>
+          <w:tab w:val="num" w:pos="6480"/>
+        </w:tabs>
+        <w:ind w:left="6480" w:hanging="360"/>
+      </w:pPr>
+      <w:rPr>
+        <w:rFonts w:ascii="Wingdings" w:hAnsi="Wingdings" w:hint="default"/>
+        <w:sz w:val="20"/>
+      </w:rPr>
+    </w:lvl>
+  </w:abstractNum>
+  <w:abstractNum w:abstractNumId="25" w15:restartNumberingAfterBreak="0">
     <w:nsid w:val="49C552A7"/>
     <w:multiLevelType w:val="multilevel"/>
     <w:tmpl w:val="110A216A"/>
@@ -7679,7 +9318,7 @@
       </w:rPr>
     </w:lvl>
   </w:abstractNum>
-  <w:abstractNum w:abstractNumId="22" w15:restartNumberingAfterBreak="0">
+  <w:abstractNum w:abstractNumId="26" w15:restartNumberingAfterBreak="0">
     <w:nsid w:val="53F2243B"/>
     <w:multiLevelType w:val="multilevel"/>
     <w:tmpl w:val="6B203F50"/>
@@ -7828,7 +9467,305 @@
       </w:rPr>
     </w:lvl>
   </w:abstractNum>
-  <w:abstractNum w:abstractNumId="23" w15:restartNumberingAfterBreak="0">
+  <w:abstractNum w:abstractNumId="27" w15:restartNumberingAfterBreak="0">
+    <w:nsid w:val="597F2A5B"/>
+    <w:multiLevelType w:val="multilevel"/>
+    <w:tmpl w:val="48D81E18"/>
+    <w:lvl w:ilvl="0">
+      <w:start w:val="1"/>
+      <w:numFmt w:val="bullet"/>
+      <w:lvlText w:val=""/>
+      <w:lvlJc w:val="left"/>
+      <w:pPr>
+        <w:tabs>
+          <w:tab w:val="num" w:pos="720"/>
+        </w:tabs>
+        <w:ind w:left="720" w:hanging="360"/>
+      </w:pPr>
+      <w:rPr>
+        <w:rFonts w:ascii="Symbol" w:hAnsi="Symbol" w:hint="default"/>
+        <w:sz w:val="20"/>
+      </w:rPr>
+    </w:lvl>
+    <w:lvl w:ilvl="1" w:tentative="1">
+      <w:start w:val="1"/>
+      <w:numFmt w:val="bullet"/>
+      <w:lvlText w:val="o"/>
+      <w:lvlJc w:val="left"/>
+      <w:pPr>
+        <w:tabs>
+          <w:tab w:val="num" w:pos="1440"/>
+        </w:tabs>
+        <w:ind w:left="1440" w:hanging="360"/>
+      </w:pPr>
+      <w:rPr>
+        <w:rFonts w:ascii="Courier New" w:hAnsi="Courier New" w:hint="default"/>
+        <w:sz w:val="20"/>
+      </w:rPr>
+    </w:lvl>
+    <w:lvl w:ilvl="2" w:tentative="1">
+      <w:start w:val="1"/>
+      <w:numFmt w:val="bullet"/>
+      <w:lvlText w:val=""/>
+      <w:lvlJc w:val="left"/>
+      <w:pPr>
+        <w:tabs>
+          <w:tab w:val="num" w:pos="2160"/>
+        </w:tabs>
+        <w:ind w:left="2160" w:hanging="360"/>
+      </w:pPr>
+      <w:rPr>
+        <w:rFonts w:ascii="Wingdings" w:hAnsi="Wingdings" w:hint="default"/>
+        <w:sz w:val="20"/>
+      </w:rPr>
+    </w:lvl>
+    <w:lvl w:ilvl="3" w:tentative="1">
+      <w:start w:val="1"/>
+      <w:numFmt w:val="bullet"/>
+      <w:lvlText w:val=""/>
+      <w:lvlJc w:val="left"/>
+      <w:pPr>
+        <w:tabs>
+          <w:tab w:val="num" w:pos="2880"/>
+        </w:tabs>
+        <w:ind w:left="2880" w:hanging="360"/>
+      </w:pPr>
+      <w:rPr>
+        <w:rFonts w:ascii="Wingdings" w:hAnsi="Wingdings" w:hint="default"/>
+        <w:sz w:val="20"/>
+      </w:rPr>
+    </w:lvl>
+    <w:lvl w:ilvl="4" w:tentative="1">
+      <w:start w:val="1"/>
+      <w:numFmt w:val="bullet"/>
+      <w:lvlText w:val=""/>
+      <w:lvlJc w:val="left"/>
+      <w:pPr>
+        <w:tabs>
+          <w:tab w:val="num" w:pos="3600"/>
+        </w:tabs>
+        <w:ind w:left="3600" w:hanging="360"/>
+      </w:pPr>
+      <w:rPr>
+        <w:rFonts w:ascii="Wingdings" w:hAnsi="Wingdings" w:hint="default"/>
+        <w:sz w:val="20"/>
+      </w:rPr>
+    </w:lvl>
+    <w:lvl w:ilvl="5" w:tentative="1">
+      <w:start w:val="1"/>
+      <w:numFmt w:val="bullet"/>
+      <w:lvlText w:val=""/>
+      <w:lvlJc w:val="left"/>
+      <w:pPr>
+        <w:tabs>
+          <w:tab w:val="num" w:pos="4320"/>
+        </w:tabs>
+        <w:ind w:left="4320" w:hanging="360"/>
+      </w:pPr>
+      <w:rPr>
+        <w:rFonts w:ascii="Wingdings" w:hAnsi="Wingdings" w:hint="default"/>
+        <w:sz w:val="20"/>
+      </w:rPr>
+    </w:lvl>
+    <w:lvl w:ilvl="6" w:tentative="1">
+      <w:start w:val="1"/>
+      <w:numFmt w:val="bullet"/>
+      <w:lvlText w:val=""/>
+      <w:lvlJc w:val="left"/>
+      <w:pPr>
+        <w:tabs>
+          <w:tab w:val="num" w:pos="5040"/>
+        </w:tabs>
+        <w:ind w:left="5040" w:hanging="360"/>
+      </w:pPr>
+      <w:rPr>
+        <w:rFonts w:ascii="Wingdings" w:hAnsi="Wingdings" w:hint="default"/>
+        <w:sz w:val="20"/>
+      </w:rPr>
+    </w:lvl>
+    <w:lvl w:ilvl="7" w:tentative="1">
+      <w:start w:val="1"/>
+      <w:numFmt w:val="bullet"/>
+      <w:lvlText w:val=""/>
+      <w:lvlJc w:val="left"/>
+      <w:pPr>
+        <w:tabs>
+          <w:tab w:val="num" w:pos="5760"/>
+        </w:tabs>
+        <w:ind w:left="5760" w:hanging="360"/>
+      </w:pPr>
+      <w:rPr>
+        <w:rFonts w:ascii="Wingdings" w:hAnsi="Wingdings" w:hint="default"/>
+        <w:sz w:val="20"/>
+      </w:rPr>
+    </w:lvl>
+    <w:lvl w:ilvl="8" w:tentative="1">
+      <w:start w:val="1"/>
+      <w:numFmt w:val="bullet"/>
+      <w:lvlText w:val=""/>
+      <w:lvlJc w:val="left"/>
+      <w:pPr>
+        <w:tabs>
+          <w:tab w:val="num" w:pos="6480"/>
+        </w:tabs>
+        <w:ind w:left="6480" w:hanging="360"/>
+      </w:pPr>
+      <w:rPr>
+        <w:rFonts w:ascii="Wingdings" w:hAnsi="Wingdings" w:hint="default"/>
+        <w:sz w:val="20"/>
+      </w:rPr>
+    </w:lvl>
+  </w:abstractNum>
+  <w:abstractNum w:abstractNumId="28" w15:restartNumberingAfterBreak="0">
+    <w:nsid w:val="5B4A673D"/>
+    <w:multiLevelType w:val="multilevel"/>
+    <w:tmpl w:val="C374D91C"/>
+    <w:lvl w:ilvl="0">
+      <w:start w:val="1"/>
+      <w:numFmt w:val="bullet"/>
+      <w:lvlText w:val=""/>
+      <w:lvlJc w:val="left"/>
+      <w:pPr>
+        <w:tabs>
+          <w:tab w:val="num" w:pos="720"/>
+        </w:tabs>
+        <w:ind w:left="720" w:hanging="360"/>
+      </w:pPr>
+      <w:rPr>
+        <w:rFonts w:ascii="Symbol" w:hAnsi="Symbol" w:hint="default"/>
+        <w:sz w:val="20"/>
+      </w:rPr>
+    </w:lvl>
+    <w:lvl w:ilvl="1" w:tentative="1">
+      <w:start w:val="1"/>
+      <w:numFmt w:val="bullet"/>
+      <w:lvlText w:val="o"/>
+      <w:lvlJc w:val="left"/>
+      <w:pPr>
+        <w:tabs>
+          <w:tab w:val="num" w:pos="1440"/>
+        </w:tabs>
+        <w:ind w:left="1440" w:hanging="360"/>
+      </w:pPr>
+      <w:rPr>
+        <w:rFonts w:ascii="Courier New" w:hAnsi="Courier New" w:hint="default"/>
+        <w:sz w:val="20"/>
+      </w:rPr>
+    </w:lvl>
+    <w:lvl w:ilvl="2" w:tentative="1">
+      <w:start w:val="1"/>
+      <w:numFmt w:val="bullet"/>
+      <w:lvlText w:val=""/>
+      <w:lvlJc w:val="left"/>
+      <w:pPr>
+        <w:tabs>
+          <w:tab w:val="num" w:pos="2160"/>
+        </w:tabs>
+        <w:ind w:left="2160" w:hanging="360"/>
+      </w:pPr>
+      <w:rPr>
+        <w:rFonts w:ascii="Wingdings" w:hAnsi="Wingdings" w:hint="default"/>
+        <w:sz w:val="20"/>
+      </w:rPr>
+    </w:lvl>
+    <w:lvl w:ilvl="3" w:tentative="1">
+      <w:start w:val="1"/>
+      <w:numFmt w:val="bullet"/>
+      <w:lvlText w:val=""/>
+      <w:lvlJc w:val="left"/>
+      <w:pPr>
+        <w:tabs>
+          <w:tab w:val="num" w:pos="2880"/>
+        </w:tabs>
+        <w:ind w:left="2880" w:hanging="360"/>
+      </w:pPr>
+      <w:rPr>
+        <w:rFonts w:ascii="Wingdings" w:hAnsi="Wingdings" w:hint="default"/>
+        <w:sz w:val="20"/>
+      </w:rPr>
+    </w:lvl>
+    <w:lvl w:ilvl="4" w:tentative="1">
+      <w:start w:val="1"/>
+      <w:numFmt w:val="bullet"/>
+      <w:lvlText w:val=""/>
+      <w:lvlJc w:val="left"/>
+      <w:pPr>
+        <w:tabs>
+          <w:tab w:val="num" w:pos="3600"/>
+        </w:tabs>
+        <w:ind w:left="3600" w:hanging="360"/>
+      </w:pPr>
+      <w:rPr>
+        <w:rFonts w:ascii="Wingdings" w:hAnsi="Wingdings" w:hint="default"/>
+        <w:sz w:val="20"/>
+      </w:rPr>
+    </w:lvl>
+    <w:lvl w:ilvl="5" w:tentative="1">
+      <w:start w:val="1"/>
+      <w:numFmt w:val="bullet"/>
+      <w:lvlText w:val=""/>
+      <w:lvlJc w:val="left"/>
+      <w:pPr>
+        <w:tabs>
+          <w:tab w:val="num" w:pos="4320"/>
+        </w:tabs>
+        <w:ind w:left="4320" w:hanging="360"/>
+      </w:pPr>
+      <w:rPr>
+        <w:rFonts w:ascii="Wingdings" w:hAnsi="Wingdings" w:hint="default"/>
+        <w:sz w:val="20"/>
+      </w:rPr>
+    </w:lvl>
+    <w:lvl w:ilvl="6" w:tentative="1">
+      <w:start w:val="1"/>
+      <w:numFmt w:val="bullet"/>
+      <w:lvlText w:val=""/>
+      <w:lvlJc w:val="left"/>
+      <w:pPr>
+        <w:tabs>
+          <w:tab w:val="num" w:pos="5040"/>
+        </w:tabs>
+        <w:ind w:left="5040" w:hanging="360"/>
+      </w:pPr>
+      <w:rPr>
+        <w:rFonts w:ascii="Wingdings" w:hAnsi="Wingdings" w:hint="default"/>
+        <w:sz w:val="20"/>
+      </w:rPr>
+    </w:lvl>
+    <w:lvl w:ilvl="7" w:tentative="1">
+      <w:start w:val="1"/>
+      <w:numFmt w:val="bullet"/>
+      <w:lvlText w:val=""/>
+      <w:lvlJc w:val="left"/>
+      <w:pPr>
+        <w:tabs>
+          <w:tab w:val="num" w:pos="5760"/>
+        </w:tabs>
+        <w:ind w:left="5760" w:hanging="360"/>
+      </w:pPr>
+      <w:rPr>
+        <w:rFonts w:ascii="Wingdings" w:hAnsi="Wingdings" w:hint="default"/>
+        <w:sz w:val="20"/>
+      </w:rPr>
+    </w:lvl>
+    <w:lvl w:ilvl="8" w:tentative="1">
+      <w:start w:val="1"/>
+      <w:numFmt w:val="bullet"/>
+      <w:lvlText w:val=""/>
+      <w:lvlJc w:val="left"/>
+      <w:pPr>
+        <w:tabs>
+          <w:tab w:val="num" w:pos="6480"/>
+        </w:tabs>
+        <w:ind w:left="6480" w:hanging="360"/>
+      </w:pPr>
+      <w:rPr>
+        <w:rFonts w:ascii="Wingdings" w:hAnsi="Wingdings" w:hint="default"/>
+        <w:sz w:val="20"/>
+      </w:rPr>
+    </w:lvl>
+  </w:abstractNum>
+  <w:abstractNum w:abstractNumId="29" w15:restartNumberingAfterBreak="0">
     <w:nsid w:val="61C21F20"/>
     <w:multiLevelType w:val="multilevel"/>
     <w:tmpl w:val="9EC6B29A"/>
@@ -7977,7 +9914,156 @@
       </w:rPr>
     </w:lvl>
   </w:abstractNum>
-  <w:abstractNum w:abstractNumId="24" w15:restartNumberingAfterBreak="0">
+  <w:abstractNum w:abstractNumId="30" w15:restartNumberingAfterBreak="0">
+    <w:nsid w:val="62790036"/>
+    <w:multiLevelType w:val="multilevel"/>
+    <w:tmpl w:val="93D25058"/>
+    <w:lvl w:ilvl="0">
+      <w:start w:val="1"/>
+      <w:numFmt w:val="bullet"/>
+      <w:lvlText w:val=""/>
+      <w:lvlJc w:val="left"/>
+      <w:pPr>
+        <w:tabs>
+          <w:tab w:val="num" w:pos="720"/>
+        </w:tabs>
+        <w:ind w:left="720" w:hanging="360"/>
+      </w:pPr>
+      <w:rPr>
+        <w:rFonts w:ascii="Symbol" w:hAnsi="Symbol" w:hint="default"/>
+        <w:sz w:val="20"/>
+      </w:rPr>
+    </w:lvl>
+    <w:lvl w:ilvl="1" w:tentative="1">
+      <w:start w:val="1"/>
+      <w:numFmt w:val="bullet"/>
+      <w:lvlText w:val="o"/>
+      <w:lvlJc w:val="left"/>
+      <w:pPr>
+        <w:tabs>
+          <w:tab w:val="num" w:pos="1440"/>
+        </w:tabs>
+        <w:ind w:left="1440" w:hanging="360"/>
+      </w:pPr>
+      <w:rPr>
+        <w:rFonts w:ascii="Courier New" w:hAnsi="Courier New" w:hint="default"/>
+        <w:sz w:val="20"/>
+      </w:rPr>
+    </w:lvl>
+    <w:lvl w:ilvl="2" w:tentative="1">
+      <w:start w:val="1"/>
+      <w:numFmt w:val="bullet"/>
+      <w:lvlText w:val=""/>
+      <w:lvlJc w:val="left"/>
+      <w:pPr>
+        <w:tabs>
+          <w:tab w:val="num" w:pos="2160"/>
+        </w:tabs>
+        <w:ind w:left="2160" w:hanging="360"/>
+      </w:pPr>
+      <w:rPr>
+        <w:rFonts w:ascii="Wingdings" w:hAnsi="Wingdings" w:hint="default"/>
+        <w:sz w:val="20"/>
+      </w:rPr>
+    </w:lvl>
+    <w:lvl w:ilvl="3" w:tentative="1">
+      <w:start w:val="1"/>
+      <w:numFmt w:val="bullet"/>
+      <w:lvlText w:val=""/>
+      <w:lvlJc w:val="left"/>
+      <w:pPr>
+        <w:tabs>
+          <w:tab w:val="num" w:pos="2880"/>
+        </w:tabs>
+        <w:ind w:left="2880" w:hanging="360"/>
+      </w:pPr>
+      <w:rPr>
+        <w:rFonts w:ascii="Wingdings" w:hAnsi="Wingdings" w:hint="default"/>
+        <w:sz w:val="20"/>
+      </w:rPr>
+    </w:lvl>
+    <w:lvl w:ilvl="4" w:tentative="1">
+      <w:start w:val="1"/>
+      <w:numFmt w:val="bullet"/>
+      <w:lvlText w:val=""/>
+      <w:lvlJc w:val="left"/>
+      <w:pPr>
+        <w:tabs>
+          <w:tab w:val="num" w:pos="3600"/>
+        </w:tabs>
+        <w:ind w:left="3600" w:hanging="360"/>
+      </w:pPr>
+      <w:rPr>
+        <w:rFonts w:ascii="Wingdings" w:hAnsi="Wingdings" w:hint="default"/>
+        <w:sz w:val="20"/>
+      </w:rPr>
+    </w:lvl>
+    <w:lvl w:ilvl="5" w:tentative="1">
+      <w:start w:val="1"/>
+      <w:numFmt w:val="bullet"/>
+      <w:lvlText w:val=""/>
+      <w:lvlJc w:val="left"/>
+      <w:pPr>
+        <w:tabs>
+          <w:tab w:val="num" w:pos="4320"/>
+        </w:tabs>
+        <w:ind w:left="4320" w:hanging="360"/>
+      </w:pPr>
+      <w:rPr>
+        <w:rFonts w:ascii="Wingdings" w:hAnsi="Wingdings" w:hint="default"/>
+        <w:sz w:val="20"/>
+      </w:rPr>
+    </w:lvl>
+    <w:lvl w:ilvl="6" w:tentative="1">
+      <w:start w:val="1"/>
+      <w:numFmt w:val="bullet"/>
+      <w:lvlText w:val=""/>
+      <w:lvlJc w:val="left"/>
+      <w:pPr>
+        <w:tabs>
+          <w:tab w:val="num" w:pos="5040"/>
+        </w:tabs>
+        <w:ind w:left="5040" w:hanging="360"/>
+      </w:pPr>
+      <w:rPr>
+        <w:rFonts w:ascii="Wingdings" w:hAnsi="Wingdings" w:hint="default"/>
+        <w:sz w:val="20"/>
+      </w:rPr>
+    </w:lvl>
+    <w:lvl w:ilvl="7" w:tentative="1">
+      <w:start w:val="1"/>
+      <w:numFmt w:val="bullet"/>
+      <w:lvlText w:val=""/>
+      <w:lvlJc w:val="left"/>
+      <w:pPr>
+        <w:tabs>
+          <w:tab w:val="num" w:pos="5760"/>
+        </w:tabs>
+        <w:ind w:left="5760" w:hanging="360"/>
+      </w:pPr>
+      <w:rPr>
+        <w:rFonts w:ascii="Wingdings" w:hAnsi="Wingdings" w:hint="default"/>
+        <w:sz w:val="20"/>
+      </w:rPr>
+    </w:lvl>
+    <w:lvl w:ilvl="8" w:tentative="1">
+      <w:start w:val="1"/>
+      <w:numFmt w:val="bullet"/>
+      <w:lvlText w:val=""/>
+      <w:lvlJc w:val="left"/>
+      <w:pPr>
+        <w:tabs>
+          <w:tab w:val="num" w:pos="6480"/>
+        </w:tabs>
+        <w:ind w:left="6480" w:hanging="360"/>
+      </w:pPr>
+      <w:rPr>
+        <w:rFonts w:ascii="Wingdings" w:hAnsi="Wingdings" w:hint="default"/>
+        <w:sz w:val="20"/>
+      </w:rPr>
+    </w:lvl>
+  </w:abstractNum>
+  <w:abstractNum w:abstractNumId="31" w15:restartNumberingAfterBreak="0">
     <w:nsid w:val="63730EA0"/>
     <w:multiLevelType w:val="multilevel"/>
     <w:tmpl w:val="A1F0EBA8"/>
@@ -8126,7 +10212,7 @@
       </w:rPr>
     </w:lvl>
   </w:abstractNum>
-  <w:abstractNum w:abstractNumId="25" w15:restartNumberingAfterBreak="0">
+  <w:abstractNum w:abstractNumId="32" w15:restartNumberingAfterBreak="0">
     <w:nsid w:val="63CA0A21"/>
     <w:multiLevelType w:val="multilevel"/>
     <w:tmpl w:val="ABEAB454"/>
@@ -8275,7 +10361,7 @@
       </w:rPr>
     </w:lvl>
   </w:abstractNum>
-  <w:abstractNum w:abstractNumId="26" w15:restartNumberingAfterBreak="0">
+  <w:abstractNum w:abstractNumId="33" w15:restartNumberingAfterBreak="0">
     <w:nsid w:val="6C427D99"/>
     <w:multiLevelType w:val="multilevel"/>
     <w:tmpl w:val="6C26539A"/>
@@ -8424,7 +10510,7 @@
       </w:rPr>
     </w:lvl>
   </w:abstractNum>
-  <w:abstractNum w:abstractNumId="27" w15:restartNumberingAfterBreak="0">
+  <w:abstractNum w:abstractNumId="34" w15:restartNumberingAfterBreak="0">
     <w:nsid w:val="6C76368B"/>
     <w:multiLevelType w:val="multilevel"/>
     <w:tmpl w:val="53D44A26"/>
@@ -8573,7 +10659,7 @@
       </w:rPr>
     </w:lvl>
   </w:abstractNum>
-  <w:abstractNum w:abstractNumId="28" w15:restartNumberingAfterBreak="0">
+  <w:abstractNum w:abstractNumId="35" w15:restartNumberingAfterBreak="0">
     <w:nsid w:val="7B204074"/>
     <w:multiLevelType w:val="multilevel"/>
     <w:tmpl w:val="E6C803BC"/>
@@ -8726,88 +10812,109 @@
     <w:abstractNumId w:val="0"/>
   </w:num>
   <w:num w:numId="2" w16cid:durableId="278145578">
+    <w:abstractNumId w:val="22"/>
+  </w:num>
+  <w:num w:numId="3" w16cid:durableId="1082869659">
+    <w:abstractNumId w:val="9"/>
+  </w:num>
+  <w:num w:numId="4" w16cid:durableId="1399087449">
+    <w:abstractNumId w:val="33"/>
+  </w:num>
+  <w:num w:numId="5" w16cid:durableId="1590115480">
+    <w:abstractNumId w:val="11"/>
+  </w:num>
+  <w:num w:numId="6" w16cid:durableId="1275599465">
+    <w:abstractNumId w:val="5"/>
+  </w:num>
+  <w:num w:numId="7" w16cid:durableId="949821662">
+    <w:abstractNumId w:val="8"/>
+  </w:num>
+  <w:num w:numId="8" w16cid:durableId="502160085">
+    <w:abstractNumId w:val="10"/>
+  </w:num>
+  <w:num w:numId="9" w16cid:durableId="1561751620">
+    <w:abstractNumId w:val="18"/>
+  </w:num>
+  <w:num w:numId="10" w16cid:durableId="642005705">
+    <w:abstractNumId w:val="25"/>
+  </w:num>
+  <w:num w:numId="11" w16cid:durableId="1916285314">
+    <w:abstractNumId w:val="29"/>
+  </w:num>
+  <w:num w:numId="12" w16cid:durableId="112209799">
+    <w:abstractNumId w:val="7"/>
+  </w:num>
+  <w:num w:numId="13" w16cid:durableId="2034110977">
+    <w:abstractNumId w:val="4"/>
+  </w:num>
+  <w:num w:numId="14" w16cid:durableId="1815020617">
+    <w:abstractNumId w:val="34"/>
+  </w:num>
+  <w:num w:numId="15" w16cid:durableId="122311294">
+    <w:abstractNumId w:val="14"/>
+  </w:num>
+  <w:num w:numId="16" w16cid:durableId="1880705022">
+    <w:abstractNumId w:val="32"/>
+  </w:num>
+  <w:num w:numId="17" w16cid:durableId="245304063">
     <w:abstractNumId w:val="19"/>
   </w:num>
-  <w:num w:numId="3" w16cid:durableId="1082869659">
-    <w:abstractNumId w:val="8"/>
+  <w:num w:numId="18" w16cid:durableId="130291419">
+    <w:abstractNumId w:val="3"/>
   </w:num>
-  <w:num w:numId="4" w16cid:durableId="1399087449">
+  <w:num w:numId="19" w16cid:durableId="175270223">
     <w:abstractNumId w:val="26"/>
   </w:num>
-  <w:num w:numId="5" w16cid:durableId="1590115480">
-    <w:abstractNumId w:val="10"/>
+  <w:num w:numId="20" w16cid:durableId="1088422739">
+    <w:abstractNumId w:val="16"/>
   </w:num>
-  <w:num w:numId="6" w16cid:durableId="1275599465">
-    <w:abstractNumId w:val="4"/>
+  <w:num w:numId="21" w16cid:durableId="943269753">
+    <w:abstractNumId w:val="23"/>
   </w:num>
-  <w:num w:numId="7" w16cid:durableId="949821662">
-    <w:abstractNumId w:val="7"/>
+  <w:num w:numId="22" w16cid:durableId="1132791763">
+    <w:abstractNumId w:val="21"/>
   </w:num>
-  <w:num w:numId="8" w16cid:durableId="502160085">
-    <w:abstractNumId w:val="9"/>
+  <w:num w:numId="23" w16cid:durableId="1311708505">
+    <w:abstractNumId w:val="20"/>
   </w:num>
-  <w:num w:numId="9" w16cid:durableId="1561751620">
+  <w:num w:numId="24" w16cid:durableId="863400549">
+    <w:abstractNumId w:val="6"/>
+  </w:num>
+  <w:num w:numId="25" w16cid:durableId="790245534">
+    <w:abstractNumId w:val="35"/>
+  </w:num>
+  <w:num w:numId="26" w16cid:durableId="1656452626">
+    <w:abstractNumId w:val="13"/>
+  </w:num>
+  <w:num w:numId="27" w16cid:durableId="1394891037">
+    <w:abstractNumId w:val="2"/>
+  </w:num>
+  <w:num w:numId="28" w16cid:durableId="139657957">
+    <w:abstractNumId w:val="31"/>
+  </w:num>
+  <w:num w:numId="29" w16cid:durableId="1263414231">
+    <w:abstractNumId w:val="12"/>
+  </w:num>
+  <w:num w:numId="30" w16cid:durableId="667756751">
+    <w:abstractNumId w:val="30"/>
+  </w:num>
+  <w:num w:numId="31" w16cid:durableId="1266379373">
+    <w:abstractNumId w:val="24"/>
+  </w:num>
+  <w:num w:numId="32" w16cid:durableId="883054225">
+    <w:abstractNumId w:val="28"/>
+  </w:num>
+  <w:num w:numId="33" w16cid:durableId="624852574">
+    <w:abstractNumId w:val="27"/>
+  </w:num>
+  <w:num w:numId="34" w16cid:durableId="943994323">
     <w:abstractNumId w:val="15"/>
   </w:num>
-  <w:num w:numId="10" w16cid:durableId="642005705">
-    <w:abstractNumId w:val="21"/>
-  </w:num>
-  <w:num w:numId="11" w16cid:durableId="1916285314">
-    <w:abstractNumId w:val="23"/>
-  </w:num>
-  <w:num w:numId="12" w16cid:durableId="112209799">
-    <w:abstractNumId w:val="6"/>
-  </w:num>
-  <w:num w:numId="13" w16cid:durableId="2034110977">
-    <w:abstractNumId w:val="3"/>
-  </w:num>
-  <w:num w:numId="14" w16cid:durableId="1815020617">
-    <w:abstractNumId w:val="27"/>
-  </w:num>
-  <w:num w:numId="15" w16cid:durableId="122311294">
-    <w:abstractNumId w:val="13"/>
-  </w:num>
-  <w:num w:numId="16" w16cid:durableId="1880705022">
-    <w:abstractNumId w:val="25"/>
-  </w:num>
-  <w:num w:numId="17" w16cid:durableId="245304063">
-    <w:abstractNumId w:val="16"/>
-  </w:num>
-  <w:num w:numId="18" w16cid:durableId="130291419">
-    <w:abstractNumId w:val="2"/>
-  </w:num>
-  <w:num w:numId="19" w16cid:durableId="175270223">
-    <w:abstractNumId w:val="22"/>
-  </w:num>
-  <w:num w:numId="20" w16cid:durableId="1088422739">
-    <w:abstractNumId w:val="14"/>
-  </w:num>
-  <w:num w:numId="21" w16cid:durableId="943269753">
-    <w:abstractNumId w:val="20"/>
-  </w:num>
-  <w:num w:numId="22" w16cid:durableId="1132791763">
-    <w:abstractNumId w:val="18"/>
-  </w:num>
-  <w:num w:numId="23" w16cid:durableId="1311708505">
+  <w:num w:numId="35" w16cid:durableId="568460629">
     <w:abstractNumId w:val="17"/>
   </w:num>
-  <w:num w:numId="24" w16cid:durableId="863400549">
-    <w:abstractNumId w:val="5"/>
-  </w:num>
-  <w:num w:numId="25" w16cid:durableId="790245534">
-    <w:abstractNumId w:val="28"/>
-  </w:num>
-  <w:num w:numId="26" w16cid:durableId="1656452626">
-    <w:abstractNumId w:val="12"/>
-  </w:num>
-  <w:num w:numId="27" w16cid:durableId="1394891037">
+  <w:num w:numId="36" w16cid:durableId="1182277291">
     <w:abstractNumId w:val="1"/>
-  </w:num>
-  <w:num w:numId="28" w16cid:durableId="139657957">
-    <w:abstractNumId w:val="24"/>
-  </w:num>
-  <w:num w:numId="29" w16cid:durableId="1263414231">
-    <w:abstractNumId w:val="11"/>
   </w:num>
 </w:numbering>
 </file>

</xml_diff>

<commit_message>
Dia 37: Roadmap del proyecto CV analyzer
</commit_message>
<xml_diff>
--- a/Diseño de proyectos de IA/Diseño de proyectos de IA.docx
+++ b/Diseño de proyectos de IA/Diseño de proyectos de IA.docx
@@ -4479,7 +4479,7 @@
     <w:p>
       <w:r>
         <w:pict w14:anchorId="72BAD59E">
-          <v:rect id="_x0000_i1119" style="width:0;height:1.5pt" o:hralign="center" o:hrstd="t" o:hr="t" fillcolor="#a0a0a0" stroked="f"/>
+          <v:rect id="_x0000_i1059" style="width:0;height:1.5pt" o:hralign="center" o:hrstd="t" o:hr="t" fillcolor="#a0a0a0" stroked="f"/>
         </w:pict>
       </w:r>
     </w:p>
@@ -4499,25 +4499,7 @@
           <w:bCs/>
           <w:u w:val="single"/>
         </w:rPr>
-        <w:t>1️</w:t>
-      </w:r>
-      <w:r>
-        <w:rPr>
-          <w:rFonts w:cstheme="minorHAnsi"/>
-          <w:b/>
-          <w:bCs/>
-          <w:u w:val="single"/>
-        </w:rPr>
-        <w:t xml:space="preserve">) </w:t>
-      </w:r>
-      <w:r>
-        <w:rPr>
-          <w:rFonts w:cstheme="minorHAnsi"/>
-          <w:b/>
-          <w:bCs/>
-          <w:u w:val="single"/>
-        </w:rPr>
-        <w:t xml:space="preserve">Problema real </w:t>
+        <w:t xml:space="preserve">1️) Problema real </w:t>
       </w:r>
       <w:r>
         <w:rPr>
@@ -4594,7 +4576,7 @@
     <w:p>
       <w:r>
         <w:pict w14:anchorId="04A20311">
-          <v:rect id="_x0000_i1120" style="width:0;height:1.5pt" o:hralign="center" o:hrstd="t" o:hr="t" fillcolor="#a0a0a0" stroked="f"/>
+          <v:rect id="_x0000_i1060" style="width:0;height:1.5pt" o:hralign="center" o:hrstd="t" o:hr="t" fillcolor="#a0a0a0" stroked="f"/>
         </w:pict>
       </w:r>
     </w:p>
@@ -4614,17 +4596,49 @@
           <w:bCs/>
           <w:u w:val="single"/>
         </w:rPr>
-        <w:t>2️</w:t>
-      </w:r>
-      <w:r>
+        <w:t xml:space="preserve">2️) Alcance acotado </w:t>
+      </w:r>
+      <w:r>
+        <w:rPr>
+          <w:rFonts w:ascii="Segoe UI Symbol" w:hAnsi="Segoe UI Symbol" w:cs="Segoe UI Symbol"/>
+          <w:b/>
+          <w:bCs/>
+          <w:u w:val="single"/>
+        </w:rPr>
+        <w:t>✔</w:t>
+      </w:r>
+    </w:p>
+    <w:p>
+      <w:r>
+        <w:t>Debe poder hacerse en:</w:t>
+      </w:r>
+    </w:p>
+    <w:p>
+      <w:r>
+        <w:t>1–2 semanas (MVP)</w:t>
+      </w:r>
+    </w:p>
+    <w:p>
+      <w:r>
+        <w:t>No meses.</w:t>
+      </w:r>
+    </w:p>
+    <w:p>
+      <w:r>
+        <w:pict w14:anchorId="565C4F9B">
+          <v:rect id="_x0000_i1061" style="width:0;height:1.5pt" o:hralign="center" o:hrstd="t" o:hr="t" fillcolor="#a0a0a0" stroked="f"/>
+        </w:pict>
+      </w:r>
+    </w:p>
+    <w:p>
+      <w:pPr>
         <w:rPr>
           <w:rFonts w:cstheme="minorHAnsi"/>
           <w:b/>
           <w:bCs/>
           <w:u w:val="single"/>
         </w:rPr>
-        <w:t xml:space="preserve">) </w:t>
-      </w:r>
+      </w:pPr>
       <w:r>
         <w:rPr>
           <w:rFonts w:cstheme="minorHAnsi"/>
@@ -4632,75 +4646,7 @@
           <w:bCs/>
           <w:u w:val="single"/>
         </w:rPr>
-        <w:t xml:space="preserve">Alcance acotado </w:t>
-      </w:r>
-      <w:r>
-        <w:rPr>
-          <w:rFonts w:ascii="Segoe UI Symbol" w:hAnsi="Segoe UI Symbol" w:cs="Segoe UI Symbol"/>
-          <w:b/>
-          <w:bCs/>
-          <w:u w:val="single"/>
-        </w:rPr>
-        <w:t>✔</w:t>
-      </w:r>
-    </w:p>
-    <w:p>
-      <w:r>
-        <w:t>Debe poder hacerse en:</w:t>
-      </w:r>
-    </w:p>
-    <w:p>
-      <w:r>
-        <w:t>1–2 semanas (MVP)</w:t>
-      </w:r>
-    </w:p>
-    <w:p>
-      <w:r>
-        <w:t>No meses.</w:t>
-      </w:r>
-    </w:p>
-    <w:p>
-      <w:r>
-        <w:pict w14:anchorId="565C4F9B">
-          <v:rect id="_x0000_i1121" style="width:0;height:1.5pt" o:hralign="center" o:hrstd="t" o:hr="t" fillcolor="#a0a0a0" stroked="f"/>
-        </w:pict>
-      </w:r>
-    </w:p>
-    <w:p>
-      <w:pPr>
-        <w:rPr>
-          <w:rFonts w:cstheme="minorHAnsi"/>
-          <w:b/>
-          <w:bCs/>
-          <w:u w:val="single"/>
-        </w:rPr>
-      </w:pPr>
-      <w:r>
-        <w:rPr>
-          <w:rFonts w:cstheme="minorHAnsi"/>
-          <w:b/>
-          <w:bCs/>
-          <w:u w:val="single"/>
-        </w:rPr>
-        <w:t>3️</w:t>
-      </w:r>
-      <w:r>
-        <w:rPr>
-          <w:rFonts w:cstheme="minorHAnsi"/>
-          <w:b/>
-          <w:bCs/>
-          <w:u w:val="single"/>
-        </w:rPr>
-        <w:t xml:space="preserve">) </w:t>
-      </w:r>
-      <w:r>
-        <w:rPr>
-          <w:rFonts w:cstheme="minorHAnsi"/>
-          <w:b/>
-          <w:bCs/>
-          <w:u w:val="single"/>
-        </w:rPr>
-        <w:t xml:space="preserve">Usa lo que ya </w:t>
+        <w:t xml:space="preserve">3️) Usa lo que ya </w:t>
       </w:r>
       <w:proofErr w:type="spellStart"/>
       <w:r>
@@ -4803,7 +4749,7 @@
     <w:p>
       <w:r>
         <w:pict w14:anchorId="2E66E27F">
-          <v:rect id="_x0000_i1122" style="width:0;height:1.5pt" o:hralign="center" o:hrstd="t" o:hr="t" fillcolor="#a0a0a0" stroked="f"/>
+          <v:rect id="_x0000_i1062" style="width:0;height:1.5pt" o:hralign="center" o:hrstd="t" o:hr="t" fillcolor="#a0a0a0" stroked="f"/>
         </w:pict>
       </w:r>
     </w:p>
@@ -4823,25 +4769,7 @@
           <w:bCs/>
           <w:u w:val="single"/>
         </w:rPr>
-        <w:t>4️</w:t>
-      </w:r>
-      <w:r>
-        <w:rPr>
-          <w:rFonts w:cstheme="minorHAnsi"/>
-          <w:b/>
-          <w:bCs/>
-          <w:u w:val="single"/>
-        </w:rPr>
-        <w:t xml:space="preserve">) </w:t>
-      </w:r>
-      <w:r>
-        <w:rPr>
-          <w:rFonts w:cstheme="minorHAnsi"/>
-          <w:b/>
-          <w:bCs/>
-          <w:u w:val="single"/>
-        </w:rPr>
-        <w:t xml:space="preserve">Se puede mostrar </w:t>
+        <w:t xml:space="preserve">4️) Se puede mostrar </w:t>
       </w:r>
       <w:r>
         <w:rPr>
@@ -4899,7 +4827,7 @@
     <w:p>
       <w:r>
         <w:pict w14:anchorId="516112F2">
-          <v:rect id="_x0000_i1247" style="width:0;height:1.5pt" o:hralign="center" o:hrstd="t" o:hr="t" fillcolor="#a0a0a0" stroked="f"/>
+          <v:rect id="_x0000_i1063" style="width:0;height:1.5pt" o:hralign="center" o:hrstd="t" o:hr="t" fillcolor="#a0a0a0" stroked="f"/>
         </w:pict>
       </w:r>
     </w:p>
@@ -4990,7 +4918,7 @@
     <w:p>
       <w:r>
         <w:pict w14:anchorId="1420B1A6">
-          <v:rect id="_x0000_i1248" style="width:0;height:1.5pt" o:hralign="center" o:hrstd="t" o:hr="t" fillcolor="#a0a0a0" stroked="f"/>
+          <v:rect id="_x0000_i1064" style="width:0;height:1.5pt" o:hralign="center" o:hrstd="t" o:hr="t" fillcolor="#a0a0a0" stroked="f"/>
         </w:pict>
       </w:r>
     </w:p>
@@ -5053,7 +4981,7 @@
     <w:p>
       <w:r>
         <w:pict w14:anchorId="454BD7B7">
-          <v:rect id="_x0000_i1249" style="width:0;height:1.5pt" o:hralign="center" o:hrstd="t" o:hr="t" fillcolor="#a0a0a0" stroked="f"/>
+          <v:rect id="_x0000_i1065" style="width:0;height:1.5pt" o:hralign="center" o:hrstd="t" o:hr="t" fillcolor="#a0a0a0" stroked="f"/>
         </w:pict>
       </w:r>
     </w:p>
@@ -5116,7 +5044,7 @@
     <w:p>
       <w:r>
         <w:pict w14:anchorId="099F59FB">
-          <v:rect id="_x0000_i1250" style="width:0;height:1.5pt" o:hralign="center" o:hrstd="t" o:hr="t" fillcolor="#a0a0a0" stroked="f"/>
+          <v:rect id="_x0000_i1066" style="width:0;height:1.5pt" o:hralign="center" o:hrstd="t" o:hr="t" fillcolor="#a0a0a0" stroked="f"/>
         </w:pict>
       </w:r>
     </w:p>
@@ -5248,10 +5176,7 @@
     </w:p>
     <w:p>
       <w:r>
-        <w:t>Proyecto elegido →</w:t>
-      </w:r>
-      <w:r>
-        <w:t xml:space="preserve"> </w:t>
+        <w:t xml:space="preserve">Proyecto elegido → </w:t>
       </w:r>
       <w:proofErr w:type="spellStart"/>
       <w:r>
@@ -5264,10 +5189,7 @@
     </w:p>
     <w:p>
       <w:r>
-        <w:t>Por qué →</w:t>
-      </w:r>
-      <w:r>
-        <w:t xml:space="preserve"> Buena cantidad de conceptos a aplicar de los aprendidos</w:t>
+        <w:t>Por qué → Buena cantidad de conceptos a aplicar de los aprendidos</w:t>
       </w:r>
       <w:r>
         <w:t>,</w:t>
@@ -5284,10 +5206,7 @@
     </w:p>
     <w:p>
       <w:r>
-        <w:t>Arquitectura básica →</w:t>
-      </w:r>
-      <w:r>
-        <w:t xml:space="preserve"> </w:t>
+        <w:t xml:space="preserve">Arquitectura básica → </w:t>
       </w:r>
     </w:p>
     <w:p>
@@ -5428,6 +5347,1661 @@
       </w:r>
     </w:p>
     <w:p/>
+    <w:p>
+      <w:pPr>
+        <w:rPr>
+          <w:b/>
+          <w:bCs/>
+          <w:sz w:val="36"/>
+          <w:szCs w:val="36"/>
+          <w:u w:val="single"/>
+        </w:rPr>
+      </w:pPr>
+      <w:proofErr w:type="spellStart"/>
+      <w:r>
+        <w:rPr>
+          <w:b/>
+          <w:bCs/>
+          <w:sz w:val="36"/>
+          <w:szCs w:val="36"/>
+          <w:u w:val="single"/>
+        </w:rPr>
+        <w:t>Roadmap</w:t>
+      </w:r>
+      <w:proofErr w:type="spellEnd"/>
+      <w:r>
+        <w:rPr>
+          <w:b/>
+          <w:bCs/>
+          <w:sz w:val="36"/>
+          <w:szCs w:val="36"/>
+          <w:u w:val="single"/>
+        </w:rPr>
+        <w:t xml:space="preserve"> del proyecto (CV </w:t>
+      </w:r>
+      <w:proofErr w:type="spellStart"/>
+      <w:r>
+        <w:rPr>
+          <w:b/>
+          <w:bCs/>
+          <w:sz w:val="36"/>
+          <w:szCs w:val="36"/>
+          <w:u w:val="single"/>
+        </w:rPr>
+        <w:t>Analyzer</w:t>
+      </w:r>
+      <w:proofErr w:type="spellEnd"/>
+      <w:r>
+        <w:rPr>
+          <w:b/>
+          <w:bCs/>
+          <w:sz w:val="36"/>
+          <w:szCs w:val="36"/>
+          <w:u w:val="single"/>
+        </w:rPr>
+        <w:t>)</w:t>
+      </w:r>
+    </w:p>
+    <w:p>
+      <w:pPr>
+        <w:rPr>
+          <w:rFonts w:cstheme="minorHAnsi"/>
+          <w:b/>
+          <w:bCs/>
+          <w:sz w:val="28"/>
+          <w:szCs w:val="28"/>
+          <w:u w:val="single"/>
+        </w:rPr>
+      </w:pPr>
+      <w:r>
+        <w:rPr>
+          <w:rFonts w:ascii="Segoe UI Emoji" w:hAnsi="Segoe UI Emoji" w:cs="Segoe UI Emoji"/>
+          <w:b/>
+          <w:bCs/>
+          <w:sz w:val="28"/>
+          <w:szCs w:val="28"/>
+          <w:u w:val="single"/>
+        </w:rPr>
+        <w:t>🎯</w:t>
+      </w:r>
+      <w:r>
+        <w:rPr>
+          <w:rFonts w:cstheme="minorHAnsi"/>
+          <w:b/>
+          <w:bCs/>
+          <w:sz w:val="28"/>
+          <w:szCs w:val="28"/>
+          <w:u w:val="single"/>
+        </w:rPr>
+        <w:t xml:space="preserve"> Objetivo</w:t>
+      </w:r>
+    </w:p>
+    <w:p>
+      <w:r>
+        <w:t>Convertir tu proyecto en:</w:t>
+      </w:r>
+    </w:p>
+    <w:p>
+      <w:r>
+        <w:rPr>
+          <w:b/>
+          <w:bCs/>
+        </w:rPr>
+        <w:t xml:space="preserve">pasos concretos que </w:t>
+      </w:r>
+      <w:proofErr w:type="spellStart"/>
+      <w:r>
+        <w:rPr>
+          <w:b/>
+          <w:bCs/>
+        </w:rPr>
+        <w:t>podés</w:t>
+      </w:r>
+      <w:proofErr w:type="spellEnd"/>
+      <w:r>
+        <w:rPr>
+          <w:b/>
+          <w:bCs/>
+        </w:rPr>
+        <w:t xml:space="preserve"> ejecutar sin perderte</w:t>
+      </w:r>
+    </w:p>
+    <w:p>
+      <w:r>
+        <w:pict w14:anchorId="097647DE">
+          <v:rect id="_x0000_i1202" style="width:0;height:1.5pt" o:hralign="center" o:hrstd="t" o:hr="t" fillcolor="#a0a0a0" stroked="f"/>
+        </w:pict>
+      </w:r>
+    </w:p>
+    <w:p>
+      <w:pPr>
+        <w:rPr>
+          <w:rFonts w:cstheme="minorHAnsi"/>
+          <w:b/>
+          <w:bCs/>
+          <w:sz w:val="28"/>
+          <w:szCs w:val="28"/>
+          <w:u w:val="single"/>
+        </w:rPr>
+      </w:pPr>
+      <w:r>
+        <w:rPr>
+          <w:rFonts w:ascii="Segoe UI Emoji" w:hAnsi="Segoe UI Emoji" w:cs="Segoe UI Emoji"/>
+          <w:b/>
+          <w:bCs/>
+          <w:sz w:val="28"/>
+          <w:szCs w:val="28"/>
+          <w:u w:val="single"/>
+        </w:rPr>
+        <w:t>🧠</w:t>
+      </w:r>
+      <w:r>
+        <w:rPr>
+          <w:rFonts w:cstheme="minorHAnsi"/>
+          <w:b/>
+          <w:bCs/>
+          <w:sz w:val="28"/>
+          <w:szCs w:val="28"/>
+          <w:u w:val="single"/>
+        </w:rPr>
+        <w:t xml:space="preserve"> Error más común</w:t>
+      </w:r>
+    </w:p>
+    <w:p>
+      <w:r>
+        <w:t>Intentar hacer esto:</w:t>
+      </w:r>
+    </w:p>
+    <w:p>
+      <w:r>
+        <w:t xml:space="preserve">todo junto → LLM + ML + RAG + UI + </w:t>
+      </w:r>
+      <w:proofErr w:type="spellStart"/>
+      <w:r>
+        <w:t>deploy</w:t>
+      </w:r>
+      <w:proofErr w:type="spellEnd"/>
+    </w:p>
+    <w:p>
+      <w:r>
+        <w:rPr>
+          <w:rFonts w:ascii="Segoe UI Emoji" w:hAnsi="Segoe UI Emoji" w:cs="Segoe UI Emoji"/>
+        </w:rPr>
+        <w:t>👉</w:t>
+      </w:r>
+      <w:r>
+        <w:t xml:space="preserve"> Resultado: te </w:t>
+      </w:r>
+      <w:proofErr w:type="spellStart"/>
+      <w:r>
+        <w:t>trabás</w:t>
+      </w:r>
+      <w:proofErr w:type="spellEnd"/>
+      <w:r>
+        <w:t>.</w:t>
+      </w:r>
+    </w:p>
+    <w:p>
+      <w:r>
+        <w:pict w14:anchorId="19AFD4CF">
+          <v:rect id="_x0000_i1203" style="width:0;height:1.5pt" o:hralign="center" o:hrstd="t" o:hr="t" fillcolor="#a0a0a0" stroked="f"/>
+        </w:pict>
+      </w:r>
+    </w:p>
+    <w:p>
+      <w:pPr>
+        <w:rPr>
+          <w:rFonts w:cstheme="minorHAnsi"/>
+          <w:b/>
+          <w:bCs/>
+          <w:sz w:val="28"/>
+          <w:szCs w:val="28"/>
+          <w:u w:val="single"/>
+        </w:rPr>
+      </w:pPr>
+      <w:r>
+        <w:rPr>
+          <w:rFonts w:ascii="Segoe UI Emoji" w:hAnsi="Segoe UI Emoji" w:cs="Segoe UI Emoji"/>
+          <w:b/>
+          <w:bCs/>
+          <w:sz w:val="28"/>
+          <w:szCs w:val="28"/>
+          <w:u w:val="single"/>
+        </w:rPr>
+        <w:t>🧠</w:t>
+      </w:r>
+      <w:r>
+        <w:rPr>
+          <w:rFonts w:cstheme="minorHAnsi"/>
+          <w:b/>
+          <w:bCs/>
+          <w:sz w:val="28"/>
+          <w:szCs w:val="28"/>
+          <w:u w:val="single"/>
+        </w:rPr>
+        <w:t xml:space="preserve"> Regla clave</w:t>
+      </w:r>
+    </w:p>
+    <w:p>
+      <w:r>
+        <w:t>Construir en capas simples, una por vez.</w:t>
+      </w:r>
+    </w:p>
+    <w:p>
+      <w:r>
+        <w:pict w14:anchorId="0983D5C8">
+          <v:rect id="_x0000_i1204" style="width:0;height:1.5pt" o:hralign="center" o:hrstd="t" o:hr="t" fillcolor="#a0a0a0" stroked="f"/>
+        </w:pict>
+      </w:r>
+    </w:p>
+    <w:p>
+      <w:pPr>
+        <w:rPr>
+          <w:rFonts w:cstheme="minorHAnsi"/>
+          <w:b/>
+          <w:bCs/>
+          <w:sz w:val="28"/>
+          <w:szCs w:val="28"/>
+          <w:u w:val="single"/>
+        </w:rPr>
+      </w:pPr>
+      <w:r>
+        <w:rPr>
+          <w:rFonts w:ascii="Segoe UI Emoji" w:hAnsi="Segoe UI Emoji" w:cs="Segoe UI Emoji"/>
+          <w:b/>
+          <w:bCs/>
+          <w:sz w:val="28"/>
+          <w:szCs w:val="28"/>
+          <w:u w:val="single"/>
+        </w:rPr>
+        <w:t>🧱</w:t>
+      </w:r>
+      <w:r>
+        <w:rPr>
+          <w:rFonts w:cstheme="minorHAnsi"/>
+          <w:b/>
+          <w:bCs/>
+          <w:sz w:val="28"/>
+          <w:szCs w:val="28"/>
+          <w:u w:val="single"/>
+        </w:rPr>
+        <w:t xml:space="preserve"> </w:t>
+      </w:r>
+      <w:proofErr w:type="spellStart"/>
+      <w:r>
+        <w:rPr>
+          <w:rFonts w:cstheme="minorHAnsi"/>
+          <w:b/>
+          <w:bCs/>
+          <w:sz w:val="28"/>
+          <w:szCs w:val="28"/>
+          <w:u w:val="single"/>
+        </w:rPr>
+        <w:t>Roadmap</w:t>
+      </w:r>
+      <w:proofErr w:type="spellEnd"/>
+      <w:r>
+        <w:rPr>
+          <w:rFonts w:cstheme="minorHAnsi"/>
+          <w:b/>
+          <w:bCs/>
+          <w:sz w:val="28"/>
+          <w:szCs w:val="28"/>
+          <w:u w:val="single"/>
+        </w:rPr>
+        <w:t xml:space="preserve"> en 5 </w:t>
+      </w:r>
+      <w:proofErr w:type="gramStart"/>
+      <w:r>
+        <w:rPr>
+          <w:rFonts w:cstheme="minorHAnsi"/>
+          <w:b/>
+          <w:bCs/>
+          <w:sz w:val="28"/>
+          <w:szCs w:val="28"/>
+          <w:u w:val="single"/>
+        </w:rPr>
+        <w:t>fases</w:t>
+      </w:r>
+      <w:r>
+        <w:rPr>
+          <w:rFonts w:cstheme="minorHAnsi"/>
+          <w:b/>
+          <w:bCs/>
+          <w:sz w:val="28"/>
+          <w:szCs w:val="28"/>
+          <w:u w:val="single"/>
+        </w:rPr>
+        <w:t>(</w:t>
+      </w:r>
+      <w:proofErr w:type="gramEnd"/>
+      <w:r>
+        <w:rPr>
+          <w:rFonts w:cstheme="minorHAnsi"/>
+          <w:b/>
+          <w:bCs/>
+          <w:sz w:val="28"/>
+          <w:szCs w:val="28"/>
+          <w:u w:val="single"/>
+        </w:rPr>
+        <w:t>Con LL</w:t>
+      </w:r>
+      <w:r>
+        <w:rPr>
+          <w:rFonts w:cstheme="minorHAnsi"/>
+          <w:b/>
+          <w:bCs/>
+          <w:sz w:val="28"/>
+          <w:szCs w:val="28"/>
+          <w:u w:val="single"/>
+        </w:rPr>
+        <w:t>M</w:t>
+      </w:r>
+      <w:r>
+        <w:rPr>
+          <w:rFonts w:cstheme="minorHAnsi"/>
+          <w:b/>
+          <w:bCs/>
+          <w:sz w:val="28"/>
+          <w:szCs w:val="28"/>
+          <w:u w:val="single"/>
+        </w:rPr>
+        <w:t>)</w:t>
+      </w:r>
+    </w:p>
+    <w:p>
+      <w:r>
+        <w:pict w14:anchorId="21ACFF33">
+          <v:rect id="_x0000_i1205" style="width:0;height:1.5pt" o:hralign="center" o:hrstd="t" o:hr="t" fillcolor="#a0a0a0" stroked="f"/>
+        </w:pict>
+      </w:r>
+    </w:p>
+    <w:p>
+      <w:pPr>
+        <w:rPr>
+          <w:b/>
+          <w:bCs/>
+        </w:rPr>
+      </w:pPr>
+      <w:r>
+        <w:rPr>
+          <w:rFonts w:ascii="Segoe UI Emoji" w:hAnsi="Segoe UI Emoji" w:cs="Segoe UI Emoji"/>
+          <w:b/>
+          <w:bCs/>
+        </w:rPr>
+        <w:lastRenderedPageBreak/>
+        <w:t>🔹</w:t>
+      </w:r>
+      <w:r>
+        <w:rPr>
+          <w:b/>
+          <w:bCs/>
+        </w:rPr>
+        <w:t xml:space="preserve"> Fase 1 — Leer y mostrar </w:t>
+      </w:r>
+      <w:proofErr w:type="spellStart"/>
+      <w:r>
+        <w:rPr>
+          <w:b/>
+          <w:bCs/>
+        </w:rPr>
+        <w:t>CVs</w:t>
+      </w:r>
+      <w:proofErr w:type="spellEnd"/>
+      <w:r>
+        <w:rPr>
+          <w:b/>
+          <w:bCs/>
+        </w:rPr>
+        <w:t xml:space="preserve"> (base)</w:t>
+      </w:r>
+    </w:p>
+    <w:p>
+      <w:r>
+        <w:t>Objetivo:</w:t>
+      </w:r>
+    </w:p>
+    <w:p>
+      <w:pPr>
+        <w:numPr>
+          <w:ilvl w:val="0"/>
+          <w:numId w:val="37"/>
+        </w:numPr>
+      </w:pPr>
+      <w:r>
+        <w:t xml:space="preserve">cargar </w:t>
+      </w:r>
+      <w:proofErr w:type="spellStart"/>
+      <w:r>
+        <w:t>CVs</w:t>
+      </w:r>
+      <w:proofErr w:type="spellEnd"/>
+      <w:r>
+        <w:t xml:space="preserve"> (PDF o texto) </w:t>
+      </w:r>
+    </w:p>
+    <w:p>
+      <w:pPr>
+        <w:numPr>
+          <w:ilvl w:val="0"/>
+          <w:numId w:val="37"/>
+        </w:numPr>
+      </w:pPr>
+      <w:r>
+        <w:t xml:space="preserve">mostrar el contenido </w:t>
+      </w:r>
+    </w:p>
+    <w:p>
+      <w:r>
+        <w:t>Nada de IA todavía.</w:t>
+      </w:r>
+    </w:p>
+    <w:p>
+      <w:r>
+        <w:t>Ejemplo:</w:t>
+      </w:r>
+    </w:p>
+    <w:p>
+      <w:pPr>
+        <w:rPr>
+          <w:lang w:val="en-US"/>
+        </w:rPr>
+      </w:pPr>
+      <w:r>
+        <w:rPr>
+          <w:lang w:val="en-US"/>
+        </w:rPr>
+        <w:t>Input: CV.pdf</w:t>
+      </w:r>
+      <w:r>
+        <w:rPr>
+          <w:lang w:val="en-US"/>
+        </w:rPr>
+        <w:br/>
+        <w:t xml:space="preserve">Output: </w:t>
+      </w:r>
+      <w:proofErr w:type="spellStart"/>
+      <w:r>
+        <w:rPr>
+          <w:lang w:val="en-US"/>
+        </w:rPr>
+        <w:t>texto</w:t>
+      </w:r>
+      <w:proofErr w:type="spellEnd"/>
+      <w:r>
+        <w:rPr>
+          <w:lang w:val="en-US"/>
+        </w:rPr>
+        <w:t xml:space="preserve"> del CV</w:t>
+      </w:r>
+    </w:p>
+    <w:p>
+      <w:r>
+        <w:rPr>
+          <w:rFonts w:ascii="Segoe UI Emoji" w:hAnsi="Segoe UI Emoji" w:cs="Segoe UI Emoji"/>
+        </w:rPr>
+        <w:t>📌</w:t>
+      </w:r>
+      <w:r>
+        <w:t xml:space="preserve"> Esto asegura que el pipeline empieza bien.</w:t>
+      </w:r>
+    </w:p>
+    <w:p>
+      <w:r>
+        <w:pict w14:anchorId="04C6FB15">
+          <v:rect id="_x0000_i1206" style="width:0;height:1.5pt" o:hralign="center" o:hrstd="t" o:hr="t" fillcolor="#a0a0a0" stroked="f"/>
+        </w:pict>
+      </w:r>
+    </w:p>
+    <w:p>
+      <w:pPr>
+        <w:rPr>
+          <w:b/>
+          <w:bCs/>
+        </w:rPr>
+      </w:pPr>
+      <w:r>
+        <w:rPr>
+          <w:rFonts w:ascii="Segoe UI Emoji" w:hAnsi="Segoe UI Emoji" w:cs="Segoe UI Emoji"/>
+          <w:b/>
+          <w:bCs/>
+        </w:rPr>
+        <w:t>🔹</w:t>
+      </w:r>
+      <w:r>
+        <w:rPr>
+          <w:b/>
+          <w:bCs/>
+        </w:rPr>
+        <w:t xml:space="preserve"> Fase 2 — Extracción con LLM (sin ML)</w:t>
+      </w:r>
+    </w:p>
+    <w:p>
+      <w:r>
+        <w:t>Objetivo:</w:t>
+      </w:r>
+    </w:p>
+    <w:p>
+      <w:pPr>
+        <w:numPr>
+          <w:ilvl w:val="0"/>
+          <w:numId w:val="38"/>
+        </w:numPr>
+      </w:pPr>
+      <w:r>
+        <w:t xml:space="preserve">extraer </w:t>
+      </w:r>
+      <w:proofErr w:type="spellStart"/>
+      <w:r>
+        <w:t>info</w:t>
+      </w:r>
+      <w:proofErr w:type="spellEnd"/>
+      <w:r>
+        <w:t xml:space="preserve"> clave: </w:t>
+      </w:r>
+    </w:p>
+    <w:p>
+      <w:r>
+        <w:t>nombre</w:t>
+      </w:r>
+      <w:r>
+        <w:br/>
+      </w:r>
+      <w:proofErr w:type="spellStart"/>
+      <w:r>
+        <w:t>skills</w:t>
+      </w:r>
+      <w:proofErr w:type="spellEnd"/>
+      <w:r>
+        <w:br/>
+        <w:t>años de experiencia</w:t>
+      </w:r>
+      <w:r>
+        <w:br/>
+        <w:t>educación</w:t>
+      </w:r>
+    </w:p>
+    <w:p>
+      <w:r>
+        <w:t>Ejemplo output:</w:t>
+      </w:r>
+    </w:p>
+    <w:p>
+      <w:r>
+        <w:t>{</w:t>
+      </w:r>
+      <w:r>
+        <w:br/>
+        <w:t xml:space="preserve">  "nombre": "Juan",</w:t>
+      </w:r>
+      <w:r>
+        <w:br/>
+        <w:t xml:space="preserve">  "</w:t>
+      </w:r>
+      <w:proofErr w:type="spellStart"/>
+      <w:r>
+        <w:t>skills</w:t>
+      </w:r>
+      <w:proofErr w:type="spellEnd"/>
+      <w:r>
+        <w:t>": ["Python", "SQL"],</w:t>
+      </w:r>
+      <w:r>
+        <w:br/>
+        <w:t xml:space="preserve">  "experiencia": 3</w:t>
+      </w:r>
+      <w:r>
+        <w:br/>
+        <w:t>}</w:t>
+      </w:r>
+    </w:p>
+    <w:p>
+      <w:r>
+        <w:rPr>
+          <w:rFonts w:ascii="Segoe UI Emoji" w:hAnsi="Segoe UI Emoji" w:cs="Segoe UI Emoji"/>
+        </w:rPr>
+        <w:t>📌</w:t>
+      </w:r>
+      <w:r>
+        <w:t xml:space="preserve"> Ya empieza a parecer IA.</w:t>
+      </w:r>
+    </w:p>
+    <w:p>
+      <w:r>
+        <w:pict w14:anchorId="609B06E7">
+          <v:rect id="_x0000_i1207" style="width:0;height:1.5pt" o:hralign="center" o:hrstd="t" o:hr="t" fillcolor="#a0a0a0" stroked="f"/>
+        </w:pict>
+      </w:r>
+    </w:p>
+    <w:p>
+      <w:pPr>
+        <w:rPr>
+          <w:b/>
+          <w:bCs/>
+        </w:rPr>
+      </w:pPr>
+      <w:r>
+        <w:rPr>
+          <w:rFonts w:ascii="Segoe UI Emoji" w:hAnsi="Segoe UI Emoji" w:cs="Segoe UI Emoji"/>
+          <w:b/>
+          <w:bCs/>
+        </w:rPr>
+        <w:t>🔹</w:t>
+      </w:r>
+      <w:r>
+        <w:rPr>
+          <w:b/>
+          <w:bCs/>
+        </w:rPr>
+        <w:t xml:space="preserve"> Fase 3 — </w:t>
+      </w:r>
+      <w:proofErr w:type="spellStart"/>
+      <w:r>
+        <w:rPr>
+          <w:b/>
+          <w:bCs/>
+        </w:rPr>
+        <w:t>Scoring</w:t>
+      </w:r>
+      <w:proofErr w:type="spellEnd"/>
+      <w:r>
+        <w:rPr>
+          <w:b/>
+          <w:bCs/>
+        </w:rPr>
+        <w:t xml:space="preserve"> simple (sin ML todavía)</w:t>
+      </w:r>
+    </w:p>
+    <w:p>
+      <w:r>
+        <w:t>Antes de ML real:</w:t>
+      </w:r>
+    </w:p>
+    <w:p>
+      <w:pPr>
+        <w:numPr>
+          <w:ilvl w:val="0"/>
+          <w:numId w:val="39"/>
+        </w:numPr>
+      </w:pPr>
+      <w:r>
+        <w:t xml:space="preserve">reglas simples </w:t>
+      </w:r>
+    </w:p>
+    <w:p>
+      <w:r>
+        <w:t>Ejemplo:</w:t>
+      </w:r>
+    </w:p>
+    <w:p>
+      <w:r>
+        <w:t>+2 si tiene Python</w:t>
+      </w:r>
+      <w:r>
+        <w:br/>
+        <w:t>+1 si tiene SQL</w:t>
+      </w:r>
+      <w:r>
+        <w:br/>
+        <w:t>+1 si experiencia &gt; 2 años</w:t>
+      </w:r>
+    </w:p>
+    <w:p>
+      <w:r>
+        <w:rPr>
+          <w:rFonts w:ascii="Segoe UI Emoji" w:hAnsi="Segoe UI Emoji" w:cs="Segoe UI Emoji"/>
+        </w:rPr>
+        <w:t>📌</w:t>
+      </w:r>
+      <w:r>
+        <w:t xml:space="preserve"> Esto te permite validar lógica sin complejidad.</w:t>
+      </w:r>
+    </w:p>
+    <w:p>
+      <w:r>
+        <w:pict w14:anchorId="3664C78D">
+          <v:rect id="_x0000_i1208" style="width:0;height:1.5pt" o:hralign="center" o:hrstd="t" o:hr="t" fillcolor="#a0a0a0" stroked="f"/>
+        </w:pict>
+      </w:r>
+    </w:p>
+    <w:p>
+      <w:pPr>
+        <w:rPr>
+          <w:b/>
+          <w:bCs/>
+        </w:rPr>
+      </w:pPr>
+      <w:r>
+        <w:rPr>
+          <w:rFonts w:ascii="Segoe UI Emoji" w:hAnsi="Segoe UI Emoji" w:cs="Segoe UI Emoji"/>
+          <w:b/>
+          <w:bCs/>
+        </w:rPr>
+        <w:lastRenderedPageBreak/>
+        <w:t>🔹</w:t>
+      </w:r>
+      <w:r>
+        <w:rPr>
+          <w:b/>
+          <w:bCs/>
+        </w:rPr>
+        <w:t xml:space="preserve"> Fase 4 — Ranking</w:t>
+      </w:r>
+    </w:p>
+    <w:p>
+      <w:pPr>
+        <w:numPr>
+          <w:ilvl w:val="0"/>
+          <w:numId w:val="40"/>
+        </w:numPr>
+      </w:pPr>
+      <w:r>
+        <w:t xml:space="preserve">ordenar candidatos por score </w:t>
+      </w:r>
+    </w:p>
+    <w:p>
+      <w:r>
+        <w:t>Ejemplo:</w:t>
+      </w:r>
+    </w:p>
+    <w:p>
+      <w:r>
+        <w:t>1. Juan → 5 puntos</w:t>
+      </w:r>
+      <w:r>
+        <w:br/>
+        <w:t>2. Ana → 3 puntos</w:t>
+      </w:r>
+    </w:p>
+    <w:p>
+      <w:r>
+        <w:rPr>
+          <w:rFonts w:ascii="Segoe UI Emoji" w:hAnsi="Segoe UI Emoji" w:cs="Segoe UI Emoji"/>
+        </w:rPr>
+        <w:t>📌</w:t>
+      </w:r>
+      <w:r>
+        <w:t xml:space="preserve"> Ya </w:t>
+      </w:r>
+      <w:proofErr w:type="spellStart"/>
+      <w:r>
+        <w:t>tenés</w:t>
+      </w:r>
+      <w:proofErr w:type="spellEnd"/>
+      <w:r>
+        <w:t xml:space="preserve"> un sistema funcional.</w:t>
+      </w:r>
+    </w:p>
+    <w:p>
+      <w:r>
+        <w:pict w14:anchorId="53483AD2">
+          <v:rect id="_x0000_i1209" style="width:0;height:1.5pt" o:hralign="center" o:hrstd="t" o:hr="t" fillcolor="#a0a0a0" stroked="f"/>
+        </w:pict>
+      </w:r>
+    </w:p>
+    <w:p>
+      <w:pPr>
+        <w:rPr>
+          <w:b/>
+          <w:bCs/>
+        </w:rPr>
+      </w:pPr>
+      <w:r>
+        <w:rPr>
+          <w:rFonts w:ascii="Segoe UI Emoji" w:hAnsi="Segoe UI Emoji" w:cs="Segoe UI Emoji"/>
+          <w:b/>
+          <w:bCs/>
+        </w:rPr>
+        <w:t>🔹</w:t>
+      </w:r>
+      <w:r>
+        <w:rPr>
+          <w:b/>
+          <w:bCs/>
+        </w:rPr>
+        <w:t xml:space="preserve"> Fase 5 — Explicación con LLM</w:t>
+      </w:r>
+    </w:p>
+    <w:p>
+      <w:pPr>
+        <w:numPr>
+          <w:ilvl w:val="0"/>
+          <w:numId w:val="41"/>
+        </w:numPr>
+      </w:pPr>
+      <w:r>
+        <w:t xml:space="preserve">explicar por qué alguien es bueno </w:t>
+      </w:r>
+    </w:p>
+    <w:p>
+      <w:r>
+        <w:t>Ejemplo:</w:t>
+      </w:r>
+    </w:p>
+    <w:p>
+      <w:r>
+        <w:t xml:space="preserve">"Juan es buen candidato porque tiene experiencia en Python y </w:t>
+      </w:r>
+      <w:proofErr w:type="gramStart"/>
+      <w:r>
+        <w:t>ML...</w:t>
+      </w:r>
+      <w:proofErr w:type="gramEnd"/>
+      <w:r>
+        <w:t>"</w:t>
+      </w:r>
+    </w:p>
+    <w:p>
+      <w:r>
+        <w:pict w14:anchorId="150578E3">
+          <v:rect id="_x0000_i1210" style="width:0;height:1.5pt" o:hralign="center" o:hrstd="t" o:hr="t" fillcolor="#a0a0a0" stroked="f"/>
+        </w:pict>
+      </w:r>
+    </w:p>
+    <w:p>
+      <w:pPr>
+        <w:rPr>
+          <w:rFonts w:cstheme="minorHAnsi"/>
+          <w:b/>
+          <w:bCs/>
+          <w:sz w:val="28"/>
+          <w:szCs w:val="28"/>
+          <w:u w:val="single"/>
+        </w:rPr>
+      </w:pPr>
+      <w:r>
+        <w:rPr>
+          <w:rFonts w:ascii="Segoe UI Emoji" w:hAnsi="Segoe UI Emoji" w:cs="Segoe UI Emoji"/>
+          <w:b/>
+          <w:bCs/>
+          <w:sz w:val="28"/>
+          <w:szCs w:val="28"/>
+          <w:u w:val="single"/>
+        </w:rPr>
+        <w:t>🧱</w:t>
+      </w:r>
+      <w:r>
+        <w:rPr>
+          <w:rFonts w:cstheme="minorHAnsi"/>
+          <w:b/>
+          <w:bCs/>
+          <w:sz w:val="28"/>
+          <w:szCs w:val="28"/>
+          <w:u w:val="single"/>
+        </w:rPr>
+        <w:t xml:space="preserve"> </w:t>
+      </w:r>
+      <w:proofErr w:type="spellStart"/>
+      <w:r>
+        <w:rPr>
+          <w:rFonts w:cstheme="minorHAnsi"/>
+          <w:b/>
+          <w:bCs/>
+          <w:sz w:val="28"/>
+          <w:szCs w:val="28"/>
+          <w:u w:val="single"/>
+        </w:rPr>
+        <w:t>Roadmap</w:t>
+      </w:r>
+      <w:proofErr w:type="spellEnd"/>
+      <w:r>
+        <w:rPr>
+          <w:rFonts w:cstheme="minorHAnsi"/>
+          <w:b/>
+          <w:bCs/>
+          <w:sz w:val="28"/>
+          <w:szCs w:val="28"/>
+          <w:u w:val="single"/>
+        </w:rPr>
+        <w:t xml:space="preserve"> en 5 </w:t>
+      </w:r>
+      <w:proofErr w:type="gramStart"/>
+      <w:r>
+        <w:rPr>
+          <w:rFonts w:cstheme="minorHAnsi"/>
+          <w:b/>
+          <w:bCs/>
+          <w:sz w:val="28"/>
+          <w:szCs w:val="28"/>
+          <w:u w:val="single"/>
+        </w:rPr>
+        <w:t>fases</w:t>
+      </w:r>
+      <w:r>
+        <w:rPr>
+          <w:rFonts w:cstheme="minorHAnsi"/>
+          <w:b/>
+          <w:bCs/>
+          <w:sz w:val="28"/>
+          <w:szCs w:val="28"/>
+          <w:u w:val="single"/>
+        </w:rPr>
+        <w:t>(</w:t>
+      </w:r>
+      <w:proofErr w:type="gramEnd"/>
+      <w:r>
+        <w:rPr>
+          <w:rFonts w:cstheme="minorHAnsi"/>
+          <w:b/>
+          <w:bCs/>
+          <w:sz w:val="28"/>
+          <w:szCs w:val="28"/>
+          <w:u w:val="single"/>
+        </w:rPr>
+        <w:t>Sin</w:t>
+      </w:r>
+      <w:r>
+        <w:rPr>
+          <w:rFonts w:cstheme="minorHAnsi"/>
+          <w:b/>
+          <w:bCs/>
+          <w:sz w:val="28"/>
+          <w:szCs w:val="28"/>
+          <w:u w:val="single"/>
+        </w:rPr>
+        <w:t xml:space="preserve"> LLM)</w:t>
+      </w:r>
+    </w:p>
+    <w:p>
+      <w:pPr>
+        <w:rPr>
+          <w:rFonts w:cstheme="minorHAnsi"/>
+        </w:rPr>
+      </w:pPr>
+      <w:r>
+        <w:rPr>
+          <w:rFonts w:ascii="Segoe UI Emoji" w:hAnsi="Segoe UI Emoji" w:cs="Segoe UI Emoji"/>
+        </w:rPr>
+        <w:t>🔹</w:t>
+      </w:r>
+      <w:r>
+        <w:rPr>
+          <w:rFonts w:cstheme="minorHAnsi"/>
+        </w:rPr>
+        <w:t xml:space="preserve"> Fase 1 — Leer </w:t>
+      </w:r>
+      <w:proofErr w:type="spellStart"/>
+      <w:r>
+        <w:rPr>
+          <w:rFonts w:cstheme="minorHAnsi"/>
+        </w:rPr>
+        <w:t>CVs</w:t>
+      </w:r>
+      <w:proofErr w:type="spellEnd"/>
+    </w:p>
+    <w:p>
+      <w:pPr>
+        <w:rPr>
+          <w:rFonts w:cstheme="minorHAnsi"/>
+        </w:rPr>
+      </w:pPr>
+      <w:r>
+        <w:rPr>
+          <w:rFonts w:cstheme="minorHAnsi"/>
+        </w:rPr>
+        <w:t>Igual que antes.</w:t>
+      </w:r>
+      <w:r>
+        <w:rPr>
+          <w:rFonts w:cstheme="minorHAnsi"/>
+        </w:rPr>
+        <w:br/>
+        <w:t>Sin cambios.</w:t>
+      </w:r>
+    </w:p>
+    <w:p>
+      <w:pPr>
+        <w:rPr>
+          <w:rFonts w:cstheme="minorHAnsi"/>
+        </w:rPr>
+      </w:pPr>
+      <w:r>
+        <w:rPr>
+          <w:rFonts w:cstheme="minorHAnsi"/>
+        </w:rPr>
+        <w:pict w14:anchorId="06BBE5C7">
+          <v:rect id="_x0000_i1292" style="width:0;height:1.5pt" o:hralign="center" o:hrstd="t" o:hr="t" fillcolor="#a0a0a0" stroked="f"/>
+        </w:pict>
+      </w:r>
+    </w:p>
+    <w:p>
+      <w:pPr>
+        <w:rPr>
+          <w:rFonts w:cstheme="minorHAnsi"/>
+        </w:rPr>
+      </w:pPr>
+      <w:r>
+        <w:rPr>
+          <w:rFonts w:ascii="Segoe UI Emoji" w:hAnsi="Segoe UI Emoji" w:cs="Segoe UI Emoji"/>
+        </w:rPr>
+        <w:t>🔹</w:t>
+      </w:r>
+      <w:r>
+        <w:rPr>
+          <w:rFonts w:cstheme="minorHAnsi"/>
+        </w:rPr>
+        <w:t xml:space="preserve"> Fase 2 — Extracción simple sin LLM</w:t>
+      </w:r>
+    </w:p>
+    <w:p>
+      <w:pPr>
+        <w:rPr>
+          <w:rFonts w:cstheme="minorHAnsi"/>
+        </w:rPr>
+      </w:pPr>
+      <w:r>
+        <w:rPr>
+          <w:rFonts w:cstheme="minorHAnsi"/>
+        </w:rPr>
+        <w:t>En vez de LLM real, hacemos:</w:t>
+      </w:r>
+    </w:p>
+    <w:p>
+      <w:pPr>
+        <w:numPr>
+          <w:ilvl w:val="0"/>
+          <w:numId w:val="43"/>
+        </w:numPr>
+        <w:rPr>
+          <w:rFonts w:cstheme="minorHAnsi"/>
+        </w:rPr>
+      </w:pPr>
+      <w:proofErr w:type="spellStart"/>
+      <w:r>
+        <w:rPr>
+          <w:rFonts w:cstheme="minorHAnsi"/>
+        </w:rPr>
+        <w:t>regex</w:t>
+      </w:r>
+      <w:proofErr w:type="spellEnd"/>
+      <w:r>
+        <w:rPr>
+          <w:rFonts w:cstheme="minorHAnsi"/>
+        </w:rPr>
+        <w:t xml:space="preserve"> </w:t>
+      </w:r>
+    </w:p>
+    <w:p>
+      <w:pPr>
+        <w:numPr>
+          <w:ilvl w:val="0"/>
+          <w:numId w:val="43"/>
+        </w:numPr>
+        <w:rPr>
+          <w:rFonts w:cstheme="minorHAnsi"/>
+        </w:rPr>
+      </w:pPr>
+      <w:r>
+        <w:rPr>
+          <w:rFonts w:cstheme="minorHAnsi"/>
+        </w:rPr>
+        <w:t xml:space="preserve">búsqueda por palabras clave </w:t>
+      </w:r>
+    </w:p>
+    <w:p>
+      <w:pPr>
+        <w:numPr>
+          <w:ilvl w:val="0"/>
+          <w:numId w:val="43"/>
+        </w:numPr>
+        <w:rPr>
+          <w:rFonts w:cstheme="minorHAnsi"/>
+        </w:rPr>
+      </w:pPr>
+      <w:r>
+        <w:rPr>
+          <w:rFonts w:cstheme="minorHAnsi"/>
+        </w:rPr>
+        <w:t xml:space="preserve">reglas básicas </w:t>
+      </w:r>
+    </w:p>
+    <w:p>
+      <w:pPr>
+        <w:rPr>
+          <w:rFonts w:cstheme="minorHAnsi"/>
+        </w:rPr>
+      </w:pPr>
+      <w:r>
+        <w:rPr>
+          <w:rFonts w:cstheme="minorHAnsi"/>
+        </w:rPr>
+        <w:t>Ejemplo:</w:t>
+      </w:r>
+    </w:p>
+    <w:p>
+      <w:pPr>
+        <w:numPr>
+          <w:ilvl w:val="0"/>
+          <w:numId w:val="44"/>
+        </w:numPr>
+        <w:rPr>
+          <w:rFonts w:cstheme="minorHAnsi"/>
+        </w:rPr>
+      </w:pPr>
+      <w:r>
+        <w:rPr>
+          <w:rFonts w:cstheme="minorHAnsi"/>
+        </w:rPr>
+        <w:t xml:space="preserve">detectar “Python” </w:t>
+      </w:r>
+    </w:p>
+    <w:p>
+      <w:pPr>
+        <w:numPr>
+          <w:ilvl w:val="0"/>
+          <w:numId w:val="44"/>
+        </w:numPr>
+        <w:rPr>
+          <w:rFonts w:cstheme="minorHAnsi"/>
+        </w:rPr>
+      </w:pPr>
+      <w:r>
+        <w:rPr>
+          <w:rFonts w:cstheme="minorHAnsi"/>
+        </w:rPr>
+        <w:t xml:space="preserve">detectar “SQL” </w:t>
+      </w:r>
+    </w:p>
+    <w:p>
+      <w:pPr>
+        <w:numPr>
+          <w:ilvl w:val="0"/>
+          <w:numId w:val="44"/>
+        </w:numPr>
+        <w:rPr>
+          <w:rFonts w:cstheme="minorHAnsi"/>
+        </w:rPr>
+      </w:pPr>
+      <w:r>
+        <w:rPr>
+          <w:rFonts w:cstheme="minorHAnsi"/>
+        </w:rPr>
+        <w:t xml:space="preserve">detectar “3 años” </w:t>
+      </w:r>
+    </w:p>
+    <w:p>
+      <w:pPr>
+        <w:numPr>
+          <w:ilvl w:val="0"/>
+          <w:numId w:val="44"/>
+        </w:numPr>
+        <w:rPr>
+          <w:rFonts w:cstheme="minorHAnsi"/>
+        </w:rPr>
+      </w:pPr>
+      <w:r>
+        <w:rPr>
+          <w:rFonts w:cstheme="minorHAnsi"/>
+        </w:rPr>
+        <w:t xml:space="preserve">detectar “Ingeniería” </w:t>
+      </w:r>
+    </w:p>
+    <w:p>
+      <w:pPr>
+        <w:rPr>
+          <w:rFonts w:cstheme="minorHAnsi"/>
+        </w:rPr>
+      </w:pPr>
+      <w:r>
+        <w:rPr>
+          <w:rFonts w:cstheme="minorHAnsi"/>
+        </w:rPr>
+        <w:t>No es perfecto, pero:</w:t>
+      </w:r>
+    </w:p>
+    <w:p>
+      <w:pPr>
+        <w:numPr>
+          <w:ilvl w:val="0"/>
+          <w:numId w:val="45"/>
+        </w:numPr>
+        <w:rPr>
+          <w:rFonts w:cstheme="minorHAnsi"/>
+        </w:rPr>
+      </w:pPr>
+      <w:r>
+        <w:rPr>
+          <w:rFonts w:cstheme="minorHAnsi"/>
+        </w:rPr>
+        <w:t xml:space="preserve">funciona </w:t>
+      </w:r>
+    </w:p>
+    <w:p>
+      <w:pPr>
+        <w:numPr>
+          <w:ilvl w:val="0"/>
+          <w:numId w:val="45"/>
+        </w:numPr>
+        <w:rPr>
+          <w:rFonts w:cstheme="minorHAnsi"/>
+        </w:rPr>
+      </w:pPr>
+      <w:r>
+        <w:rPr>
+          <w:rFonts w:cstheme="minorHAnsi"/>
+        </w:rPr>
+        <w:t xml:space="preserve">es gratis </w:t>
+      </w:r>
+    </w:p>
+    <w:p>
+      <w:pPr>
+        <w:numPr>
+          <w:ilvl w:val="0"/>
+          <w:numId w:val="45"/>
+        </w:numPr>
+        <w:rPr>
+          <w:rFonts w:cstheme="minorHAnsi"/>
+        </w:rPr>
+      </w:pPr>
+      <w:r>
+        <w:rPr>
+          <w:rFonts w:cstheme="minorHAnsi"/>
+        </w:rPr>
+        <w:t xml:space="preserve">te deja avanzar </w:t>
+      </w:r>
+    </w:p>
+    <w:p>
+      <w:pPr>
+        <w:rPr>
+          <w:rFonts w:cstheme="minorHAnsi"/>
+        </w:rPr>
+      </w:pPr>
+      <w:r>
+        <w:rPr>
+          <w:rFonts w:ascii="Segoe UI Emoji" w:hAnsi="Segoe UI Emoji" w:cs="Segoe UI Emoji"/>
+        </w:rPr>
+        <w:lastRenderedPageBreak/>
+        <w:t>👉</w:t>
+      </w:r>
+      <w:r>
+        <w:rPr>
+          <w:rFonts w:cstheme="minorHAnsi"/>
+        </w:rPr>
+        <w:t xml:space="preserve"> Esto reemplaza temporalmente la extracción con LLM.</w:t>
+      </w:r>
+    </w:p>
+    <w:p>
+      <w:pPr>
+        <w:rPr>
+          <w:rFonts w:cstheme="minorHAnsi"/>
+        </w:rPr>
+      </w:pPr>
+      <w:r>
+        <w:rPr>
+          <w:rFonts w:cstheme="minorHAnsi"/>
+        </w:rPr>
+        <w:pict w14:anchorId="716AC467">
+          <v:rect id="_x0000_i1293" style="width:0;height:1.5pt" o:hralign="center" o:hrstd="t" o:hr="t" fillcolor="#a0a0a0" stroked="f"/>
+        </w:pict>
+      </w:r>
+    </w:p>
+    <w:p>
+      <w:pPr>
+        <w:rPr>
+          <w:rFonts w:cstheme="minorHAnsi"/>
+        </w:rPr>
+      </w:pPr>
+      <w:r>
+        <w:rPr>
+          <w:rFonts w:ascii="Segoe UI Emoji" w:hAnsi="Segoe UI Emoji" w:cs="Segoe UI Emoji"/>
+        </w:rPr>
+        <w:t>🔹</w:t>
+      </w:r>
+      <w:r>
+        <w:rPr>
+          <w:rFonts w:cstheme="minorHAnsi"/>
+        </w:rPr>
+        <w:t xml:space="preserve"> Fase 3 — </w:t>
+      </w:r>
+      <w:proofErr w:type="spellStart"/>
+      <w:r>
+        <w:rPr>
+          <w:rFonts w:cstheme="minorHAnsi"/>
+        </w:rPr>
+        <w:t>Scoring</w:t>
+      </w:r>
+      <w:proofErr w:type="spellEnd"/>
+    </w:p>
+    <w:p>
+      <w:pPr>
+        <w:rPr>
+          <w:rFonts w:cstheme="minorHAnsi"/>
+        </w:rPr>
+      </w:pPr>
+      <w:r>
+        <w:rPr>
+          <w:rFonts w:cstheme="minorHAnsi"/>
+        </w:rPr>
+        <w:t>Igual que antes:</w:t>
+      </w:r>
+    </w:p>
+    <w:p>
+      <w:pPr>
+        <w:numPr>
+          <w:ilvl w:val="0"/>
+          <w:numId w:val="46"/>
+        </w:numPr>
+        <w:rPr>
+          <w:rFonts w:cstheme="minorHAnsi"/>
+        </w:rPr>
+      </w:pPr>
+      <w:r>
+        <w:rPr>
+          <w:rFonts w:cstheme="minorHAnsi"/>
+        </w:rPr>
+        <w:t xml:space="preserve">reglas simples </w:t>
+      </w:r>
+    </w:p>
+    <w:p>
+      <w:pPr>
+        <w:numPr>
+          <w:ilvl w:val="0"/>
+          <w:numId w:val="46"/>
+        </w:numPr>
+        <w:rPr>
+          <w:rFonts w:cstheme="minorHAnsi"/>
+        </w:rPr>
+      </w:pPr>
+      <w:r>
+        <w:rPr>
+          <w:rFonts w:cstheme="minorHAnsi"/>
+        </w:rPr>
+        <w:t xml:space="preserve">suma de puntos </w:t>
+      </w:r>
+    </w:p>
+    <w:p>
+      <w:pPr>
+        <w:rPr>
+          <w:rFonts w:cstheme="minorHAnsi"/>
+        </w:rPr>
+      </w:pPr>
+      <w:r>
+        <w:rPr>
+          <w:rFonts w:cstheme="minorHAnsi"/>
+        </w:rPr>
+        <w:pict w14:anchorId="27FD9DB4">
+          <v:rect id="_x0000_i1294" style="width:0;height:1.5pt" o:hralign="center" o:hrstd="t" o:hr="t" fillcolor="#a0a0a0" stroked="f"/>
+        </w:pict>
+      </w:r>
+    </w:p>
+    <w:p>
+      <w:pPr>
+        <w:rPr>
+          <w:rFonts w:cstheme="minorHAnsi"/>
+        </w:rPr>
+      </w:pPr>
+      <w:r>
+        <w:rPr>
+          <w:rFonts w:ascii="Segoe UI Emoji" w:hAnsi="Segoe UI Emoji" w:cs="Segoe UI Emoji"/>
+        </w:rPr>
+        <w:t>🔹</w:t>
+      </w:r>
+      <w:r>
+        <w:rPr>
+          <w:rFonts w:cstheme="minorHAnsi"/>
+        </w:rPr>
+        <w:t xml:space="preserve"> Fase 4 — Ranking</w:t>
+      </w:r>
+    </w:p>
+    <w:p>
+      <w:pPr>
+        <w:rPr>
+          <w:rFonts w:cstheme="minorHAnsi"/>
+        </w:rPr>
+      </w:pPr>
+      <w:r>
+        <w:rPr>
+          <w:rFonts w:cstheme="minorHAnsi"/>
+        </w:rPr>
+        <w:t>Igual que antes.</w:t>
+      </w:r>
+    </w:p>
+    <w:p>
+      <w:pPr>
+        <w:rPr>
+          <w:rFonts w:cstheme="minorHAnsi"/>
+        </w:rPr>
+      </w:pPr>
+      <w:r>
+        <w:rPr>
+          <w:rFonts w:cstheme="minorHAnsi"/>
+        </w:rPr>
+        <w:pict w14:anchorId="4797C6A6">
+          <v:rect id="_x0000_i1295" style="width:0;height:1.5pt" o:hralign="center" o:hrstd="t" o:hr="t" fillcolor="#a0a0a0" stroked="f"/>
+        </w:pict>
+      </w:r>
+    </w:p>
+    <w:p>
+      <w:pPr>
+        <w:rPr>
+          <w:rFonts w:cstheme="minorHAnsi"/>
+        </w:rPr>
+      </w:pPr>
+      <w:r>
+        <w:rPr>
+          <w:rFonts w:ascii="Segoe UI Emoji" w:hAnsi="Segoe UI Emoji" w:cs="Segoe UI Emoji"/>
+        </w:rPr>
+        <w:t>🔹</w:t>
+      </w:r>
+      <w:r>
+        <w:rPr>
+          <w:rFonts w:cstheme="minorHAnsi"/>
+        </w:rPr>
+        <w:t xml:space="preserve"> Fase 5 — Explicación simple</w:t>
+      </w:r>
+    </w:p>
+    <w:p>
+      <w:pPr>
+        <w:rPr>
+          <w:rFonts w:cstheme="minorHAnsi"/>
+        </w:rPr>
+      </w:pPr>
+      <w:r>
+        <w:rPr>
+          <w:rFonts w:cstheme="minorHAnsi"/>
+        </w:rPr>
+        <w:t>En vez de LLM, hacemos:</w:t>
+      </w:r>
+    </w:p>
+    <w:p>
+      <w:pPr>
+        <w:numPr>
+          <w:ilvl w:val="0"/>
+          <w:numId w:val="47"/>
+        </w:numPr>
+        <w:rPr>
+          <w:rFonts w:cstheme="minorHAnsi"/>
+        </w:rPr>
+      </w:pPr>
+      <w:r>
+        <w:rPr>
+          <w:rFonts w:cstheme="minorHAnsi"/>
+        </w:rPr>
+        <w:t xml:space="preserve">plantilla </w:t>
+      </w:r>
+    </w:p>
+    <w:p>
+      <w:pPr>
+        <w:numPr>
+          <w:ilvl w:val="0"/>
+          <w:numId w:val="47"/>
+        </w:numPr>
+        <w:rPr>
+          <w:rFonts w:cstheme="minorHAnsi"/>
+        </w:rPr>
+      </w:pPr>
+      <w:r>
+        <w:rPr>
+          <w:rFonts w:cstheme="minorHAnsi"/>
+        </w:rPr>
+        <w:t xml:space="preserve">texto armado por variables </w:t>
+      </w:r>
+    </w:p>
+    <w:p>
+      <w:pPr>
+        <w:rPr>
+          <w:rFonts w:cstheme="minorHAnsi"/>
+        </w:rPr>
+      </w:pPr>
+      <w:r>
+        <w:rPr>
+          <w:rFonts w:cstheme="minorHAnsi"/>
+        </w:rPr>
+        <w:t>Ejemplo:</w:t>
+      </w:r>
+    </w:p>
+    <w:p>
+      <w:pPr>
+        <w:rPr>
+          <w:rFonts w:cstheme="minorHAnsi"/>
+        </w:rPr>
+      </w:pPr>
+      <w:r>
+        <w:rPr>
+          <w:rFonts w:cstheme="minorHAnsi"/>
+        </w:rPr>
+        <w:t>“Juan es buen candidato porque tiene Python, SQL y más de 2 años de experiencia.”</w:t>
+      </w:r>
+    </w:p>
+    <w:p>
+      <w:pPr>
+        <w:rPr>
+          <w:rFonts w:cstheme="minorHAnsi"/>
+          <w:b/>
+          <w:bCs/>
+          <w:sz w:val="28"/>
+          <w:szCs w:val="28"/>
+          <w:u w:val="single"/>
+        </w:rPr>
+      </w:pPr>
+    </w:p>
+    <w:p/>
+    <w:p>
+      <w:pPr>
+        <w:rPr>
+          <w:b/>
+          <w:bCs/>
+          <w:sz w:val="28"/>
+          <w:szCs w:val="28"/>
+          <w:u w:val="single"/>
+        </w:rPr>
+      </w:pPr>
+      <w:r>
+        <w:rPr>
+          <w:rFonts w:ascii="Segoe UI Emoji" w:hAnsi="Segoe UI Emoji" w:cs="Segoe UI Emoji"/>
+          <w:b/>
+          <w:bCs/>
+          <w:sz w:val="28"/>
+          <w:szCs w:val="28"/>
+          <w:u w:val="single"/>
+        </w:rPr>
+        <w:t>📌</w:t>
+      </w:r>
+      <w:r>
+        <w:rPr>
+          <w:b/>
+          <w:bCs/>
+          <w:sz w:val="28"/>
+          <w:szCs w:val="28"/>
+          <w:u w:val="single"/>
+        </w:rPr>
+        <w:t xml:space="preserve"> Resultado de estas 5 fases</w:t>
+      </w:r>
+    </w:p>
+    <w:p>
+      <w:r>
+        <w:t xml:space="preserve">Ya </w:t>
+      </w:r>
+      <w:proofErr w:type="spellStart"/>
+      <w:r>
+        <w:t>tenés</w:t>
+      </w:r>
+      <w:proofErr w:type="spellEnd"/>
+      <w:r>
+        <w:t xml:space="preserve"> un sistema que:</w:t>
+      </w:r>
+    </w:p>
+    <w:p>
+      <w:pPr>
+        <w:numPr>
+          <w:ilvl w:val="0"/>
+          <w:numId w:val="42"/>
+        </w:numPr>
+      </w:pPr>
+      <w:r>
+        <w:t xml:space="preserve">lee </w:t>
+      </w:r>
+      <w:proofErr w:type="spellStart"/>
+      <w:r>
+        <w:t>CVs</w:t>
+      </w:r>
+      <w:proofErr w:type="spellEnd"/>
+      <w:r>
+        <w:t xml:space="preserve"> </w:t>
+      </w:r>
+    </w:p>
+    <w:p>
+      <w:pPr>
+        <w:numPr>
+          <w:ilvl w:val="0"/>
+          <w:numId w:val="42"/>
+        </w:numPr>
+      </w:pPr>
+      <w:r>
+        <w:t xml:space="preserve">entiende contenido </w:t>
+      </w:r>
+    </w:p>
+    <w:p>
+      <w:pPr>
+        <w:numPr>
+          <w:ilvl w:val="0"/>
+          <w:numId w:val="42"/>
+        </w:numPr>
+      </w:pPr>
+      <w:r>
+        <w:t xml:space="preserve">evalúa </w:t>
+      </w:r>
+    </w:p>
+    <w:p>
+      <w:pPr>
+        <w:numPr>
+          <w:ilvl w:val="0"/>
+          <w:numId w:val="42"/>
+        </w:numPr>
+      </w:pPr>
+      <w:r>
+        <w:t xml:space="preserve">ordena </w:t>
+      </w:r>
+    </w:p>
+    <w:p>
+      <w:pPr>
+        <w:numPr>
+          <w:ilvl w:val="0"/>
+          <w:numId w:val="42"/>
+        </w:numPr>
+      </w:pPr>
+      <w:r>
+        <w:t xml:space="preserve">explica </w:t>
+      </w:r>
+    </w:p>
+    <w:p>
+      <w:r>
+        <w:rPr>
+          <w:rFonts w:ascii="Segoe UI Emoji" w:hAnsi="Segoe UI Emoji" w:cs="Segoe UI Emoji"/>
+        </w:rPr>
+        <w:t>👉</w:t>
+      </w:r>
+      <w:r>
+        <w:t xml:space="preserve"> </w:t>
+      </w:r>
+      <w:r>
+        <w:rPr>
+          <w:b/>
+          <w:bCs/>
+        </w:rPr>
+        <w:t>Esto ya es un MVP real</w:t>
+      </w:r>
+    </w:p>
     <w:p/>
     <w:p/>
     <w:p/>
@@ -6041,6 +7615,155 @@
     </w:lvl>
   </w:abstractNum>
   <w:abstractNum w:abstractNumId="4" w15:restartNumberingAfterBreak="0">
+    <w:nsid w:val="0DB74D0E"/>
+    <w:multiLevelType w:val="multilevel"/>
+    <w:tmpl w:val="A48E439E"/>
+    <w:lvl w:ilvl="0">
+      <w:start w:val="1"/>
+      <w:numFmt w:val="bullet"/>
+      <w:lvlText w:val=""/>
+      <w:lvlJc w:val="left"/>
+      <w:pPr>
+        <w:tabs>
+          <w:tab w:val="num" w:pos="720"/>
+        </w:tabs>
+        <w:ind w:left="720" w:hanging="360"/>
+      </w:pPr>
+      <w:rPr>
+        <w:rFonts w:ascii="Symbol" w:hAnsi="Symbol" w:hint="default"/>
+        <w:sz w:val="20"/>
+      </w:rPr>
+    </w:lvl>
+    <w:lvl w:ilvl="1" w:tentative="1">
+      <w:start w:val="1"/>
+      <w:numFmt w:val="bullet"/>
+      <w:lvlText w:val="o"/>
+      <w:lvlJc w:val="left"/>
+      <w:pPr>
+        <w:tabs>
+          <w:tab w:val="num" w:pos="1440"/>
+        </w:tabs>
+        <w:ind w:left="1440" w:hanging="360"/>
+      </w:pPr>
+      <w:rPr>
+        <w:rFonts w:ascii="Courier New" w:hAnsi="Courier New" w:hint="default"/>
+        <w:sz w:val="20"/>
+      </w:rPr>
+    </w:lvl>
+    <w:lvl w:ilvl="2" w:tentative="1">
+      <w:start w:val="1"/>
+      <w:numFmt w:val="bullet"/>
+      <w:lvlText w:val=""/>
+      <w:lvlJc w:val="left"/>
+      <w:pPr>
+        <w:tabs>
+          <w:tab w:val="num" w:pos="2160"/>
+        </w:tabs>
+        <w:ind w:left="2160" w:hanging="360"/>
+      </w:pPr>
+      <w:rPr>
+        <w:rFonts w:ascii="Wingdings" w:hAnsi="Wingdings" w:hint="default"/>
+        <w:sz w:val="20"/>
+      </w:rPr>
+    </w:lvl>
+    <w:lvl w:ilvl="3" w:tentative="1">
+      <w:start w:val="1"/>
+      <w:numFmt w:val="bullet"/>
+      <w:lvlText w:val=""/>
+      <w:lvlJc w:val="left"/>
+      <w:pPr>
+        <w:tabs>
+          <w:tab w:val="num" w:pos="2880"/>
+        </w:tabs>
+        <w:ind w:left="2880" w:hanging="360"/>
+      </w:pPr>
+      <w:rPr>
+        <w:rFonts w:ascii="Wingdings" w:hAnsi="Wingdings" w:hint="default"/>
+        <w:sz w:val="20"/>
+      </w:rPr>
+    </w:lvl>
+    <w:lvl w:ilvl="4" w:tentative="1">
+      <w:start w:val="1"/>
+      <w:numFmt w:val="bullet"/>
+      <w:lvlText w:val=""/>
+      <w:lvlJc w:val="left"/>
+      <w:pPr>
+        <w:tabs>
+          <w:tab w:val="num" w:pos="3600"/>
+        </w:tabs>
+        <w:ind w:left="3600" w:hanging="360"/>
+      </w:pPr>
+      <w:rPr>
+        <w:rFonts w:ascii="Wingdings" w:hAnsi="Wingdings" w:hint="default"/>
+        <w:sz w:val="20"/>
+      </w:rPr>
+    </w:lvl>
+    <w:lvl w:ilvl="5" w:tentative="1">
+      <w:start w:val="1"/>
+      <w:numFmt w:val="bullet"/>
+      <w:lvlText w:val=""/>
+      <w:lvlJc w:val="left"/>
+      <w:pPr>
+        <w:tabs>
+          <w:tab w:val="num" w:pos="4320"/>
+        </w:tabs>
+        <w:ind w:left="4320" w:hanging="360"/>
+      </w:pPr>
+      <w:rPr>
+        <w:rFonts w:ascii="Wingdings" w:hAnsi="Wingdings" w:hint="default"/>
+        <w:sz w:val="20"/>
+      </w:rPr>
+    </w:lvl>
+    <w:lvl w:ilvl="6" w:tentative="1">
+      <w:start w:val="1"/>
+      <w:numFmt w:val="bullet"/>
+      <w:lvlText w:val=""/>
+      <w:lvlJc w:val="left"/>
+      <w:pPr>
+        <w:tabs>
+          <w:tab w:val="num" w:pos="5040"/>
+        </w:tabs>
+        <w:ind w:left="5040" w:hanging="360"/>
+      </w:pPr>
+      <w:rPr>
+        <w:rFonts w:ascii="Wingdings" w:hAnsi="Wingdings" w:hint="default"/>
+        <w:sz w:val="20"/>
+      </w:rPr>
+    </w:lvl>
+    <w:lvl w:ilvl="7" w:tentative="1">
+      <w:start w:val="1"/>
+      <w:numFmt w:val="bullet"/>
+      <w:lvlText w:val=""/>
+      <w:lvlJc w:val="left"/>
+      <w:pPr>
+        <w:tabs>
+          <w:tab w:val="num" w:pos="5760"/>
+        </w:tabs>
+        <w:ind w:left="5760" w:hanging="360"/>
+      </w:pPr>
+      <w:rPr>
+        <w:rFonts w:ascii="Wingdings" w:hAnsi="Wingdings" w:hint="default"/>
+        <w:sz w:val="20"/>
+      </w:rPr>
+    </w:lvl>
+    <w:lvl w:ilvl="8" w:tentative="1">
+      <w:start w:val="1"/>
+      <w:numFmt w:val="bullet"/>
+      <w:lvlText w:val=""/>
+      <w:lvlJc w:val="left"/>
+      <w:pPr>
+        <w:tabs>
+          <w:tab w:val="num" w:pos="6480"/>
+        </w:tabs>
+        <w:ind w:left="6480" w:hanging="360"/>
+      </w:pPr>
+      <w:rPr>
+        <w:rFonts w:ascii="Wingdings" w:hAnsi="Wingdings" w:hint="default"/>
+        <w:sz w:val="20"/>
+      </w:rPr>
+    </w:lvl>
+  </w:abstractNum>
+  <w:abstractNum w:abstractNumId="5" w15:restartNumberingAfterBreak="0">
     <w:nsid w:val="0E017DE4"/>
     <w:multiLevelType w:val="multilevel"/>
     <w:tmpl w:val="E7D8C8A6"/>
@@ -6189,7 +7912,156 @@
       </w:rPr>
     </w:lvl>
   </w:abstractNum>
-  <w:abstractNum w:abstractNumId="5" w15:restartNumberingAfterBreak="0">
+  <w:abstractNum w:abstractNumId="6" w15:restartNumberingAfterBreak="0">
+    <w:nsid w:val="11A33DA5"/>
+    <w:multiLevelType w:val="multilevel"/>
+    <w:tmpl w:val="5CCA1B48"/>
+    <w:lvl w:ilvl="0">
+      <w:start w:val="1"/>
+      <w:numFmt w:val="bullet"/>
+      <w:lvlText w:val=""/>
+      <w:lvlJc w:val="left"/>
+      <w:pPr>
+        <w:tabs>
+          <w:tab w:val="num" w:pos="720"/>
+        </w:tabs>
+        <w:ind w:left="720" w:hanging="360"/>
+      </w:pPr>
+      <w:rPr>
+        <w:rFonts w:ascii="Symbol" w:hAnsi="Symbol" w:hint="default"/>
+        <w:sz w:val="20"/>
+      </w:rPr>
+    </w:lvl>
+    <w:lvl w:ilvl="1" w:tentative="1">
+      <w:start w:val="1"/>
+      <w:numFmt w:val="bullet"/>
+      <w:lvlText w:val="o"/>
+      <w:lvlJc w:val="left"/>
+      <w:pPr>
+        <w:tabs>
+          <w:tab w:val="num" w:pos="1440"/>
+        </w:tabs>
+        <w:ind w:left="1440" w:hanging="360"/>
+      </w:pPr>
+      <w:rPr>
+        <w:rFonts w:ascii="Courier New" w:hAnsi="Courier New" w:hint="default"/>
+        <w:sz w:val="20"/>
+      </w:rPr>
+    </w:lvl>
+    <w:lvl w:ilvl="2" w:tentative="1">
+      <w:start w:val="1"/>
+      <w:numFmt w:val="bullet"/>
+      <w:lvlText w:val=""/>
+      <w:lvlJc w:val="left"/>
+      <w:pPr>
+        <w:tabs>
+          <w:tab w:val="num" w:pos="2160"/>
+        </w:tabs>
+        <w:ind w:left="2160" w:hanging="360"/>
+      </w:pPr>
+      <w:rPr>
+        <w:rFonts w:ascii="Wingdings" w:hAnsi="Wingdings" w:hint="default"/>
+        <w:sz w:val="20"/>
+      </w:rPr>
+    </w:lvl>
+    <w:lvl w:ilvl="3" w:tentative="1">
+      <w:start w:val="1"/>
+      <w:numFmt w:val="bullet"/>
+      <w:lvlText w:val=""/>
+      <w:lvlJc w:val="left"/>
+      <w:pPr>
+        <w:tabs>
+          <w:tab w:val="num" w:pos="2880"/>
+        </w:tabs>
+        <w:ind w:left="2880" w:hanging="360"/>
+      </w:pPr>
+      <w:rPr>
+        <w:rFonts w:ascii="Wingdings" w:hAnsi="Wingdings" w:hint="default"/>
+        <w:sz w:val="20"/>
+      </w:rPr>
+    </w:lvl>
+    <w:lvl w:ilvl="4" w:tentative="1">
+      <w:start w:val="1"/>
+      <w:numFmt w:val="bullet"/>
+      <w:lvlText w:val=""/>
+      <w:lvlJc w:val="left"/>
+      <w:pPr>
+        <w:tabs>
+          <w:tab w:val="num" w:pos="3600"/>
+        </w:tabs>
+        <w:ind w:left="3600" w:hanging="360"/>
+      </w:pPr>
+      <w:rPr>
+        <w:rFonts w:ascii="Wingdings" w:hAnsi="Wingdings" w:hint="default"/>
+        <w:sz w:val="20"/>
+      </w:rPr>
+    </w:lvl>
+    <w:lvl w:ilvl="5" w:tentative="1">
+      <w:start w:val="1"/>
+      <w:numFmt w:val="bullet"/>
+      <w:lvlText w:val=""/>
+      <w:lvlJc w:val="left"/>
+      <w:pPr>
+        <w:tabs>
+          <w:tab w:val="num" w:pos="4320"/>
+        </w:tabs>
+        <w:ind w:left="4320" w:hanging="360"/>
+      </w:pPr>
+      <w:rPr>
+        <w:rFonts w:ascii="Wingdings" w:hAnsi="Wingdings" w:hint="default"/>
+        <w:sz w:val="20"/>
+      </w:rPr>
+    </w:lvl>
+    <w:lvl w:ilvl="6" w:tentative="1">
+      <w:start w:val="1"/>
+      <w:numFmt w:val="bullet"/>
+      <w:lvlText w:val=""/>
+      <w:lvlJc w:val="left"/>
+      <w:pPr>
+        <w:tabs>
+          <w:tab w:val="num" w:pos="5040"/>
+        </w:tabs>
+        <w:ind w:left="5040" w:hanging="360"/>
+      </w:pPr>
+      <w:rPr>
+        <w:rFonts w:ascii="Wingdings" w:hAnsi="Wingdings" w:hint="default"/>
+        <w:sz w:val="20"/>
+      </w:rPr>
+    </w:lvl>
+    <w:lvl w:ilvl="7" w:tentative="1">
+      <w:start w:val="1"/>
+      <w:numFmt w:val="bullet"/>
+      <w:lvlText w:val=""/>
+      <w:lvlJc w:val="left"/>
+      <w:pPr>
+        <w:tabs>
+          <w:tab w:val="num" w:pos="5760"/>
+        </w:tabs>
+        <w:ind w:left="5760" w:hanging="360"/>
+      </w:pPr>
+      <w:rPr>
+        <w:rFonts w:ascii="Wingdings" w:hAnsi="Wingdings" w:hint="default"/>
+        <w:sz w:val="20"/>
+      </w:rPr>
+    </w:lvl>
+    <w:lvl w:ilvl="8" w:tentative="1">
+      <w:start w:val="1"/>
+      <w:numFmt w:val="bullet"/>
+      <w:lvlText w:val=""/>
+      <w:lvlJc w:val="left"/>
+      <w:pPr>
+        <w:tabs>
+          <w:tab w:val="num" w:pos="6480"/>
+        </w:tabs>
+        <w:ind w:left="6480" w:hanging="360"/>
+      </w:pPr>
+      <w:rPr>
+        <w:rFonts w:ascii="Wingdings" w:hAnsi="Wingdings" w:hint="default"/>
+        <w:sz w:val="20"/>
+      </w:rPr>
+    </w:lvl>
+  </w:abstractNum>
+  <w:abstractNum w:abstractNumId="7" w15:restartNumberingAfterBreak="0">
     <w:nsid w:val="14CD2F19"/>
     <w:multiLevelType w:val="multilevel"/>
     <w:tmpl w:val="035EAAB4"/>
@@ -6338,7 +8210,7 @@
       </w:rPr>
     </w:lvl>
   </w:abstractNum>
-  <w:abstractNum w:abstractNumId="6" w15:restartNumberingAfterBreak="0">
+  <w:abstractNum w:abstractNumId="8" w15:restartNumberingAfterBreak="0">
     <w:nsid w:val="15EB15B1"/>
     <w:multiLevelType w:val="multilevel"/>
     <w:tmpl w:val="C91E09EE"/>
@@ -6487,7 +8359,7 @@
       </w:rPr>
     </w:lvl>
   </w:abstractNum>
-  <w:abstractNum w:abstractNumId="7" w15:restartNumberingAfterBreak="0">
+  <w:abstractNum w:abstractNumId="9" w15:restartNumberingAfterBreak="0">
     <w:nsid w:val="168C1C14"/>
     <w:multiLevelType w:val="multilevel"/>
     <w:tmpl w:val="DE145FA8"/>
@@ -6636,7 +8508,7 @@
       </w:rPr>
     </w:lvl>
   </w:abstractNum>
-  <w:abstractNum w:abstractNumId="8" w15:restartNumberingAfterBreak="0">
+  <w:abstractNum w:abstractNumId="10" w15:restartNumberingAfterBreak="0">
     <w:nsid w:val="1E62487A"/>
     <w:multiLevelType w:val="multilevel"/>
     <w:tmpl w:val="89003A2C"/>
@@ -6785,7 +8657,156 @@
       </w:rPr>
     </w:lvl>
   </w:abstractNum>
-  <w:abstractNum w:abstractNumId="9" w15:restartNumberingAfterBreak="0">
+  <w:abstractNum w:abstractNumId="11" w15:restartNumberingAfterBreak="0">
+    <w:nsid w:val="230D512A"/>
+    <w:multiLevelType w:val="multilevel"/>
+    <w:tmpl w:val="D87813E2"/>
+    <w:lvl w:ilvl="0">
+      <w:start w:val="1"/>
+      <w:numFmt w:val="bullet"/>
+      <w:lvlText w:val=""/>
+      <w:lvlJc w:val="left"/>
+      <w:pPr>
+        <w:tabs>
+          <w:tab w:val="num" w:pos="720"/>
+        </w:tabs>
+        <w:ind w:left="720" w:hanging="360"/>
+      </w:pPr>
+      <w:rPr>
+        <w:rFonts w:ascii="Symbol" w:hAnsi="Symbol" w:hint="default"/>
+        <w:sz w:val="20"/>
+      </w:rPr>
+    </w:lvl>
+    <w:lvl w:ilvl="1" w:tentative="1">
+      <w:start w:val="1"/>
+      <w:numFmt w:val="bullet"/>
+      <w:lvlText w:val="o"/>
+      <w:lvlJc w:val="left"/>
+      <w:pPr>
+        <w:tabs>
+          <w:tab w:val="num" w:pos="1440"/>
+        </w:tabs>
+        <w:ind w:left="1440" w:hanging="360"/>
+      </w:pPr>
+      <w:rPr>
+        <w:rFonts w:ascii="Courier New" w:hAnsi="Courier New" w:hint="default"/>
+        <w:sz w:val="20"/>
+      </w:rPr>
+    </w:lvl>
+    <w:lvl w:ilvl="2" w:tentative="1">
+      <w:start w:val="1"/>
+      <w:numFmt w:val="bullet"/>
+      <w:lvlText w:val=""/>
+      <w:lvlJc w:val="left"/>
+      <w:pPr>
+        <w:tabs>
+          <w:tab w:val="num" w:pos="2160"/>
+        </w:tabs>
+        <w:ind w:left="2160" w:hanging="360"/>
+      </w:pPr>
+      <w:rPr>
+        <w:rFonts w:ascii="Wingdings" w:hAnsi="Wingdings" w:hint="default"/>
+        <w:sz w:val="20"/>
+      </w:rPr>
+    </w:lvl>
+    <w:lvl w:ilvl="3" w:tentative="1">
+      <w:start w:val="1"/>
+      <w:numFmt w:val="bullet"/>
+      <w:lvlText w:val=""/>
+      <w:lvlJc w:val="left"/>
+      <w:pPr>
+        <w:tabs>
+          <w:tab w:val="num" w:pos="2880"/>
+        </w:tabs>
+        <w:ind w:left="2880" w:hanging="360"/>
+      </w:pPr>
+      <w:rPr>
+        <w:rFonts w:ascii="Wingdings" w:hAnsi="Wingdings" w:hint="default"/>
+        <w:sz w:val="20"/>
+      </w:rPr>
+    </w:lvl>
+    <w:lvl w:ilvl="4" w:tentative="1">
+      <w:start w:val="1"/>
+      <w:numFmt w:val="bullet"/>
+      <w:lvlText w:val=""/>
+      <w:lvlJc w:val="left"/>
+      <w:pPr>
+        <w:tabs>
+          <w:tab w:val="num" w:pos="3600"/>
+        </w:tabs>
+        <w:ind w:left="3600" w:hanging="360"/>
+      </w:pPr>
+      <w:rPr>
+        <w:rFonts w:ascii="Wingdings" w:hAnsi="Wingdings" w:hint="default"/>
+        <w:sz w:val="20"/>
+      </w:rPr>
+    </w:lvl>
+    <w:lvl w:ilvl="5" w:tentative="1">
+      <w:start w:val="1"/>
+      <w:numFmt w:val="bullet"/>
+      <w:lvlText w:val=""/>
+      <w:lvlJc w:val="left"/>
+      <w:pPr>
+        <w:tabs>
+          <w:tab w:val="num" w:pos="4320"/>
+        </w:tabs>
+        <w:ind w:left="4320" w:hanging="360"/>
+      </w:pPr>
+      <w:rPr>
+        <w:rFonts w:ascii="Wingdings" w:hAnsi="Wingdings" w:hint="default"/>
+        <w:sz w:val="20"/>
+      </w:rPr>
+    </w:lvl>
+    <w:lvl w:ilvl="6" w:tentative="1">
+      <w:start w:val="1"/>
+      <w:numFmt w:val="bullet"/>
+      <w:lvlText w:val=""/>
+      <w:lvlJc w:val="left"/>
+      <w:pPr>
+        <w:tabs>
+          <w:tab w:val="num" w:pos="5040"/>
+        </w:tabs>
+        <w:ind w:left="5040" w:hanging="360"/>
+      </w:pPr>
+      <w:rPr>
+        <w:rFonts w:ascii="Wingdings" w:hAnsi="Wingdings" w:hint="default"/>
+        <w:sz w:val="20"/>
+      </w:rPr>
+    </w:lvl>
+    <w:lvl w:ilvl="7" w:tentative="1">
+      <w:start w:val="1"/>
+      <w:numFmt w:val="bullet"/>
+      <w:lvlText w:val=""/>
+      <w:lvlJc w:val="left"/>
+      <w:pPr>
+        <w:tabs>
+          <w:tab w:val="num" w:pos="5760"/>
+        </w:tabs>
+        <w:ind w:left="5760" w:hanging="360"/>
+      </w:pPr>
+      <w:rPr>
+        <w:rFonts w:ascii="Wingdings" w:hAnsi="Wingdings" w:hint="default"/>
+        <w:sz w:val="20"/>
+      </w:rPr>
+    </w:lvl>
+    <w:lvl w:ilvl="8" w:tentative="1">
+      <w:start w:val="1"/>
+      <w:numFmt w:val="bullet"/>
+      <w:lvlText w:val=""/>
+      <w:lvlJc w:val="left"/>
+      <w:pPr>
+        <w:tabs>
+          <w:tab w:val="num" w:pos="6480"/>
+        </w:tabs>
+        <w:ind w:left="6480" w:hanging="360"/>
+      </w:pPr>
+      <w:rPr>
+        <w:rFonts w:ascii="Wingdings" w:hAnsi="Wingdings" w:hint="default"/>
+        <w:sz w:val="20"/>
+      </w:rPr>
+    </w:lvl>
+  </w:abstractNum>
+  <w:abstractNum w:abstractNumId="12" w15:restartNumberingAfterBreak="0">
     <w:nsid w:val="23B50855"/>
     <w:multiLevelType w:val="multilevel"/>
     <w:tmpl w:val="B6E64CE6"/>
@@ -6934,7 +8955,7 @@
       </w:rPr>
     </w:lvl>
   </w:abstractNum>
-  <w:abstractNum w:abstractNumId="10" w15:restartNumberingAfterBreak="0">
+  <w:abstractNum w:abstractNumId="13" w15:restartNumberingAfterBreak="0">
     <w:nsid w:val="24DC500A"/>
     <w:multiLevelType w:val="multilevel"/>
     <w:tmpl w:val="A5D4323C"/>
@@ -7083,7 +9104,7 @@
       </w:rPr>
     </w:lvl>
   </w:abstractNum>
-  <w:abstractNum w:abstractNumId="11" w15:restartNumberingAfterBreak="0">
+  <w:abstractNum w:abstractNumId="14" w15:restartNumberingAfterBreak="0">
     <w:nsid w:val="24F916FC"/>
     <w:multiLevelType w:val="multilevel"/>
     <w:tmpl w:val="DB32BF3E"/>
@@ -7232,7 +9253,156 @@
       </w:rPr>
     </w:lvl>
   </w:abstractNum>
-  <w:abstractNum w:abstractNumId="12" w15:restartNumberingAfterBreak="0">
+  <w:abstractNum w:abstractNumId="15" w15:restartNumberingAfterBreak="0">
+    <w:nsid w:val="25847539"/>
+    <w:multiLevelType w:val="multilevel"/>
+    <w:tmpl w:val="AD3A0AA2"/>
+    <w:lvl w:ilvl="0">
+      <w:start w:val="1"/>
+      <w:numFmt w:val="bullet"/>
+      <w:lvlText w:val=""/>
+      <w:lvlJc w:val="left"/>
+      <w:pPr>
+        <w:tabs>
+          <w:tab w:val="num" w:pos="720"/>
+        </w:tabs>
+        <w:ind w:left="720" w:hanging="360"/>
+      </w:pPr>
+      <w:rPr>
+        <w:rFonts w:ascii="Symbol" w:hAnsi="Symbol" w:hint="default"/>
+        <w:sz w:val="20"/>
+      </w:rPr>
+    </w:lvl>
+    <w:lvl w:ilvl="1" w:tentative="1">
+      <w:start w:val="1"/>
+      <w:numFmt w:val="bullet"/>
+      <w:lvlText w:val="o"/>
+      <w:lvlJc w:val="left"/>
+      <w:pPr>
+        <w:tabs>
+          <w:tab w:val="num" w:pos="1440"/>
+        </w:tabs>
+        <w:ind w:left="1440" w:hanging="360"/>
+      </w:pPr>
+      <w:rPr>
+        <w:rFonts w:ascii="Courier New" w:hAnsi="Courier New" w:hint="default"/>
+        <w:sz w:val="20"/>
+      </w:rPr>
+    </w:lvl>
+    <w:lvl w:ilvl="2" w:tentative="1">
+      <w:start w:val="1"/>
+      <w:numFmt w:val="bullet"/>
+      <w:lvlText w:val=""/>
+      <w:lvlJc w:val="left"/>
+      <w:pPr>
+        <w:tabs>
+          <w:tab w:val="num" w:pos="2160"/>
+        </w:tabs>
+        <w:ind w:left="2160" w:hanging="360"/>
+      </w:pPr>
+      <w:rPr>
+        <w:rFonts w:ascii="Wingdings" w:hAnsi="Wingdings" w:hint="default"/>
+        <w:sz w:val="20"/>
+      </w:rPr>
+    </w:lvl>
+    <w:lvl w:ilvl="3" w:tentative="1">
+      <w:start w:val="1"/>
+      <w:numFmt w:val="bullet"/>
+      <w:lvlText w:val=""/>
+      <w:lvlJc w:val="left"/>
+      <w:pPr>
+        <w:tabs>
+          <w:tab w:val="num" w:pos="2880"/>
+        </w:tabs>
+        <w:ind w:left="2880" w:hanging="360"/>
+      </w:pPr>
+      <w:rPr>
+        <w:rFonts w:ascii="Wingdings" w:hAnsi="Wingdings" w:hint="default"/>
+        <w:sz w:val="20"/>
+      </w:rPr>
+    </w:lvl>
+    <w:lvl w:ilvl="4" w:tentative="1">
+      <w:start w:val="1"/>
+      <w:numFmt w:val="bullet"/>
+      <w:lvlText w:val=""/>
+      <w:lvlJc w:val="left"/>
+      <w:pPr>
+        <w:tabs>
+          <w:tab w:val="num" w:pos="3600"/>
+        </w:tabs>
+        <w:ind w:left="3600" w:hanging="360"/>
+      </w:pPr>
+      <w:rPr>
+        <w:rFonts w:ascii="Wingdings" w:hAnsi="Wingdings" w:hint="default"/>
+        <w:sz w:val="20"/>
+      </w:rPr>
+    </w:lvl>
+    <w:lvl w:ilvl="5" w:tentative="1">
+      <w:start w:val="1"/>
+      <w:numFmt w:val="bullet"/>
+      <w:lvlText w:val=""/>
+      <w:lvlJc w:val="left"/>
+      <w:pPr>
+        <w:tabs>
+          <w:tab w:val="num" w:pos="4320"/>
+        </w:tabs>
+        <w:ind w:left="4320" w:hanging="360"/>
+      </w:pPr>
+      <w:rPr>
+        <w:rFonts w:ascii="Wingdings" w:hAnsi="Wingdings" w:hint="default"/>
+        <w:sz w:val="20"/>
+      </w:rPr>
+    </w:lvl>
+    <w:lvl w:ilvl="6" w:tentative="1">
+      <w:start w:val="1"/>
+      <w:numFmt w:val="bullet"/>
+      <w:lvlText w:val=""/>
+      <w:lvlJc w:val="left"/>
+      <w:pPr>
+        <w:tabs>
+          <w:tab w:val="num" w:pos="5040"/>
+        </w:tabs>
+        <w:ind w:left="5040" w:hanging="360"/>
+      </w:pPr>
+      <w:rPr>
+        <w:rFonts w:ascii="Wingdings" w:hAnsi="Wingdings" w:hint="default"/>
+        <w:sz w:val="20"/>
+      </w:rPr>
+    </w:lvl>
+    <w:lvl w:ilvl="7" w:tentative="1">
+      <w:start w:val="1"/>
+      <w:numFmt w:val="bullet"/>
+      <w:lvlText w:val=""/>
+      <w:lvlJc w:val="left"/>
+      <w:pPr>
+        <w:tabs>
+          <w:tab w:val="num" w:pos="5760"/>
+        </w:tabs>
+        <w:ind w:left="5760" w:hanging="360"/>
+      </w:pPr>
+      <w:rPr>
+        <w:rFonts w:ascii="Wingdings" w:hAnsi="Wingdings" w:hint="default"/>
+        <w:sz w:val="20"/>
+      </w:rPr>
+    </w:lvl>
+    <w:lvl w:ilvl="8" w:tentative="1">
+      <w:start w:val="1"/>
+      <w:numFmt w:val="bullet"/>
+      <w:lvlText w:val=""/>
+      <w:lvlJc w:val="left"/>
+      <w:pPr>
+        <w:tabs>
+          <w:tab w:val="num" w:pos="6480"/>
+        </w:tabs>
+        <w:ind w:left="6480" w:hanging="360"/>
+      </w:pPr>
+      <w:rPr>
+        <w:rFonts w:ascii="Wingdings" w:hAnsi="Wingdings" w:hint="default"/>
+        <w:sz w:val="20"/>
+      </w:rPr>
+    </w:lvl>
+  </w:abstractNum>
+  <w:abstractNum w:abstractNumId="16" w15:restartNumberingAfterBreak="0">
     <w:nsid w:val="25AC6489"/>
     <w:multiLevelType w:val="multilevel"/>
     <w:tmpl w:val="2D100BE8"/>
@@ -7381,7 +9551,7 @@
       </w:rPr>
     </w:lvl>
   </w:abstractNum>
-  <w:abstractNum w:abstractNumId="13" w15:restartNumberingAfterBreak="0">
+  <w:abstractNum w:abstractNumId="17" w15:restartNumberingAfterBreak="0">
     <w:nsid w:val="2C667E53"/>
     <w:multiLevelType w:val="multilevel"/>
     <w:tmpl w:val="2AC423AE"/>
@@ -7530,7 +9700,7 @@
       </w:rPr>
     </w:lvl>
   </w:abstractNum>
-  <w:abstractNum w:abstractNumId="14" w15:restartNumberingAfterBreak="0">
+  <w:abstractNum w:abstractNumId="18" w15:restartNumberingAfterBreak="0">
     <w:nsid w:val="2D357FD8"/>
     <w:multiLevelType w:val="multilevel"/>
     <w:tmpl w:val="92B840E6"/>
@@ -7679,7 +9849,7 @@
       </w:rPr>
     </w:lvl>
   </w:abstractNum>
-  <w:abstractNum w:abstractNumId="15" w15:restartNumberingAfterBreak="0">
+  <w:abstractNum w:abstractNumId="19" w15:restartNumberingAfterBreak="0">
     <w:nsid w:val="2EF359FC"/>
     <w:multiLevelType w:val="multilevel"/>
     <w:tmpl w:val="C14AAB2E"/>
@@ -7828,7 +9998,7 @@
       </w:rPr>
     </w:lvl>
   </w:abstractNum>
-  <w:abstractNum w:abstractNumId="16" w15:restartNumberingAfterBreak="0">
+  <w:abstractNum w:abstractNumId="20" w15:restartNumberingAfterBreak="0">
     <w:nsid w:val="2F697D3D"/>
     <w:multiLevelType w:val="multilevel"/>
     <w:tmpl w:val="A0FC9258"/>
@@ -7977,7 +10147,7 @@
       </w:rPr>
     </w:lvl>
   </w:abstractNum>
-  <w:abstractNum w:abstractNumId="17" w15:restartNumberingAfterBreak="0">
+  <w:abstractNum w:abstractNumId="21" w15:restartNumberingAfterBreak="0">
     <w:nsid w:val="312A5F99"/>
     <w:multiLevelType w:val="multilevel"/>
     <w:tmpl w:val="7D5E0A1A"/>
@@ -8126,7 +10296,7 @@
       </w:rPr>
     </w:lvl>
   </w:abstractNum>
-  <w:abstractNum w:abstractNumId="18" w15:restartNumberingAfterBreak="0">
+  <w:abstractNum w:abstractNumId="22" w15:restartNumberingAfterBreak="0">
     <w:nsid w:val="337C5212"/>
     <w:multiLevelType w:val="multilevel"/>
     <w:tmpl w:val="8B40A606"/>
@@ -8275,7 +10445,156 @@
       </w:rPr>
     </w:lvl>
   </w:abstractNum>
-  <w:abstractNum w:abstractNumId="19" w15:restartNumberingAfterBreak="0">
+  <w:abstractNum w:abstractNumId="23" w15:restartNumberingAfterBreak="0">
+    <w:nsid w:val="37C701C7"/>
+    <w:multiLevelType w:val="multilevel"/>
+    <w:tmpl w:val="AF4EF0FE"/>
+    <w:lvl w:ilvl="0">
+      <w:start w:val="1"/>
+      <w:numFmt w:val="bullet"/>
+      <w:lvlText w:val=""/>
+      <w:lvlJc w:val="left"/>
+      <w:pPr>
+        <w:tabs>
+          <w:tab w:val="num" w:pos="720"/>
+        </w:tabs>
+        <w:ind w:left="720" w:hanging="360"/>
+      </w:pPr>
+      <w:rPr>
+        <w:rFonts w:ascii="Symbol" w:hAnsi="Symbol" w:hint="default"/>
+        <w:sz w:val="20"/>
+      </w:rPr>
+    </w:lvl>
+    <w:lvl w:ilvl="1" w:tentative="1">
+      <w:start w:val="1"/>
+      <w:numFmt w:val="bullet"/>
+      <w:lvlText w:val="o"/>
+      <w:lvlJc w:val="left"/>
+      <w:pPr>
+        <w:tabs>
+          <w:tab w:val="num" w:pos="1440"/>
+        </w:tabs>
+        <w:ind w:left="1440" w:hanging="360"/>
+      </w:pPr>
+      <w:rPr>
+        <w:rFonts w:ascii="Courier New" w:hAnsi="Courier New" w:hint="default"/>
+        <w:sz w:val="20"/>
+      </w:rPr>
+    </w:lvl>
+    <w:lvl w:ilvl="2" w:tentative="1">
+      <w:start w:val="1"/>
+      <w:numFmt w:val="bullet"/>
+      <w:lvlText w:val=""/>
+      <w:lvlJc w:val="left"/>
+      <w:pPr>
+        <w:tabs>
+          <w:tab w:val="num" w:pos="2160"/>
+        </w:tabs>
+        <w:ind w:left="2160" w:hanging="360"/>
+      </w:pPr>
+      <w:rPr>
+        <w:rFonts w:ascii="Wingdings" w:hAnsi="Wingdings" w:hint="default"/>
+        <w:sz w:val="20"/>
+      </w:rPr>
+    </w:lvl>
+    <w:lvl w:ilvl="3" w:tentative="1">
+      <w:start w:val="1"/>
+      <w:numFmt w:val="bullet"/>
+      <w:lvlText w:val=""/>
+      <w:lvlJc w:val="left"/>
+      <w:pPr>
+        <w:tabs>
+          <w:tab w:val="num" w:pos="2880"/>
+        </w:tabs>
+        <w:ind w:left="2880" w:hanging="360"/>
+      </w:pPr>
+      <w:rPr>
+        <w:rFonts w:ascii="Wingdings" w:hAnsi="Wingdings" w:hint="default"/>
+        <w:sz w:val="20"/>
+      </w:rPr>
+    </w:lvl>
+    <w:lvl w:ilvl="4" w:tentative="1">
+      <w:start w:val="1"/>
+      <w:numFmt w:val="bullet"/>
+      <w:lvlText w:val=""/>
+      <w:lvlJc w:val="left"/>
+      <w:pPr>
+        <w:tabs>
+          <w:tab w:val="num" w:pos="3600"/>
+        </w:tabs>
+        <w:ind w:left="3600" w:hanging="360"/>
+      </w:pPr>
+      <w:rPr>
+        <w:rFonts w:ascii="Wingdings" w:hAnsi="Wingdings" w:hint="default"/>
+        <w:sz w:val="20"/>
+      </w:rPr>
+    </w:lvl>
+    <w:lvl w:ilvl="5" w:tentative="1">
+      <w:start w:val="1"/>
+      <w:numFmt w:val="bullet"/>
+      <w:lvlText w:val=""/>
+      <w:lvlJc w:val="left"/>
+      <w:pPr>
+        <w:tabs>
+          <w:tab w:val="num" w:pos="4320"/>
+        </w:tabs>
+        <w:ind w:left="4320" w:hanging="360"/>
+      </w:pPr>
+      <w:rPr>
+        <w:rFonts w:ascii="Wingdings" w:hAnsi="Wingdings" w:hint="default"/>
+        <w:sz w:val="20"/>
+      </w:rPr>
+    </w:lvl>
+    <w:lvl w:ilvl="6" w:tentative="1">
+      <w:start w:val="1"/>
+      <w:numFmt w:val="bullet"/>
+      <w:lvlText w:val=""/>
+      <w:lvlJc w:val="left"/>
+      <w:pPr>
+        <w:tabs>
+          <w:tab w:val="num" w:pos="5040"/>
+        </w:tabs>
+        <w:ind w:left="5040" w:hanging="360"/>
+      </w:pPr>
+      <w:rPr>
+        <w:rFonts w:ascii="Wingdings" w:hAnsi="Wingdings" w:hint="default"/>
+        <w:sz w:val="20"/>
+      </w:rPr>
+    </w:lvl>
+    <w:lvl w:ilvl="7" w:tentative="1">
+      <w:start w:val="1"/>
+      <w:numFmt w:val="bullet"/>
+      <w:lvlText w:val=""/>
+      <w:lvlJc w:val="left"/>
+      <w:pPr>
+        <w:tabs>
+          <w:tab w:val="num" w:pos="5760"/>
+        </w:tabs>
+        <w:ind w:left="5760" w:hanging="360"/>
+      </w:pPr>
+      <w:rPr>
+        <w:rFonts w:ascii="Wingdings" w:hAnsi="Wingdings" w:hint="default"/>
+        <w:sz w:val="20"/>
+      </w:rPr>
+    </w:lvl>
+    <w:lvl w:ilvl="8" w:tentative="1">
+      <w:start w:val="1"/>
+      <w:numFmt w:val="bullet"/>
+      <w:lvlText w:val=""/>
+      <w:lvlJc w:val="left"/>
+      <w:pPr>
+        <w:tabs>
+          <w:tab w:val="num" w:pos="6480"/>
+        </w:tabs>
+        <w:ind w:left="6480" w:hanging="360"/>
+      </w:pPr>
+      <w:rPr>
+        <w:rFonts w:ascii="Wingdings" w:hAnsi="Wingdings" w:hint="default"/>
+        <w:sz w:val="20"/>
+      </w:rPr>
+    </w:lvl>
+  </w:abstractNum>
+  <w:abstractNum w:abstractNumId="24" w15:restartNumberingAfterBreak="0">
     <w:nsid w:val="391A538B"/>
     <w:multiLevelType w:val="multilevel"/>
     <w:tmpl w:val="7F30BA7A"/>
@@ -8424,7 +10743,7 @@
       </w:rPr>
     </w:lvl>
   </w:abstractNum>
-  <w:abstractNum w:abstractNumId="20" w15:restartNumberingAfterBreak="0">
+  <w:abstractNum w:abstractNumId="25" w15:restartNumberingAfterBreak="0">
     <w:nsid w:val="39430A20"/>
     <w:multiLevelType w:val="multilevel"/>
     <w:tmpl w:val="5FE2FB92"/>
@@ -8573,7 +10892,156 @@
       </w:rPr>
     </w:lvl>
   </w:abstractNum>
-  <w:abstractNum w:abstractNumId="21" w15:restartNumberingAfterBreak="0">
+  <w:abstractNum w:abstractNumId="26" w15:restartNumberingAfterBreak="0">
+    <w:nsid w:val="3EED53E1"/>
+    <w:multiLevelType w:val="multilevel"/>
+    <w:tmpl w:val="36163F86"/>
+    <w:lvl w:ilvl="0">
+      <w:start w:val="1"/>
+      <w:numFmt w:val="bullet"/>
+      <w:lvlText w:val=""/>
+      <w:lvlJc w:val="left"/>
+      <w:pPr>
+        <w:tabs>
+          <w:tab w:val="num" w:pos="720"/>
+        </w:tabs>
+        <w:ind w:left="720" w:hanging="360"/>
+      </w:pPr>
+      <w:rPr>
+        <w:rFonts w:ascii="Symbol" w:hAnsi="Symbol" w:hint="default"/>
+        <w:sz w:val="20"/>
+      </w:rPr>
+    </w:lvl>
+    <w:lvl w:ilvl="1" w:tentative="1">
+      <w:start w:val="1"/>
+      <w:numFmt w:val="bullet"/>
+      <w:lvlText w:val="o"/>
+      <w:lvlJc w:val="left"/>
+      <w:pPr>
+        <w:tabs>
+          <w:tab w:val="num" w:pos="1440"/>
+        </w:tabs>
+        <w:ind w:left="1440" w:hanging="360"/>
+      </w:pPr>
+      <w:rPr>
+        <w:rFonts w:ascii="Courier New" w:hAnsi="Courier New" w:hint="default"/>
+        <w:sz w:val="20"/>
+      </w:rPr>
+    </w:lvl>
+    <w:lvl w:ilvl="2" w:tentative="1">
+      <w:start w:val="1"/>
+      <w:numFmt w:val="bullet"/>
+      <w:lvlText w:val=""/>
+      <w:lvlJc w:val="left"/>
+      <w:pPr>
+        <w:tabs>
+          <w:tab w:val="num" w:pos="2160"/>
+        </w:tabs>
+        <w:ind w:left="2160" w:hanging="360"/>
+      </w:pPr>
+      <w:rPr>
+        <w:rFonts w:ascii="Wingdings" w:hAnsi="Wingdings" w:hint="default"/>
+        <w:sz w:val="20"/>
+      </w:rPr>
+    </w:lvl>
+    <w:lvl w:ilvl="3" w:tentative="1">
+      <w:start w:val="1"/>
+      <w:numFmt w:val="bullet"/>
+      <w:lvlText w:val=""/>
+      <w:lvlJc w:val="left"/>
+      <w:pPr>
+        <w:tabs>
+          <w:tab w:val="num" w:pos="2880"/>
+        </w:tabs>
+        <w:ind w:left="2880" w:hanging="360"/>
+      </w:pPr>
+      <w:rPr>
+        <w:rFonts w:ascii="Wingdings" w:hAnsi="Wingdings" w:hint="default"/>
+        <w:sz w:val="20"/>
+      </w:rPr>
+    </w:lvl>
+    <w:lvl w:ilvl="4" w:tentative="1">
+      <w:start w:val="1"/>
+      <w:numFmt w:val="bullet"/>
+      <w:lvlText w:val=""/>
+      <w:lvlJc w:val="left"/>
+      <w:pPr>
+        <w:tabs>
+          <w:tab w:val="num" w:pos="3600"/>
+        </w:tabs>
+        <w:ind w:left="3600" w:hanging="360"/>
+      </w:pPr>
+      <w:rPr>
+        <w:rFonts w:ascii="Wingdings" w:hAnsi="Wingdings" w:hint="default"/>
+        <w:sz w:val="20"/>
+      </w:rPr>
+    </w:lvl>
+    <w:lvl w:ilvl="5" w:tentative="1">
+      <w:start w:val="1"/>
+      <w:numFmt w:val="bullet"/>
+      <w:lvlText w:val=""/>
+      <w:lvlJc w:val="left"/>
+      <w:pPr>
+        <w:tabs>
+          <w:tab w:val="num" w:pos="4320"/>
+        </w:tabs>
+        <w:ind w:left="4320" w:hanging="360"/>
+      </w:pPr>
+      <w:rPr>
+        <w:rFonts w:ascii="Wingdings" w:hAnsi="Wingdings" w:hint="default"/>
+        <w:sz w:val="20"/>
+      </w:rPr>
+    </w:lvl>
+    <w:lvl w:ilvl="6" w:tentative="1">
+      <w:start w:val="1"/>
+      <w:numFmt w:val="bullet"/>
+      <w:lvlText w:val=""/>
+      <w:lvlJc w:val="left"/>
+      <w:pPr>
+        <w:tabs>
+          <w:tab w:val="num" w:pos="5040"/>
+        </w:tabs>
+        <w:ind w:left="5040" w:hanging="360"/>
+      </w:pPr>
+      <w:rPr>
+        <w:rFonts w:ascii="Wingdings" w:hAnsi="Wingdings" w:hint="default"/>
+        <w:sz w:val="20"/>
+      </w:rPr>
+    </w:lvl>
+    <w:lvl w:ilvl="7" w:tentative="1">
+      <w:start w:val="1"/>
+      <w:numFmt w:val="bullet"/>
+      <w:lvlText w:val=""/>
+      <w:lvlJc w:val="left"/>
+      <w:pPr>
+        <w:tabs>
+          <w:tab w:val="num" w:pos="5760"/>
+        </w:tabs>
+        <w:ind w:left="5760" w:hanging="360"/>
+      </w:pPr>
+      <w:rPr>
+        <w:rFonts w:ascii="Wingdings" w:hAnsi="Wingdings" w:hint="default"/>
+        <w:sz w:val="20"/>
+      </w:rPr>
+    </w:lvl>
+    <w:lvl w:ilvl="8" w:tentative="1">
+      <w:start w:val="1"/>
+      <w:numFmt w:val="bullet"/>
+      <w:lvlText w:val=""/>
+      <w:lvlJc w:val="left"/>
+      <w:pPr>
+        <w:tabs>
+          <w:tab w:val="num" w:pos="6480"/>
+        </w:tabs>
+        <w:ind w:left="6480" w:hanging="360"/>
+      </w:pPr>
+      <w:rPr>
+        <w:rFonts w:ascii="Wingdings" w:hAnsi="Wingdings" w:hint="default"/>
+        <w:sz w:val="20"/>
+      </w:rPr>
+    </w:lvl>
+  </w:abstractNum>
+  <w:abstractNum w:abstractNumId="27" w15:restartNumberingAfterBreak="0">
     <w:nsid w:val="3F0440EC"/>
     <w:multiLevelType w:val="multilevel"/>
     <w:tmpl w:val="D68E910E"/>
@@ -8722,7 +11190,7 @@
       </w:rPr>
     </w:lvl>
   </w:abstractNum>
-  <w:abstractNum w:abstractNumId="22" w15:restartNumberingAfterBreak="0">
+  <w:abstractNum w:abstractNumId="28" w15:restartNumberingAfterBreak="0">
     <w:nsid w:val="40787588"/>
     <w:multiLevelType w:val="multilevel"/>
     <w:tmpl w:val="56E2A682"/>
@@ -8871,7 +11339,7 @@
       </w:rPr>
     </w:lvl>
   </w:abstractNum>
-  <w:abstractNum w:abstractNumId="23" w15:restartNumberingAfterBreak="0">
+  <w:abstractNum w:abstractNumId="29" w15:restartNumberingAfterBreak="0">
     <w:nsid w:val="41EE0DF2"/>
     <w:multiLevelType w:val="multilevel"/>
     <w:tmpl w:val="53D8DF16"/>
@@ -9020,7 +11488,7 @@
       </w:rPr>
     </w:lvl>
   </w:abstractNum>
-  <w:abstractNum w:abstractNumId="24" w15:restartNumberingAfterBreak="0">
+  <w:abstractNum w:abstractNumId="30" w15:restartNumberingAfterBreak="0">
     <w:nsid w:val="42A74D23"/>
     <w:multiLevelType w:val="multilevel"/>
     <w:tmpl w:val="0C48949E"/>
@@ -9169,7 +11637,156 @@
       </w:rPr>
     </w:lvl>
   </w:abstractNum>
-  <w:abstractNum w:abstractNumId="25" w15:restartNumberingAfterBreak="0">
+  <w:abstractNum w:abstractNumId="31" w15:restartNumberingAfterBreak="0">
+    <w:nsid w:val="44DF52FD"/>
+    <w:multiLevelType w:val="multilevel"/>
+    <w:tmpl w:val="E9DC25C2"/>
+    <w:lvl w:ilvl="0">
+      <w:start w:val="1"/>
+      <w:numFmt w:val="bullet"/>
+      <w:lvlText w:val=""/>
+      <w:lvlJc w:val="left"/>
+      <w:pPr>
+        <w:tabs>
+          <w:tab w:val="num" w:pos="720"/>
+        </w:tabs>
+        <w:ind w:left="720" w:hanging="360"/>
+      </w:pPr>
+      <w:rPr>
+        <w:rFonts w:ascii="Symbol" w:hAnsi="Symbol" w:hint="default"/>
+        <w:sz w:val="20"/>
+      </w:rPr>
+    </w:lvl>
+    <w:lvl w:ilvl="1" w:tentative="1">
+      <w:start w:val="1"/>
+      <w:numFmt w:val="bullet"/>
+      <w:lvlText w:val="o"/>
+      <w:lvlJc w:val="left"/>
+      <w:pPr>
+        <w:tabs>
+          <w:tab w:val="num" w:pos="1440"/>
+        </w:tabs>
+        <w:ind w:left="1440" w:hanging="360"/>
+      </w:pPr>
+      <w:rPr>
+        <w:rFonts w:ascii="Courier New" w:hAnsi="Courier New" w:hint="default"/>
+        <w:sz w:val="20"/>
+      </w:rPr>
+    </w:lvl>
+    <w:lvl w:ilvl="2" w:tentative="1">
+      <w:start w:val="1"/>
+      <w:numFmt w:val="bullet"/>
+      <w:lvlText w:val=""/>
+      <w:lvlJc w:val="left"/>
+      <w:pPr>
+        <w:tabs>
+          <w:tab w:val="num" w:pos="2160"/>
+        </w:tabs>
+        <w:ind w:left="2160" w:hanging="360"/>
+      </w:pPr>
+      <w:rPr>
+        <w:rFonts w:ascii="Wingdings" w:hAnsi="Wingdings" w:hint="default"/>
+        <w:sz w:val="20"/>
+      </w:rPr>
+    </w:lvl>
+    <w:lvl w:ilvl="3" w:tentative="1">
+      <w:start w:val="1"/>
+      <w:numFmt w:val="bullet"/>
+      <w:lvlText w:val=""/>
+      <w:lvlJc w:val="left"/>
+      <w:pPr>
+        <w:tabs>
+          <w:tab w:val="num" w:pos="2880"/>
+        </w:tabs>
+        <w:ind w:left="2880" w:hanging="360"/>
+      </w:pPr>
+      <w:rPr>
+        <w:rFonts w:ascii="Wingdings" w:hAnsi="Wingdings" w:hint="default"/>
+        <w:sz w:val="20"/>
+      </w:rPr>
+    </w:lvl>
+    <w:lvl w:ilvl="4" w:tentative="1">
+      <w:start w:val="1"/>
+      <w:numFmt w:val="bullet"/>
+      <w:lvlText w:val=""/>
+      <w:lvlJc w:val="left"/>
+      <w:pPr>
+        <w:tabs>
+          <w:tab w:val="num" w:pos="3600"/>
+        </w:tabs>
+        <w:ind w:left="3600" w:hanging="360"/>
+      </w:pPr>
+      <w:rPr>
+        <w:rFonts w:ascii="Wingdings" w:hAnsi="Wingdings" w:hint="default"/>
+        <w:sz w:val="20"/>
+      </w:rPr>
+    </w:lvl>
+    <w:lvl w:ilvl="5" w:tentative="1">
+      <w:start w:val="1"/>
+      <w:numFmt w:val="bullet"/>
+      <w:lvlText w:val=""/>
+      <w:lvlJc w:val="left"/>
+      <w:pPr>
+        <w:tabs>
+          <w:tab w:val="num" w:pos="4320"/>
+        </w:tabs>
+        <w:ind w:left="4320" w:hanging="360"/>
+      </w:pPr>
+      <w:rPr>
+        <w:rFonts w:ascii="Wingdings" w:hAnsi="Wingdings" w:hint="default"/>
+        <w:sz w:val="20"/>
+      </w:rPr>
+    </w:lvl>
+    <w:lvl w:ilvl="6" w:tentative="1">
+      <w:start w:val="1"/>
+      <w:numFmt w:val="bullet"/>
+      <w:lvlText w:val=""/>
+      <w:lvlJc w:val="left"/>
+      <w:pPr>
+        <w:tabs>
+          <w:tab w:val="num" w:pos="5040"/>
+        </w:tabs>
+        <w:ind w:left="5040" w:hanging="360"/>
+      </w:pPr>
+      <w:rPr>
+        <w:rFonts w:ascii="Wingdings" w:hAnsi="Wingdings" w:hint="default"/>
+        <w:sz w:val="20"/>
+      </w:rPr>
+    </w:lvl>
+    <w:lvl w:ilvl="7" w:tentative="1">
+      <w:start w:val="1"/>
+      <w:numFmt w:val="bullet"/>
+      <w:lvlText w:val=""/>
+      <w:lvlJc w:val="left"/>
+      <w:pPr>
+        <w:tabs>
+          <w:tab w:val="num" w:pos="5760"/>
+        </w:tabs>
+        <w:ind w:left="5760" w:hanging="360"/>
+      </w:pPr>
+      <w:rPr>
+        <w:rFonts w:ascii="Wingdings" w:hAnsi="Wingdings" w:hint="default"/>
+        <w:sz w:val="20"/>
+      </w:rPr>
+    </w:lvl>
+    <w:lvl w:ilvl="8" w:tentative="1">
+      <w:start w:val="1"/>
+      <w:numFmt w:val="bullet"/>
+      <w:lvlText w:val=""/>
+      <w:lvlJc w:val="left"/>
+      <w:pPr>
+        <w:tabs>
+          <w:tab w:val="num" w:pos="6480"/>
+        </w:tabs>
+        <w:ind w:left="6480" w:hanging="360"/>
+      </w:pPr>
+      <w:rPr>
+        <w:rFonts w:ascii="Wingdings" w:hAnsi="Wingdings" w:hint="default"/>
+        <w:sz w:val="20"/>
+      </w:rPr>
+    </w:lvl>
+  </w:abstractNum>
+  <w:abstractNum w:abstractNumId="32" w15:restartNumberingAfterBreak="0">
     <w:nsid w:val="49C552A7"/>
     <w:multiLevelType w:val="multilevel"/>
     <w:tmpl w:val="110A216A"/>
@@ -9318,7 +11935,305 @@
       </w:rPr>
     </w:lvl>
   </w:abstractNum>
-  <w:abstractNum w:abstractNumId="26" w15:restartNumberingAfterBreak="0">
+  <w:abstractNum w:abstractNumId="33" w15:restartNumberingAfterBreak="0">
+    <w:nsid w:val="4AC8321C"/>
+    <w:multiLevelType w:val="multilevel"/>
+    <w:tmpl w:val="5656976A"/>
+    <w:lvl w:ilvl="0">
+      <w:start w:val="1"/>
+      <w:numFmt w:val="bullet"/>
+      <w:lvlText w:val=""/>
+      <w:lvlJc w:val="left"/>
+      <w:pPr>
+        <w:tabs>
+          <w:tab w:val="num" w:pos="720"/>
+        </w:tabs>
+        <w:ind w:left="720" w:hanging="360"/>
+      </w:pPr>
+      <w:rPr>
+        <w:rFonts w:ascii="Symbol" w:hAnsi="Symbol" w:hint="default"/>
+        <w:sz w:val="20"/>
+      </w:rPr>
+    </w:lvl>
+    <w:lvl w:ilvl="1" w:tentative="1">
+      <w:start w:val="1"/>
+      <w:numFmt w:val="bullet"/>
+      <w:lvlText w:val="o"/>
+      <w:lvlJc w:val="left"/>
+      <w:pPr>
+        <w:tabs>
+          <w:tab w:val="num" w:pos="1440"/>
+        </w:tabs>
+        <w:ind w:left="1440" w:hanging="360"/>
+      </w:pPr>
+      <w:rPr>
+        <w:rFonts w:ascii="Courier New" w:hAnsi="Courier New" w:hint="default"/>
+        <w:sz w:val="20"/>
+      </w:rPr>
+    </w:lvl>
+    <w:lvl w:ilvl="2" w:tentative="1">
+      <w:start w:val="1"/>
+      <w:numFmt w:val="bullet"/>
+      <w:lvlText w:val=""/>
+      <w:lvlJc w:val="left"/>
+      <w:pPr>
+        <w:tabs>
+          <w:tab w:val="num" w:pos="2160"/>
+        </w:tabs>
+        <w:ind w:left="2160" w:hanging="360"/>
+      </w:pPr>
+      <w:rPr>
+        <w:rFonts w:ascii="Wingdings" w:hAnsi="Wingdings" w:hint="default"/>
+        <w:sz w:val="20"/>
+      </w:rPr>
+    </w:lvl>
+    <w:lvl w:ilvl="3" w:tentative="1">
+      <w:start w:val="1"/>
+      <w:numFmt w:val="bullet"/>
+      <w:lvlText w:val=""/>
+      <w:lvlJc w:val="left"/>
+      <w:pPr>
+        <w:tabs>
+          <w:tab w:val="num" w:pos="2880"/>
+        </w:tabs>
+        <w:ind w:left="2880" w:hanging="360"/>
+      </w:pPr>
+      <w:rPr>
+        <w:rFonts w:ascii="Wingdings" w:hAnsi="Wingdings" w:hint="default"/>
+        <w:sz w:val="20"/>
+      </w:rPr>
+    </w:lvl>
+    <w:lvl w:ilvl="4" w:tentative="1">
+      <w:start w:val="1"/>
+      <w:numFmt w:val="bullet"/>
+      <w:lvlText w:val=""/>
+      <w:lvlJc w:val="left"/>
+      <w:pPr>
+        <w:tabs>
+          <w:tab w:val="num" w:pos="3600"/>
+        </w:tabs>
+        <w:ind w:left="3600" w:hanging="360"/>
+      </w:pPr>
+      <w:rPr>
+        <w:rFonts w:ascii="Wingdings" w:hAnsi="Wingdings" w:hint="default"/>
+        <w:sz w:val="20"/>
+      </w:rPr>
+    </w:lvl>
+    <w:lvl w:ilvl="5" w:tentative="1">
+      <w:start w:val="1"/>
+      <w:numFmt w:val="bullet"/>
+      <w:lvlText w:val=""/>
+      <w:lvlJc w:val="left"/>
+      <w:pPr>
+        <w:tabs>
+          <w:tab w:val="num" w:pos="4320"/>
+        </w:tabs>
+        <w:ind w:left="4320" w:hanging="360"/>
+      </w:pPr>
+      <w:rPr>
+        <w:rFonts w:ascii="Wingdings" w:hAnsi="Wingdings" w:hint="default"/>
+        <w:sz w:val="20"/>
+      </w:rPr>
+    </w:lvl>
+    <w:lvl w:ilvl="6" w:tentative="1">
+      <w:start w:val="1"/>
+      <w:numFmt w:val="bullet"/>
+      <w:lvlText w:val=""/>
+      <w:lvlJc w:val="left"/>
+      <w:pPr>
+        <w:tabs>
+          <w:tab w:val="num" w:pos="5040"/>
+        </w:tabs>
+        <w:ind w:left="5040" w:hanging="360"/>
+      </w:pPr>
+      <w:rPr>
+        <w:rFonts w:ascii="Wingdings" w:hAnsi="Wingdings" w:hint="default"/>
+        <w:sz w:val="20"/>
+      </w:rPr>
+    </w:lvl>
+    <w:lvl w:ilvl="7" w:tentative="1">
+      <w:start w:val="1"/>
+      <w:numFmt w:val="bullet"/>
+      <w:lvlText w:val=""/>
+      <w:lvlJc w:val="left"/>
+      <w:pPr>
+        <w:tabs>
+          <w:tab w:val="num" w:pos="5760"/>
+        </w:tabs>
+        <w:ind w:left="5760" w:hanging="360"/>
+      </w:pPr>
+      <w:rPr>
+        <w:rFonts w:ascii="Wingdings" w:hAnsi="Wingdings" w:hint="default"/>
+        <w:sz w:val="20"/>
+      </w:rPr>
+    </w:lvl>
+    <w:lvl w:ilvl="8" w:tentative="1">
+      <w:start w:val="1"/>
+      <w:numFmt w:val="bullet"/>
+      <w:lvlText w:val=""/>
+      <w:lvlJc w:val="left"/>
+      <w:pPr>
+        <w:tabs>
+          <w:tab w:val="num" w:pos="6480"/>
+        </w:tabs>
+        <w:ind w:left="6480" w:hanging="360"/>
+      </w:pPr>
+      <w:rPr>
+        <w:rFonts w:ascii="Wingdings" w:hAnsi="Wingdings" w:hint="default"/>
+        <w:sz w:val="20"/>
+      </w:rPr>
+    </w:lvl>
+  </w:abstractNum>
+  <w:abstractNum w:abstractNumId="34" w15:restartNumberingAfterBreak="0">
+    <w:nsid w:val="4E9C0769"/>
+    <w:multiLevelType w:val="multilevel"/>
+    <w:tmpl w:val="D50E12A4"/>
+    <w:lvl w:ilvl="0">
+      <w:start w:val="1"/>
+      <w:numFmt w:val="bullet"/>
+      <w:lvlText w:val=""/>
+      <w:lvlJc w:val="left"/>
+      <w:pPr>
+        <w:tabs>
+          <w:tab w:val="num" w:pos="720"/>
+        </w:tabs>
+        <w:ind w:left="720" w:hanging="360"/>
+      </w:pPr>
+      <w:rPr>
+        <w:rFonts w:ascii="Symbol" w:hAnsi="Symbol" w:hint="default"/>
+        <w:sz w:val="20"/>
+      </w:rPr>
+    </w:lvl>
+    <w:lvl w:ilvl="1" w:tentative="1">
+      <w:start w:val="1"/>
+      <w:numFmt w:val="bullet"/>
+      <w:lvlText w:val="o"/>
+      <w:lvlJc w:val="left"/>
+      <w:pPr>
+        <w:tabs>
+          <w:tab w:val="num" w:pos="1440"/>
+        </w:tabs>
+        <w:ind w:left="1440" w:hanging="360"/>
+      </w:pPr>
+      <w:rPr>
+        <w:rFonts w:ascii="Courier New" w:hAnsi="Courier New" w:hint="default"/>
+        <w:sz w:val="20"/>
+      </w:rPr>
+    </w:lvl>
+    <w:lvl w:ilvl="2" w:tentative="1">
+      <w:start w:val="1"/>
+      <w:numFmt w:val="bullet"/>
+      <w:lvlText w:val=""/>
+      <w:lvlJc w:val="left"/>
+      <w:pPr>
+        <w:tabs>
+          <w:tab w:val="num" w:pos="2160"/>
+        </w:tabs>
+        <w:ind w:left="2160" w:hanging="360"/>
+      </w:pPr>
+      <w:rPr>
+        <w:rFonts w:ascii="Wingdings" w:hAnsi="Wingdings" w:hint="default"/>
+        <w:sz w:val="20"/>
+      </w:rPr>
+    </w:lvl>
+    <w:lvl w:ilvl="3" w:tentative="1">
+      <w:start w:val="1"/>
+      <w:numFmt w:val="bullet"/>
+      <w:lvlText w:val=""/>
+      <w:lvlJc w:val="left"/>
+      <w:pPr>
+        <w:tabs>
+          <w:tab w:val="num" w:pos="2880"/>
+        </w:tabs>
+        <w:ind w:left="2880" w:hanging="360"/>
+      </w:pPr>
+      <w:rPr>
+        <w:rFonts w:ascii="Wingdings" w:hAnsi="Wingdings" w:hint="default"/>
+        <w:sz w:val="20"/>
+      </w:rPr>
+    </w:lvl>
+    <w:lvl w:ilvl="4" w:tentative="1">
+      <w:start w:val="1"/>
+      <w:numFmt w:val="bullet"/>
+      <w:lvlText w:val=""/>
+      <w:lvlJc w:val="left"/>
+      <w:pPr>
+        <w:tabs>
+          <w:tab w:val="num" w:pos="3600"/>
+        </w:tabs>
+        <w:ind w:left="3600" w:hanging="360"/>
+      </w:pPr>
+      <w:rPr>
+        <w:rFonts w:ascii="Wingdings" w:hAnsi="Wingdings" w:hint="default"/>
+        <w:sz w:val="20"/>
+      </w:rPr>
+    </w:lvl>
+    <w:lvl w:ilvl="5" w:tentative="1">
+      <w:start w:val="1"/>
+      <w:numFmt w:val="bullet"/>
+      <w:lvlText w:val=""/>
+      <w:lvlJc w:val="left"/>
+      <w:pPr>
+        <w:tabs>
+          <w:tab w:val="num" w:pos="4320"/>
+        </w:tabs>
+        <w:ind w:left="4320" w:hanging="360"/>
+      </w:pPr>
+      <w:rPr>
+        <w:rFonts w:ascii="Wingdings" w:hAnsi="Wingdings" w:hint="default"/>
+        <w:sz w:val="20"/>
+      </w:rPr>
+    </w:lvl>
+    <w:lvl w:ilvl="6" w:tentative="1">
+      <w:start w:val="1"/>
+      <w:numFmt w:val="bullet"/>
+      <w:lvlText w:val=""/>
+      <w:lvlJc w:val="left"/>
+      <w:pPr>
+        <w:tabs>
+          <w:tab w:val="num" w:pos="5040"/>
+        </w:tabs>
+        <w:ind w:left="5040" w:hanging="360"/>
+      </w:pPr>
+      <w:rPr>
+        <w:rFonts w:ascii="Wingdings" w:hAnsi="Wingdings" w:hint="default"/>
+        <w:sz w:val="20"/>
+      </w:rPr>
+    </w:lvl>
+    <w:lvl w:ilvl="7" w:tentative="1">
+      <w:start w:val="1"/>
+      <w:numFmt w:val="bullet"/>
+      <w:lvlText w:val=""/>
+      <w:lvlJc w:val="left"/>
+      <w:pPr>
+        <w:tabs>
+          <w:tab w:val="num" w:pos="5760"/>
+        </w:tabs>
+        <w:ind w:left="5760" w:hanging="360"/>
+      </w:pPr>
+      <w:rPr>
+        <w:rFonts w:ascii="Wingdings" w:hAnsi="Wingdings" w:hint="default"/>
+        <w:sz w:val="20"/>
+      </w:rPr>
+    </w:lvl>
+    <w:lvl w:ilvl="8" w:tentative="1">
+      <w:start w:val="1"/>
+      <w:numFmt w:val="bullet"/>
+      <w:lvlText w:val=""/>
+      <w:lvlJc w:val="left"/>
+      <w:pPr>
+        <w:tabs>
+          <w:tab w:val="num" w:pos="6480"/>
+        </w:tabs>
+        <w:ind w:left="6480" w:hanging="360"/>
+      </w:pPr>
+      <w:rPr>
+        <w:rFonts w:ascii="Wingdings" w:hAnsi="Wingdings" w:hint="default"/>
+        <w:sz w:val="20"/>
+      </w:rPr>
+    </w:lvl>
+  </w:abstractNum>
+  <w:abstractNum w:abstractNumId="35" w15:restartNumberingAfterBreak="0">
     <w:nsid w:val="53F2243B"/>
     <w:multiLevelType w:val="multilevel"/>
     <w:tmpl w:val="6B203F50"/>
@@ -9467,7 +12382,156 @@
       </w:rPr>
     </w:lvl>
   </w:abstractNum>
-  <w:abstractNum w:abstractNumId="27" w15:restartNumberingAfterBreak="0">
+  <w:abstractNum w:abstractNumId="36" w15:restartNumberingAfterBreak="0">
+    <w:nsid w:val="57EB2B0D"/>
+    <w:multiLevelType w:val="multilevel"/>
+    <w:tmpl w:val="B8F42046"/>
+    <w:lvl w:ilvl="0">
+      <w:start w:val="1"/>
+      <w:numFmt w:val="bullet"/>
+      <w:lvlText w:val=""/>
+      <w:lvlJc w:val="left"/>
+      <w:pPr>
+        <w:tabs>
+          <w:tab w:val="num" w:pos="720"/>
+        </w:tabs>
+        <w:ind w:left="720" w:hanging="360"/>
+      </w:pPr>
+      <w:rPr>
+        <w:rFonts w:ascii="Symbol" w:hAnsi="Symbol" w:hint="default"/>
+        <w:sz w:val="20"/>
+      </w:rPr>
+    </w:lvl>
+    <w:lvl w:ilvl="1" w:tentative="1">
+      <w:start w:val="1"/>
+      <w:numFmt w:val="bullet"/>
+      <w:lvlText w:val="o"/>
+      <w:lvlJc w:val="left"/>
+      <w:pPr>
+        <w:tabs>
+          <w:tab w:val="num" w:pos="1440"/>
+        </w:tabs>
+        <w:ind w:left="1440" w:hanging="360"/>
+      </w:pPr>
+      <w:rPr>
+        <w:rFonts w:ascii="Courier New" w:hAnsi="Courier New" w:hint="default"/>
+        <w:sz w:val="20"/>
+      </w:rPr>
+    </w:lvl>
+    <w:lvl w:ilvl="2" w:tentative="1">
+      <w:start w:val="1"/>
+      <w:numFmt w:val="bullet"/>
+      <w:lvlText w:val=""/>
+      <w:lvlJc w:val="left"/>
+      <w:pPr>
+        <w:tabs>
+          <w:tab w:val="num" w:pos="2160"/>
+        </w:tabs>
+        <w:ind w:left="2160" w:hanging="360"/>
+      </w:pPr>
+      <w:rPr>
+        <w:rFonts w:ascii="Wingdings" w:hAnsi="Wingdings" w:hint="default"/>
+        <w:sz w:val="20"/>
+      </w:rPr>
+    </w:lvl>
+    <w:lvl w:ilvl="3" w:tentative="1">
+      <w:start w:val="1"/>
+      <w:numFmt w:val="bullet"/>
+      <w:lvlText w:val=""/>
+      <w:lvlJc w:val="left"/>
+      <w:pPr>
+        <w:tabs>
+          <w:tab w:val="num" w:pos="2880"/>
+        </w:tabs>
+        <w:ind w:left="2880" w:hanging="360"/>
+      </w:pPr>
+      <w:rPr>
+        <w:rFonts w:ascii="Wingdings" w:hAnsi="Wingdings" w:hint="default"/>
+        <w:sz w:val="20"/>
+      </w:rPr>
+    </w:lvl>
+    <w:lvl w:ilvl="4" w:tentative="1">
+      <w:start w:val="1"/>
+      <w:numFmt w:val="bullet"/>
+      <w:lvlText w:val=""/>
+      <w:lvlJc w:val="left"/>
+      <w:pPr>
+        <w:tabs>
+          <w:tab w:val="num" w:pos="3600"/>
+        </w:tabs>
+        <w:ind w:left="3600" w:hanging="360"/>
+      </w:pPr>
+      <w:rPr>
+        <w:rFonts w:ascii="Wingdings" w:hAnsi="Wingdings" w:hint="default"/>
+        <w:sz w:val="20"/>
+      </w:rPr>
+    </w:lvl>
+    <w:lvl w:ilvl="5" w:tentative="1">
+      <w:start w:val="1"/>
+      <w:numFmt w:val="bullet"/>
+      <w:lvlText w:val=""/>
+      <w:lvlJc w:val="left"/>
+      <w:pPr>
+        <w:tabs>
+          <w:tab w:val="num" w:pos="4320"/>
+        </w:tabs>
+        <w:ind w:left="4320" w:hanging="360"/>
+      </w:pPr>
+      <w:rPr>
+        <w:rFonts w:ascii="Wingdings" w:hAnsi="Wingdings" w:hint="default"/>
+        <w:sz w:val="20"/>
+      </w:rPr>
+    </w:lvl>
+    <w:lvl w:ilvl="6" w:tentative="1">
+      <w:start w:val="1"/>
+      <w:numFmt w:val="bullet"/>
+      <w:lvlText w:val=""/>
+      <w:lvlJc w:val="left"/>
+      <w:pPr>
+        <w:tabs>
+          <w:tab w:val="num" w:pos="5040"/>
+        </w:tabs>
+        <w:ind w:left="5040" w:hanging="360"/>
+      </w:pPr>
+      <w:rPr>
+        <w:rFonts w:ascii="Wingdings" w:hAnsi="Wingdings" w:hint="default"/>
+        <w:sz w:val="20"/>
+      </w:rPr>
+    </w:lvl>
+    <w:lvl w:ilvl="7" w:tentative="1">
+      <w:start w:val="1"/>
+      <w:numFmt w:val="bullet"/>
+      <w:lvlText w:val=""/>
+      <w:lvlJc w:val="left"/>
+      <w:pPr>
+        <w:tabs>
+          <w:tab w:val="num" w:pos="5760"/>
+        </w:tabs>
+        <w:ind w:left="5760" w:hanging="360"/>
+      </w:pPr>
+      <w:rPr>
+        <w:rFonts w:ascii="Wingdings" w:hAnsi="Wingdings" w:hint="default"/>
+        <w:sz w:val="20"/>
+      </w:rPr>
+    </w:lvl>
+    <w:lvl w:ilvl="8" w:tentative="1">
+      <w:start w:val="1"/>
+      <w:numFmt w:val="bullet"/>
+      <w:lvlText w:val=""/>
+      <w:lvlJc w:val="left"/>
+      <w:pPr>
+        <w:tabs>
+          <w:tab w:val="num" w:pos="6480"/>
+        </w:tabs>
+        <w:ind w:left="6480" w:hanging="360"/>
+      </w:pPr>
+      <w:rPr>
+        <w:rFonts w:ascii="Wingdings" w:hAnsi="Wingdings" w:hint="default"/>
+        <w:sz w:val="20"/>
+      </w:rPr>
+    </w:lvl>
+  </w:abstractNum>
+  <w:abstractNum w:abstractNumId="37" w15:restartNumberingAfterBreak="0">
     <w:nsid w:val="597F2A5B"/>
     <w:multiLevelType w:val="multilevel"/>
     <w:tmpl w:val="48D81E18"/>
@@ -9616,7 +12680,7 @@
       </w:rPr>
     </w:lvl>
   </w:abstractNum>
-  <w:abstractNum w:abstractNumId="28" w15:restartNumberingAfterBreak="0">
+  <w:abstractNum w:abstractNumId="38" w15:restartNumberingAfterBreak="0">
     <w:nsid w:val="5B4A673D"/>
     <w:multiLevelType w:val="multilevel"/>
     <w:tmpl w:val="C374D91C"/>
@@ -9765,7 +12829,7 @@
       </w:rPr>
     </w:lvl>
   </w:abstractNum>
-  <w:abstractNum w:abstractNumId="29" w15:restartNumberingAfterBreak="0">
+  <w:abstractNum w:abstractNumId="39" w15:restartNumberingAfterBreak="0">
     <w:nsid w:val="61C21F20"/>
     <w:multiLevelType w:val="multilevel"/>
     <w:tmpl w:val="9EC6B29A"/>
@@ -9914,7 +12978,156 @@
       </w:rPr>
     </w:lvl>
   </w:abstractNum>
-  <w:abstractNum w:abstractNumId="30" w15:restartNumberingAfterBreak="0">
+  <w:abstractNum w:abstractNumId="40" w15:restartNumberingAfterBreak="0">
+    <w:nsid w:val="61E553A4"/>
+    <w:multiLevelType w:val="multilevel"/>
+    <w:tmpl w:val="FC54BF1A"/>
+    <w:lvl w:ilvl="0">
+      <w:start w:val="1"/>
+      <w:numFmt w:val="bullet"/>
+      <w:lvlText w:val=""/>
+      <w:lvlJc w:val="left"/>
+      <w:pPr>
+        <w:tabs>
+          <w:tab w:val="num" w:pos="720"/>
+        </w:tabs>
+        <w:ind w:left="720" w:hanging="360"/>
+      </w:pPr>
+      <w:rPr>
+        <w:rFonts w:ascii="Symbol" w:hAnsi="Symbol" w:hint="default"/>
+        <w:sz w:val="20"/>
+      </w:rPr>
+    </w:lvl>
+    <w:lvl w:ilvl="1" w:tentative="1">
+      <w:start w:val="1"/>
+      <w:numFmt w:val="bullet"/>
+      <w:lvlText w:val="o"/>
+      <w:lvlJc w:val="left"/>
+      <w:pPr>
+        <w:tabs>
+          <w:tab w:val="num" w:pos="1440"/>
+        </w:tabs>
+        <w:ind w:left="1440" w:hanging="360"/>
+      </w:pPr>
+      <w:rPr>
+        <w:rFonts w:ascii="Courier New" w:hAnsi="Courier New" w:hint="default"/>
+        <w:sz w:val="20"/>
+      </w:rPr>
+    </w:lvl>
+    <w:lvl w:ilvl="2" w:tentative="1">
+      <w:start w:val="1"/>
+      <w:numFmt w:val="bullet"/>
+      <w:lvlText w:val=""/>
+      <w:lvlJc w:val="left"/>
+      <w:pPr>
+        <w:tabs>
+          <w:tab w:val="num" w:pos="2160"/>
+        </w:tabs>
+        <w:ind w:left="2160" w:hanging="360"/>
+      </w:pPr>
+      <w:rPr>
+        <w:rFonts w:ascii="Wingdings" w:hAnsi="Wingdings" w:hint="default"/>
+        <w:sz w:val="20"/>
+      </w:rPr>
+    </w:lvl>
+    <w:lvl w:ilvl="3" w:tentative="1">
+      <w:start w:val="1"/>
+      <w:numFmt w:val="bullet"/>
+      <w:lvlText w:val=""/>
+      <w:lvlJc w:val="left"/>
+      <w:pPr>
+        <w:tabs>
+          <w:tab w:val="num" w:pos="2880"/>
+        </w:tabs>
+        <w:ind w:left="2880" w:hanging="360"/>
+      </w:pPr>
+      <w:rPr>
+        <w:rFonts w:ascii="Wingdings" w:hAnsi="Wingdings" w:hint="default"/>
+        <w:sz w:val="20"/>
+      </w:rPr>
+    </w:lvl>
+    <w:lvl w:ilvl="4" w:tentative="1">
+      <w:start w:val="1"/>
+      <w:numFmt w:val="bullet"/>
+      <w:lvlText w:val=""/>
+      <w:lvlJc w:val="left"/>
+      <w:pPr>
+        <w:tabs>
+          <w:tab w:val="num" w:pos="3600"/>
+        </w:tabs>
+        <w:ind w:left="3600" w:hanging="360"/>
+      </w:pPr>
+      <w:rPr>
+        <w:rFonts w:ascii="Wingdings" w:hAnsi="Wingdings" w:hint="default"/>
+        <w:sz w:val="20"/>
+      </w:rPr>
+    </w:lvl>
+    <w:lvl w:ilvl="5" w:tentative="1">
+      <w:start w:val="1"/>
+      <w:numFmt w:val="bullet"/>
+      <w:lvlText w:val=""/>
+      <w:lvlJc w:val="left"/>
+      <w:pPr>
+        <w:tabs>
+          <w:tab w:val="num" w:pos="4320"/>
+        </w:tabs>
+        <w:ind w:left="4320" w:hanging="360"/>
+      </w:pPr>
+      <w:rPr>
+        <w:rFonts w:ascii="Wingdings" w:hAnsi="Wingdings" w:hint="default"/>
+        <w:sz w:val="20"/>
+      </w:rPr>
+    </w:lvl>
+    <w:lvl w:ilvl="6" w:tentative="1">
+      <w:start w:val="1"/>
+      <w:numFmt w:val="bullet"/>
+      <w:lvlText w:val=""/>
+      <w:lvlJc w:val="left"/>
+      <w:pPr>
+        <w:tabs>
+          <w:tab w:val="num" w:pos="5040"/>
+        </w:tabs>
+        <w:ind w:left="5040" w:hanging="360"/>
+      </w:pPr>
+      <w:rPr>
+        <w:rFonts w:ascii="Wingdings" w:hAnsi="Wingdings" w:hint="default"/>
+        <w:sz w:val="20"/>
+      </w:rPr>
+    </w:lvl>
+    <w:lvl w:ilvl="7" w:tentative="1">
+      <w:start w:val="1"/>
+      <w:numFmt w:val="bullet"/>
+      <w:lvlText w:val=""/>
+      <w:lvlJc w:val="left"/>
+      <w:pPr>
+        <w:tabs>
+          <w:tab w:val="num" w:pos="5760"/>
+        </w:tabs>
+        <w:ind w:left="5760" w:hanging="360"/>
+      </w:pPr>
+      <w:rPr>
+        <w:rFonts w:ascii="Wingdings" w:hAnsi="Wingdings" w:hint="default"/>
+        <w:sz w:val="20"/>
+      </w:rPr>
+    </w:lvl>
+    <w:lvl w:ilvl="8" w:tentative="1">
+      <w:start w:val="1"/>
+      <w:numFmt w:val="bullet"/>
+      <w:lvlText w:val=""/>
+      <w:lvlJc w:val="left"/>
+      <w:pPr>
+        <w:tabs>
+          <w:tab w:val="num" w:pos="6480"/>
+        </w:tabs>
+        <w:ind w:left="6480" w:hanging="360"/>
+      </w:pPr>
+      <w:rPr>
+        <w:rFonts w:ascii="Wingdings" w:hAnsi="Wingdings" w:hint="default"/>
+        <w:sz w:val="20"/>
+      </w:rPr>
+    </w:lvl>
+  </w:abstractNum>
+  <w:abstractNum w:abstractNumId="41" w15:restartNumberingAfterBreak="0">
     <w:nsid w:val="62790036"/>
     <w:multiLevelType w:val="multilevel"/>
     <w:tmpl w:val="93D25058"/>
@@ -10063,7 +13276,7 @@
       </w:rPr>
     </w:lvl>
   </w:abstractNum>
-  <w:abstractNum w:abstractNumId="31" w15:restartNumberingAfterBreak="0">
+  <w:abstractNum w:abstractNumId="42" w15:restartNumberingAfterBreak="0">
     <w:nsid w:val="63730EA0"/>
     <w:multiLevelType w:val="multilevel"/>
     <w:tmpl w:val="A1F0EBA8"/>
@@ -10212,7 +13425,7 @@
       </w:rPr>
     </w:lvl>
   </w:abstractNum>
-  <w:abstractNum w:abstractNumId="32" w15:restartNumberingAfterBreak="0">
+  <w:abstractNum w:abstractNumId="43" w15:restartNumberingAfterBreak="0">
     <w:nsid w:val="63CA0A21"/>
     <w:multiLevelType w:val="multilevel"/>
     <w:tmpl w:val="ABEAB454"/>
@@ -10361,7 +13574,7 @@
       </w:rPr>
     </w:lvl>
   </w:abstractNum>
-  <w:abstractNum w:abstractNumId="33" w15:restartNumberingAfterBreak="0">
+  <w:abstractNum w:abstractNumId="44" w15:restartNumberingAfterBreak="0">
     <w:nsid w:val="6C427D99"/>
     <w:multiLevelType w:val="multilevel"/>
     <w:tmpl w:val="6C26539A"/>
@@ -10510,7 +13723,7 @@
       </w:rPr>
     </w:lvl>
   </w:abstractNum>
-  <w:abstractNum w:abstractNumId="34" w15:restartNumberingAfterBreak="0">
+  <w:abstractNum w:abstractNumId="45" w15:restartNumberingAfterBreak="0">
     <w:nsid w:val="6C76368B"/>
     <w:multiLevelType w:val="multilevel"/>
     <w:tmpl w:val="53D44A26"/>
@@ -10659,7 +13872,7 @@
       </w:rPr>
     </w:lvl>
   </w:abstractNum>
-  <w:abstractNum w:abstractNumId="35" w15:restartNumberingAfterBreak="0">
+  <w:abstractNum w:abstractNumId="46" w15:restartNumberingAfterBreak="0">
     <w:nsid w:val="7B204074"/>
     <w:multiLevelType w:val="multilevel"/>
     <w:tmpl w:val="E6C803BC"/>
@@ -10812,109 +14025,142 @@
     <w:abstractNumId w:val="0"/>
   </w:num>
   <w:num w:numId="2" w16cid:durableId="278145578">
+    <w:abstractNumId w:val="28"/>
+  </w:num>
+  <w:num w:numId="3" w16cid:durableId="1082869659">
+    <w:abstractNumId w:val="12"/>
+  </w:num>
+  <w:num w:numId="4" w16cid:durableId="1399087449">
+    <w:abstractNumId w:val="44"/>
+  </w:num>
+  <w:num w:numId="5" w16cid:durableId="1590115480">
+    <w:abstractNumId w:val="14"/>
+  </w:num>
+  <w:num w:numId="6" w16cid:durableId="1275599465">
+    <w:abstractNumId w:val="7"/>
+  </w:num>
+  <w:num w:numId="7" w16cid:durableId="949821662">
+    <w:abstractNumId w:val="10"/>
+  </w:num>
+  <w:num w:numId="8" w16cid:durableId="502160085">
+    <w:abstractNumId w:val="13"/>
+  </w:num>
+  <w:num w:numId="9" w16cid:durableId="1561751620">
     <w:abstractNumId w:val="22"/>
   </w:num>
-  <w:num w:numId="3" w16cid:durableId="1082869659">
+  <w:num w:numId="10" w16cid:durableId="642005705">
+    <w:abstractNumId w:val="32"/>
+  </w:num>
+  <w:num w:numId="11" w16cid:durableId="1916285314">
+    <w:abstractNumId w:val="39"/>
+  </w:num>
+  <w:num w:numId="12" w16cid:durableId="112209799">
     <w:abstractNumId w:val="9"/>
   </w:num>
-  <w:num w:numId="4" w16cid:durableId="1399087449">
-    <w:abstractNumId w:val="33"/>
-  </w:num>
-  <w:num w:numId="5" w16cid:durableId="1590115480">
-    <w:abstractNumId w:val="11"/>
-  </w:num>
-  <w:num w:numId="6" w16cid:durableId="1275599465">
+  <w:num w:numId="13" w16cid:durableId="2034110977">
     <w:abstractNumId w:val="5"/>
   </w:num>
-  <w:num w:numId="7" w16cid:durableId="949821662">
-    <w:abstractNumId w:val="8"/>
+  <w:num w:numId="14" w16cid:durableId="1815020617">
+    <w:abstractNumId w:val="45"/>
   </w:num>
-  <w:num w:numId="8" w16cid:durableId="502160085">
-    <w:abstractNumId w:val="10"/>
-  </w:num>
-  <w:num w:numId="9" w16cid:durableId="1561751620">
+  <w:num w:numId="15" w16cid:durableId="122311294">
     <w:abstractNumId w:val="18"/>
   </w:num>
-  <w:num w:numId="10" w16cid:durableId="642005705">
-    <w:abstractNumId w:val="25"/>
-  </w:num>
-  <w:num w:numId="11" w16cid:durableId="1916285314">
-    <w:abstractNumId w:val="29"/>
-  </w:num>
-  <w:num w:numId="12" w16cid:durableId="112209799">
-    <w:abstractNumId w:val="7"/>
-  </w:num>
-  <w:num w:numId="13" w16cid:durableId="2034110977">
-    <w:abstractNumId w:val="4"/>
-  </w:num>
-  <w:num w:numId="14" w16cid:durableId="1815020617">
-    <w:abstractNumId w:val="34"/>
-  </w:num>
-  <w:num w:numId="15" w16cid:durableId="122311294">
-    <w:abstractNumId w:val="14"/>
-  </w:num>
   <w:num w:numId="16" w16cid:durableId="1880705022">
-    <w:abstractNumId w:val="32"/>
+    <w:abstractNumId w:val="43"/>
   </w:num>
   <w:num w:numId="17" w16cid:durableId="245304063">
-    <w:abstractNumId w:val="19"/>
+    <w:abstractNumId w:val="24"/>
   </w:num>
   <w:num w:numId="18" w16cid:durableId="130291419">
     <w:abstractNumId w:val="3"/>
   </w:num>
   <w:num w:numId="19" w16cid:durableId="175270223">
-    <w:abstractNumId w:val="26"/>
+    <w:abstractNumId w:val="35"/>
   </w:num>
   <w:num w:numId="20" w16cid:durableId="1088422739">
-    <w:abstractNumId w:val="16"/>
+    <w:abstractNumId w:val="20"/>
   </w:num>
   <w:num w:numId="21" w16cid:durableId="943269753">
-    <w:abstractNumId w:val="23"/>
+    <w:abstractNumId w:val="29"/>
   </w:num>
   <w:num w:numId="22" w16cid:durableId="1132791763">
-    <w:abstractNumId w:val="21"/>
+    <w:abstractNumId w:val="27"/>
   </w:num>
   <w:num w:numId="23" w16cid:durableId="1311708505">
-    <w:abstractNumId w:val="20"/>
+    <w:abstractNumId w:val="25"/>
   </w:num>
   <w:num w:numId="24" w16cid:durableId="863400549">
-    <w:abstractNumId w:val="6"/>
+    <w:abstractNumId w:val="8"/>
   </w:num>
   <w:num w:numId="25" w16cid:durableId="790245534">
-    <w:abstractNumId w:val="35"/>
+    <w:abstractNumId w:val="46"/>
   </w:num>
   <w:num w:numId="26" w16cid:durableId="1656452626">
-    <w:abstractNumId w:val="13"/>
+    <w:abstractNumId w:val="17"/>
   </w:num>
   <w:num w:numId="27" w16cid:durableId="1394891037">
     <w:abstractNumId w:val="2"/>
   </w:num>
   <w:num w:numId="28" w16cid:durableId="139657957">
-    <w:abstractNumId w:val="31"/>
+    <w:abstractNumId w:val="42"/>
   </w:num>
   <w:num w:numId="29" w16cid:durableId="1263414231">
-    <w:abstractNumId w:val="12"/>
+    <w:abstractNumId w:val="16"/>
   </w:num>
   <w:num w:numId="30" w16cid:durableId="667756751">
+    <w:abstractNumId w:val="41"/>
+  </w:num>
+  <w:num w:numId="31" w16cid:durableId="1266379373">
     <w:abstractNumId w:val="30"/>
   </w:num>
-  <w:num w:numId="31" w16cid:durableId="1266379373">
-    <w:abstractNumId w:val="24"/>
-  </w:num>
   <w:num w:numId="32" w16cid:durableId="883054225">
-    <w:abstractNumId w:val="28"/>
+    <w:abstractNumId w:val="38"/>
   </w:num>
   <w:num w:numId="33" w16cid:durableId="624852574">
-    <w:abstractNumId w:val="27"/>
+    <w:abstractNumId w:val="37"/>
   </w:num>
   <w:num w:numId="34" w16cid:durableId="943994323">
-    <w:abstractNumId w:val="15"/>
+    <w:abstractNumId w:val="19"/>
   </w:num>
   <w:num w:numId="35" w16cid:durableId="568460629">
-    <w:abstractNumId w:val="17"/>
+    <w:abstractNumId w:val="21"/>
   </w:num>
   <w:num w:numId="36" w16cid:durableId="1182277291">
     <w:abstractNumId w:val="1"/>
+  </w:num>
+  <w:num w:numId="37" w16cid:durableId="1388527229">
+    <w:abstractNumId w:val="15"/>
+  </w:num>
+  <w:num w:numId="38" w16cid:durableId="25913813">
+    <w:abstractNumId w:val="4"/>
+  </w:num>
+  <w:num w:numId="39" w16cid:durableId="1563061307">
+    <w:abstractNumId w:val="11"/>
+  </w:num>
+  <w:num w:numId="40" w16cid:durableId="1532306481">
+    <w:abstractNumId w:val="6"/>
+  </w:num>
+  <w:num w:numId="41" w16cid:durableId="407575439">
+    <w:abstractNumId w:val="31"/>
+  </w:num>
+  <w:num w:numId="42" w16cid:durableId="1741555141">
+    <w:abstractNumId w:val="23"/>
+  </w:num>
+  <w:num w:numId="43" w16cid:durableId="1881890696">
+    <w:abstractNumId w:val="36"/>
+  </w:num>
+  <w:num w:numId="44" w16cid:durableId="822552679">
+    <w:abstractNumId w:val="40"/>
+  </w:num>
+  <w:num w:numId="45" w16cid:durableId="729034471">
+    <w:abstractNumId w:val="34"/>
+  </w:num>
+  <w:num w:numId="46" w16cid:durableId="554045489">
+    <w:abstractNumId w:val="26"/>
+  </w:num>
+  <w:num w:numId="47" w16cid:durableId="1540387310">
+    <w:abstractNumId w:val="33"/>
   </w:num>
 </w:numbering>
 </file>

</xml_diff>

<commit_message>
Dia 38: Especificaciones del MVP del CV analyzer
</commit_message>
<xml_diff>
--- a/Diseño de proyectos de IA/Diseño de proyectos de IA.docx
+++ b/Diseño de proyectos de IA/Diseño de proyectos de IA.docx
@@ -1972,15 +1972,7 @@
     </w:p>
     <w:p>
       <w:r>
-        <w:t xml:space="preserve">En </w:t>
-      </w:r>
-      <w:proofErr w:type="gramStart"/>
-      <w:r>
-        <w:t>realidad</w:t>
-      </w:r>
-      <w:proofErr w:type="gramEnd"/>
-      <w:r>
-        <w:t xml:space="preserve"> suele ser </w:t>
+        <w:t xml:space="preserve">En realidad suele ser </w:t>
       </w:r>
       <w:r>
         <w:rPr>
@@ -4130,29 +4122,7 @@
           <w:szCs w:val="28"/>
           <w:u w:val="single"/>
         </w:rPr>
-        <w:t xml:space="preserve">Sistemas que ya </w:t>
-      </w:r>
-      <w:proofErr w:type="gramStart"/>
-      <w:r>
-        <w:rPr>
-          <w:b/>
-          <w:bCs/>
-          <w:sz w:val="28"/>
-          <w:szCs w:val="28"/>
-          <w:u w:val="single"/>
-        </w:rPr>
-        <w:t>existen</w:t>
-      </w:r>
-      <w:proofErr w:type="gramEnd"/>
-      <w:r>
-        <w:rPr>
-          <w:b/>
-          <w:bCs/>
-          <w:sz w:val="28"/>
-          <w:szCs w:val="28"/>
-          <w:u w:val="single"/>
-        </w:rPr>
-        <w:t xml:space="preserve"> pero son malos</w:t>
+        <w:t>Sistemas que ya existen pero son malos</w:t>
       </w:r>
     </w:p>
     <w:p>
@@ -4407,18 +4377,10 @@
         <w:t>:</w:t>
       </w:r>
       <w:r>
-        <w:t xml:space="preserve"> datos del alumno (materias aprobadas, </w:t>
-      </w:r>
-      <w:proofErr w:type="gramStart"/>
-      <w:r>
-        <w:t>estado)</w:t>
-      </w:r>
-      <w:r>
-        <w:t>LLM</w:t>
-      </w:r>
-      <w:proofErr w:type="gramEnd"/>
-      <w:r>
-        <w:t>: Contesta la pregunta</w:t>
+        <w:t xml:space="preserve"> datos del alumno (materias aprobadas, estado)</w:t>
+      </w:r>
+      <w:r>
+        <w:t>LLM: Contesta la pregunta</w:t>
       </w:r>
     </w:p>
     <w:p>
@@ -5347,1661 +5309,6 @@
       </w:r>
     </w:p>
     <w:p/>
-    <w:p>
-      <w:pPr>
-        <w:rPr>
-          <w:b/>
-          <w:bCs/>
-          <w:sz w:val="36"/>
-          <w:szCs w:val="36"/>
-          <w:u w:val="single"/>
-        </w:rPr>
-      </w:pPr>
-      <w:proofErr w:type="spellStart"/>
-      <w:r>
-        <w:rPr>
-          <w:b/>
-          <w:bCs/>
-          <w:sz w:val="36"/>
-          <w:szCs w:val="36"/>
-          <w:u w:val="single"/>
-        </w:rPr>
-        <w:t>Roadmap</w:t>
-      </w:r>
-      <w:proofErr w:type="spellEnd"/>
-      <w:r>
-        <w:rPr>
-          <w:b/>
-          <w:bCs/>
-          <w:sz w:val="36"/>
-          <w:szCs w:val="36"/>
-          <w:u w:val="single"/>
-        </w:rPr>
-        <w:t xml:space="preserve"> del proyecto (CV </w:t>
-      </w:r>
-      <w:proofErr w:type="spellStart"/>
-      <w:r>
-        <w:rPr>
-          <w:b/>
-          <w:bCs/>
-          <w:sz w:val="36"/>
-          <w:szCs w:val="36"/>
-          <w:u w:val="single"/>
-        </w:rPr>
-        <w:t>Analyzer</w:t>
-      </w:r>
-      <w:proofErr w:type="spellEnd"/>
-      <w:r>
-        <w:rPr>
-          <w:b/>
-          <w:bCs/>
-          <w:sz w:val="36"/>
-          <w:szCs w:val="36"/>
-          <w:u w:val="single"/>
-        </w:rPr>
-        <w:t>)</w:t>
-      </w:r>
-    </w:p>
-    <w:p>
-      <w:pPr>
-        <w:rPr>
-          <w:rFonts w:cstheme="minorHAnsi"/>
-          <w:b/>
-          <w:bCs/>
-          <w:sz w:val="28"/>
-          <w:szCs w:val="28"/>
-          <w:u w:val="single"/>
-        </w:rPr>
-      </w:pPr>
-      <w:r>
-        <w:rPr>
-          <w:rFonts w:ascii="Segoe UI Emoji" w:hAnsi="Segoe UI Emoji" w:cs="Segoe UI Emoji"/>
-          <w:b/>
-          <w:bCs/>
-          <w:sz w:val="28"/>
-          <w:szCs w:val="28"/>
-          <w:u w:val="single"/>
-        </w:rPr>
-        <w:t>🎯</w:t>
-      </w:r>
-      <w:r>
-        <w:rPr>
-          <w:rFonts w:cstheme="minorHAnsi"/>
-          <w:b/>
-          <w:bCs/>
-          <w:sz w:val="28"/>
-          <w:szCs w:val="28"/>
-          <w:u w:val="single"/>
-        </w:rPr>
-        <w:t xml:space="preserve"> Objetivo</w:t>
-      </w:r>
-    </w:p>
-    <w:p>
-      <w:r>
-        <w:t>Convertir tu proyecto en:</w:t>
-      </w:r>
-    </w:p>
-    <w:p>
-      <w:r>
-        <w:rPr>
-          <w:b/>
-          <w:bCs/>
-        </w:rPr>
-        <w:t xml:space="preserve">pasos concretos que </w:t>
-      </w:r>
-      <w:proofErr w:type="spellStart"/>
-      <w:r>
-        <w:rPr>
-          <w:b/>
-          <w:bCs/>
-        </w:rPr>
-        <w:t>podés</w:t>
-      </w:r>
-      <w:proofErr w:type="spellEnd"/>
-      <w:r>
-        <w:rPr>
-          <w:b/>
-          <w:bCs/>
-        </w:rPr>
-        <w:t xml:space="preserve"> ejecutar sin perderte</w:t>
-      </w:r>
-    </w:p>
-    <w:p>
-      <w:r>
-        <w:pict w14:anchorId="097647DE">
-          <v:rect id="_x0000_i1202" style="width:0;height:1.5pt" o:hralign="center" o:hrstd="t" o:hr="t" fillcolor="#a0a0a0" stroked="f"/>
-        </w:pict>
-      </w:r>
-    </w:p>
-    <w:p>
-      <w:pPr>
-        <w:rPr>
-          <w:rFonts w:cstheme="minorHAnsi"/>
-          <w:b/>
-          <w:bCs/>
-          <w:sz w:val="28"/>
-          <w:szCs w:val="28"/>
-          <w:u w:val="single"/>
-        </w:rPr>
-      </w:pPr>
-      <w:r>
-        <w:rPr>
-          <w:rFonts w:ascii="Segoe UI Emoji" w:hAnsi="Segoe UI Emoji" w:cs="Segoe UI Emoji"/>
-          <w:b/>
-          <w:bCs/>
-          <w:sz w:val="28"/>
-          <w:szCs w:val="28"/>
-          <w:u w:val="single"/>
-        </w:rPr>
-        <w:t>🧠</w:t>
-      </w:r>
-      <w:r>
-        <w:rPr>
-          <w:rFonts w:cstheme="minorHAnsi"/>
-          <w:b/>
-          <w:bCs/>
-          <w:sz w:val="28"/>
-          <w:szCs w:val="28"/>
-          <w:u w:val="single"/>
-        </w:rPr>
-        <w:t xml:space="preserve"> Error más común</w:t>
-      </w:r>
-    </w:p>
-    <w:p>
-      <w:r>
-        <w:t>Intentar hacer esto:</w:t>
-      </w:r>
-    </w:p>
-    <w:p>
-      <w:r>
-        <w:t xml:space="preserve">todo junto → LLM + ML + RAG + UI + </w:t>
-      </w:r>
-      <w:proofErr w:type="spellStart"/>
-      <w:r>
-        <w:t>deploy</w:t>
-      </w:r>
-      <w:proofErr w:type="spellEnd"/>
-    </w:p>
-    <w:p>
-      <w:r>
-        <w:rPr>
-          <w:rFonts w:ascii="Segoe UI Emoji" w:hAnsi="Segoe UI Emoji" w:cs="Segoe UI Emoji"/>
-        </w:rPr>
-        <w:t>👉</w:t>
-      </w:r>
-      <w:r>
-        <w:t xml:space="preserve"> Resultado: te </w:t>
-      </w:r>
-      <w:proofErr w:type="spellStart"/>
-      <w:r>
-        <w:t>trabás</w:t>
-      </w:r>
-      <w:proofErr w:type="spellEnd"/>
-      <w:r>
-        <w:t>.</w:t>
-      </w:r>
-    </w:p>
-    <w:p>
-      <w:r>
-        <w:pict w14:anchorId="19AFD4CF">
-          <v:rect id="_x0000_i1203" style="width:0;height:1.5pt" o:hralign="center" o:hrstd="t" o:hr="t" fillcolor="#a0a0a0" stroked="f"/>
-        </w:pict>
-      </w:r>
-    </w:p>
-    <w:p>
-      <w:pPr>
-        <w:rPr>
-          <w:rFonts w:cstheme="minorHAnsi"/>
-          <w:b/>
-          <w:bCs/>
-          <w:sz w:val="28"/>
-          <w:szCs w:val="28"/>
-          <w:u w:val="single"/>
-        </w:rPr>
-      </w:pPr>
-      <w:r>
-        <w:rPr>
-          <w:rFonts w:ascii="Segoe UI Emoji" w:hAnsi="Segoe UI Emoji" w:cs="Segoe UI Emoji"/>
-          <w:b/>
-          <w:bCs/>
-          <w:sz w:val="28"/>
-          <w:szCs w:val="28"/>
-          <w:u w:val="single"/>
-        </w:rPr>
-        <w:t>🧠</w:t>
-      </w:r>
-      <w:r>
-        <w:rPr>
-          <w:rFonts w:cstheme="minorHAnsi"/>
-          <w:b/>
-          <w:bCs/>
-          <w:sz w:val="28"/>
-          <w:szCs w:val="28"/>
-          <w:u w:val="single"/>
-        </w:rPr>
-        <w:t xml:space="preserve"> Regla clave</w:t>
-      </w:r>
-    </w:p>
-    <w:p>
-      <w:r>
-        <w:t>Construir en capas simples, una por vez.</w:t>
-      </w:r>
-    </w:p>
-    <w:p>
-      <w:r>
-        <w:pict w14:anchorId="0983D5C8">
-          <v:rect id="_x0000_i1204" style="width:0;height:1.5pt" o:hralign="center" o:hrstd="t" o:hr="t" fillcolor="#a0a0a0" stroked="f"/>
-        </w:pict>
-      </w:r>
-    </w:p>
-    <w:p>
-      <w:pPr>
-        <w:rPr>
-          <w:rFonts w:cstheme="minorHAnsi"/>
-          <w:b/>
-          <w:bCs/>
-          <w:sz w:val="28"/>
-          <w:szCs w:val="28"/>
-          <w:u w:val="single"/>
-        </w:rPr>
-      </w:pPr>
-      <w:r>
-        <w:rPr>
-          <w:rFonts w:ascii="Segoe UI Emoji" w:hAnsi="Segoe UI Emoji" w:cs="Segoe UI Emoji"/>
-          <w:b/>
-          <w:bCs/>
-          <w:sz w:val="28"/>
-          <w:szCs w:val="28"/>
-          <w:u w:val="single"/>
-        </w:rPr>
-        <w:t>🧱</w:t>
-      </w:r>
-      <w:r>
-        <w:rPr>
-          <w:rFonts w:cstheme="minorHAnsi"/>
-          <w:b/>
-          <w:bCs/>
-          <w:sz w:val="28"/>
-          <w:szCs w:val="28"/>
-          <w:u w:val="single"/>
-        </w:rPr>
-        <w:t xml:space="preserve"> </w:t>
-      </w:r>
-      <w:proofErr w:type="spellStart"/>
-      <w:r>
-        <w:rPr>
-          <w:rFonts w:cstheme="minorHAnsi"/>
-          <w:b/>
-          <w:bCs/>
-          <w:sz w:val="28"/>
-          <w:szCs w:val="28"/>
-          <w:u w:val="single"/>
-        </w:rPr>
-        <w:t>Roadmap</w:t>
-      </w:r>
-      <w:proofErr w:type="spellEnd"/>
-      <w:r>
-        <w:rPr>
-          <w:rFonts w:cstheme="minorHAnsi"/>
-          <w:b/>
-          <w:bCs/>
-          <w:sz w:val="28"/>
-          <w:szCs w:val="28"/>
-          <w:u w:val="single"/>
-        </w:rPr>
-        <w:t xml:space="preserve"> en 5 </w:t>
-      </w:r>
-      <w:proofErr w:type="gramStart"/>
-      <w:r>
-        <w:rPr>
-          <w:rFonts w:cstheme="minorHAnsi"/>
-          <w:b/>
-          <w:bCs/>
-          <w:sz w:val="28"/>
-          <w:szCs w:val="28"/>
-          <w:u w:val="single"/>
-        </w:rPr>
-        <w:t>fases</w:t>
-      </w:r>
-      <w:r>
-        <w:rPr>
-          <w:rFonts w:cstheme="minorHAnsi"/>
-          <w:b/>
-          <w:bCs/>
-          <w:sz w:val="28"/>
-          <w:szCs w:val="28"/>
-          <w:u w:val="single"/>
-        </w:rPr>
-        <w:t>(</w:t>
-      </w:r>
-      <w:proofErr w:type="gramEnd"/>
-      <w:r>
-        <w:rPr>
-          <w:rFonts w:cstheme="minorHAnsi"/>
-          <w:b/>
-          <w:bCs/>
-          <w:sz w:val="28"/>
-          <w:szCs w:val="28"/>
-          <w:u w:val="single"/>
-        </w:rPr>
-        <w:t>Con LL</w:t>
-      </w:r>
-      <w:r>
-        <w:rPr>
-          <w:rFonts w:cstheme="minorHAnsi"/>
-          <w:b/>
-          <w:bCs/>
-          <w:sz w:val="28"/>
-          <w:szCs w:val="28"/>
-          <w:u w:val="single"/>
-        </w:rPr>
-        <w:t>M</w:t>
-      </w:r>
-      <w:r>
-        <w:rPr>
-          <w:rFonts w:cstheme="minorHAnsi"/>
-          <w:b/>
-          <w:bCs/>
-          <w:sz w:val="28"/>
-          <w:szCs w:val="28"/>
-          <w:u w:val="single"/>
-        </w:rPr>
-        <w:t>)</w:t>
-      </w:r>
-    </w:p>
-    <w:p>
-      <w:r>
-        <w:pict w14:anchorId="21ACFF33">
-          <v:rect id="_x0000_i1205" style="width:0;height:1.5pt" o:hralign="center" o:hrstd="t" o:hr="t" fillcolor="#a0a0a0" stroked="f"/>
-        </w:pict>
-      </w:r>
-    </w:p>
-    <w:p>
-      <w:pPr>
-        <w:rPr>
-          <w:b/>
-          <w:bCs/>
-        </w:rPr>
-      </w:pPr>
-      <w:r>
-        <w:rPr>
-          <w:rFonts w:ascii="Segoe UI Emoji" w:hAnsi="Segoe UI Emoji" w:cs="Segoe UI Emoji"/>
-          <w:b/>
-          <w:bCs/>
-        </w:rPr>
-        <w:lastRenderedPageBreak/>
-        <w:t>🔹</w:t>
-      </w:r>
-      <w:r>
-        <w:rPr>
-          <w:b/>
-          <w:bCs/>
-        </w:rPr>
-        <w:t xml:space="preserve"> Fase 1 — Leer y mostrar </w:t>
-      </w:r>
-      <w:proofErr w:type="spellStart"/>
-      <w:r>
-        <w:rPr>
-          <w:b/>
-          <w:bCs/>
-        </w:rPr>
-        <w:t>CVs</w:t>
-      </w:r>
-      <w:proofErr w:type="spellEnd"/>
-      <w:r>
-        <w:rPr>
-          <w:b/>
-          <w:bCs/>
-        </w:rPr>
-        <w:t xml:space="preserve"> (base)</w:t>
-      </w:r>
-    </w:p>
-    <w:p>
-      <w:r>
-        <w:t>Objetivo:</w:t>
-      </w:r>
-    </w:p>
-    <w:p>
-      <w:pPr>
-        <w:numPr>
-          <w:ilvl w:val="0"/>
-          <w:numId w:val="37"/>
-        </w:numPr>
-      </w:pPr>
-      <w:r>
-        <w:t xml:space="preserve">cargar </w:t>
-      </w:r>
-      <w:proofErr w:type="spellStart"/>
-      <w:r>
-        <w:t>CVs</w:t>
-      </w:r>
-      <w:proofErr w:type="spellEnd"/>
-      <w:r>
-        <w:t xml:space="preserve"> (PDF o texto) </w:t>
-      </w:r>
-    </w:p>
-    <w:p>
-      <w:pPr>
-        <w:numPr>
-          <w:ilvl w:val="0"/>
-          <w:numId w:val="37"/>
-        </w:numPr>
-      </w:pPr>
-      <w:r>
-        <w:t xml:space="preserve">mostrar el contenido </w:t>
-      </w:r>
-    </w:p>
-    <w:p>
-      <w:r>
-        <w:t>Nada de IA todavía.</w:t>
-      </w:r>
-    </w:p>
-    <w:p>
-      <w:r>
-        <w:t>Ejemplo:</w:t>
-      </w:r>
-    </w:p>
-    <w:p>
-      <w:pPr>
-        <w:rPr>
-          <w:lang w:val="en-US"/>
-        </w:rPr>
-      </w:pPr>
-      <w:r>
-        <w:rPr>
-          <w:lang w:val="en-US"/>
-        </w:rPr>
-        <w:t>Input: CV.pdf</w:t>
-      </w:r>
-      <w:r>
-        <w:rPr>
-          <w:lang w:val="en-US"/>
-        </w:rPr>
-        <w:br/>
-        <w:t xml:space="preserve">Output: </w:t>
-      </w:r>
-      <w:proofErr w:type="spellStart"/>
-      <w:r>
-        <w:rPr>
-          <w:lang w:val="en-US"/>
-        </w:rPr>
-        <w:t>texto</w:t>
-      </w:r>
-      <w:proofErr w:type="spellEnd"/>
-      <w:r>
-        <w:rPr>
-          <w:lang w:val="en-US"/>
-        </w:rPr>
-        <w:t xml:space="preserve"> del CV</w:t>
-      </w:r>
-    </w:p>
-    <w:p>
-      <w:r>
-        <w:rPr>
-          <w:rFonts w:ascii="Segoe UI Emoji" w:hAnsi="Segoe UI Emoji" w:cs="Segoe UI Emoji"/>
-        </w:rPr>
-        <w:t>📌</w:t>
-      </w:r>
-      <w:r>
-        <w:t xml:space="preserve"> Esto asegura que el pipeline empieza bien.</w:t>
-      </w:r>
-    </w:p>
-    <w:p>
-      <w:r>
-        <w:pict w14:anchorId="04C6FB15">
-          <v:rect id="_x0000_i1206" style="width:0;height:1.5pt" o:hralign="center" o:hrstd="t" o:hr="t" fillcolor="#a0a0a0" stroked="f"/>
-        </w:pict>
-      </w:r>
-    </w:p>
-    <w:p>
-      <w:pPr>
-        <w:rPr>
-          <w:b/>
-          <w:bCs/>
-        </w:rPr>
-      </w:pPr>
-      <w:r>
-        <w:rPr>
-          <w:rFonts w:ascii="Segoe UI Emoji" w:hAnsi="Segoe UI Emoji" w:cs="Segoe UI Emoji"/>
-          <w:b/>
-          <w:bCs/>
-        </w:rPr>
-        <w:t>🔹</w:t>
-      </w:r>
-      <w:r>
-        <w:rPr>
-          <w:b/>
-          <w:bCs/>
-        </w:rPr>
-        <w:t xml:space="preserve"> Fase 2 — Extracción con LLM (sin ML)</w:t>
-      </w:r>
-    </w:p>
-    <w:p>
-      <w:r>
-        <w:t>Objetivo:</w:t>
-      </w:r>
-    </w:p>
-    <w:p>
-      <w:pPr>
-        <w:numPr>
-          <w:ilvl w:val="0"/>
-          <w:numId w:val="38"/>
-        </w:numPr>
-      </w:pPr>
-      <w:r>
-        <w:t xml:space="preserve">extraer </w:t>
-      </w:r>
-      <w:proofErr w:type="spellStart"/>
-      <w:r>
-        <w:t>info</w:t>
-      </w:r>
-      <w:proofErr w:type="spellEnd"/>
-      <w:r>
-        <w:t xml:space="preserve"> clave: </w:t>
-      </w:r>
-    </w:p>
-    <w:p>
-      <w:r>
-        <w:t>nombre</w:t>
-      </w:r>
-      <w:r>
-        <w:br/>
-      </w:r>
-      <w:proofErr w:type="spellStart"/>
-      <w:r>
-        <w:t>skills</w:t>
-      </w:r>
-      <w:proofErr w:type="spellEnd"/>
-      <w:r>
-        <w:br/>
-        <w:t>años de experiencia</w:t>
-      </w:r>
-      <w:r>
-        <w:br/>
-        <w:t>educación</w:t>
-      </w:r>
-    </w:p>
-    <w:p>
-      <w:r>
-        <w:t>Ejemplo output:</w:t>
-      </w:r>
-    </w:p>
-    <w:p>
-      <w:r>
-        <w:t>{</w:t>
-      </w:r>
-      <w:r>
-        <w:br/>
-        <w:t xml:space="preserve">  "nombre": "Juan",</w:t>
-      </w:r>
-      <w:r>
-        <w:br/>
-        <w:t xml:space="preserve">  "</w:t>
-      </w:r>
-      <w:proofErr w:type="spellStart"/>
-      <w:r>
-        <w:t>skills</w:t>
-      </w:r>
-      <w:proofErr w:type="spellEnd"/>
-      <w:r>
-        <w:t>": ["Python", "SQL"],</w:t>
-      </w:r>
-      <w:r>
-        <w:br/>
-        <w:t xml:space="preserve">  "experiencia": 3</w:t>
-      </w:r>
-      <w:r>
-        <w:br/>
-        <w:t>}</w:t>
-      </w:r>
-    </w:p>
-    <w:p>
-      <w:r>
-        <w:rPr>
-          <w:rFonts w:ascii="Segoe UI Emoji" w:hAnsi="Segoe UI Emoji" w:cs="Segoe UI Emoji"/>
-        </w:rPr>
-        <w:t>📌</w:t>
-      </w:r>
-      <w:r>
-        <w:t xml:space="preserve"> Ya empieza a parecer IA.</w:t>
-      </w:r>
-    </w:p>
-    <w:p>
-      <w:r>
-        <w:pict w14:anchorId="609B06E7">
-          <v:rect id="_x0000_i1207" style="width:0;height:1.5pt" o:hralign="center" o:hrstd="t" o:hr="t" fillcolor="#a0a0a0" stroked="f"/>
-        </w:pict>
-      </w:r>
-    </w:p>
-    <w:p>
-      <w:pPr>
-        <w:rPr>
-          <w:b/>
-          <w:bCs/>
-        </w:rPr>
-      </w:pPr>
-      <w:r>
-        <w:rPr>
-          <w:rFonts w:ascii="Segoe UI Emoji" w:hAnsi="Segoe UI Emoji" w:cs="Segoe UI Emoji"/>
-          <w:b/>
-          <w:bCs/>
-        </w:rPr>
-        <w:t>🔹</w:t>
-      </w:r>
-      <w:r>
-        <w:rPr>
-          <w:b/>
-          <w:bCs/>
-        </w:rPr>
-        <w:t xml:space="preserve"> Fase 3 — </w:t>
-      </w:r>
-      <w:proofErr w:type="spellStart"/>
-      <w:r>
-        <w:rPr>
-          <w:b/>
-          <w:bCs/>
-        </w:rPr>
-        <w:t>Scoring</w:t>
-      </w:r>
-      <w:proofErr w:type="spellEnd"/>
-      <w:r>
-        <w:rPr>
-          <w:b/>
-          <w:bCs/>
-        </w:rPr>
-        <w:t xml:space="preserve"> simple (sin ML todavía)</w:t>
-      </w:r>
-    </w:p>
-    <w:p>
-      <w:r>
-        <w:t>Antes de ML real:</w:t>
-      </w:r>
-    </w:p>
-    <w:p>
-      <w:pPr>
-        <w:numPr>
-          <w:ilvl w:val="0"/>
-          <w:numId w:val="39"/>
-        </w:numPr>
-      </w:pPr>
-      <w:r>
-        <w:t xml:space="preserve">reglas simples </w:t>
-      </w:r>
-    </w:p>
-    <w:p>
-      <w:r>
-        <w:t>Ejemplo:</w:t>
-      </w:r>
-    </w:p>
-    <w:p>
-      <w:r>
-        <w:t>+2 si tiene Python</w:t>
-      </w:r>
-      <w:r>
-        <w:br/>
-        <w:t>+1 si tiene SQL</w:t>
-      </w:r>
-      <w:r>
-        <w:br/>
-        <w:t>+1 si experiencia &gt; 2 años</w:t>
-      </w:r>
-    </w:p>
-    <w:p>
-      <w:r>
-        <w:rPr>
-          <w:rFonts w:ascii="Segoe UI Emoji" w:hAnsi="Segoe UI Emoji" w:cs="Segoe UI Emoji"/>
-        </w:rPr>
-        <w:t>📌</w:t>
-      </w:r>
-      <w:r>
-        <w:t xml:space="preserve"> Esto te permite validar lógica sin complejidad.</w:t>
-      </w:r>
-    </w:p>
-    <w:p>
-      <w:r>
-        <w:pict w14:anchorId="3664C78D">
-          <v:rect id="_x0000_i1208" style="width:0;height:1.5pt" o:hralign="center" o:hrstd="t" o:hr="t" fillcolor="#a0a0a0" stroked="f"/>
-        </w:pict>
-      </w:r>
-    </w:p>
-    <w:p>
-      <w:pPr>
-        <w:rPr>
-          <w:b/>
-          <w:bCs/>
-        </w:rPr>
-      </w:pPr>
-      <w:r>
-        <w:rPr>
-          <w:rFonts w:ascii="Segoe UI Emoji" w:hAnsi="Segoe UI Emoji" w:cs="Segoe UI Emoji"/>
-          <w:b/>
-          <w:bCs/>
-        </w:rPr>
-        <w:lastRenderedPageBreak/>
-        <w:t>🔹</w:t>
-      </w:r>
-      <w:r>
-        <w:rPr>
-          <w:b/>
-          <w:bCs/>
-        </w:rPr>
-        <w:t xml:space="preserve"> Fase 4 — Ranking</w:t>
-      </w:r>
-    </w:p>
-    <w:p>
-      <w:pPr>
-        <w:numPr>
-          <w:ilvl w:val="0"/>
-          <w:numId w:val="40"/>
-        </w:numPr>
-      </w:pPr>
-      <w:r>
-        <w:t xml:space="preserve">ordenar candidatos por score </w:t>
-      </w:r>
-    </w:p>
-    <w:p>
-      <w:r>
-        <w:t>Ejemplo:</w:t>
-      </w:r>
-    </w:p>
-    <w:p>
-      <w:r>
-        <w:t>1. Juan → 5 puntos</w:t>
-      </w:r>
-      <w:r>
-        <w:br/>
-        <w:t>2. Ana → 3 puntos</w:t>
-      </w:r>
-    </w:p>
-    <w:p>
-      <w:r>
-        <w:rPr>
-          <w:rFonts w:ascii="Segoe UI Emoji" w:hAnsi="Segoe UI Emoji" w:cs="Segoe UI Emoji"/>
-        </w:rPr>
-        <w:t>📌</w:t>
-      </w:r>
-      <w:r>
-        <w:t xml:space="preserve"> Ya </w:t>
-      </w:r>
-      <w:proofErr w:type="spellStart"/>
-      <w:r>
-        <w:t>tenés</w:t>
-      </w:r>
-      <w:proofErr w:type="spellEnd"/>
-      <w:r>
-        <w:t xml:space="preserve"> un sistema funcional.</w:t>
-      </w:r>
-    </w:p>
-    <w:p>
-      <w:r>
-        <w:pict w14:anchorId="53483AD2">
-          <v:rect id="_x0000_i1209" style="width:0;height:1.5pt" o:hralign="center" o:hrstd="t" o:hr="t" fillcolor="#a0a0a0" stroked="f"/>
-        </w:pict>
-      </w:r>
-    </w:p>
-    <w:p>
-      <w:pPr>
-        <w:rPr>
-          <w:b/>
-          <w:bCs/>
-        </w:rPr>
-      </w:pPr>
-      <w:r>
-        <w:rPr>
-          <w:rFonts w:ascii="Segoe UI Emoji" w:hAnsi="Segoe UI Emoji" w:cs="Segoe UI Emoji"/>
-          <w:b/>
-          <w:bCs/>
-        </w:rPr>
-        <w:t>🔹</w:t>
-      </w:r>
-      <w:r>
-        <w:rPr>
-          <w:b/>
-          <w:bCs/>
-        </w:rPr>
-        <w:t xml:space="preserve"> Fase 5 — Explicación con LLM</w:t>
-      </w:r>
-    </w:p>
-    <w:p>
-      <w:pPr>
-        <w:numPr>
-          <w:ilvl w:val="0"/>
-          <w:numId w:val="41"/>
-        </w:numPr>
-      </w:pPr>
-      <w:r>
-        <w:t xml:space="preserve">explicar por qué alguien es bueno </w:t>
-      </w:r>
-    </w:p>
-    <w:p>
-      <w:r>
-        <w:t>Ejemplo:</w:t>
-      </w:r>
-    </w:p>
-    <w:p>
-      <w:r>
-        <w:t xml:space="preserve">"Juan es buen candidato porque tiene experiencia en Python y </w:t>
-      </w:r>
-      <w:proofErr w:type="gramStart"/>
-      <w:r>
-        <w:t>ML...</w:t>
-      </w:r>
-      <w:proofErr w:type="gramEnd"/>
-      <w:r>
-        <w:t>"</w:t>
-      </w:r>
-    </w:p>
-    <w:p>
-      <w:r>
-        <w:pict w14:anchorId="150578E3">
-          <v:rect id="_x0000_i1210" style="width:0;height:1.5pt" o:hralign="center" o:hrstd="t" o:hr="t" fillcolor="#a0a0a0" stroked="f"/>
-        </w:pict>
-      </w:r>
-    </w:p>
-    <w:p>
-      <w:pPr>
-        <w:rPr>
-          <w:rFonts w:cstheme="minorHAnsi"/>
-          <w:b/>
-          <w:bCs/>
-          <w:sz w:val="28"/>
-          <w:szCs w:val="28"/>
-          <w:u w:val="single"/>
-        </w:rPr>
-      </w:pPr>
-      <w:r>
-        <w:rPr>
-          <w:rFonts w:ascii="Segoe UI Emoji" w:hAnsi="Segoe UI Emoji" w:cs="Segoe UI Emoji"/>
-          <w:b/>
-          <w:bCs/>
-          <w:sz w:val="28"/>
-          <w:szCs w:val="28"/>
-          <w:u w:val="single"/>
-        </w:rPr>
-        <w:t>🧱</w:t>
-      </w:r>
-      <w:r>
-        <w:rPr>
-          <w:rFonts w:cstheme="minorHAnsi"/>
-          <w:b/>
-          <w:bCs/>
-          <w:sz w:val="28"/>
-          <w:szCs w:val="28"/>
-          <w:u w:val="single"/>
-        </w:rPr>
-        <w:t xml:space="preserve"> </w:t>
-      </w:r>
-      <w:proofErr w:type="spellStart"/>
-      <w:r>
-        <w:rPr>
-          <w:rFonts w:cstheme="minorHAnsi"/>
-          <w:b/>
-          <w:bCs/>
-          <w:sz w:val="28"/>
-          <w:szCs w:val="28"/>
-          <w:u w:val="single"/>
-        </w:rPr>
-        <w:t>Roadmap</w:t>
-      </w:r>
-      <w:proofErr w:type="spellEnd"/>
-      <w:r>
-        <w:rPr>
-          <w:rFonts w:cstheme="minorHAnsi"/>
-          <w:b/>
-          <w:bCs/>
-          <w:sz w:val="28"/>
-          <w:szCs w:val="28"/>
-          <w:u w:val="single"/>
-        </w:rPr>
-        <w:t xml:space="preserve"> en 5 </w:t>
-      </w:r>
-      <w:proofErr w:type="gramStart"/>
-      <w:r>
-        <w:rPr>
-          <w:rFonts w:cstheme="minorHAnsi"/>
-          <w:b/>
-          <w:bCs/>
-          <w:sz w:val="28"/>
-          <w:szCs w:val="28"/>
-          <w:u w:val="single"/>
-        </w:rPr>
-        <w:t>fases</w:t>
-      </w:r>
-      <w:r>
-        <w:rPr>
-          <w:rFonts w:cstheme="minorHAnsi"/>
-          <w:b/>
-          <w:bCs/>
-          <w:sz w:val="28"/>
-          <w:szCs w:val="28"/>
-          <w:u w:val="single"/>
-        </w:rPr>
-        <w:t>(</w:t>
-      </w:r>
-      <w:proofErr w:type="gramEnd"/>
-      <w:r>
-        <w:rPr>
-          <w:rFonts w:cstheme="minorHAnsi"/>
-          <w:b/>
-          <w:bCs/>
-          <w:sz w:val="28"/>
-          <w:szCs w:val="28"/>
-          <w:u w:val="single"/>
-        </w:rPr>
-        <w:t>Sin</w:t>
-      </w:r>
-      <w:r>
-        <w:rPr>
-          <w:rFonts w:cstheme="minorHAnsi"/>
-          <w:b/>
-          <w:bCs/>
-          <w:sz w:val="28"/>
-          <w:szCs w:val="28"/>
-          <w:u w:val="single"/>
-        </w:rPr>
-        <w:t xml:space="preserve"> LLM)</w:t>
-      </w:r>
-    </w:p>
-    <w:p>
-      <w:pPr>
-        <w:rPr>
-          <w:rFonts w:cstheme="minorHAnsi"/>
-        </w:rPr>
-      </w:pPr>
-      <w:r>
-        <w:rPr>
-          <w:rFonts w:ascii="Segoe UI Emoji" w:hAnsi="Segoe UI Emoji" w:cs="Segoe UI Emoji"/>
-        </w:rPr>
-        <w:t>🔹</w:t>
-      </w:r>
-      <w:r>
-        <w:rPr>
-          <w:rFonts w:cstheme="minorHAnsi"/>
-        </w:rPr>
-        <w:t xml:space="preserve"> Fase 1 — Leer </w:t>
-      </w:r>
-      <w:proofErr w:type="spellStart"/>
-      <w:r>
-        <w:rPr>
-          <w:rFonts w:cstheme="minorHAnsi"/>
-        </w:rPr>
-        <w:t>CVs</w:t>
-      </w:r>
-      <w:proofErr w:type="spellEnd"/>
-    </w:p>
-    <w:p>
-      <w:pPr>
-        <w:rPr>
-          <w:rFonts w:cstheme="minorHAnsi"/>
-        </w:rPr>
-      </w:pPr>
-      <w:r>
-        <w:rPr>
-          <w:rFonts w:cstheme="minorHAnsi"/>
-        </w:rPr>
-        <w:t>Igual que antes.</w:t>
-      </w:r>
-      <w:r>
-        <w:rPr>
-          <w:rFonts w:cstheme="minorHAnsi"/>
-        </w:rPr>
-        <w:br/>
-        <w:t>Sin cambios.</w:t>
-      </w:r>
-    </w:p>
-    <w:p>
-      <w:pPr>
-        <w:rPr>
-          <w:rFonts w:cstheme="minorHAnsi"/>
-        </w:rPr>
-      </w:pPr>
-      <w:r>
-        <w:rPr>
-          <w:rFonts w:cstheme="minorHAnsi"/>
-        </w:rPr>
-        <w:pict w14:anchorId="06BBE5C7">
-          <v:rect id="_x0000_i1292" style="width:0;height:1.5pt" o:hralign="center" o:hrstd="t" o:hr="t" fillcolor="#a0a0a0" stroked="f"/>
-        </w:pict>
-      </w:r>
-    </w:p>
-    <w:p>
-      <w:pPr>
-        <w:rPr>
-          <w:rFonts w:cstheme="minorHAnsi"/>
-        </w:rPr>
-      </w:pPr>
-      <w:r>
-        <w:rPr>
-          <w:rFonts w:ascii="Segoe UI Emoji" w:hAnsi="Segoe UI Emoji" w:cs="Segoe UI Emoji"/>
-        </w:rPr>
-        <w:t>🔹</w:t>
-      </w:r>
-      <w:r>
-        <w:rPr>
-          <w:rFonts w:cstheme="minorHAnsi"/>
-        </w:rPr>
-        <w:t xml:space="preserve"> Fase 2 — Extracción simple sin LLM</w:t>
-      </w:r>
-    </w:p>
-    <w:p>
-      <w:pPr>
-        <w:rPr>
-          <w:rFonts w:cstheme="minorHAnsi"/>
-        </w:rPr>
-      </w:pPr>
-      <w:r>
-        <w:rPr>
-          <w:rFonts w:cstheme="minorHAnsi"/>
-        </w:rPr>
-        <w:t>En vez de LLM real, hacemos:</w:t>
-      </w:r>
-    </w:p>
-    <w:p>
-      <w:pPr>
-        <w:numPr>
-          <w:ilvl w:val="0"/>
-          <w:numId w:val="43"/>
-        </w:numPr>
-        <w:rPr>
-          <w:rFonts w:cstheme="minorHAnsi"/>
-        </w:rPr>
-      </w:pPr>
-      <w:proofErr w:type="spellStart"/>
-      <w:r>
-        <w:rPr>
-          <w:rFonts w:cstheme="minorHAnsi"/>
-        </w:rPr>
-        <w:t>regex</w:t>
-      </w:r>
-      <w:proofErr w:type="spellEnd"/>
-      <w:r>
-        <w:rPr>
-          <w:rFonts w:cstheme="minorHAnsi"/>
-        </w:rPr>
-        <w:t xml:space="preserve"> </w:t>
-      </w:r>
-    </w:p>
-    <w:p>
-      <w:pPr>
-        <w:numPr>
-          <w:ilvl w:val="0"/>
-          <w:numId w:val="43"/>
-        </w:numPr>
-        <w:rPr>
-          <w:rFonts w:cstheme="minorHAnsi"/>
-        </w:rPr>
-      </w:pPr>
-      <w:r>
-        <w:rPr>
-          <w:rFonts w:cstheme="minorHAnsi"/>
-        </w:rPr>
-        <w:t xml:space="preserve">búsqueda por palabras clave </w:t>
-      </w:r>
-    </w:p>
-    <w:p>
-      <w:pPr>
-        <w:numPr>
-          <w:ilvl w:val="0"/>
-          <w:numId w:val="43"/>
-        </w:numPr>
-        <w:rPr>
-          <w:rFonts w:cstheme="minorHAnsi"/>
-        </w:rPr>
-      </w:pPr>
-      <w:r>
-        <w:rPr>
-          <w:rFonts w:cstheme="minorHAnsi"/>
-        </w:rPr>
-        <w:t xml:space="preserve">reglas básicas </w:t>
-      </w:r>
-    </w:p>
-    <w:p>
-      <w:pPr>
-        <w:rPr>
-          <w:rFonts w:cstheme="minorHAnsi"/>
-        </w:rPr>
-      </w:pPr>
-      <w:r>
-        <w:rPr>
-          <w:rFonts w:cstheme="minorHAnsi"/>
-        </w:rPr>
-        <w:t>Ejemplo:</w:t>
-      </w:r>
-    </w:p>
-    <w:p>
-      <w:pPr>
-        <w:numPr>
-          <w:ilvl w:val="0"/>
-          <w:numId w:val="44"/>
-        </w:numPr>
-        <w:rPr>
-          <w:rFonts w:cstheme="minorHAnsi"/>
-        </w:rPr>
-      </w:pPr>
-      <w:r>
-        <w:rPr>
-          <w:rFonts w:cstheme="minorHAnsi"/>
-        </w:rPr>
-        <w:t xml:space="preserve">detectar “Python” </w:t>
-      </w:r>
-    </w:p>
-    <w:p>
-      <w:pPr>
-        <w:numPr>
-          <w:ilvl w:val="0"/>
-          <w:numId w:val="44"/>
-        </w:numPr>
-        <w:rPr>
-          <w:rFonts w:cstheme="minorHAnsi"/>
-        </w:rPr>
-      </w:pPr>
-      <w:r>
-        <w:rPr>
-          <w:rFonts w:cstheme="minorHAnsi"/>
-        </w:rPr>
-        <w:t xml:space="preserve">detectar “SQL” </w:t>
-      </w:r>
-    </w:p>
-    <w:p>
-      <w:pPr>
-        <w:numPr>
-          <w:ilvl w:val="0"/>
-          <w:numId w:val="44"/>
-        </w:numPr>
-        <w:rPr>
-          <w:rFonts w:cstheme="minorHAnsi"/>
-        </w:rPr>
-      </w:pPr>
-      <w:r>
-        <w:rPr>
-          <w:rFonts w:cstheme="minorHAnsi"/>
-        </w:rPr>
-        <w:t xml:space="preserve">detectar “3 años” </w:t>
-      </w:r>
-    </w:p>
-    <w:p>
-      <w:pPr>
-        <w:numPr>
-          <w:ilvl w:val="0"/>
-          <w:numId w:val="44"/>
-        </w:numPr>
-        <w:rPr>
-          <w:rFonts w:cstheme="minorHAnsi"/>
-        </w:rPr>
-      </w:pPr>
-      <w:r>
-        <w:rPr>
-          <w:rFonts w:cstheme="minorHAnsi"/>
-        </w:rPr>
-        <w:t xml:space="preserve">detectar “Ingeniería” </w:t>
-      </w:r>
-    </w:p>
-    <w:p>
-      <w:pPr>
-        <w:rPr>
-          <w:rFonts w:cstheme="minorHAnsi"/>
-        </w:rPr>
-      </w:pPr>
-      <w:r>
-        <w:rPr>
-          <w:rFonts w:cstheme="minorHAnsi"/>
-        </w:rPr>
-        <w:t>No es perfecto, pero:</w:t>
-      </w:r>
-    </w:p>
-    <w:p>
-      <w:pPr>
-        <w:numPr>
-          <w:ilvl w:val="0"/>
-          <w:numId w:val="45"/>
-        </w:numPr>
-        <w:rPr>
-          <w:rFonts w:cstheme="minorHAnsi"/>
-        </w:rPr>
-      </w:pPr>
-      <w:r>
-        <w:rPr>
-          <w:rFonts w:cstheme="minorHAnsi"/>
-        </w:rPr>
-        <w:t xml:space="preserve">funciona </w:t>
-      </w:r>
-    </w:p>
-    <w:p>
-      <w:pPr>
-        <w:numPr>
-          <w:ilvl w:val="0"/>
-          <w:numId w:val="45"/>
-        </w:numPr>
-        <w:rPr>
-          <w:rFonts w:cstheme="minorHAnsi"/>
-        </w:rPr>
-      </w:pPr>
-      <w:r>
-        <w:rPr>
-          <w:rFonts w:cstheme="minorHAnsi"/>
-        </w:rPr>
-        <w:t xml:space="preserve">es gratis </w:t>
-      </w:r>
-    </w:p>
-    <w:p>
-      <w:pPr>
-        <w:numPr>
-          <w:ilvl w:val="0"/>
-          <w:numId w:val="45"/>
-        </w:numPr>
-        <w:rPr>
-          <w:rFonts w:cstheme="minorHAnsi"/>
-        </w:rPr>
-      </w:pPr>
-      <w:r>
-        <w:rPr>
-          <w:rFonts w:cstheme="minorHAnsi"/>
-        </w:rPr>
-        <w:t xml:space="preserve">te deja avanzar </w:t>
-      </w:r>
-    </w:p>
-    <w:p>
-      <w:pPr>
-        <w:rPr>
-          <w:rFonts w:cstheme="minorHAnsi"/>
-        </w:rPr>
-      </w:pPr>
-      <w:r>
-        <w:rPr>
-          <w:rFonts w:ascii="Segoe UI Emoji" w:hAnsi="Segoe UI Emoji" w:cs="Segoe UI Emoji"/>
-        </w:rPr>
-        <w:lastRenderedPageBreak/>
-        <w:t>👉</w:t>
-      </w:r>
-      <w:r>
-        <w:rPr>
-          <w:rFonts w:cstheme="minorHAnsi"/>
-        </w:rPr>
-        <w:t xml:space="preserve"> Esto reemplaza temporalmente la extracción con LLM.</w:t>
-      </w:r>
-    </w:p>
-    <w:p>
-      <w:pPr>
-        <w:rPr>
-          <w:rFonts w:cstheme="minorHAnsi"/>
-        </w:rPr>
-      </w:pPr>
-      <w:r>
-        <w:rPr>
-          <w:rFonts w:cstheme="minorHAnsi"/>
-        </w:rPr>
-        <w:pict w14:anchorId="716AC467">
-          <v:rect id="_x0000_i1293" style="width:0;height:1.5pt" o:hralign="center" o:hrstd="t" o:hr="t" fillcolor="#a0a0a0" stroked="f"/>
-        </w:pict>
-      </w:r>
-    </w:p>
-    <w:p>
-      <w:pPr>
-        <w:rPr>
-          <w:rFonts w:cstheme="minorHAnsi"/>
-        </w:rPr>
-      </w:pPr>
-      <w:r>
-        <w:rPr>
-          <w:rFonts w:ascii="Segoe UI Emoji" w:hAnsi="Segoe UI Emoji" w:cs="Segoe UI Emoji"/>
-        </w:rPr>
-        <w:t>🔹</w:t>
-      </w:r>
-      <w:r>
-        <w:rPr>
-          <w:rFonts w:cstheme="minorHAnsi"/>
-        </w:rPr>
-        <w:t xml:space="preserve"> Fase 3 — </w:t>
-      </w:r>
-      <w:proofErr w:type="spellStart"/>
-      <w:r>
-        <w:rPr>
-          <w:rFonts w:cstheme="minorHAnsi"/>
-        </w:rPr>
-        <w:t>Scoring</w:t>
-      </w:r>
-      <w:proofErr w:type="spellEnd"/>
-    </w:p>
-    <w:p>
-      <w:pPr>
-        <w:rPr>
-          <w:rFonts w:cstheme="minorHAnsi"/>
-        </w:rPr>
-      </w:pPr>
-      <w:r>
-        <w:rPr>
-          <w:rFonts w:cstheme="minorHAnsi"/>
-        </w:rPr>
-        <w:t>Igual que antes:</w:t>
-      </w:r>
-    </w:p>
-    <w:p>
-      <w:pPr>
-        <w:numPr>
-          <w:ilvl w:val="0"/>
-          <w:numId w:val="46"/>
-        </w:numPr>
-        <w:rPr>
-          <w:rFonts w:cstheme="minorHAnsi"/>
-        </w:rPr>
-      </w:pPr>
-      <w:r>
-        <w:rPr>
-          <w:rFonts w:cstheme="minorHAnsi"/>
-        </w:rPr>
-        <w:t xml:space="preserve">reglas simples </w:t>
-      </w:r>
-    </w:p>
-    <w:p>
-      <w:pPr>
-        <w:numPr>
-          <w:ilvl w:val="0"/>
-          <w:numId w:val="46"/>
-        </w:numPr>
-        <w:rPr>
-          <w:rFonts w:cstheme="minorHAnsi"/>
-        </w:rPr>
-      </w:pPr>
-      <w:r>
-        <w:rPr>
-          <w:rFonts w:cstheme="minorHAnsi"/>
-        </w:rPr>
-        <w:t xml:space="preserve">suma de puntos </w:t>
-      </w:r>
-    </w:p>
-    <w:p>
-      <w:pPr>
-        <w:rPr>
-          <w:rFonts w:cstheme="minorHAnsi"/>
-        </w:rPr>
-      </w:pPr>
-      <w:r>
-        <w:rPr>
-          <w:rFonts w:cstheme="minorHAnsi"/>
-        </w:rPr>
-        <w:pict w14:anchorId="27FD9DB4">
-          <v:rect id="_x0000_i1294" style="width:0;height:1.5pt" o:hralign="center" o:hrstd="t" o:hr="t" fillcolor="#a0a0a0" stroked="f"/>
-        </w:pict>
-      </w:r>
-    </w:p>
-    <w:p>
-      <w:pPr>
-        <w:rPr>
-          <w:rFonts w:cstheme="minorHAnsi"/>
-        </w:rPr>
-      </w:pPr>
-      <w:r>
-        <w:rPr>
-          <w:rFonts w:ascii="Segoe UI Emoji" w:hAnsi="Segoe UI Emoji" w:cs="Segoe UI Emoji"/>
-        </w:rPr>
-        <w:t>🔹</w:t>
-      </w:r>
-      <w:r>
-        <w:rPr>
-          <w:rFonts w:cstheme="minorHAnsi"/>
-        </w:rPr>
-        <w:t xml:space="preserve"> Fase 4 — Ranking</w:t>
-      </w:r>
-    </w:p>
-    <w:p>
-      <w:pPr>
-        <w:rPr>
-          <w:rFonts w:cstheme="minorHAnsi"/>
-        </w:rPr>
-      </w:pPr>
-      <w:r>
-        <w:rPr>
-          <w:rFonts w:cstheme="minorHAnsi"/>
-        </w:rPr>
-        <w:t>Igual que antes.</w:t>
-      </w:r>
-    </w:p>
-    <w:p>
-      <w:pPr>
-        <w:rPr>
-          <w:rFonts w:cstheme="minorHAnsi"/>
-        </w:rPr>
-      </w:pPr>
-      <w:r>
-        <w:rPr>
-          <w:rFonts w:cstheme="minorHAnsi"/>
-        </w:rPr>
-        <w:pict w14:anchorId="4797C6A6">
-          <v:rect id="_x0000_i1295" style="width:0;height:1.5pt" o:hralign="center" o:hrstd="t" o:hr="t" fillcolor="#a0a0a0" stroked="f"/>
-        </w:pict>
-      </w:r>
-    </w:p>
-    <w:p>
-      <w:pPr>
-        <w:rPr>
-          <w:rFonts w:cstheme="minorHAnsi"/>
-        </w:rPr>
-      </w:pPr>
-      <w:r>
-        <w:rPr>
-          <w:rFonts w:ascii="Segoe UI Emoji" w:hAnsi="Segoe UI Emoji" w:cs="Segoe UI Emoji"/>
-        </w:rPr>
-        <w:t>🔹</w:t>
-      </w:r>
-      <w:r>
-        <w:rPr>
-          <w:rFonts w:cstheme="minorHAnsi"/>
-        </w:rPr>
-        <w:t xml:space="preserve"> Fase 5 — Explicación simple</w:t>
-      </w:r>
-    </w:p>
-    <w:p>
-      <w:pPr>
-        <w:rPr>
-          <w:rFonts w:cstheme="minorHAnsi"/>
-        </w:rPr>
-      </w:pPr>
-      <w:r>
-        <w:rPr>
-          <w:rFonts w:cstheme="minorHAnsi"/>
-        </w:rPr>
-        <w:t>En vez de LLM, hacemos:</w:t>
-      </w:r>
-    </w:p>
-    <w:p>
-      <w:pPr>
-        <w:numPr>
-          <w:ilvl w:val="0"/>
-          <w:numId w:val="47"/>
-        </w:numPr>
-        <w:rPr>
-          <w:rFonts w:cstheme="minorHAnsi"/>
-        </w:rPr>
-      </w:pPr>
-      <w:r>
-        <w:rPr>
-          <w:rFonts w:cstheme="minorHAnsi"/>
-        </w:rPr>
-        <w:t xml:space="preserve">plantilla </w:t>
-      </w:r>
-    </w:p>
-    <w:p>
-      <w:pPr>
-        <w:numPr>
-          <w:ilvl w:val="0"/>
-          <w:numId w:val="47"/>
-        </w:numPr>
-        <w:rPr>
-          <w:rFonts w:cstheme="minorHAnsi"/>
-        </w:rPr>
-      </w:pPr>
-      <w:r>
-        <w:rPr>
-          <w:rFonts w:cstheme="minorHAnsi"/>
-        </w:rPr>
-        <w:t xml:space="preserve">texto armado por variables </w:t>
-      </w:r>
-    </w:p>
-    <w:p>
-      <w:pPr>
-        <w:rPr>
-          <w:rFonts w:cstheme="minorHAnsi"/>
-        </w:rPr>
-      </w:pPr>
-      <w:r>
-        <w:rPr>
-          <w:rFonts w:cstheme="minorHAnsi"/>
-        </w:rPr>
-        <w:t>Ejemplo:</w:t>
-      </w:r>
-    </w:p>
-    <w:p>
-      <w:pPr>
-        <w:rPr>
-          <w:rFonts w:cstheme="minorHAnsi"/>
-        </w:rPr>
-      </w:pPr>
-      <w:r>
-        <w:rPr>
-          <w:rFonts w:cstheme="minorHAnsi"/>
-        </w:rPr>
-        <w:t>“Juan es buen candidato porque tiene Python, SQL y más de 2 años de experiencia.”</w:t>
-      </w:r>
-    </w:p>
-    <w:p>
-      <w:pPr>
-        <w:rPr>
-          <w:rFonts w:cstheme="minorHAnsi"/>
-          <w:b/>
-          <w:bCs/>
-          <w:sz w:val="28"/>
-          <w:szCs w:val="28"/>
-          <w:u w:val="single"/>
-        </w:rPr>
-      </w:pPr>
-    </w:p>
-    <w:p/>
-    <w:p>
-      <w:pPr>
-        <w:rPr>
-          <w:b/>
-          <w:bCs/>
-          <w:sz w:val="28"/>
-          <w:szCs w:val="28"/>
-          <w:u w:val="single"/>
-        </w:rPr>
-      </w:pPr>
-      <w:r>
-        <w:rPr>
-          <w:rFonts w:ascii="Segoe UI Emoji" w:hAnsi="Segoe UI Emoji" w:cs="Segoe UI Emoji"/>
-          <w:b/>
-          <w:bCs/>
-          <w:sz w:val="28"/>
-          <w:szCs w:val="28"/>
-          <w:u w:val="single"/>
-        </w:rPr>
-        <w:t>📌</w:t>
-      </w:r>
-      <w:r>
-        <w:rPr>
-          <w:b/>
-          <w:bCs/>
-          <w:sz w:val="28"/>
-          <w:szCs w:val="28"/>
-          <w:u w:val="single"/>
-        </w:rPr>
-        <w:t xml:space="preserve"> Resultado de estas 5 fases</w:t>
-      </w:r>
-    </w:p>
-    <w:p>
-      <w:r>
-        <w:t xml:space="preserve">Ya </w:t>
-      </w:r>
-      <w:proofErr w:type="spellStart"/>
-      <w:r>
-        <w:t>tenés</w:t>
-      </w:r>
-      <w:proofErr w:type="spellEnd"/>
-      <w:r>
-        <w:t xml:space="preserve"> un sistema que:</w:t>
-      </w:r>
-    </w:p>
-    <w:p>
-      <w:pPr>
-        <w:numPr>
-          <w:ilvl w:val="0"/>
-          <w:numId w:val="42"/>
-        </w:numPr>
-      </w:pPr>
-      <w:r>
-        <w:t xml:space="preserve">lee </w:t>
-      </w:r>
-      <w:proofErr w:type="spellStart"/>
-      <w:r>
-        <w:t>CVs</w:t>
-      </w:r>
-      <w:proofErr w:type="spellEnd"/>
-      <w:r>
-        <w:t xml:space="preserve"> </w:t>
-      </w:r>
-    </w:p>
-    <w:p>
-      <w:pPr>
-        <w:numPr>
-          <w:ilvl w:val="0"/>
-          <w:numId w:val="42"/>
-        </w:numPr>
-      </w:pPr>
-      <w:r>
-        <w:t xml:space="preserve">entiende contenido </w:t>
-      </w:r>
-    </w:p>
-    <w:p>
-      <w:pPr>
-        <w:numPr>
-          <w:ilvl w:val="0"/>
-          <w:numId w:val="42"/>
-        </w:numPr>
-      </w:pPr>
-      <w:r>
-        <w:t xml:space="preserve">evalúa </w:t>
-      </w:r>
-    </w:p>
-    <w:p>
-      <w:pPr>
-        <w:numPr>
-          <w:ilvl w:val="0"/>
-          <w:numId w:val="42"/>
-        </w:numPr>
-      </w:pPr>
-      <w:r>
-        <w:t xml:space="preserve">ordena </w:t>
-      </w:r>
-    </w:p>
-    <w:p>
-      <w:pPr>
-        <w:numPr>
-          <w:ilvl w:val="0"/>
-          <w:numId w:val="42"/>
-        </w:numPr>
-      </w:pPr>
-      <w:r>
-        <w:t xml:space="preserve">explica </w:t>
-      </w:r>
-    </w:p>
-    <w:p>
-      <w:r>
-        <w:rPr>
-          <w:rFonts w:ascii="Segoe UI Emoji" w:hAnsi="Segoe UI Emoji" w:cs="Segoe UI Emoji"/>
-        </w:rPr>
-        <w:t>👉</w:t>
-      </w:r>
-      <w:r>
-        <w:t xml:space="preserve"> </w:t>
-      </w:r>
-      <w:r>
-        <w:rPr>
-          <w:b/>
-          <w:bCs/>
-        </w:rPr>
-        <w:t>Esto ya es un MVP real</w:t>
-      </w:r>
-    </w:p>
     <w:p/>
     <w:p/>
     <w:p/>
@@ -14568,6 +12875,7 @@
   <w:style w:type="character" w:default="1" w:styleId="DefaultParagraphFont">
     <w:name w:val="Default Paragraph Font"/>
     <w:uiPriority w:val="1"/>
+    <w:semiHidden/>
     <w:unhideWhenUsed/>
   </w:style>
   <w:style w:type="table" w:default="1" w:styleId="TableNormal">

</xml_diff>